<commit_message>
User manual & others.
</commit_message>
<xml_diff>
--- a/Documents/Vizsgaremek dokumentáció.docx
+++ b/Documents/Vizsgaremek dokumentáció.docx
@@ -252,6 +252,9 @@
         <w:jc w:val="center"/>
       </w:pPr>
       <w:r>
+        <w:rPr>
+          <w:noProof/>
+        </w:rPr>
         <w:drawing>
           <wp:inline distT="0" distB="0" distL="0" distR="0" wp14:anchorId="7FE6E3B0" wp14:editId="58F6551B">
             <wp:extent cx="5760720" cy="1339215"/>
@@ -331,7 +334,13 @@
         <w:t>Mentés</w:t>
       </w:r>
       <w:r>
-        <w:t xml:space="preserve"> gombra kattintva az alkalmazás – a megadott adatokat – az adatbázisba menti.</w:t>
+        <w:t xml:space="preserve"> gombra kattintva az alkalmazás – a megadott adatokat – az adatbázisba</w:t>
+      </w:r>
+      <w:r>
+        <w:t>n tárolja</w:t>
+      </w:r>
+      <w:r>
+        <w:t>.</w:t>
       </w:r>
     </w:p>
     <w:p>
@@ -470,6 +479,180 @@
           </wp:inline>
         </w:drawing>
       </w:r>
+    </w:p>
+    <w:p>
+      <w:pPr>
+        <w:pStyle w:val="Szakdolozatbekezdsek"/>
+      </w:pPr>
+      <w:r>
+        <w:t>Az állapot mezőben a legtöbbet alkalmazott „tárolási” lehetőségek vannak felsorolva. Ezek az állapotok fordulnak elő a legtöbbször az üzletben. A többi mezők a fenyők fajtáit adja meg, amit a nagykereskedés felhasznál.</w:t>
+      </w:r>
+    </w:p>
+    <w:p>
+      <w:pPr>
+        <w:pStyle w:val="Szakdolozatbekezdsek"/>
+      </w:pPr>
+      <w:r>
+        <w:t>A táblázat többi része már a feltöltött adatbázis adatait mutatja meg a felhasználónak. Amikor egy bálarendelés beérkezik, akkor az a mennyiségű bála az „Érkezett” sorba kerül. Természetesen a megfelelő oszlopba teszi az adatbázis, mert nem csak az állapotot kell megadni, hanem a fenyőbála típusát is.</w:t>
+      </w:r>
+    </w:p>
+    <w:p>
+      <w:pPr>
+        <w:pStyle w:val="Szakdolozatbekezdsek"/>
+      </w:pPr>
+      <w:r>
+        <w:t>Természetesen</w:t>
+      </w:r>
+      <w:r>
+        <w:t>, ha az alkalmazást megfelelően</w:t>
+      </w:r>
+      <w:r>
+        <w:t xml:space="preserve"> használ</w:t>
+      </w:r>
+      <w:r>
+        <w:t>ják, akkor az</w:t>
+      </w:r>
+      <w:r>
+        <w:t xml:space="preserve"> adat</w:t>
+      </w:r>
+      <w:r>
+        <w:t>ok</w:t>
+      </w:r>
+      <w:r>
+        <w:t xml:space="preserve"> a megfelelő hely</w:t>
+      </w:r>
+      <w:r>
+        <w:t>ük</w:t>
+      </w:r>
+      <w:r>
+        <w:t>re kerül</w:t>
+      </w:r>
+      <w:r>
+        <w:t>ne</w:t>
+      </w:r>
+      <w:r>
+        <w:t>, és akkor a való</w:t>
+      </w:r>
+      <w:r>
+        <w:t>di raktárban</w:t>
+      </w:r>
+      <w:r>
+        <w:t xml:space="preserve"> és a </w:t>
+      </w:r>
+      <w:r>
+        <w:t>„</w:t>
+      </w:r>
+      <w:r>
+        <w:t>digitalizált</w:t>
+      </w:r>
+      <w:r>
+        <w:t>”</w:t>
+      </w:r>
+      <w:r>
+        <w:t xml:space="preserve"> </w:t>
+      </w:r>
+      <w:r>
+        <w:t>raktárban az fenyőbálák mennyisége, és az adatok megegyeznek.</w:t>
+      </w:r>
+    </w:p>
+    <w:p>
+      <w:r>
+        <w:br w:type="page"/>
+      </w:r>
+    </w:p>
+    <w:p>
+      <w:pPr>
+        <w:pStyle w:val="Cmsor2"/>
+        <w:sectPr>
+          <w:type w:val="continuous"/>
+          <w:pgSz w:w="11906" w:h="16838"/>
+          <w:pgMar w:top="1417" w:right="1417" w:bottom="1417" w:left="1417" w:header="708" w:footer="708" w:gutter="0"/>
+          <w:cols w:space="708"/>
+          <w:docGrid w:linePitch="360"/>
+        </w:sectPr>
+      </w:pPr>
+      <w:r>
+        <w:lastRenderedPageBreak/>
+        <w:t>Koszorúalap:</w:t>
+      </w:r>
+    </w:p>
+    <w:p>
+      <w:pPr>
+        <w:pStyle w:val="Szakdolozatbekezdsek"/>
+      </w:pPr>
+      <w:r>
+        <w:t xml:space="preserve">Ez az oldal is 1/3-2/3 arányban fel van osztva. Az 1/3 részen szintén az adatok felvitelére van lehetőség. </w:t>
+      </w:r>
+      <w:r>
+        <w:t xml:space="preserve">Az összes beviteli mező kitöltése kötelező, hiszen fontos adatokról van szó. A vevő, a koszorúalap mérete, a fenyő fajtája, a határidő – ami a vevőnek nagyon fontos – és a darabszám, hogy mennyi alapra van szükség. Az összes beviteli mező itt is legördülő elem, és az adatbázisból kiszedett adatok jelennek meg benne választható lehetőségként. A megadott adatokat a </w:t>
+      </w:r>
+      <w:r>
+        <w:rPr>
+          <w:b/>
+          <w:bCs/>
+        </w:rPr>
+        <w:t>Mentés</w:t>
+      </w:r>
+      <w:r>
+        <w:t xml:space="preserve"> gombra kattintva tárolja az adatbázis.</w:t>
+      </w:r>
+    </w:p>
+    <w:p>
+      <w:pPr>
+        <w:jc w:val="center"/>
+      </w:pPr>
+      <w:r>
+        <w:br w:type="column"/>
+      </w:r>
+      <w:r>
+        <w:drawing>
+          <wp:inline distT="0" distB="0" distL="0" distR="0" wp14:anchorId="3A9A0EE7" wp14:editId="7D94FFDA">
+            <wp:extent cx="2238375" cy="3959708"/>
+            <wp:effectExtent l="0" t="0" r="0" b="3175"/>
+            <wp:docPr id="1454068945" name="Kép 1"/>
+            <wp:cNvGraphicFramePr>
+              <a:graphicFrameLocks xmlns:a="http://schemas.openxmlformats.org/drawingml/2006/main" noChangeAspect="1"/>
+            </wp:cNvGraphicFramePr>
+            <a:graphic xmlns:a="http://schemas.openxmlformats.org/drawingml/2006/main">
+              <a:graphicData uri="http://schemas.openxmlformats.org/drawingml/2006/picture">
+                <pic:pic xmlns:pic="http://schemas.openxmlformats.org/drawingml/2006/picture">
+                  <pic:nvPicPr>
+                    <pic:cNvPr id="1454068945" name=""/>
+                    <pic:cNvPicPr/>
+                  </pic:nvPicPr>
+                  <pic:blipFill>
+                    <a:blip r:embed="rId8"/>
+                    <a:stretch>
+                      <a:fillRect/>
+                    </a:stretch>
+                  </pic:blipFill>
+                  <pic:spPr>
+                    <a:xfrm>
+                      <a:off x="0" y="0"/>
+                      <a:ext cx="2244209" cy="3970028"/>
+                    </a:xfrm>
+                    <a:prstGeom prst="rect">
+                      <a:avLst/>
+                    </a:prstGeom>
+                  </pic:spPr>
+                </pic:pic>
+              </a:graphicData>
+            </a:graphic>
+          </wp:inline>
+        </w:drawing>
+      </w:r>
+    </w:p>
+    <w:p>
+      <w:pPr>
+        <w:jc w:val="center"/>
+        <w:sectPr>
+          <w:type w:val="continuous"/>
+          <w:pgSz w:w="11906" w:h="16838"/>
+          <w:pgMar w:top="1417" w:right="1417" w:bottom="1417" w:left="1417" w:header="708" w:footer="708" w:gutter="0"/>
+          <w:cols w:num="2" w:space="708"/>
+          <w:docGrid w:linePitch="360"/>
+        </w:sectPr>
+      </w:pPr>
     </w:p>
     <w:p>
       <w:pPr>

</xml_diff>

<commit_message>
Document update with Costumers
</commit_message>
<xml_diff>
--- a/Documents/Vizsgaremek dokumentáció.docx
+++ b/Documents/Vizsgaremek dokumentáció.docx
@@ -600,11 +600,21 @@
     <w:p>
       <w:pPr>
         <w:jc w:val="center"/>
+        <w:sectPr>
+          <w:type w:val="continuous"/>
+          <w:pgSz w:w="11906" w:h="16838"/>
+          <w:pgMar w:top="1417" w:right="1417" w:bottom="1417" w:left="1417" w:header="708" w:footer="708" w:gutter="0"/>
+          <w:cols w:num="2" w:space="708"/>
+          <w:docGrid w:linePitch="360"/>
+        </w:sectPr>
       </w:pPr>
       <w:r>
         <w:br w:type="column"/>
       </w:r>
       <w:r>
+        <w:rPr>
+          <w:noProof/>
+        </w:rPr>
         <w:drawing>
           <wp:inline distT="0" distB="0" distL="0" distR="0" wp14:anchorId="3A9A0EE7" wp14:editId="7D94FFDA">
             <wp:extent cx="2238375" cy="3959708"/>
@@ -644,7 +654,232 @@
     </w:p>
     <w:p>
       <w:pPr>
+        <w:pStyle w:val="Szakdolozatbekezdsek"/>
+      </w:pPr>
+      <w:r>
+        <w:t>Az oldal 2/3-ad részében az előbb megadott adatok szerepelnek, csak itt már olyan táblázatos formában, mit a már említett fenyőbála rendelés esetében. A mezőnevek természetesen mások, mert itt más adatokat kellett megadni.</w:t>
+      </w:r>
+    </w:p>
+    <w:p>
+      <w:pPr>
         <w:jc w:val="center"/>
+      </w:pPr>
+      <w:r>
+        <w:drawing>
+          <wp:inline distT="0" distB="0" distL="0" distR="0" wp14:anchorId="5F730163" wp14:editId="7D97A1E3">
+            <wp:extent cx="5556250" cy="3462655"/>
+            <wp:effectExtent l="0" t="0" r="6350" b="4445"/>
+            <wp:docPr id="748779683" name="Kép 1"/>
+            <wp:cNvGraphicFramePr>
+              <a:graphicFrameLocks xmlns:a="http://schemas.openxmlformats.org/drawingml/2006/main" noChangeAspect="1"/>
+            </wp:cNvGraphicFramePr>
+            <a:graphic xmlns:a="http://schemas.openxmlformats.org/drawingml/2006/main">
+              <a:graphicData uri="http://schemas.openxmlformats.org/drawingml/2006/picture">
+                <pic:pic xmlns:pic="http://schemas.openxmlformats.org/drawingml/2006/picture">
+                  <pic:nvPicPr>
+                    <pic:cNvPr id="748779683" name="Kép 1"/>
+                    <pic:cNvPicPr/>
+                  </pic:nvPicPr>
+                  <pic:blipFill>
+                    <a:blip r:embed="rId9">
+                      <a:extLst>
+                        <a:ext uri="{28A0092B-C50C-407E-A947-70E740481C1C}">
+                          <a14:useLocalDpi xmlns:a14="http://schemas.microsoft.com/office/drawing/2010/main" val="0"/>
+                        </a:ext>
+                      </a:extLst>
+                    </a:blip>
+                    <a:stretch>
+                      <a:fillRect/>
+                    </a:stretch>
+                  </pic:blipFill>
+                  <pic:spPr>
+                    <a:xfrm>
+                      <a:off x="0" y="0"/>
+                      <a:ext cx="5588387" cy="3482683"/>
+                    </a:xfrm>
+                    <a:prstGeom prst="rect">
+                      <a:avLst/>
+                    </a:prstGeom>
+                  </pic:spPr>
+                </pic:pic>
+              </a:graphicData>
+            </a:graphic>
+          </wp:inline>
+        </w:drawing>
+      </w:r>
+    </w:p>
+    <w:p>
+      <w:pPr>
+        <w:pStyle w:val="Szakdolozatbekezdsek"/>
+      </w:pPr>
+      <w:r>
+        <w:lastRenderedPageBreak/>
+        <w:t xml:space="preserve">A táblázat fejléce nagyon hasonlít az „Új rendelés felvétele” címkéire. Egy eltérés látható a „Rendelés részletei” táblázatnál. Itt egy jelölőnégyzet került be a </w:t>
+      </w:r>
+      <w:r>
+        <w:t xml:space="preserve">táblázatba. Ez azt a célt szolgálja, </w:t>
+      </w:r>
+      <w:r>
+        <w:t>hogy a koszorúalap készen van-e vagy sem. Amint a koszorúalap elkészült,</w:t>
+      </w:r>
+      <w:r>
+        <w:t xml:space="preserve"> a jelölőnégyzetre kattintással lehet jelezni az adatbázisnak, hogy a koszorúalap elkészült.</w:t>
+      </w:r>
+    </w:p>
+    <w:p>
+      <w:pPr>
+        <w:pStyle w:val="Szakdolozatbekezdsek"/>
+      </w:pPr>
+      <w:r>
+        <w:t xml:space="preserve">A </w:t>
+      </w:r>
+      <w:r>
+        <w:rPr>
+          <w:b/>
+          <w:bCs/>
+        </w:rPr>
+        <w:t>Kinek</w:t>
+      </w:r>
+      <w:r>
+        <w:t xml:space="preserve"> a vásárlót jelenti, a </w:t>
+      </w:r>
+      <w:r>
+        <w:rPr>
+          <w:b/>
+          <w:bCs/>
+        </w:rPr>
+        <w:t>Mikorra</w:t>
+      </w:r>
+      <w:r>
+        <w:t xml:space="preserve"> a határidőt, a </w:t>
+      </w:r>
+      <w:r>
+        <w:rPr>
+          <w:b/>
+          <w:bCs/>
+        </w:rPr>
+        <w:t>Fenyő</w:t>
+      </w:r>
+      <w:r>
+        <w:t xml:space="preserve"> </w:t>
+      </w:r>
+      <w:r>
+        <w:rPr>
+          <w:b/>
+          <w:bCs/>
+        </w:rPr>
+        <w:t>fajta</w:t>
+      </w:r>
+      <w:r>
+        <w:t xml:space="preserve"> az négy fajta lehet, az </w:t>
+      </w:r>
+      <w:r>
+        <w:rPr>
+          <w:b/>
+          <w:bCs/>
+        </w:rPr>
+        <w:t>Alap</w:t>
+      </w:r>
+      <w:r>
+        <w:t xml:space="preserve"> </w:t>
+      </w:r>
+      <w:r>
+        <w:rPr>
+          <w:b/>
+          <w:bCs/>
+        </w:rPr>
+        <w:t>típus</w:t>
+      </w:r>
+      <w:r>
+        <w:t xml:space="preserve"> két lehetőség közül lehet választani, a </w:t>
+      </w:r>
+      <w:r>
+        <w:rPr>
+          <w:b/>
+          <w:bCs/>
+        </w:rPr>
+        <w:t>Kész</w:t>
+      </w:r>
+      <w:r>
+        <w:t xml:space="preserve"> pedig az adatbázisnak, és a program felhasználójának ad fontos információt a koszorúalap állapotáról.</w:t>
+      </w:r>
+    </w:p>
+    <w:p>
+      <w:pPr>
+        <w:pStyle w:val="Cmsor2"/>
+      </w:pPr>
+      <w:r>
+        <w:t>Vásárlók:</w:t>
+      </w:r>
+    </w:p>
+    <w:p>
+      <w:pPr>
+        <w:pStyle w:val="Szakdolozatbekezdsek"/>
+        <w:sectPr>
+          <w:type w:val="continuous"/>
+          <w:pgSz w:w="11906" w:h="16838"/>
+          <w:pgMar w:top="1417" w:right="1417" w:bottom="1417" w:left="1417" w:header="708" w:footer="708" w:gutter="0"/>
+          <w:cols w:space="708"/>
+          <w:docGrid w:linePitch="360"/>
+        </w:sectPr>
+      </w:pPr>
+    </w:p>
+    <w:p>
+      <w:pPr>
+        <w:pStyle w:val="Szakdolozatbekezdsek"/>
+      </w:pPr>
+      <w:r>
+        <w:t>Ezen az oldalon a vásárlókat lehet regisztrálni az adatbázisba. Az oldal a már ismerős 1/3-2/3-ad felosztásban van. Az „Új vásárló hozzáadása” részben minden olyan információ, ami a vevő azonosításához szükséges fel van sorolva az űrlapon. A megfelelő adatok kitöltésével, majd a „Mentés” gombra kattintással a vevőt az adatbázisba menti a program.</w:t>
+      </w:r>
+    </w:p>
+    <w:p>
+      <w:pPr>
+        <w:pStyle w:val="Szakdolozatbekezdsek"/>
+      </w:pPr>
+      <w:r>
+        <w:br w:type="column"/>
+      </w:r>
+      <w:r>
+        <w:drawing>
+          <wp:inline distT="0" distB="0" distL="0" distR="0" wp14:anchorId="104336FF" wp14:editId="7AAF1786">
+            <wp:extent cx="2349246" cy="2959100"/>
+            <wp:effectExtent l="0" t="0" r="0" b="0"/>
+            <wp:docPr id="1048541838" name="Kép 1"/>
+            <wp:cNvGraphicFramePr>
+              <a:graphicFrameLocks xmlns:a="http://schemas.openxmlformats.org/drawingml/2006/main" noChangeAspect="1"/>
+            </wp:cNvGraphicFramePr>
+            <a:graphic xmlns:a="http://schemas.openxmlformats.org/drawingml/2006/main">
+              <a:graphicData uri="http://schemas.openxmlformats.org/drawingml/2006/picture">
+                <pic:pic xmlns:pic="http://schemas.openxmlformats.org/drawingml/2006/picture">
+                  <pic:nvPicPr>
+                    <pic:cNvPr id="1048541838" name=""/>
+                    <pic:cNvPicPr/>
+                  </pic:nvPicPr>
+                  <pic:blipFill>
+                    <a:blip r:embed="rId10"/>
+                    <a:stretch>
+                      <a:fillRect/>
+                    </a:stretch>
+                  </pic:blipFill>
+                  <pic:spPr>
+                    <a:xfrm>
+                      <a:off x="0" y="0"/>
+                      <a:ext cx="2386080" cy="3005496"/>
+                    </a:xfrm>
+                    <a:prstGeom prst="rect">
+                      <a:avLst/>
+                    </a:prstGeom>
+                  </pic:spPr>
+                </pic:pic>
+              </a:graphicData>
+            </a:graphic>
+          </wp:inline>
+        </w:drawing>
+      </w:r>
+    </w:p>
+    <w:p>
+      <w:pPr>
+        <w:pStyle w:val="Szakdolozatbekezdsek"/>
         <w:sectPr>
           <w:type w:val="continuous"/>
           <w:pgSz w:w="11906" w:h="16838"/>
@@ -658,6 +893,56 @@
       <w:pPr>
         <w:pStyle w:val="Szakdolozatbekezdsek"/>
       </w:pPr>
+      <w:r>
+        <w:t>A regisztrált vásárlók adatait az oldal másik része jeleníti meg – szintén – táblázatos formában. Az adatok itt csak megjelenítve vannak, de a későbbiek folyamán majd az adatok módosítására is lesz lehetőség.</w:t>
+      </w:r>
+    </w:p>
+    <w:p>
+      <w:pPr>
+        <w:jc w:val="center"/>
+      </w:pPr>
+      <w:r>
+        <w:drawing>
+          <wp:inline distT="0" distB="0" distL="0" distR="0" wp14:anchorId="27A94DF0" wp14:editId="250F789C">
+            <wp:extent cx="5760720" cy="1991995"/>
+            <wp:effectExtent l="0" t="0" r="0" b="8255"/>
+            <wp:docPr id="1738185120" name="Kép 1"/>
+            <wp:cNvGraphicFramePr>
+              <a:graphicFrameLocks xmlns:a="http://schemas.openxmlformats.org/drawingml/2006/main" noChangeAspect="1"/>
+            </wp:cNvGraphicFramePr>
+            <a:graphic xmlns:a="http://schemas.openxmlformats.org/drawingml/2006/main">
+              <a:graphicData uri="http://schemas.openxmlformats.org/drawingml/2006/picture">
+                <pic:pic xmlns:pic="http://schemas.openxmlformats.org/drawingml/2006/picture">
+                  <pic:nvPicPr>
+                    <pic:cNvPr id="1738185120" name=""/>
+                    <pic:cNvPicPr/>
+                  </pic:nvPicPr>
+                  <pic:blipFill>
+                    <a:blip r:embed="rId11"/>
+                    <a:stretch>
+                      <a:fillRect/>
+                    </a:stretch>
+                  </pic:blipFill>
+                  <pic:spPr>
+                    <a:xfrm>
+                      <a:off x="0" y="0"/>
+                      <a:ext cx="5760720" cy="1991995"/>
+                    </a:xfrm>
+                    <a:prstGeom prst="rect">
+                      <a:avLst/>
+                    </a:prstGeom>
+                  </pic:spPr>
+                </pic:pic>
+              </a:graphicData>
+            </a:graphic>
+          </wp:inline>
+        </w:drawing>
+      </w:r>
+    </w:p>
+    <w:p>
+      <w:r>
+        <w:br w:type="page"/>
+      </w:r>
     </w:p>
     <w:sectPr>
       <w:type w:val="continuous"/>
@@ -1591,7 +1876,7 @@
     <w:link w:val="SzakdolozatbekezdsekChar"/>
     <w:autoRedefine/>
     <w:qFormat/>
-    <w:rsid w:val="00C533E5"/>
+    <w:rsid w:val="00374BDC"/>
     <w:pPr>
       <w:spacing w:line="360" w:lineRule="auto"/>
       <w:ind w:firstLine="709"/>
@@ -1601,7 +1886,7 @@
     <w:name w:val="Szakdolozat bekezdések Char"/>
     <w:basedOn w:val="Bekezdsalapbettpusa"/>
     <w:link w:val="Szakdolozatbekezdsek"/>
-    <w:rsid w:val="00C533E5"/>
+    <w:rsid w:val="00374BDC"/>
   </w:style>
 </w:styles>
 </file>

</xml_diff>

<commit_message>
Updates, Put, Delete endpoints
</commit_message>
<xml_diff>
--- a/Documents/Vizsgaremek dokumentáció.docx
+++ b/Documents/Vizsgaremek dokumentáció.docx
@@ -1,6 +1,6 @@
 
 <file path=word/document.xml><?xml version="1.0" encoding="utf-8"?>
-<w:document xmlns:wpc="http://schemas.microsoft.com/office/word/2010/wordprocessingCanvas" xmlns:cx="http://schemas.microsoft.com/office/drawing/2014/chartex" xmlns:cx1="http://schemas.microsoft.com/office/drawing/2015/9/8/chartex" xmlns:cx2="http://schemas.microsoft.com/office/drawing/2015/10/21/chartex" xmlns:cx3="http://schemas.microsoft.com/office/drawing/2016/5/9/chartex" xmlns:cx4="http://schemas.microsoft.com/office/drawing/2016/5/10/chartex" xmlns:cx5="http://schemas.microsoft.com/office/drawing/2016/5/11/chartex" xmlns:cx6="http://schemas.microsoft.com/office/drawing/2016/5/12/chartex" xmlns:cx7="http://schemas.microsoft.com/office/drawing/2016/5/13/chartex" xmlns:cx8="http://schemas.microsoft.com/office/drawing/2016/5/14/chartex" xmlns:mc="http://schemas.openxmlformats.org/markup-compatibility/2006" xmlns:aink="http://schemas.microsoft.com/office/drawing/2016/ink" xmlns:am3d="http://schemas.microsoft.com/office/drawing/2017/model3d" xmlns:o="urn:schemas-microsoft-com:office:office" xmlns:oel="http://schemas.microsoft.com/office/2019/extlst" xmlns:r="http://schemas.openxmlformats.org/officeDocument/2006/relationships" xmlns:m="http://schemas.openxmlformats.org/officeDocument/2006/math" xmlns:v="urn:schemas-microsoft-com:vml" xmlns:wp14="http://schemas.microsoft.com/office/word/2010/wordprocessingDrawing" xmlns:wp="http://schemas.openxmlformats.org/drawingml/2006/wordprocessingDrawing" xmlns:w10="urn:schemas-microsoft-com:office:word" xmlns:w="http://schemas.openxmlformats.org/wordprocessingml/2006/main" xmlns:w14="http://schemas.microsoft.com/office/word/2010/wordml" xmlns:w15="http://schemas.microsoft.com/office/word/2012/wordml" xmlns:w16cei="http://schemas.microsoft.com/office/word/2026/wordml/cei" xmlns:w16cex="http://schemas.microsoft.com/office/word/2018/wordml/cex" xmlns:w16cid="http://schemas.microsoft.com/office/word/2016/wordml/cid" xmlns:w16="http://schemas.microsoft.com/office/word/2018/wordml" xmlns:w16du="http://schemas.microsoft.com/office/word/2023/wordml/word16du" xmlns:w16sdtdh="http://schemas.microsoft.com/office/word/2020/wordml/sdtdatahash" xmlns:w16sdtfl="http://schemas.microsoft.com/office/word/2024/wordml/sdtformatlock" xmlns:w16se="http://schemas.microsoft.com/office/word/2015/wordml/symex" xmlns:wpg="http://schemas.microsoft.com/office/word/2010/wordprocessingGroup" xmlns:wpi="http://schemas.microsoft.com/office/word/2010/wordprocessingInk" xmlns:wne="http://schemas.microsoft.com/office/word/2006/wordml" xmlns:wps="http://schemas.microsoft.com/office/word/2010/wordprocessingShape" mc:Ignorable="w14 w15 w16se w16cid w16 w16cex w16sdtdh w16sdtfl w16du wp14">
+<w:document xmlns:wpc="http://schemas.microsoft.com/office/word/2010/wordprocessingCanvas" xmlns:cx="http://schemas.microsoft.com/office/drawing/2014/chartex" xmlns:cx1="http://schemas.microsoft.com/office/drawing/2015/9/8/chartex" xmlns:cx2="http://schemas.microsoft.com/office/drawing/2015/10/21/chartex" xmlns:cx3="http://schemas.microsoft.com/office/drawing/2016/5/9/chartex" xmlns:cx4="http://schemas.microsoft.com/office/drawing/2016/5/10/chartex" xmlns:cx5="http://schemas.microsoft.com/office/drawing/2016/5/11/chartex" xmlns:cx6="http://schemas.microsoft.com/office/drawing/2016/5/12/chartex" xmlns:cx7="http://schemas.microsoft.com/office/drawing/2016/5/13/chartex" xmlns:cx8="http://schemas.microsoft.com/office/drawing/2016/5/14/chartex" xmlns:mc="http://schemas.openxmlformats.org/markup-compatibility/2006" xmlns:aink="http://schemas.microsoft.com/office/drawing/2016/ink" xmlns:am3d="http://schemas.microsoft.com/office/drawing/2017/model3d" xmlns:o="urn:schemas-microsoft-com:office:office" xmlns:oel="http://schemas.microsoft.com/office/2019/extlst" xmlns:r="http://schemas.openxmlformats.org/officeDocument/2006/relationships" xmlns:m="http://schemas.openxmlformats.org/officeDocument/2006/math" xmlns:v="urn:schemas-microsoft-com:vml" xmlns:wp14="http://schemas.microsoft.com/office/word/2010/wordprocessingDrawing" xmlns:wp="http://schemas.openxmlformats.org/drawingml/2006/wordprocessingDrawing" xmlns:w10="urn:schemas-microsoft-com:office:word" xmlns:w="http://schemas.openxmlformats.org/wordprocessingml/2006/main" xmlns:w14="http://schemas.microsoft.com/office/word/2010/wordml" xmlns:w15="http://schemas.microsoft.com/office/word/2012/wordml" xmlns:w16cex="http://schemas.microsoft.com/office/word/2018/wordml/cex" xmlns:w16cid="http://schemas.microsoft.com/office/word/2016/wordml/cid" xmlns:w16="http://schemas.microsoft.com/office/word/2018/wordml" xmlns:w16du="http://schemas.microsoft.com/office/word/2023/wordml/word16du" xmlns:w16sdtdh="http://schemas.microsoft.com/office/word/2020/wordml/sdtdatahash" xmlns:w16sdtfl="http://schemas.microsoft.com/office/word/2024/wordml/sdtformatlock" xmlns:w16se="http://schemas.microsoft.com/office/word/2015/wordml/symex" xmlns:wpg="http://schemas.microsoft.com/office/word/2010/wordprocessingGroup" xmlns:wpi="http://schemas.microsoft.com/office/word/2010/wordprocessingInk" xmlns:wne="http://schemas.microsoft.com/office/word/2006/wordml" xmlns:wps="http://schemas.microsoft.com/office/word/2010/wordprocessingShape" mc:Ignorable="w14 w15 w16se w16cid w16 w16cex w16sdtdh w16sdtfl w16du wp14">
   <w:body>
     <w:p>
       <w:pPr>
@@ -355,9 +355,9 @@
           <w:noProof/>
         </w:rPr>
         <w:drawing>
-          <wp:inline distT="0" distB="0" distL="0" distR="0" wp14:anchorId="099E527E" wp14:editId="6660F5F5">
-            <wp:extent cx="2126701" cy="3267075"/>
-            <wp:effectExtent l="0" t="0" r="6985" b="0"/>
+          <wp:inline distT="0" distB="0" distL="0" distR="0" wp14:anchorId="099E527E" wp14:editId="008BA346">
+            <wp:extent cx="2121655" cy="3291351"/>
+            <wp:effectExtent l="0" t="0" r="0" b="4445"/>
             <wp:docPr id="1525476440" name="Kép 1"/>
             <wp:cNvGraphicFramePr>
               <a:graphicFrameLocks xmlns:a="http://schemas.openxmlformats.org/drawingml/2006/main" noChangeAspect="1"/>
@@ -366,7 +366,7 @@
               <a:graphicData uri="http://schemas.openxmlformats.org/drawingml/2006/picture">
                 <pic:pic xmlns:pic="http://schemas.openxmlformats.org/drawingml/2006/picture">
                   <pic:nvPicPr>
-                    <pic:cNvPr id="0" name="Picture 2"/>
+                    <pic:cNvPr id="1525476440" name="Kép 1"/>
                     <pic:cNvPicPr>
                       <a:picLocks noChangeAspect="1" noChangeArrowheads="1"/>
                     </pic:cNvPicPr>
@@ -379,7 +379,6 @@
                         </a:ext>
                       </a:extLst>
                     </a:blip>
-                    <a:srcRect/>
                     <a:stretch>
                       <a:fillRect/>
                     </a:stretch>
@@ -387,7 +386,7 @@
                   <pic:spPr bwMode="auto">
                     <a:xfrm>
                       <a:off x="0" y="0"/>
-                      <a:ext cx="2142504" cy="3291351"/>
+                      <a:ext cx="2121655" cy="3291351"/>
                     </a:xfrm>
                     <a:prstGeom prst="rect">
                       <a:avLst/>
@@ -616,9 +615,9 @@
           <w:noProof/>
         </w:rPr>
         <w:drawing>
-          <wp:inline distT="0" distB="0" distL="0" distR="0" wp14:anchorId="3A9A0EE7" wp14:editId="7D94FFDA">
-            <wp:extent cx="2238375" cy="3959708"/>
-            <wp:effectExtent l="0" t="0" r="0" b="3175"/>
+          <wp:inline distT="0" distB="0" distL="0" distR="0" wp14:anchorId="3A9A0EE7" wp14:editId="0327B311">
+            <wp:extent cx="2244209" cy="3414175"/>
+            <wp:effectExtent l="0" t="0" r="3810" b="0"/>
             <wp:docPr id="1454068945" name="Kép 1"/>
             <wp:cNvGraphicFramePr>
               <a:graphicFrameLocks xmlns:a="http://schemas.openxmlformats.org/drawingml/2006/main" noChangeAspect="1"/>
@@ -627,11 +626,17 @@
               <a:graphicData uri="http://schemas.openxmlformats.org/drawingml/2006/picture">
                 <pic:pic xmlns:pic="http://schemas.openxmlformats.org/drawingml/2006/picture">
                   <pic:nvPicPr>
-                    <pic:cNvPr id="1454068945" name=""/>
+                    <pic:cNvPr id="1454068945" name="Kép 1"/>
                     <pic:cNvPicPr/>
                   </pic:nvPicPr>
                   <pic:blipFill>
-                    <a:blip r:embed="rId8"/>
+                    <a:blip r:embed="rId8">
+                      <a:extLst>
+                        <a:ext uri="{28A0092B-C50C-407E-A947-70E740481C1C}">
+                          <a14:useLocalDpi xmlns:a14="http://schemas.microsoft.com/office/drawing/2010/main" val="0"/>
+                        </a:ext>
+                      </a:extLst>
+                    </a:blip>
                     <a:stretch>
                       <a:fillRect/>
                     </a:stretch>
@@ -639,7 +644,7 @@
                   <pic:spPr>
                     <a:xfrm>
                       <a:off x="0" y="0"/>
-                      <a:ext cx="2244209" cy="3970028"/>
+                      <a:ext cx="2244209" cy="3414175"/>
                     </a:xfrm>
                     <a:prstGeom prst="rect">
                       <a:avLst/>
@@ -665,10 +670,13 @@
         <w:jc w:val="center"/>
       </w:pPr>
       <w:r>
+        <w:rPr>
+          <w:noProof/>
+        </w:rPr>
         <w:drawing>
-          <wp:inline distT="0" distB="0" distL="0" distR="0" wp14:anchorId="5F730163" wp14:editId="7D97A1E3">
-            <wp:extent cx="5556250" cy="3462655"/>
-            <wp:effectExtent l="0" t="0" r="6350" b="4445"/>
+          <wp:inline distT="0" distB="0" distL="0" distR="0" wp14:anchorId="5F730163" wp14:editId="7AE9C06F">
+            <wp:extent cx="5588387" cy="3430429"/>
+            <wp:effectExtent l="0" t="0" r="0" b="0"/>
             <wp:docPr id="748779683" name="Kép 1"/>
             <wp:cNvGraphicFramePr>
               <a:graphicFrameLocks xmlns:a="http://schemas.openxmlformats.org/drawingml/2006/main" noChangeAspect="1"/>
@@ -695,7 +703,7 @@
                   <pic:spPr>
                     <a:xfrm>
                       <a:off x="0" y="0"/>
-                      <a:ext cx="5588387" cy="3482683"/>
+                      <a:ext cx="5588387" cy="3430429"/>
                     </a:xfrm>
                     <a:prstGeom prst="rect">
                       <a:avLst/>
@@ -840,10 +848,13 @@
         <w:br w:type="column"/>
       </w:r>
       <w:r>
+        <w:rPr>
+          <w:noProof/>
+        </w:rPr>
         <w:drawing>
-          <wp:inline distT="0" distB="0" distL="0" distR="0" wp14:anchorId="104336FF" wp14:editId="7AAF1786">
-            <wp:extent cx="2349246" cy="2959100"/>
-            <wp:effectExtent l="0" t="0" r="0" b="0"/>
+          <wp:inline distT="0" distB="0" distL="0" distR="0" wp14:anchorId="104336FF" wp14:editId="571B424D">
+            <wp:extent cx="2076093" cy="2943225"/>
+            <wp:effectExtent l="0" t="0" r="635" b="0"/>
             <wp:docPr id="1048541838" name="Kép 1"/>
             <wp:cNvGraphicFramePr>
               <a:graphicFrameLocks xmlns:a="http://schemas.openxmlformats.org/drawingml/2006/main" noChangeAspect="1"/>
@@ -852,11 +863,17 @@
               <a:graphicData uri="http://schemas.openxmlformats.org/drawingml/2006/picture">
                 <pic:pic xmlns:pic="http://schemas.openxmlformats.org/drawingml/2006/picture">
                   <pic:nvPicPr>
-                    <pic:cNvPr id="1048541838" name=""/>
+                    <pic:cNvPr id="1048541838" name="Kép 1"/>
                     <pic:cNvPicPr/>
                   </pic:nvPicPr>
                   <pic:blipFill>
-                    <a:blip r:embed="rId10"/>
+                    <a:blip r:embed="rId10">
+                      <a:extLst>
+                        <a:ext uri="{28A0092B-C50C-407E-A947-70E740481C1C}">
+                          <a14:useLocalDpi xmlns:a14="http://schemas.microsoft.com/office/drawing/2010/main" val="0"/>
+                        </a:ext>
+                      </a:extLst>
+                    </a:blip>
                     <a:stretch>
                       <a:fillRect/>
                     </a:stretch>
@@ -864,7 +881,7 @@
                   <pic:spPr>
                     <a:xfrm>
                       <a:off x="0" y="0"/>
-                      <a:ext cx="2386080" cy="3005496"/>
+                      <a:ext cx="2079534" cy="2948104"/>
                     </a:xfrm>
                     <a:prstGeom prst="rect">
                       <a:avLst/>
@@ -902,10 +919,13 @@
         <w:jc w:val="center"/>
       </w:pPr>
       <w:r>
+        <w:rPr>
+          <w:noProof/>
+        </w:rPr>
         <w:drawing>
-          <wp:inline distT="0" distB="0" distL="0" distR="0" wp14:anchorId="27A94DF0" wp14:editId="250F789C">
-            <wp:extent cx="5760720" cy="1991995"/>
-            <wp:effectExtent l="0" t="0" r="0" b="8255"/>
+          <wp:inline distT="0" distB="0" distL="0" distR="0" wp14:anchorId="27A94DF0" wp14:editId="7EB0A10D">
+            <wp:extent cx="5561808" cy="1991995"/>
+            <wp:effectExtent l="0" t="0" r="1270" b="8255"/>
             <wp:docPr id="1738185120" name="Kép 1"/>
             <wp:cNvGraphicFramePr>
               <a:graphicFrameLocks xmlns:a="http://schemas.openxmlformats.org/drawingml/2006/main" noChangeAspect="1"/>
@@ -914,11 +934,17 @@
               <a:graphicData uri="http://schemas.openxmlformats.org/drawingml/2006/picture">
                 <pic:pic xmlns:pic="http://schemas.openxmlformats.org/drawingml/2006/picture">
                   <pic:nvPicPr>
-                    <pic:cNvPr id="1738185120" name=""/>
+                    <pic:cNvPr id="1738185120" name="Kép 1"/>
                     <pic:cNvPicPr/>
                   </pic:nvPicPr>
                   <pic:blipFill>
-                    <a:blip r:embed="rId11"/>
+                    <a:blip r:embed="rId11">
+                      <a:extLst>
+                        <a:ext uri="{28A0092B-C50C-407E-A947-70E740481C1C}">
+                          <a14:useLocalDpi xmlns:a14="http://schemas.microsoft.com/office/drawing/2010/main" val="0"/>
+                        </a:ext>
+                      </a:extLst>
+                    </a:blip>
                     <a:stretch>
                       <a:fillRect/>
                     </a:stretch>
@@ -926,7 +952,7 @@
                   <pic:spPr>
                     <a:xfrm>
                       <a:off x="0" y="0"/>
-                      <a:ext cx="5760720" cy="1991995"/>
+                      <a:ext cx="5561808" cy="1991995"/>
                     </a:xfrm>
                     <a:prstGeom prst="rect">
                       <a:avLst/>

</xml_diff>

<commit_message>
Document continued with database
</commit_message>
<xml_diff>
--- a/Documents/Vizsgaremek dokumentáció.docx
+++ b/Documents/Vizsgaremek dokumentáció.docx
@@ -191,7 +191,7 @@
                     <pic:cNvPicPr/>
                   </pic:nvPicPr>
                   <pic:blipFill>
-                    <a:blip r:embed="rId4"/>
+                    <a:blip r:embed="rId5"/>
                     <a:stretch>
                       <a:fillRect/>
                     </a:stretch>
@@ -271,7 +271,7 @@
                     <pic:cNvPicPr/>
                   </pic:nvPicPr>
                   <pic:blipFill>
-                    <a:blip r:embed="rId5"/>
+                    <a:blip r:embed="rId6"/>
                     <a:stretch>
                       <a:fillRect/>
                     </a:stretch>
@@ -372,7 +372,7 @@
                     </pic:cNvPicPr>
                   </pic:nvPicPr>
                   <pic:blipFill>
-                    <a:blip r:embed="rId6">
+                    <a:blip r:embed="rId7">
                       <a:extLst>
                         <a:ext uri="{28A0092B-C50C-407E-A947-70E740481C1C}">
                           <a14:useLocalDpi xmlns:a14="http://schemas.microsoft.com/office/drawing/2010/main" val="0"/>
@@ -451,7 +451,7 @@
                     </pic:cNvPicPr>
                   </pic:nvPicPr>
                   <pic:blipFill>
-                    <a:blip r:embed="rId7">
+                    <a:blip r:embed="rId8">
                       <a:extLst>
                         <a:ext uri="{28A0092B-C50C-407E-A947-70E740481C1C}">
                           <a14:useLocalDpi xmlns:a14="http://schemas.microsoft.com/office/drawing/2010/main" val="0"/>
@@ -630,7 +630,7 @@
                     <pic:cNvPicPr/>
                   </pic:nvPicPr>
                   <pic:blipFill>
-                    <a:blip r:embed="rId8">
+                    <a:blip r:embed="rId9">
                       <a:extLst>
                         <a:ext uri="{28A0092B-C50C-407E-A947-70E740481C1C}">
                           <a14:useLocalDpi xmlns:a14="http://schemas.microsoft.com/office/drawing/2010/main" val="0"/>
@@ -689,7 +689,7 @@
                     <pic:cNvPicPr/>
                   </pic:nvPicPr>
                   <pic:blipFill>
-                    <a:blip r:embed="rId9">
+                    <a:blip r:embed="rId10">
                       <a:extLst>
                         <a:ext uri="{28A0092B-C50C-407E-A947-70E740481C1C}">
                           <a14:useLocalDpi xmlns:a14="http://schemas.microsoft.com/office/drawing/2010/main" val="0"/>
@@ -867,7 +867,7 @@
                     <pic:cNvPicPr/>
                   </pic:nvPicPr>
                   <pic:blipFill>
-                    <a:blip r:embed="rId10">
+                    <a:blip r:embed="rId11">
                       <a:extLst>
                         <a:ext uri="{28A0092B-C50C-407E-A947-70E740481C1C}">
                           <a14:useLocalDpi xmlns:a14="http://schemas.microsoft.com/office/drawing/2010/main" val="0"/>
@@ -938,7 +938,7 @@
                     <pic:cNvPicPr/>
                   </pic:nvPicPr>
                   <pic:blipFill>
-                    <a:blip r:embed="rId11">
+                    <a:blip r:embed="rId12">
                       <a:extLst>
                         <a:ext uri="{28A0092B-C50C-407E-A947-70E740481C1C}">
                           <a14:useLocalDpi xmlns:a14="http://schemas.microsoft.com/office/drawing/2010/main" val="0"/>
@@ -966,9 +966,910 @@
       </w:r>
     </w:p>
     <w:p>
+      <w:pPr>
+        <w:pStyle w:val="Cmsor1"/>
+      </w:pPr>
       <w:r>
         <w:br w:type="page"/>
       </w:r>
+      <w:r>
+        <w:lastRenderedPageBreak/>
+        <w:t>Az adatbázis</w:t>
+      </w:r>
+    </w:p>
+    <w:p>
+      <w:pPr>
+        <w:pStyle w:val="Szakdolozatbekezdsek"/>
+      </w:pPr>
+      <w:r>
+        <w:t>Az előbb bemutatott webalkalmazás adatait egy adatbázisban tároljuk. Jelen esetben ezt a „Wampserver” rendszer segítségével hoztuk létre. Az adatbázis hét táblát tartalmaz, melyek</w:t>
+      </w:r>
+      <w:r>
+        <w:t>ben az egymással összefüggő adatokat tároljuk.</w:t>
+      </w:r>
+    </w:p>
+    <w:p>
+      <w:pPr>
+        <w:pStyle w:val="Cmsor2"/>
+      </w:pPr>
+      <w:r>
+        <w:t>Felhasználók</w:t>
+      </w:r>
+      <w:r>
+        <w:t xml:space="preserve"> tábla</w:t>
+      </w:r>
+      <w:r>
+        <w:t>:</w:t>
+      </w:r>
+    </w:p>
+    <w:p>
+      <w:pPr>
+        <w:pStyle w:val="Szakdolozatbekezdsek"/>
+      </w:pPr>
+      <w:r>
+        <w:t>Ebben, ahogyan a tábla neve is mondja, a felhasználók adatait tároljuk le. Ehhez a következő mezőket kellett létrehozni:</w:t>
+      </w:r>
+    </w:p>
+    <w:p>
+      <w:pPr>
+        <w:pStyle w:val="Szakdolozatbekezdsek"/>
+        <w:numPr>
+          <w:ilvl w:val="0"/>
+          <w:numId w:val="1"/>
+        </w:numPr>
+      </w:pPr>
+      <w:r>
+        <w:rPr>
+          <w:b/>
+          <w:bCs/>
+        </w:rPr>
+        <w:t>user_id</w:t>
+      </w:r>
+      <w:r>
+        <w:t xml:space="preserve"> – Egy int típusú változó, aki az elsődleges kulcsa a táblának és automatikusan növekszik az értéke;</w:t>
+      </w:r>
+    </w:p>
+    <w:p>
+      <w:pPr>
+        <w:pStyle w:val="Szakdolozatbekezdsek"/>
+        <w:numPr>
+          <w:ilvl w:val="0"/>
+          <w:numId w:val="1"/>
+        </w:numPr>
+      </w:pPr>
+      <w:r>
+        <w:rPr>
+          <w:b/>
+          <w:bCs/>
+        </w:rPr>
+        <w:t>user_name</w:t>
+      </w:r>
+      <w:r>
+        <w:t xml:space="preserve"> – Egy </w:t>
+      </w:r>
+      <w:r>
+        <w:t>varchar</w:t>
+      </w:r>
+      <w:r>
+        <w:t xml:space="preserve"> típusú változó. Természetesen a felhasználó nevét tartalmazza;</w:t>
+      </w:r>
+    </w:p>
+    <w:p>
+      <w:pPr>
+        <w:pStyle w:val="Szakdolozatbekezdsek"/>
+        <w:numPr>
+          <w:ilvl w:val="0"/>
+          <w:numId w:val="1"/>
+        </w:numPr>
+      </w:pPr>
+      <w:r>
+        <w:rPr>
+          <w:b/>
+          <w:bCs/>
+        </w:rPr>
+        <w:t>pass_word</w:t>
+      </w:r>
+      <w:r>
+        <w:t xml:space="preserve"> – Szintén egy </w:t>
+      </w:r>
+      <w:r>
+        <w:t>varchar</w:t>
+      </w:r>
+      <w:r>
+        <w:t xml:space="preserve"> változó. A felhasználó jelszavát tartalmazza, viszont a jelszót „hash”</w:t>
+      </w:r>
+      <w:r>
+        <w:t xml:space="preserve"> </w:t>
+      </w:r>
+      <w:r>
+        <w:t>-elve tárolja;</w:t>
+      </w:r>
+    </w:p>
+    <w:p>
+      <w:pPr>
+        <w:jc w:val="center"/>
+      </w:pPr>
+      <w:r>
+        <w:drawing>
+          <wp:inline distT="0" distB="0" distL="0" distR="0" wp14:anchorId="07BCDC95" wp14:editId="7366FFD1">
+            <wp:extent cx="2067213" cy="971686"/>
+            <wp:effectExtent l="0" t="0" r="0" b="0"/>
+            <wp:docPr id="363969393" name="Kép 1"/>
+            <wp:cNvGraphicFramePr>
+              <a:graphicFrameLocks xmlns:a="http://schemas.openxmlformats.org/drawingml/2006/main" noChangeAspect="1"/>
+            </wp:cNvGraphicFramePr>
+            <a:graphic xmlns:a="http://schemas.openxmlformats.org/drawingml/2006/main">
+              <a:graphicData uri="http://schemas.openxmlformats.org/drawingml/2006/picture">
+                <pic:pic xmlns:pic="http://schemas.openxmlformats.org/drawingml/2006/picture">
+                  <pic:nvPicPr>
+                    <pic:cNvPr id="363969393" name=""/>
+                    <pic:cNvPicPr/>
+                  </pic:nvPicPr>
+                  <pic:blipFill>
+                    <a:blip r:embed="rId13"/>
+                    <a:stretch>
+                      <a:fillRect/>
+                    </a:stretch>
+                  </pic:blipFill>
+                  <pic:spPr>
+                    <a:xfrm>
+                      <a:off x="0" y="0"/>
+                      <a:ext cx="2067213" cy="971686"/>
+                    </a:xfrm>
+                    <a:prstGeom prst="rect">
+                      <a:avLst/>
+                    </a:prstGeom>
+                  </pic:spPr>
+                </pic:pic>
+              </a:graphicData>
+            </a:graphic>
+          </wp:inline>
+        </w:drawing>
+      </w:r>
+    </w:p>
+    <w:p>
+      <w:pPr>
+        <w:pStyle w:val="Szakdolozatbekezdsek"/>
+      </w:pPr>
+      <w:r>
+        <w:t>A tábla tervez</w:t>
+      </w:r>
+      <w:r>
+        <w:t>ő</w:t>
+      </w:r>
+      <w:r>
+        <w:t xml:space="preserve"> nézetben látható a fenti képen, a forráskódja pedig lentebb található:</w:t>
+      </w:r>
+    </w:p>
+    <w:p>
+      <w:pPr>
+        <w:jc w:val="center"/>
+      </w:pPr>
+      <w:r>
+        <w:drawing>
+          <wp:inline distT="0" distB="0" distL="0" distR="0" wp14:anchorId="0B35B04E" wp14:editId="4DABDE6A">
+            <wp:extent cx="5760720" cy="1062355"/>
+            <wp:effectExtent l="0" t="0" r="0" b="4445"/>
+            <wp:docPr id="201986694" name="Kép 1"/>
+            <wp:cNvGraphicFramePr>
+              <a:graphicFrameLocks xmlns:a="http://schemas.openxmlformats.org/drawingml/2006/main" noChangeAspect="1"/>
+            </wp:cNvGraphicFramePr>
+            <a:graphic xmlns:a="http://schemas.openxmlformats.org/drawingml/2006/main">
+              <a:graphicData uri="http://schemas.openxmlformats.org/drawingml/2006/picture">
+                <pic:pic xmlns:pic="http://schemas.openxmlformats.org/drawingml/2006/picture">
+                  <pic:nvPicPr>
+                    <pic:cNvPr id="201986694" name=""/>
+                    <pic:cNvPicPr/>
+                  </pic:nvPicPr>
+                  <pic:blipFill>
+                    <a:blip r:embed="rId14"/>
+                    <a:stretch>
+                      <a:fillRect/>
+                    </a:stretch>
+                  </pic:blipFill>
+                  <pic:spPr>
+                    <a:xfrm>
+                      <a:off x="0" y="0"/>
+                      <a:ext cx="5760720" cy="1062355"/>
+                    </a:xfrm>
+                    <a:prstGeom prst="rect">
+                      <a:avLst/>
+                    </a:prstGeom>
+                  </pic:spPr>
+                </pic:pic>
+              </a:graphicData>
+            </a:graphic>
+          </wp:inline>
+        </w:drawing>
+      </w:r>
+    </w:p>
+    <w:p>
+      <w:r>
+        <w:br w:type="page"/>
+      </w:r>
+    </w:p>
+    <w:p>
+      <w:pPr>
+        <w:pStyle w:val="Cmsor2"/>
+      </w:pPr>
+      <w:r>
+        <w:lastRenderedPageBreak/>
+        <w:t>Fenyőfajta tábla:</w:t>
+      </w:r>
+    </w:p>
+    <w:p>
+      <w:pPr>
+        <w:pStyle w:val="Szakdolozatbekezdsek"/>
+      </w:pPr>
+      <w:r>
+        <w:t>A nagykereskedés négy fajta fenyőt használ fel, illetve ad el. Ezek tárolásához is létre lett hozva egy tábla. A táblázat adatai előre meg vannak adva, viszont a későbbi típusok hozzáadása is lehetséges lesz majd később.</w:t>
+      </w:r>
+    </w:p>
+    <w:p>
+      <w:pPr>
+        <w:pStyle w:val="Szakdolozatbekezdsek"/>
+      </w:pPr>
+      <w:r>
+        <w:t>A mezők, amiket a tábla tartalmaz:</w:t>
+      </w:r>
+    </w:p>
+    <w:p>
+      <w:pPr>
+        <w:pStyle w:val="Szakdolozatbekezdsek"/>
+        <w:numPr>
+          <w:ilvl w:val="0"/>
+          <w:numId w:val="2"/>
+        </w:numPr>
+      </w:pPr>
+      <w:r>
+        <w:rPr>
+          <w:b/>
+          <w:bCs/>
+        </w:rPr>
+        <w:t>pine_id:</w:t>
+      </w:r>
+      <w:r>
+        <w:t xml:space="preserve"> int típusú, elsődleges kulcsa a táblának, mely automatikusan növekszik;</w:t>
+      </w:r>
+    </w:p>
+    <w:p>
+      <w:pPr>
+        <w:pStyle w:val="Szakdolozatbekezdsek"/>
+        <w:numPr>
+          <w:ilvl w:val="0"/>
+          <w:numId w:val="2"/>
+        </w:numPr>
+      </w:pPr>
+      <w:r>
+        <w:rPr>
+          <w:b/>
+          <w:bCs/>
+        </w:rPr>
+        <w:t>pine_type:</w:t>
+      </w:r>
+      <w:r>
+        <w:t xml:space="preserve"> varchar típusú mező, mely a fenyőfajta nevét tartalmazza;</w:t>
+      </w:r>
+    </w:p>
+    <w:p>
+      <w:pPr>
+        <w:jc w:val="center"/>
+      </w:pPr>
+      <w:r>
+        <w:drawing>
+          <wp:inline distT="0" distB="0" distL="0" distR="0" wp14:anchorId="2118251D" wp14:editId="36547D9C">
+            <wp:extent cx="2267266" cy="752580"/>
+            <wp:effectExtent l="0" t="0" r="0" b="9525"/>
+            <wp:docPr id="2001856145" name="Kép 1"/>
+            <wp:cNvGraphicFramePr>
+              <a:graphicFrameLocks xmlns:a="http://schemas.openxmlformats.org/drawingml/2006/main" noChangeAspect="1"/>
+            </wp:cNvGraphicFramePr>
+            <a:graphic xmlns:a="http://schemas.openxmlformats.org/drawingml/2006/main">
+              <a:graphicData uri="http://schemas.openxmlformats.org/drawingml/2006/picture">
+                <pic:pic xmlns:pic="http://schemas.openxmlformats.org/drawingml/2006/picture">
+                  <pic:nvPicPr>
+                    <pic:cNvPr id="2001856145" name=""/>
+                    <pic:cNvPicPr/>
+                  </pic:nvPicPr>
+                  <pic:blipFill>
+                    <a:blip r:embed="rId15"/>
+                    <a:stretch>
+                      <a:fillRect/>
+                    </a:stretch>
+                  </pic:blipFill>
+                  <pic:spPr>
+                    <a:xfrm>
+                      <a:off x="0" y="0"/>
+                      <a:ext cx="2267266" cy="752580"/>
+                    </a:xfrm>
+                    <a:prstGeom prst="rect">
+                      <a:avLst/>
+                    </a:prstGeom>
+                  </pic:spPr>
+                </pic:pic>
+              </a:graphicData>
+            </a:graphic>
+          </wp:inline>
+        </w:drawing>
+      </w:r>
+    </w:p>
+    <w:p>
+      <w:pPr>
+        <w:pStyle w:val="Szakdolozatbekezdsek"/>
+      </w:pPr>
+      <w:r>
+        <w:t>A tábla tervező nézetben. Ennek a táblának az adatait még két másik tábla is fogja használni, ahol majd az itteni elsődleges kulcs a másik táblában másodlagos kulcsként szerepel majd. Lentebb a tábla létrehozásának és az adatok beillesztésének forráskódja látható:</w:t>
+      </w:r>
+    </w:p>
+    <w:p>
+      <w:pPr>
+        <w:jc w:val="center"/>
+      </w:pPr>
+      <w:r>
+        <w:drawing>
+          <wp:inline distT="0" distB="0" distL="0" distR="0" wp14:anchorId="616AA649" wp14:editId="4994D196">
+            <wp:extent cx="5760720" cy="788670"/>
+            <wp:effectExtent l="0" t="0" r="0" b="0"/>
+            <wp:docPr id="1685412296" name="Kép 1"/>
+            <wp:cNvGraphicFramePr>
+              <a:graphicFrameLocks xmlns:a="http://schemas.openxmlformats.org/drawingml/2006/main" noChangeAspect="1"/>
+            </wp:cNvGraphicFramePr>
+            <a:graphic xmlns:a="http://schemas.openxmlformats.org/drawingml/2006/main">
+              <a:graphicData uri="http://schemas.openxmlformats.org/drawingml/2006/picture">
+                <pic:pic xmlns:pic="http://schemas.openxmlformats.org/drawingml/2006/picture">
+                  <pic:nvPicPr>
+                    <pic:cNvPr id="1685412296" name=""/>
+                    <pic:cNvPicPr/>
+                  </pic:nvPicPr>
+                  <pic:blipFill>
+                    <a:blip r:embed="rId16"/>
+                    <a:stretch>
+                      <a:fillRect/>
+                    </a:stretch>
+                  </pic:blipFill>
+                  <pic:spPr>
+                    <a:xfrm>
+                      <a:off x="0" y="0"/>
+                      <a:ext cx="5760720" cy="788670"/>
+                    </a:xfrm>
+                    <a:prstGeom prst="rect">
+                      <a:avLst/>
+                    </a:prstGeom>
+                  </pic:spPr>
+                </pic:pic>
+              </a:graphicData>
+            </a:graphic>
+          </wp:inline>
+        </w:drawing>
+      </w:r>
+    </w:p>
+    <w:p>
+      <w:pPr>
+        <w:jc w:val="center"/>
+      </w:pPr>
+      <w:r>
+        <w:drawing>
+          <wp:inline distT="0" distB="0" distL="0" distR="0" wp14:anchorId="7398D1C1" wp14:editId="60D73220">
+            <wp:extent cx="4000500" cy="886290"/>
+            <wp:effectExtent l="0" t="0" r="0" b="9525"/>
+            <wp:docPr id="1823184638" name="Kép 1"/>
+            <wp:cNvGraphicFramePr>
+              <a:graphicFrameLocks xmlns:a="http://schemas.openxmlformats.org/drawingml/2006/main" noChangeAspect="1"/>
+            </wp:cNvGraphicFramePr>
+            <a:graphic xmlns:a="http://schemas.openxmlformats.org/drawingml/2006/main">
+              <a:graphicData uri="http://schemas.openxmlformats.org/drawingml/2006/picture">
+                <pic:pic xmlns:pic="http://schemas.openxmlformats.org/drawingml/2006/picture">
+                  <pic:nvPicPr>
+                    <pic:cNvPr id="1823184638" name=""/>
+                    <pic:cNvPicPr/>
+                  </pic:nvPicPr>
+                  <pic:blipFill>
+                    <a:blip r:embed="rId17"/>
+                    <a:stretch>
+                      <a:fillRect/>
+                    </a:stretch>
+                  </pic:blipFill>
+                  <pic:spPr>
+                    <a:xfrm>
+                      <a:off x="0" y="0"/>
+                      <a:ext cx="4048497" cy="896924"/>
+                    </a:xfrm>
+                    <a:prstGeom prst="rect">
+                      <a:avLst/>
+                    </a:prstGeom>
+                  </pic:spPr>
+                </pic:pic>
+              </a:graphicData>
+            </a:graphic>
+          </wp:inline>
+        </w:drawing>
+      </w:r>
+    </w:p>
+    <w:p>
+      <w:r>
+        <w:br w:type="page"/>
+      </w:r>
+    </w:p>
+    <w:p>
+      <w:pPr>
+        <w:pStyle w:val="Cmsor2"/>
+      </w:pPr>
+      <w:r>
+        <w:lastRenderedPageBreak/>
+        <w:t>Fenyőalap típus tábla:</w:t>
+      </w:r>
+    </w:p>
+    <w:p>
+      <w:pPr>
+        <w:pStyle w:val="Szakdolozatbekezdsek"/>
+      </w:pPr>
+      <w:r>
+        <w:t>Az előző táblánál már említ</w:t>
+      </w:r>
+      <w:r>
+        <w:t>ve lett</w:t>
+      </w:r>
+      <w:r>
+        <w:t xml:space="preserve">, hogy négyfajta fenyőt használnak fel. Mind a négy típusból </w:t>
+      </w:r>
+      <w:r>
+        <w:t>érkeznek bálák. Ezekből kötnek koszorúalapot, valamint el is adnak belőle. Viszont ez a tábla csak a koszorúalaphoz kötődik oly módon, hogy a koszorúalapból a nagykereskedés csak kettő félét köt. Ezen adatok vannak a táblában az előzőhöz hasonlóan beégetve. Egyébként a könnyebb adatbevitel érdekében lett ez létrehozva.</w:t>
+      </w:r>
+    </w:p>
+    <w:p>
+      <w:pPr>
+        <w:pStyle w:val="Szakdolozatbekezdsek"/>
+      </w:pPr>
+      <w:r>
+        <w:t>A tábla mezői:</w:t>
+      </w:r>
+    </w:p>
+    <w:p>
+      <w:pPr>
+        <w:pStyle w:val="Szakdolozatbekezdsek"/>
+        <w:numPr>
+          <w:ilvl w:val="0"/>
+          <w:numId w:val="3"/>
+        </w:numPr>
+      </w:pPr>
+      <w:r>
+        <w:rPr>
+          <w:b/>
+          <w:bCs/>
+        </w:rPr>
+        <w:t>base_id</w:t>
+      </w:r>
+      <w:r>
+        <w:t>: int típusú, a tábla elsődleges kulcsa, ami automatikusan növekszik;</w:t>
+      </w:r>
+    </w:p>
+    <w:p>
+      <w:pPr>
+        <w:pStyle w:val="Szakdolozatbekezdsek"/>
+        <w:numPr>
+          <w:ilvl w:val="0"/>
+          <w:numId w:val="3"/>
+        </w:numPr>
+      </w:pPr>
+      <w:r>
+        <w:rPr>
+          <w:b/>
+          <w:bCs/>
+        </w:rPr>
+        <w:t>base_type</w:t>
+      </w:r>
+      <w:r>
+        <w:t>: varchar típusú mező, mely az alap típusát tartalmazza;</w:t>
+      </w:r>
+    </w:p>
+    <w:p>
+      <w:pPr>
+        <w:jc w:val="center"/>
+      </w:pPr>
+      <w:r>
+        <w:drawing>
+          <wp:inline distT="0" distB="0" distL="0" distR="0" wp14:anchorId="43928429" wp14:editId="66E4EC96">
+            <wp:extent cx="2476846" cy="724001"/>
+            <wp:effectExtent l="0" t="0" r="0" b="0"/>
+            <wp:docPr id="700236216" name="Kép 1"/>
+            <wp:cNvGraphicFramePr>
+              <a:graphicFrameLocks xmlns:a="http://schemas.openxmlformats.org/drawingml/2006/main" noChangeAspect="1"/>
+            </wp:cNvGraphicFramePr>
+            <a:graphic xmlns:a="http://schemas.openxmlformats.org/drawingml/2006/main">
+              <a:graphicData uri="http://schemas.openxmlformats.org/drawingml/2006/picture">
+                <pic:pic xmlns:pic="http://schemas.openxmlformats.org/drawingml/2006/picture">
+                  <pic:nvPicPr>
+                    <pic:cNvPr id="700236216" name=""/>
+                    <pic:cNvPicPr/>
+                  </pic:nvPicPr>
+                  <pic:blipFill>
+                    <a:blip r:embed="rId18"/>
+                    <a:stretch>
+                      <a:fillRect/>
+                    </a:stretch>
+                  </pic:blipFill>
+                  <pic:spPr>
+                    <a:xfrm>
+                      <a:off x="0" y="0"/>
+                      <a:ext cx="2476846" cy="724001"/>
+                    </a:xfrm>
+                    <a:prstGeom prst="rect">
+                      <a:avLst/>
+                    </a:prstGeom>
+                  </pic:spPr>
+                </pic:pic>
+              </a:graphicData>
+            </a:graphic>
+          </wp:inline>
+        </w:drawing>
+      </w:r>
+    </w:p>
+    <w:p>
+      <w:pPr>
+        <w:pStyle w:val="Szakdolozatbekezdsek"/>
+      </w:pPr>
+      <w:r>
+        <w:t xml:space="preserve">Tervező nézetben a tábla. Ennek a táblának egy másik tábla fogja használni az adatait. Természetesen ott másodlagos kulcsként szerepel </w:t>
+      </w:r>
+      <w:r>
+        <w:t>az itteni elsődleges kulcs. Lentebb a tábla létrehozásának forráskódja -, és az adatok beégetéséhez szükséges forráskód látható.</w:t>
+      </w:r>
+    </w:p>
+    <w:p>
+      <w:pPr>
+        <w:jc w:val="center"/>
+      </w:pPr>
+      <w:r>
+        <w:drawing>
+          <wp:inline distT="0" distB="0" distL="0" distR="0" wp14:anchorId="03C75B17" wp14:editId="7467C520">
+            <wp:extent cx="5760720" cy="806450"/>
+            <wp:effectExtent l="0" t="0" r="0" b="0"/>
+            <wp:docPr id="1690431229" name="Kép 1"/>
+            <wp:cNvGraphicFramePr>
+              <a:graphicFrameLocks xmlns:a="http://schemas.openxmlformats.org/drawingml/2006/main" noChangeAspect="1"/>
+            </wp:cNvGraphicFramePr>
+            <a:graphic xmlns:a="http://schemas.openxmlformats.org/drawingml/2006/main">
+              <a:graphicData uri="http://schemas.openxmlformats.org/drawingml/2006/picture">
+                <pic:pic xmlns:pic="http://schemas.openxmlformats.org/drawingml/2006/picture">
+                  <pic:nvPicPr>
+                    <pic:cNvPr id="1690431229" name=""/>
+                    <pic:cNvPicPr/>
+                  </pic:nvPicPr>
+                  <pic:blipFill>
+                    <a:blip r:embed="rId19"/>
+                    <a:stretch>
+                      <a:fillRect/>
+                    </a:stretch>
+                  </pic:blipFill>
+                  <pic:spPr>
+                    <a:xfrm>
+                      <a:off x="0" y="0"/>
+                      <a:ext cx="5760720" cy="806450"/>
+                    </a:xfrm>
+                    <a:prstGeom prst="rect">
+                      <a:avLst/>
+                    </a:prstGeom>
+                  </pic:spPr>
+                </pic:pic>
+              </a:graphicData>
+            </a:graphic>
+          </wp:inline>
+        </w:drawing>
+      </w:r>
+    </w:p>
+    <w:p>
+      <w:pPr>
+        <w:jc w:val="center"/>
+      </w:pPr>
+      <w:r>
+        <w:drawing>
+          <wp:inline distT="0" distB="0" distL="0" distR="0" wp14:anchorId="43ABAF72" wp14:editId="04D70B29">
+            <wp:extent cx="4095750" cy="448096"/>
+            <wp:effectExtent l="0" t="0" r="0" b="9525"/>
+            <wp:docPr id="1948630843" name="Kép 1"/>
+            <wp:cNvGraphicFramePr>
+              <a:graphicFrameLocks xmlns:a="http://schemas.openxmlformats.org/drawingml/2006/main" noChangeAspect="1"/>
+            </wp:cNvGraphicFramePr>
+            <a:graphic xmlns:a="http://schemas.openxmlformats.org/drawingml/2006/main">
+              <a:graphicData uri="http://schemas.openxmlformats.org/drawingml/2006/picture">
+                <pic:pic xmlns:pic="http://schemas.openxmlformats.org/drawingml/2006/picture">
+                  <pic:nvPicPr>
+                    <pic:cNvPr id="1948630843" name=""/>
+                    <pic:cNvPicPr/>
+                  </pic:nvPicPr>
+                  <pic:blipFill>
+                    <a:blip r:embed="rId20"/>
+                    <a:stretch>
+                      <a:fillRect/>
+                    </a:stretch>
+                  </pic:blipFill>
+                  <pic:spPr>
+                    <a:xfrm>
+                      <a:off x="0" y="0"/>
+                      <a:ext cx="4180186" cy="457334"/>
+                    </a:xfrm>
+                    <a:prstGeom prst="rect">
+                      <a:avLst/>
+                    </a:prstGeom>
+                  </pic:spPr>
+                </pic:pic>
+              </a:graphicData>
+            </a:graphic>
+          </wp:inline>
+        </w:drawing>
+      </w:r>
+    </w:p>
+    <w:p>
+      <w:r>
+        <w:br w:type="page"/>
+      </w:r>
+    </w:p>
+    <w:p>
+      <w:pPr>
+        <w:pStyle w:val="Cmsor2"/>
+      </w:pPr>
+      <w:r>
+        <w:lastRenderedPageBreak/>
+        <w:t>Fenyőbála állapot tábla:</w:t>
+      </w:r>
+    </w:p>
+    <w:p>
+      <w:pPr>
+        <w:pStyle w:val="Szakdolozatbekezdsek"/>
+      </w:pPr>
+      <w:r>
+        <w:t xml:space="preserve">A nagykereskedés által rendelt fenyőbálákat többféle módon kezelik. A tábla ezen adatokat tartalmazza. </w:t>
+      </w:r>
+      <w:r>
+        <w:t xml:space="preserve">Rendelés után </w:t>
+      </w:r>
+      <w:r>
+        <w:rPr>
+          <w:b/>
+          <w:bCs/>
+        </w:rPr>
+        <w:t>érkezik</w:t>
+      </w:r>
+      <w:r>
+        <w:rPr>
+          <w:b/>
+          <w:bCs/>
+        </w:rPr>
+        <w:t>,</w:t>
+      </w:r>
+      <w:r>
+        <w:t xml:space="preserve"> van olyan, amit </w:t>
+      </w:r>
+      <w:r>
+        <w:rPr>
+          <w:b/>
+          <w:bCs/>
+        </w:rPr>
+        <w:t>lekötnek</w:t>
+      </w:r>
+      <w:r>
+        <w:t xml:space="preserve">, amit </w:t>
+      </w:r>
+      <w:r>
+        <w:rPr>
+          <w:b/>
+          <w:bCs/>
+        </w:rPr>
+        <w:t>eladnak</w:t>
+      </w:r>
+      <w:r>
+        <w:t xml:space="preserve">, amit </w:t>
+      </w:r>
+      <w:r>
+        <w:rPr>
+          <w:b/>
+          <w:bCs/>
+        </w:rPr>
+        <w:t>kiszállítanak</w:t>
+      </w:r>
+      <w:r>
+        <w:t xml:space="preserve">, esetleg valakinek </w:t>
+      </w:r>
+      <w:r>
+        <w:rPr>
+          <w:b/>
+          <w:bCs/>
+        </w:rPr>
+        <w:t>eltesz</w:t>
+      </w:r>
+      <w:r>
+        <w:rPr>
+          <w:b/>
+          <w:bCs/>
+        </w:rPr>
+        <w:t xml:space="preserve">nek. </w:t>
+      </w:r>
+      <w:r>
+        <w:t>Ezeket az állapotokat tartalmazza a tábla az alábbiak szerint:</w:t>
+      </w:r>
+    </w:p>
+    <w:p>
+      <w:pPr>
+        <w:pStyle w:val="Szakdolozatbekezdsek"/>
+        <w:numPr>
+          <w:ilvl w:val="0"/>
+          <w:numId w:val="4"/>
+        </w:numPr>
+      </w:pPr>
+      <w:proofErr w:type="spellStart"/>
+      <w:r>
+        <w:rPr>
+          <w:b/>
+          <w:bCs/>
+        </w:rPr>
+        <w:t>batch_state_id</w:t>
+      </w:r>
+      <w:proofErr w:type="spellEnd"/>
+      <w:r>
+        <w:t>: int típusú elsődleges kulcsa a táblának, automatikusan növekszik;</w:t>
+      </w:r>
+    </w:p>
+    <w:p>
+      <w:pPr>
+        <w:pStyle w:val="Szakdolozatbekezdsek"/>
+        <w:numPr>
+          <w:ilvl w:val="0"/>
+          <w:numId w:val="4"/>
+        </w:numPr>
+      </w:pPr>
+      <w:proofErr w:type="spellStart"/>
+      <w:r>
+        <w:rPr>
+          <w:b/>
+          <w:bCs/>
+        </w:rPr>
+        <w:t>batch_state</w:t>
+      </w:r>
+      <w:proofErr w:type="spellEnd"/>
+      <w:r>
+        <w:t>: varchar típusú, az állapot szöveges definíciója;</w:t>
+      </w:r>
+    </w:p>
+    <w:p>
+      <w:pPr>
+        <w:jc w:val="center"/>
+      </w:pPr>
+      <w:r>
+        <w:drawing>
+          <wp:inline distT="0" distB="0" distL="0" distR="0" wp14:anchorId="45459AB1" wp14:editId="1A4C4C73">
+            <wp:extent cx="2572109" cy="724001"/>
+            <wp:effectExtent l="0" t="0" r="0" b="0"/>
+            <wp:docPr id="486874691" name="Kép 1"/>
+            <wp:cNvGraphicFramePr>
+              <a:graphicFrameLocks xmlns:a="http://schemas.openxmlformats.org/drawingml/2006/main" noChangeAspect="1"/>
+            </wp:cNvGraphicFramePr>
+            <a:graphic xmlns:a="http://schemas.openxmlformats.org/drawingml/2006/main">
+              <a:graphicData uri="http://schemas.openxmlformats.org/drawingml/2006/picture">
+                <pic:pic xmlns:pic="http://schemas.openxmlformats.org/drawingml/2006/picture">
+                  <pic:nvPicPr>
+                    <pic:cNvPr id="486874691" name=""/>
+                    <pic:cNvPicPr/>
+                  </pic:nvPicPr>
+                  <pic:blipFill>
+                    <a:blip r:embed="rId21"/>
+                    <a:stretch>
+                      <a:fillRect/>
+                    </a:stretch>
+                  </pic:blipFill>
+                  <pic:spPr>
+                    <a:xfrm>
+                      <a:off x="0" y="0"/>
+                      <a:ext cx="2572109" cy="724001"/>
+                    </a:xfrm>
+                    <a:prstGeom prst="rect">
+                      <a:avLst/>
+                    </a:prstGeom>
+                  </pic:spPr>
+                </pic:pic>
+              </a:graphicData>
+            </a:graphic>
+          </wp:inline>
+        </w:drawing>
+      </w:r>
+    </w:p>
+    <w:p>
+      <w:pPr>
+        <w:pStyle w:val="Szakdolozatbekezdsek"/>
+      </w:pPr>
+      <w:r>
+        <w:t>A tábla tervező nézete a fenti ábra. Lentebb található a tábla létrehozásának kódja, valamint a táblázatot feltöltő forráskód is.</w:t>
+      </w:r>
+    </w:p>
+    <w:p>
+      <w:r>
+        <w:drawing>
+          <wp:inline distT="0" distB="0" distL="0" distR="0" wp14:anchorId="0E6F1C6D" wp14:editId="6E9EBE5C">
+            <wp:extent cx="5760720" cy="794385"/>
+            <wp:effectExtent l="0" t="0" r="0" b="5715"/>
+            <wp:docPr id="2075772451" name="Kép 1"/>
+            <wp:cNvGraphicFramePr>
+              <a:graphicFrameLocks xmlns:a="http://schemas.openxmlformats.org/drawingml/2006/main" noChangeAspect="1"/>
+            </wp:cNvGraphicFramePr>
+            <a:graphic xmlns:a="http://schemas.openxmlformats.org/drawingml/2006/main">
+              <a:graphicData uri="http://schemas.openxmlformats.org/drawingml/2006/picture">
+                <pic:pic xmlns:pic="http://schemas.openxmlformats.org/drawingml/2006/picture">
+                  <pic:nvPicPr>
+                    <pic:cNvPr id="2075772451" name=""/>
+                    <pic:cNvPicPr/>
+                  </pic:nvPicPr>
+                  <pic:blipFill>
+                    <a:blip r:embed="rId22"/>
+                    <a:stretch>
+                      <a:fillRect/>
+                    </a:stretch>
+                  </pic:blipFill>
+                  <pic:spPr>
+                    <a:xfrm>
+                      <a:off x="0" y="0"/>
+                      <a:ext cx="5760720" cy="794385"/>
+                    </a:xfrm>
+                    <a:prstGeom prst="rect">
+                      <a:avLst/>
+                    </a:prstGeom>
+                  </pic:spPr>
+                </pic:pic>
+              </a:graphicData>
+            </a:graphic>
+          </wp:inline>
+        </w:drawing>
+      </w:r>
+    </w:p>
+    <w:p>
+      <w:pPr>
+        <w:jc w:val="center"/>
+      </w:pPr>
+      <w:r>
+        <w:drawing>
+          <wp:inline distT="0" distB="0" distL="0" distR="0" wp14:anchorId="536A5EB9" wp14:editId="6C5F573E">
+            <wp:extent cx="4876800" cy="860643"/>
+            <wp:effectExtent l="0" t="0" r="0" b="0"/>
+            <wp:docPr id="2040932130" name="Kép 1"/>
+            <wp:cNvGraphicFramePr>
+              <a:graphicFrameLocks xmlns:a="http://schemas.openxmlformats.org/drawingml/2006/main" noChangeAspect="1"/>
+            </wp:cNvGraphicFramePr>
+            <a:graphic xmlns:a="http://schemas.openxmlformats.org/drawingml/2006/main">
+              <a:graphicData uri="http://schemas.openxmlformats.org/drawingml/2006/picture">
+                <pic:pic xmlns:pic="http://schemas.openxmlformats.org/drawingml/2006/picture">
+                  <pic:nvPicPr>
+                    <pic:cNvPr id="2040932130" name=""/>
+                    <pic:cNvPicPr/>
+                  </pic:nvPicPr>
+                  <pic:blipFill>
+                    <a:blip r:embed="rId23"/>
+                    <a:stretch>
+                      <a:fillRect/>
+                    </a:stretch>
+                  </pic:blipFill>
+                  <pic:spPr>
+                    <a:xfrm>
+                      <a:off x="0" y="0"/>
+                      <a:ext cx="4922886" cy="868776"/>
+                    </a:xfrm>
+                    <a:prstGeom prst="rect">
+                      <a:avLst/>
+                    </a:prstGeom>
+                  </pic:spPr>
+                </pic:pic>
+              </a:graphicData>
+            </a:graphic>
+          </wp:inline>
+        </w:drawing>
+      </w:r>
+    </w:p>
+    <w:p>
+      <w:r>
+        <w:br w:type="page"/>
+      </w:r>
+    </w:p>
+    <w:p>
+      <w:pPr>
+        <w:pStyle w:val="Szakdolozatbekezdsek"/>
+      </w:pPr>
     </w:p>
     <w:sectPr>
       <w:type w:val="continuous"/>
@@ -979,6 +1880,475 @@
     </w:sectPr>
   </w:body>
 </w:document>
+</file>
+
+<file path=word/numbering.xml><?xml version="1.0" encoding="utf-8"?>
+<w:numbering xmlns:wpc="http://schemas.microsoft.com/office/word/2010/wordprocessingCanvas" xmlns:cx="http://schemas.microsoft.com/office/drawing/2014/chartex" xmlns:cx1="http://schemas.microsoft.com/office/drawing/2015/9/8/chartex" xmlns:cx2="http://schemas.microsoft.com/office/drawing/2015/10/21/chartex" xmlns:cx3="http://schemas.microsoft.com/office/drawing/2016/5/9/chartex" xmlns:cx4="http://schemas.microsoft.com/office/drawing/2016/5/10/chartex" xmlns:cx5="http://schemas.microsoft.com/office/drawing/2016/5/11/chartex" xmlns:cx6="http://schemas.microsoft.com/office/drawing/2016/5/12/chartex" xmlns:cx7="http://schemas.microsoft.com/office/drawing/2016/5/13/chartex" xmlns:cx8="http://schemas.microsoft.com/office/drawing/2016/5/14/chartex" xmlns:mc="http://schemas.openxmlformats.org/markup-compatibility/2006" xmlns:aink="http://schemas.microsoft.com/office/drawing/2016/ink" xmlns:am3d="http://schemas.microsoft.com/office/drawing/2017/model3d" xmlns:o="urn:schemas-microsoft-com:office:office" xmlns:oel="http://schemas.microsoft.com/office/2019/extlst" xmlns:r="http://schemas.openxmlformats.org/officeDocument/2006/relationships" xmlns:m="http://schemas.openxmlformats.org/officeDocument/2006/math" xmlns:v="urn:schemas-microsoft-com:vml" xmlns:wp14="http://schemas.microsoft.com/office/word/2010/wordprocessingDrawing" xmlns:wp="http://schemas.openxmlformats.org/drawingml/2006/wordprocessingDrawing" xmlns:w10="urn:schemas-microsoft-com:office:word" xmlns:w="http://schemas.openxmlformats.org/wordprocessingml/2006/main" xmlns:w14="http://schemas.microsoft.com/office/word/2010/wordml" xmlns:w15="http://schemas.microsoft.com/office/word/2012/wordml" xmlns:w16cex="http://schemas.microsoft.com/office/word/2018/wordml/cex" xmlns:w16cid="http://schemas.microsoft.com/office/word/2016/wordml/cid" xmlns:w16="http://schemas.microsoft.com/office/word/2018/wordml" xmlns:w16du="http://schemas.microsoft.com/office/word/2023/wordml/word16du" xmlns:w16sdtdh="http://schemas.microsoft.com/office/word/2020/wordml/sdtdatahash" xmlns:w16sdtfl="http://schemas.microsoft.com/office/word/2024/wordml/sdtformatlock" xmlns:w16se="http://schemas.microsoft.com/office/word/2015/wordml/symex" xmlns:wpg="http://schemas.microsoft.com/office/word/2010/wordprocessingGroup" xmlns:wpi="http://schemas.microsoft.com/office/word/2010/wordprocessingInk" xmlns:wne="http://schemas.microsoft.com/office/word/2006/wordml" xmlns:wps="http://schemas.microsoft.com/office/word/2010/wordprocessingShape" mc:Ignorable="w14 w15 w16se w16cid w16 w16cex w16sdtdh w16sdtfl w16du wp14">
+  <w:abstractNum w:abstractNumId="0" w15:restartNumberingAfterBreak="0">
+    <w:nsid w:val="06F631CA"/>
+    <w:multiLevelType w:val="hybridMultilevel"/>
+    <w:tmpl w:val="9DFC4DE0"/>
+    <w:lvl w:ilvl="0" w:tplc="040E0001">
+      <w:start w:val="1"/>
+      <w:numFmt w:val="bullet"/>
+      <w:lvlText w:val=""/>
+      <w:lvlJc w:val="left"/>
+      <w:pPr>
+        <w:ind w:left="1429" w:hanging="360"/>
+      </w:pPr>
+      <w:rPr>
+        <w:rFonts w:ascii="Symbol" w:hAnsi="Symbol" w:hint="default"/>
+      </w:rPr>
+    </w:lvl>
+    <w:lvl w:ilvl="1" w:tplc="040E0003" w:tentative="1">
+      <w:start w:val="1"/>
+      <w:numFmt w:val="bullet"/>
+      <w:lvlText w:val="o"/>
+      <w:lvlJc w:val="left"/>
+      <w:pPr>
+        <w:ind w:left="2149" w:hanging="360"/>
+      </w:pPr>
+      <w:rPr>
+        <w:rFonts w:ascii="Courier New" w:hAnsi="Courier New" w:cs="Courier New" w:hint="default"/>
+      </w:rPr>
+    </w:lvl>
+    <w:lvl w:ilvl="2" w:tplc="040E0005" w:tentative="1">
+      <w:start w:val="1"/>
+      <w:numFmt w:val="bullet"/>
+      <w:lvlText w:val=""/>
+      <w:lvlJc w:val="left"/>
+      <w:pPr>
+        <w:ind w:left="2869" w:hanging="360"/>
+      </w:pPr>
+      <w:rPr>
+        <w:rFonts w:ascii="Wingdings" w:hAnsi="Wingdings" w:hint="default"/>
+      </w:rPr>
+    </w:lvl>
+    <w:lvl w:ilvl="3" w:tplc="040E0001" w:tentative="1">
+      <w:start w:val="1"/>
+      <w:numFmt w:val="bullet"/>
+      <w:lvlText w:val=""/>
+      <w:lvlJc w:val="left"/>
+      <w:pPr>
+        <w:ind w:left="3589" w:hanging="360"/>
+      </w:pPr>
+      <w:rPr>
+        <w:rFonts w:ascii="Symbol" w:hAnsi="Symbol" w:hint="default"/>
+      </w:rPr>
+    </w:lvl>
+    <w:lvl w:ilvl="4" w:tplc="040E0003" w:tentative="1">
+      <w:start w:val="1"/>
+      <w:numFmt w:val="bullet"/>
+      <w:lvlText w:val="o"/>
+      <w:lvlJc w:val="left"/>
+      <w:pPr>
+        <w:ind w:left="4309" w:hanging="360"/>
+      </w:pPr>
+      <w:rPr>
+        <w:rFonts w:ascii="Courier New" w:hAnsi="Courier New" w:cs="Courier New" w:hint="default"/>
+      </w:rPr>
+    </w:lvl>
+    <w:lvl w:ilvl="5" w:tplc="040E0005" w:tentative="1">
+      <w:start w:val="1"/>
+      <w:numFmt w:val="bullet"/>
+      <w:lvlText w:val=""/>
+      <w:lvlJc w:val="left"/>
+      <w:pPr>
+        <w:ind w:left="5029" w:hanging="360"/>
+      </w:pPr>
+      <w:rPr>
+        <w:rFonts w:ascii="Wingdings" w:hAnsi="Wingdings" w:hint="default"/>
+      </w:rPr>
+    </w:lvl>
+    <w:lvl w:ilvl="6" w:tplc="040E0001" w:tentative="1">
+      <w:start w:val="1"/>
+      <w:numFmt w:val="bullet"/>
+      <w:lvlText w:val=""/>
+      <w:lvlJc w:val="left"/>
+      <w:pPr>
+        <w:ind w:left="5749" w:hanging="360"/>
+      </w:pPr>
+      <w:rPr>
+        <w:rFonts w:ascii="Symbol" w:hAnsi="Symbol" w:hint="default"/>
+      </w:rPr>
+    </w:lvl>
+    <w:lvl w:ilvl="7" w:tplc="040E0003" w:tentative="1">
+      <w:start w:val="1"/>
+      <w:numFmt w:val="bullet"/>
+      <w:lvlText w:val="o"/>
+      <w:lvlJc w:val="left"/>
+      <w:pPr>
+        <w:ind w:left="6469" w:hanging="360"/>
+      </w:pPr>
+      <w:rPr>
+        <w:rFonts w:ascii="Courier New" w:hAnsi="Courier New" w:cs="Courier New" w:hint="default"/>
+      </w:rPr>
+    </w:lvl>
+    <w:lvl w:ilvl="8" w:tplc="040E0005" w:tentative="1">
+      <w:start w:val="1"/>
+      <w:numFmt w:val="bullet"/>
+      <w:lvlText w:val=""/>
+      <w:lvlJc w:val="left"/>
+      <w:pPr>
+        <w:ind w:left="7189" w:hanging="360"/>
+      </w:pPr>
+      <w:rPr>
+        <w:rFonts w:ascii="Wingdings" w:hAnsi="Wingdings" w:hint="default"/>
+      </w:rPr>
+    </w:lvl>
+  </w:abstractNum>
+  <w:abstractNum w:abstractNumId="1" w15:restartNumberingAfterBreak="0">
+    <w:nsid w:val="1D1430D8"/>
+    <w:multiLevelType w:val="hybridMultilevel"/>
+    <w:tmpl w:val="2AFEA61A"/>
+    <w:lvl w:ilvl="0" w:tplc="040E0001">
+      <w:start w:val="1"/>
+      <w:numFmt w:val="bullet"/>
+      <w:lvlText w:val=""/>
+      <w:lvlJc w:val="left"/>
+      <w:pPr>
+        <w:ind w:left="1429" w:hanging="360"/>
+      </w:pPr>
+      <w:rPr>
+        <w:rFonts w:ascii="Symbol" w:hAnsi="Symbol" w:hint="default"/>
+      </w:rPr>
+    </w:lvl>
+    <w:lvl w:ilvl="1" w:tplc="040E0003" w:tentative="1">
+      <w:start w:val="1"/>
+      <w:numFmt w:val="bullet"/>
+      <w:lvlText w:val="o"/>
+      <w:lvlJc w:val="left"/>
+      <w:pPr>
+        <w:ind w:left="2149" w:hanging="360"/>
+      </w:pPr>
+      <w:rPr>
+        <w:rFonts w:ascii="Courier New" w:hAnsi="Courier New" w:cs="Courier New" w:hint="default"/>
+      </w:rPr>
+    </w:lvl>
+    <w:lvl w:ilvl="2" w:tplc="040E0005" w:tentative="1">
+      <w:start w:val="1"/>
+      <w:numFmt w:val="bullet"/>
+      <w:lvlText w:val=""/>
+      <w:lvlJc w:val="left"/>
+      <w:pPr>
+        <w:ind w:left="2869" w:hanging="360"/>
+      </w:pPr>
+      <w:rPr>
+        <w:rFonts w:ascii="Wingdings" w:hAnsi="Wingdings" w:hint="default"/>
+      </w:rPr>
+    </w:lvl>
+    <w:lvl w:ilvl="3" w:tplc="040E0001" w:tentative="1">
+      <w:start w:val="1"/>
+      <w:numFmt w:val="bullet"/>
+      <w:lvlText w:val=""/>
+      <w:lvlJc w:val="left"/>
+      <w:pPr>
+        <w:ind w:left="3589" w:hanging="360"/>
+      </w:pPr>
+      <w:rPr>
+        <w:rFonts w:ascii="Symbol" w:hAnsi="Symbol" w:hint="default"/>
+      </w:rPr>
+    </w:lvl>
+    <w:lvl w:ilvl="4" w:tplc="040E0003" w:tentative="1">
+      <w:start w:val="1"/>
+      <w:numFmt w:val="bullet"/>
+      <w:lvlText w:val="o"/>
+      <w:lvlJc w:val="left"/>
+      <w:pPr>
+        <w:ind w:left="4309" w:hanging="360"/>
+      </w:pPr>
+      <w:rPr>
+        <w:rFonts w:ascii="Courier New" w:hAnsi="Courier New" w:cs="Courier New" w:hint="default"/>
+      </w:rPr>
+    </w:lvl>
+    <w:lvl w:ilvl="5" w:tplc="040E0005" w:tentative="1">
+      <w:start w:val="1"/>
+      <w:numFmt w:val="bullet"/>
+      <w:lvlText w:val=""/>
+      <w:lvlJc w:val="left"/>
+      <w:pPr>
+        <w:ind w:left="5029" w:hanging="360"/>
+      </w:pPr>
+      <w:rPr>
+        <w:rFonts w:ascii="Wingdings" w:hAnsi="Wingdings" w:hint="default"/>
+      </w:rPr>
+    </w:lvl>
+    <w:lvl w:ilvl="6" w:tplc="040E0001" w:tentative="1">
+      <w:start w:val="1"/>
+      <w:numFmt w:val="bullet"/>
+      <w:lvlText w:val=""/>
+      <w:lvlJc w:val="left"/>
+      <w:pPr>
+        <w:ind w:left="5749" w:hanging="360"/>
+      </w:pPr>
+      <w:rPr>
+        <w:rFonts w:ascii="Symbol" w:hAnsi="Symbol" w:hint="default"/>
+      </w:rPr>
+    </w:lvl>
+    <w:lvl w:ilvl="7" w:tplc="040E0003" w:tentative="1">
+      <w:start w:val="1"/>
+      <w:numFmt w:val="bullet"/>
+      <w:lvlText w:val="o"/>
+      <w:lvlJc w:val="left"/>
+      <w:pPr>
+        <w:ind w:left="6469" w:hanging="360"/>
+      </w:pPr>
+      <w:rPr>
+        <w:rFonts w:ascii="Courier New" w:hAnsi="Courier New" w:cs="Courier New" w:hint="default"/>
+      </w:rPr>
+    </w:lvl>
+    <w:lvl w:ilvl="8" w:tplc="040E0005" w:tentative="1">
+      <w:start w:val="1"/>
+      <w:numFmt w:val="bullet"/>
+      <w:lvlText w:val=""/>
+      <w:lvlJc w:val="left"/>
+      <w:pPr>
+        <w:ind w:left="7189" w:hanging="360"/>
+      </w:pPr>
+      <w:rPr>
+        <w:rFonts w:ascii="Wingdings" w:hAnsi="Wingdings" w:hint="default"/>
+      </w:rPr>
+    </w:lvl>
+  </w:abstractNum>
+  <w:abstractNum w:abstractNumId="2" w15:restartNumberingAfterBreak="0">
+    <w:nsid w:val="4BC22624"/>
+    <w:multiLevelType w:val="hybridMultilevel"/>
+    <w:tmpl w:val="B378B62E"/>
+    <w:lvl w:ilvl="0" w:tplc="040E0001">
+      <w:start w:val="1"/>
+      <w:numFmt w:val="bullet"/>
+      <w:lvlText w:val=""/>
+      <w:lvlJc w:val="left"/>
+      <w:pPr>
+        <w:ind w:left="1429" w:hanging="360"/>
+      </w:pPr>
+      <w:rPr>
+        <w:rFonts w:ascii="Symbol" w:hAnsi="Symbol" w:hint="default"/>
+      </w:rPr>
+    </w:lvl>
+    <w:lvl w:ilvl="1" w:tplc="040E0003" w:tentative="1">
+      <w:start w:val="1"/>
+      <w:numFmt w:val="bullet"/>
+      <w:lvlText w:val="o"/>
+      <w:lvlJc w:val="left"/>
+      <w:pPr>
+        <w:ind w:left="2149" w:hanging="360"/>
+      </w:pPr>
+      <w:rPr>
+        <w:rFonts w:ascii="Courier New" w:hAnsi="Courier New" w:cs="Courier New" w:hint="default"/>
+      </w:rPr>
+    </w:lvl>
+    <w:lvl w:ilvl="2" w:tplc="040E0005" w:tentative="1">
+      <w:start w:val="1"/>
+      <w:numFmt w:val="bullet"/>
+      <w:lvlText w:val=""/>
+      <w:lvlJc w:val="left"/>
+      <w:pPr>
+        <w:ind w:left="2869" w:hanging="360"/>
+      </w:pPr>
+      <w:rPr>
+        <w:rFonts w:ascii="Wingdings" w:hAnsi="Wingdings" w:hint="default"/>
+      </w:rPr>
+    </w:lvl>
+    <w:lvl w:ilvl="3" w:tplc="040E0001" w:tentative="1">
+      <w:start w:val="1"/>
+      <w:numFmt w:val="bullet"/>
+      <w:lvlText w:val=""/>
+      <w:lvlJc w:val="left"/>
+      <w:pPr>
+        <w:ind w:left="3589" w:hanging="360"/>
+      </w:pPr>
+      <w:rPr>
+        <w:rFonts w:ascii="Symbol" w:hAnsi="Symbol" w:hint="default"/>
+      </w:rPr>
+    </w:lvl>
+    <w:lvl w:ilvl="4" w:tplc="040E0003" w:tentative="1">
+      <w:start w:val="1"/>
+      <w:numFmt w:val="bullet"/>
+      <w:lvlText w:val="o"/>
+      <w:lvlJc w:val="left"/>
+      <w:pPr>
+        <w:ind w:left="4309" w:hanging="360"/>
+      </w:pPr>
+      <w:rPr>
+        <w:rFonts w:ascii="Courier New" w:hAnsi="Courier New" w:cs="Courier New" w:hint="default"/>
+      </w:rPr>
+    </w:lvl>
+    <w:lvl w:ilvl="5" w:tplc="040E0005" w:tentative="1">
+      <w:start w:val="1"/>
+      <w:numFmt w:val="bullet"/>
+      <w:lvlText w:val=""/>
+      <w:lvlJc w:val="left"/>
+      <w:pPr>
+        <w:ind w:left="5029" w:hanging="360"/>
+      </w:pPr>
+      <w:rPr>
+        <w:rFonts w:ascii="Wingdings" w:hAnsi="Wingdings" w:hint="default"/>
+      </w:rPr>
+    </w:lvl>
+    <w:lvl w:ilvl="6" w:tplc="040E0001" w:tentative="1">
+      <w:start w:val="1"/>
+      <w:numFmt w:val="bullet"/>
+      <w:lvlText w:val=""/>
+      <w:lvlJc w:val="left"/>
+      <w:pPr>
+        <w:ind w:left="5749" w:hanging="360"/>
+      </w:pPr>
+      <w:rPr>
+        <w:rFonts w:ascii="Symbol" w:hAnsi="Symbol" w:hint="default"/>
+      </w:rPr>
+    </w:lvl>
+    <w:lvl w:ilvl="7" w:tplc="040E0003" w:tentative="1">
+      <w:start w:val="1"/>
+      <w:numFmt w:val="bullet"/>
+      <w:lvlText w:val="o"/>
+      <w:lvlJc w:val="left"/>
+      <w:pPr>
+        <w:ind w:left="6469" w:hanging="360"/>
+      </w:pPr>
+      <w:rPr>
+        <w:rFonts w:ascii="Courier New" w:hAnsi="Courier New" w:cs="Courier New" w:hint="default"/>
+      </w:rPr>
+    </w:lvl>
+    <w:lvl w:ilvl="8" w:tplc="040E0005" w:tentative="1">
+      <w:start w:val="1"/>
+      <w:numFmt w:val="bullet"/>
+      <w:lvlText w:val=""/>
+      <w:lvlJc w:val="left"/>
+      <w:pPr>
+        <w:ind w:left="7189" w:hanging="360"/>
+      </w:pPr>
+      <w:rPr>
+        <w:rFonts w:ascii="Wingdings" w:hAnsi="Wingdings" w:hint="default"/>
+      </w:rPr>
+    </w:lvl>
+  </w:abstractNum>
+  <w:abstractNum w:abstractNumId="3" w15:restartNumberingAfterBreak="0">
+    <w:nsid w:val="77025383"/>
+    <w:multiLevelType w:val="hybridMultilevel"/>
+    <w:tmpl w:val="30246070"/>
+    <w:lvl w:ilvl="0" w:tplc="040E0001">
+      <w:start w:val="1"/>
+      <w:numFmt w:val="bullet"/>
+      <w:lvlText w:val=""/>
+      <w:lvlJc w:val="left"/>
+      <w:pPr>
+        <w:ind w:left="1429" w:hanging="360"/>
+      </w:pPr>
+      <w:rPr>
+        <w:rFonts w:ascii="Symbol" w:hAnsi="Symbol" w:hint="default"/>
+      </w:rPr>
+    </w:lvl>
+    <w:lvl w:ilvl="1" w:tplc="040E0003" w:tentative="1">
+      <w:start w:val="1"/>
+      <w:numFmt w:val="bullet"/>
+      <w:lvlText w:val="o"/>
+      <w:lvlJc w:val="left"/>
+      <w:pPr>
+        <w:ind w:left="2149" w:hanging="360"/>
+      </w:pPr>
+      <w:rPr>
+        <w:rFonts w:ascii="Courier New" w:hAnsi="Courier New" w:cs="Courier New" w:hint="default"/>
+      </w:rPr>
+    </w:lvl>
+    <w:lvl w:ilvl="2" w:tplc="040E0005" w:tentative="1">
+      <w:start w:val="1"/>
+      <w:numFmt w:val="bullet"/>
+      <w:lvlText w:val=""/>
+      <w:lvlJc w:val="left"/>
+      <w:pPr>
+        <w:ind w:left="2869" w:hanging="360"/>
+      </w:pPr>
+      <w:rPr>
+        <w:rFonts w:ascii="Wingdings" w:hAnsi="Wingdings" w:hint="default"/>
+      </w:rPr>
+    </w:lvl>
+    <w:lvl w:ilvl="3" w:tplc="040E0001" w:tentative="1">
+      <w:start w:val="1"/>
+      <w:numFmt w:val="bullet"/>
+      <w:lvlText w:val=""/>
+      <w:lvlJc w:val="left"/>
+      <w:pPr>
+        <w:ind w:left="3589" w:hanging="360"/>
+      </w:pPr>
+      <w:rPr>
+        <w:rFonts w:ascii="Symbol" w:hAnsi="Symbol" w:hint="default"/>
+      </w:rPr>
+    </w:lvl>
+    <w:lvl w:ilvl="4" w:tplc="040E0003" w:tentative="1">
+      <w:start w:val="1"/>
+      <w:numFmt w:val="bullet"/>
+      <w:lvlText w:val="o"/>
+      <w:lvlJc w:val="left"/>
+      <w:pPr>
+        <w:ind w:left="4309" w:hanging="360"/>
+      </w:pPr>
+      <w:rPr>
+        <w:rFonts w:ascii="Courier New" w:hAnsi="Courier New" w:cs="Courier New" w:hint="default"/>
+      </w:rPr>
+    </w:lvl>
+    <w:lvl w:ilvl="5" w:tplc="040E0005" w:tentative="1">
+      <w:start w:val="1"/>
+      <w:numFmt w:val="bullet"/>
+      <w:lvlText w:val=""/>
+      <w:lvlJc w:val="left"/>
+      <w:pPr>
+        <w:ind w:left="5029" w:hanging="360"/>
+      </w:pPr>
+      <w:rPr>
+        <w:rFonts w:ascii="Wingdings" w:hAnsi="Wingdings" w:hint="default"/>
+      </w:rPr>
+    </w:lvl>
+    <w:lvl w:ilvl="6" w:tplc="040E0001" w:tentative="1">
+      <w:start w:val="1"/>
+      <w:numFmt w:val="bullet"/>
+      <w:lvlText w:val=""/>
+      <w:lvlJc w:val="left"/>
+      <w:pPr>
+        <w:ind w:left="5749" w:hanging="360"/>
+      </w:pPr>
+      <w:rPr>
+        <w:rFonts w:ascii="Symbol" w:hAnsi="Symbol" w:hint="default"/>
+      </w:rPr>
+    </w:lvl>
+    <w:lvl w:ilvl="7" w:tplc="040E0003" w:tentative="1">
+      <w:start w:val="1"/>
+      <w:numFmt w:val="bullet"/>
+      <w:lvlText w:val="o"/>
+      <w:lvlJc w:val="left"/>
+      <w:pPr>
+        <w:ind w:left="6469" w:hanging="360"/>
+      </w:pPr>
+      <w:rPr>
+        <w:rFonts w:ascii="Courier New" w:hAnsi="Courier New" w:cs="Courier New" w:hint="default"/>
+      </w:rPr>
+    </w:lvl>
+    <w:lvl w:ilvl="8" w:tplc="040E0005" w:tentative="1">
+      <w:start w:val="1"/>
+      <w:numFmt w:val="bullet"/>
+      <w:lvlText w:val=""/>
+      <w:lvlJc w:val="left"/>
+      <w:pPr>
+        <w:ind w:left="7189" w:hanging="360"/>
+      </w:pPr>
+      <w:rPr>
+        <w:rFonts w:ascii="Wingdings" w:hAnsi="Wingdings" w:hint="default"/>
+      </w:rPr>
+    </w:lvl>
+  </w:abstractNum>
+  <w:num w:numId="1" w16cid:durableId="385834148">
+    <w:abstractNumId w:val="2"/>
+  </w:num>
+  <w:num w:numId="2" w16cid:durableId="1458258664">
+    <w:abstractNumId w:val="0"/>
+  </w:num>
+  <w:num w:numId="3" w16cid:durableId="1530876048">
+    <w:abstractNumId w:val="3"/>
+  </w:num>
+  <w:num w:numId="4" w16cid:durableId="1143423714">
+    <w:abstractNumId w:val="1"/>
+  </w:num>
+</w:numbering>
 </file>
 
 <file path=word/styles.xml><?xml version="1.0" encoding="utf-8"?>
@@ -1902,7 +3272,7 @@
     <w:link w:val="SzakdolozatbekezdsekChar"/>
     <w:autoRedefine/>
     <w:qFormat/>
-    <w:rsid w:val="00374BDC"/>
+    <w:rsid w:val="006E4733"/>
     <w:pPr>
       <w:spacing w:line="360" w:lineRule="auto"/>
       <w:ind w:firstLine="709"/>
@@ -1912,7 +3282,7 @@
     <w:name w:val="Szakdolozat bekezdések Char"/>
     <w:basedOn w:val="Bekezdsalapbettpusa"/>
     <w:link w:val="Szakdolozatbekezdsek"/>
-    <w:rsid w:val="00374BDC"/>
+    <w:rsid w:val="006E4733"/>
   </w:style>
 </w:styles>
 </file>

</xml_diff>

<commit_message>
Document database explanation finished.
</commit_message>
<xml_diff>
--- a/Documents/Vizsgaremek dokumentáció.docx
+++ b/Documents/Vizsgaremek dokumentáció.docx
@@ -1017,6 +1017,8 @@
           <w:ilvl w:val="0"/>
           <w:numId w:val="1"/>
         </w:numPr>
+        <w:spacing w:line="240" w:lineRule="auto"/>
+        <w:ind w:hanging="357"/>
       </w:pPr>
       <w:r>
         <w:rPr>
@@ -1036,6 +1038,8 @@
           <w:ilvl w:val="0"/>
           <w:numId w:val="1"/>
         </w:numPr>
+        <w:spacing w:line="240" w:lineRule="auto"/>
+        <w:ind w:hanging="357"/>
       </w:pPr>
       <w:r>
         <w:rPr>
@@ -1061,6 +1065,8 @@
           <w:ilvl w:val="0"/>
           <w:numId w:val="1"/>
         </w:numPr>
+        <w:spacing w:line="240" w:lineRule="auto"/>
+        <w:ind w:hanging="357"/>
       </w:pPr>
       <w:r>
         <w:rPr>
@@ -1090,6 +1096,9 @@
         <w:jc w:val="center"/>
       </w:pPr>
       <w:r>
+        <w:rPr>
+          <w:noProof/>
+        </w:rPr>
         <w:drawing>
           <wp:inline distT="0" distB="0" distL="0" distR="0" wp14:anchorId="07BCDC95" wp14:editId="7366FFD1">
             <wp:extent cx="2067213" cy="971686"/>
@@ -1146,6 +1155,9 @@
         <w:jc w:val="center"/>
       </w:pPr>
       <w:r>
+        <w:rPr>
+          <w:noProof/>
+        </w:rPr>
         <w:drawing>
           <wp:inline distT="0" distB="0" distL="0" distR="0" wp14:anchorId="0B35B04E" wp14:editId="4DABDE6A">
             <wp:extent cx="5760720" cy="1062355"/>
@@ -1220,6 +1232,8 @@
           <w:ilvl w:val="0"/>
           <w:numId w:val="2"/>
         </w:numPr>
+        <w:spacing w:line="240" w:lineRule="auto"/>
+        <w:ind w:hanging="357"/>
       </w:pPr>
       <w:r>
         <w:rPr>
@@ -1239,6 +1253,8 @@
           <w:ilvl w:val="0"/>
           <w:numId w:val="2"/>
         </w:numPr>
+        <w:spacing w:line="240" w:lineRule="auto"/>
+        <w:ind w:hanging="357"/>
       </w:pPr>
       <w:r>
         <w:rPr>
@@ -1256,6 +1272,9 @@
         <w:jc w:val="center"/>
       </w:pPr>
       <w:r>
+        <w:rPr>
+          <w:noProof/>
+        </w:rPr>
         <w:drawing>
           <wp:inline distT="0" distB="0" distL="0" distR="0" wp14:anchorId="2118251D" wp14:editId="36547D9C">
             <wp:extent cx="2267266" cy="752580"/>
@@ -1306,6 +1325,9 @@
         <w:jc w:val="center"/>
       </w:pPr>
       <w:r>
+        <w:rPr>
+          <w:noProof/>
+        </w:rPr>
         <w:drawing>
           <wp:inline distT="0" distB="0" distL="0" distR="0" wp14:anchorId="616AA649" wp14:editId="4994D196">
             <wp:extent cx="5760720" cy="788670"/>
@@ -1348,6 +1370,9 @@
         <w:jc w:val="center"/>
       </w:pPr>
       <w:r>
+        <w:rPr>
+          <w:noProof/>
+        </w:rPr>
         <w:drawing>
           <wp:inline distT="0" distB="0" distL="0" distR="0" wp14:anchorId="7398D1C1" wp14:editId="60D73220">
             <wp:extent cx="4000500" cy="886290"/>
@@ -1431,6 +1456,8 @@
           <w:ilvl w:val="0"/>
           <w:numId w:val="3"/>
         </w:numPr>
+        <w:spacing w:line="240" w:lineRule="auto"/>
+        <w:ind w:hanging="357"/>
       </w:pPr>
       <w:r>
         <w:rPr>
@@ -1450,6 +1477,8 @@
           <w:ilvl w:val="0"/>
           <w:numId w:val="3"/>
         </w:numPr>
+        <w:spacing w:line="240" w:lineRule="auto"/>
+        <w:ind w:hanging="357"/>
       </w:pPr>
       <w:r>
         <w:rPr>
@@ -1467,6 +1496,9 @@
         <w:jc w:val="center"/>
       </w:pPr>
       <w:r>
+        <w:rPr>
+          <w:noProof/>
+        </w:rPr>
         <w:drawing>
           <wp:inline distT="0" distB="0" distL="0" distR="0" wp14:anchorId="43928429" wp14:editId="66E4EC96">
             <wp:extent cx="2476846" cy="724001"/>
@@ -1520,6 +1552,9 @@
         <w:jc w:val="center"/>
       </w:pPr>
       <w:r>
+        <w:rPr>
+          <w:noProof/>
+        </w:rPr>
         <w:drawing>
           <wp:inline distT="0" distB="0" distL="0" distR="0" wp14:anchorId="03C75B17" wp14:editId="7467C520">
             <wp:extent cx="5760720" cy="806450"/>
@@ -1562,6 +1597,9 @@
         <w:jc w:val="center"/>
       </w:pPr>
       <w:r>
+        <w:rPr>
+          <w:noProof/>
+        </w:rPr>
         <w:drawing>
           <wp:inline distT="0" distB="0" distL="0" distR="0" wp14:anchorId="43ABAF72" wp14:editId="04D70B29">
             <wp:extent cx="4095750" cy="448096"/>
@@ -1695,8 +1733,9 @@
           <w:ilvl w:val="0"/>
           <w:numId w:val="4"/>
         </w:numPr>
-      </w:pPr>
-      <w:proofErr w:type="spellStart"/>
+        <w:spacing w:line="240" w:lineRule="auto"/>
+        <w:ind w:hanging="357"/>
+      </w:pPr>
       <w:r>
         <w:rPr>
           <w:b/>
@@ -1704,7 +1743,6 @@
         </w:rPr>
         <w:t>batch_state_id</w:t>
       </w:r>
-      <w:proofErr w:type="spellEnd"/>
       <w:r>
         <w:t>: int típusú elsődleges kulcsa a táblának, automatikusan növekszik;</w:t>
       </w:r>
@@ -1716,8 +1754,9 @@
           <w:ilvl w:val="0"/>
           <w:numId w:val="4"/>
         </w:numPr>
-      </w:pPr>
-      <w:proofErr w:type="spellStart"/>
+        <w:spacing w:line="240" w:lineRule="auto"/>
+        <w:ind w:hanging="357"/>
+      </w:pPr>
       <w:r>
         <w:rPr>
           <w:b/>
@@ -1725,7 +1764,6 @@
         </w:rPr>
         <w:t>batch_state</w:t>
       </w:r>
-      <w:proofErr w:type="spellEnd"/>
       <w:r>
         <w:t>: varchar típusú, az állapot szöveges definíciója;</w:t>
       </w:r>
@@ -1735,6 +1773,9 @@
         <w:jc w:val="center"/>
       </w:pPr>
       <w:r>
+        <w:rPr>
+          <w:noProof/>
+        </w:rPr>
         <w:drawing>
           <wp:inline distT="0" distB="0" distL="0" distR="0" wp14:anchorId="45459AB1" wp14:editId="1A4C4C73">
             <wp:extent cx="2572109" cy="724001"/>
@@ -1782,6 +1823,9 @@
     </w:p>
     <w:p>
       <w:r>
+        <w:rPr>
+          <w:noProof/>
+        </w:rPr>
         <w:drawing>
           <wp:inline distT="0" distB="0" distL="0" distR="0" wp14:anchorId="0E6F1C6D" wp14:editId="6E9EBE5C">
             <wp:extent cx="5760720" cy="794385"/>
@@ -1824,6 +1868,9 @@
         <w:jc w:val="center"/>
       </w:pPr>
       <w:r>
+        <w:rPr>
+          <w:noProof/>
+        </w:rPr>
         <w:drawing>
           <wp:inline distT="0" distB="0" distL="0" distR="0" wp14:anchorId="536A5EB9" wp14:editId="6C5F573E">
             <wp:extent cx="4876800" cy="860643"/>
@@ -1868,6 +1915,885 @@
     </w:p>
     <w:p>
       <w:pPr>
+        <w:pStyle w:val="Cmsor2"/>
+      </w:pPr>
+      <w:r>
+        <w:lastRenderedPageBreak/>
+        <w:t>Vásárlók tábla:</w:t>
+      </w:r>
+    </w:p>
+    <w:p>
+      <w:pPr>
+        <w:pStyle w:val="Szakdolozatbekezdsek"/>
+      </w:pPr>
+      <w:r>
+        <w:t>A vásárlók</w:t>
+      </w:r>
+      <w:r>
+        <w:t>nak is van egy külön tábla, melyben az adataikat tároljuk. Itt már jóval több adatra van szükség, főleg</w:t>
+      </w:r>
+      <w:r>
+        <w:t>,</w:t>
+      </w:r>
+      <w:r>
+        <w:t xml:space="preserve"> ha a későbbiek folyamán majd hivatalossá is lehetne tenni az alkalmazást. </w:t>
+      </w:r>
+      <w:r>
+        <w:t>Jelen esetben a vásárlók nem tudnak regisztrálni az alkalmazásba, viszont a nagykereskedés dolgozói fel tudják venni az adataikat.</w:t>
+      </w:r>
+      <w:r>
+        <w:t xml:space="preserve"> A táblában megtalálható adatok a következők:</w:t>
+      </w:r>
+    </w:p>
+    <w:p>
+      <w:pPr>
+        <w:pStyle w:val="Szakdolozatbekezdsek"/>
+        <w:numPr>
+          <w:ilvl w:val="0"/>
+          <w:numId w:val="5"/>
+        </w:numPr>
+        <w:spacing w:line="240" w:lineRule="auto"/>
+        <w:ind w:hanging="357"/>
+      </w:pPr>
+      <w:r>
+        <w:rPr>
+          <w:b/>
+          <w:bCs/>
+        </w:rPr>
+        <w:t>costumer_id</w:t>
+      </w:r>
+      <w:r>
+        <w:t>: int típusú, elsődleges kulcs, automatikusan növekszik;</w:t>
+      </w:r>
+    </w:p>
+    <w:p>
+      <w:pPr>
+        <w:pStyle w:val="Szakdolozatbekezdsek"/>
+        <w:numPr>
+          <w:ilvl w:val="0"/>
+          <w:numId w:val="5"/>
+        </w:numPr>
+        <w:spacing w:line="240" w:lineRule="auto"/>
+        <w:ind w:hanging="357"/>
+      </w:pPr>
+      <w:r>
+        <w:rPr>
+          <w:b/>
+          <w:bCs/>
+        </w:rPr>
+        <w:t>costumer_</w:t>
+      </w:r>
+      <w:r>
+        <w:rPr>
+          <w:b/>
+          <w:bCs/>
+        </w:rPr>
+        <w:t>name</w:t>
+      </w:r>
+      <w:r>
+        <w:t>: varchar típusú, a vevő nevét tartalmazza;</w:t>
+      </w:r>
+    </w:p>
+    <w:p>
+      <w:pPr>
+        <w:pStyle w:val="Szakdolozatbekezdsek"/>
+        <w:numPr>
+          <w:ilvl w:val="0"/>
+          <w:numId w:val="5"/>
+        </w:numPr>
+        <w:spacing w:line="240" w:lineRule="auto"/>
+        <w:ind w:hanging="357"/>
+      </w:pPr>
+      <w:r>
+        <w:rPr>
+          <w:b/>
+          <w:bCs/>
+        </w:rPr>
+        <w:t>costumer_</w:t>
+      </w:r>
+      <w:r>
+        <w:rPr>
+          <w:b/>
+          <w:bCs/>
+        </w:rPr>
+        <w:t>taxnumber</w:t>
+      </w:r>
+      <w:r>
+        <w:t>: a vevő adószáma;</w:t>
+      </w:r>
+    </w:p>
+    <w:p>
+      <w:pPr>
+        <w:pStyle w:val="Szakdolozatbekezdsek"/>
+        <w:numPr>
+          <w:ilvl w:val="0"/>
+          <w:numId w:val="5"/>
+        </w:numPr>
+        <w:spacing w:line="240" w:lineRule="auto"/>
+        <w:ind w:hanging="357"/>
+      </w:pPr>
+      <w:r>
+        <w:rPr>
+          <w:b/>
+          <w:bCs/>
+        </w:rPr>
+        <w:t>costumer_</w:t>
+      </w:r>
+      <w:r>
+        <w:rPr>
+          <w:b/>
+          <w:bCs/>
+        </w:rPr>
+        <w:t>postal_code</w:t>
+      </w:r>
+      <w:r>
+        <w:t>: a</w:t>
+      </w:r>
+      <w:r>
+        <w:t>z irányítószám, ahol a vevőnek van a boltja;</w:t>
+      </w:r>
+    </w:p>
+    <w:p>
+      <w:pPr>
+        <w:pStyle w:val="Szakdolozatbekezdsek"/>
+        <w:numPr>
+          <w:ilvl w:val="0"/>
+          <w:numId w:val="5"/>
+        </w:numPr>
+        <w:spacing w:line="240" w:lineRule="auto"/>
+        <w:ind w:hanging="357"/>
+      </w:pPr>
+      <w:r>
+        <w:rPr>
+          <w:b/>
+          <w:bCs/>
+        </w:rPr>
+        <w:t>costumer_</w:t>
+      </w:r>
+      <w:r>
+        <w:rPr>
+          <w:b/>
+          <w:bCs/>
+        </w:rPr>
+        <w:t>city</w:t>
+      </w:r>
+      <w:r>
+        <w:t>:</w:t>
+      </w:r>
+      <w:r>
+        <w:t xml:space="preserve"> a város, ahol a vevő üzlete van;</w:t>
+      </w:r>
+    </w:p>
+    <w:p>
+      <w:pPr>
+        <w:pStyle w:val="Szakdolozatbekezdsek"/>
+        <w:numPr>
+          <w:ilvl w:val="0"/>
+          <w:numId w:val="5"/>
+        </w:numPr>
+        <w:spacing w:line="240" w:lineRule="auto"/>
+        <w:ind w:hanging="357"/>
+      </w:pPr>
+      <w:r>
+        <w:rPr>
+          <w:b/>
+          <w:bCs/>
+        </w:rPr>
+        <w:t>costumer_</w:t>
+      </w:r>
+      <w:r>
+        <w:rPr>
+          <w:b/>
+          <w:bCs/>
+        </w:rPr>
+        <w:t>address</w:t>
+      </w:r>
+      <w:r>
+        <w:t>:</w:t>
+      </w:r>
+      <w:r>
+        <w:t xml:space="preserve"> az üzlet címe;</w:t>
+      </w:r>
+    </w:p>
+    <w:p>
+      <w:pPr>
+        <w:pStyle w:val="Szakdolozatbekezdsek"/>
+        <w:numPr>
+          <w:ilvl w:val="0"/>
+          <w:numId w:val="5"/>
+        </w:numPr>
+        <w:spacing w:line="240" w:lineRule="auto"/>
+        <w:ind w:hanging="357"/>
+      </w:pPr>
+      <w:r>
+        <w:rPr>
+          <w:b/>
+          <w:bCs/>
+        </w:rPr>
+        <w:t>costumer_</w:t>
+      </w:r>
+      <w:r>
+        <w:rPr>
+          <w:b/>
+          <w:bCs/>
+        </w:rPr>
+        <w:t>phonenumber</w:t>
+      </w:r>
+      <w:r>
+        <w:t>:</w:t>
+      </w:r>
+      <w:r>
+        <w:t xml:space="preserve"> az üzlet telefonszáma;</w:t>
+      </w:r>
+    </w:p>
+    <w:p>
+      <w:pPr>
+        <w:jc w:val="center"/>
+      </w:pPr>
+      <w:r>
+        <w:drawing>
+          <wp:inline distT="0" distB="0" distL="0" distR="0" wp14:anchorId="4A8B9D52" wp14:editId="065FA0B5">
+            <wp:extent cx="2171700" cy="1436264"/>
+            <wp:effectExtent l="0" t="0" r="0" b="0"/>
+            <wp:docPr id="152507302" name="Kép 1"/>
+            <wp:cNvGraphicFramePr>
+              <a:graphicFrameLocks xmlns:a="http://schemas.openxmlformats.org/drawingml/2006/main" noChangeAspect="1"/>
+            </wp:cNvGraphicFramePr>
+            <a:graphic xmlns:a="http://schemas.openxmlformats.org/drawingml/2006/main">
+              <a:graphicData uri="http://schemas.openxmlformats.org/drawingml/2006/picture">
+                <pic:pic xmlns:pic="http://schemas.openxmlformats.org/drawingml/2006/picture">
+                  <pic:nvPicPr>
+                    <pic:cNvPr id="152507302" name=""/>
+                    <pic:cNvPicPr/>
+                  </pic:nvPicPr>
+                  <pic:blipFill>
+                    <a:blip r:embed="rId24"/>
+                    <a:stretch>
+                      <a:fillRect/>
+                    </a:stretch>
+                  </pic:blipFill>
+                  <pic:spPr>
+                    <a:xfrm>
+                      <a:off x="0" y="0"/>
+                      <a:ext cx="2175976" cy="1439092"/>
+                    </a:xfrm>
+                    <a:prstGeom prst="rect">
+                      <a:avLst/>
+                    </a:prstGeom>
+                  </pic:spPr>
+                </pic:pic>
+              </a:graphicData>
+            </a:graphic>
+          </wp:inline>
+        </w:drawing>
+      </w:r>
+    </w:p>
+    <w:p>
+      <w:pPr>
+        <w:pStyle w:val="Szakdolozatbekezdsek"/>
+      </w:pPr>
+      <w:r>
+        <w:t>A tábla tervező nézetben, alatta a tábla létrehozásához szükséges forráskód látható.</w:t>
+      </w:r>
+    </w:p>
+    <w:p>
+      <w:pPr>
+        <w:jc w:val="center"/>
+      </w:pPr>
+      <w:r>
+        <w:drawing>
+          <wp:inline distT="0" distB="0" distL="0" distR="0" wp14:anchorId="48F2BA6F" wp14:editId="1F64336B">
+            <wp:extent cx="3695700" cy="1505036"/>
+            <wp:effectExtent l="0" t="0" r="0" b="0"/>
+            <wp:docPr id="1689857513" name="Kép 1"/>
+            <wp:cNvGraphicFramePr>
+              <a:graphicFrameLocks xmlns:a="http://schemas.openxmlformats.org/drawingml/2006/main" noChangeAspect="1"/>
+            </wp:cNvGraphicFramePr>
+            <a:graphic xmlns:a="http://schemas.openxmlformats.org/drawingml/2006/main">
+              <a:graphicData uri="http://schemas.openxmlformats.org/drawingml/2006/picture">
+                <pic:pic xmlns:pic="http://schemas.openxmlformats.org/drawingml/2006/picture">
+                  <pic:nvPicPr>
+                    <pic:cNvPr id="1689857513" name=""/>
+                    <pic:cNvPicPr/>
+                  </pic:nvPicPr>
+                  <pic:blipFill>
+                    <a:blip r:embed="rId25"/>
+                    <a:stretch>
+                      <a:fillRect/>
+                    </a:stretch>
+                  </pic:blipFill>
+                  <pic:spPr>
+                    <a:xfrm>
+                      <a:off x="0" y="0"/>
+                      <a:ext cx="3712048" cy="1511693"/>
+                    </a:xfrm>
+                    <a:prstGeom prst="rect">
+                      <a:avLst/>
+                    </a:prstGeom>
+                  </pic:spPr>
+                </pic:pic>
+              </a:graphicData>
+            </a:graphic>
+          </wp:inline>
+        </w:drawing>
+      </w:r>
+    </w:p>
+    <w:p>
+      <w:r>
+        <w:br w:type="page"/>
+      </w:r>
+    </w:p>
+    <w:p>
+      <w:pPr>
+        <w:pStyle w:val="Cmsor2"/>
+      </w:pPr>
+      <w:r>
+        <w:lastRenderedPageBreak/>
+        <w:t xml:space="preserve">Fenyőbála </w:t>
+      </w:r>
+      <w:r>
+        <w:t>tábla</w:t>
+      </w:r>
+      <w:r>
+        <w:t>:</w:t>
+      </w:r>
+    </w:p>
+    <w:p>
+      <w:pPr>
+        <w:pStyle w:val="Szakdolozatbekezdsek"/>
+      </w:pPr>
+      <w:r>
+        <w:t xml:space="preserve">A nagykereskedésnél a fenyőbála nagyon fontos alapanyag. Ebből kötnek koszorúalapot, valamint még eladnak, kiszállítják, és sokféleképpen kezelik az érkezett bálákat. </w:t>
+      </w:r>
+      <w:r>
+        <w:t>A bálák négyfajta fenyőből hetente érkezik. Az érkezett bálák számát felvezetik az adatbázisban, majd a hét folyamán – amikor kiszállítás van, vagy lekötnek koszorúalapokat, vagy egy-két vevőnek eltesznek – azokat ez a tábla tartalmazza</w:t>
+      </w:r>
+      <w:r>
+        <w:t>. Itt már számolni kell a megmaradt bálákat.</w:t>
+      </w:r>
+      <w:r>
+        <w:t xml:space="preserve"> A tábla a következőképpen néz ki:</w:t>
+      </w:r>
+    </w:p>
+    <w:p>
+      <w:pPr>
+        <w:pStyle w:val="Szakdolozatbekezdsek"/>
+        <w:numPr>
+          <w:ilvl w:val="0"/>
+          <w:numId w:val="6"/>
+        </w:numPr>
+        <w:spacing w:line="240" w:lineRule="auto"/>
+        <w:ind w:hanging="357"/>
+      </w:pPr>
+      <w:r>
+        <w:rPr>
+          <w:b/>
+          <w:bCs/>
+        </w:rPr>
+        <w:t>batch_id</w:t>
+      </w:r>
+      <w:r>
+        <w:t>: int típusú, elsődleges kulcs, automatikusan növekszik;</w:t>
+      </w:r>
+    </w:p>
+    <w:p>
+      <w:pPr>
+        <w:pStyle w:val="Szakdolozatbekezdsek"/>
+        <w:numPr>
+          <w:ilvl w:val="0"/>
+          <w:numId w:val="6"/>
+        </w:numPr>
+        <w:spacing w:line="240" w:lineRule="auto"/>
+        <w:ind w:hanging="357"/>
+      </w:pPr>
+      <w:r>
+        <w:rPr>
+          <w:b/>
+          <w:bCs/>
+        </w:rPr>
+        <w:t>Pine_type_id</w:t>
+      </w:r>
+      <w:r>
+        <w:t>: int típusú mező. Itt másodlagos kulcsként szerepel. Ez a pinetypes tábla elsődleges kulcsa;</w:t>
+      </w:r>
+    </w:p>
+    <w:p>
+      <w:pPr>
+        <w:pStyle w:val="Szakdolozatbekezdsek"/>
+        <w:numPr>
+          <w:ilvl w:val="0"/>
+          <w:numId w:val="6"/>
+        </w:numPr>
+        <w:spacing w:line="240" w:lineRule="auto"/>
+        <w:ind w:hanging="357"/>
+      </w:pPr>
+      <w:r>
+        <w:rPr>
+          <w:b/>
+          <w:bCs/>
+        </w:rPr>
+        <w:t>pinebatch_state_id</w:t>
+      </w:r>
+      <w:r>
+        <w:t>: int típusú mező. Ez is másodlagos kulcs. A pinebatchstate tábla elsődleges kulcsa;</w:t>
+      </w:r>
+    </w:p>
+    <w:p>
+      <w:pPr>
+        <w:pStyle w:val="Szakdolozatbekezdsek"/>
+        <w:numPr>
+          <w:ilvl w:val="0"/>
+          <w:numId w:val="6"/>
+        </w:numPr>
+        <w:spacing w:line="240" w:lineRule="auto"/>
+        <w:ind w:hanging="357"/>
+      </w:pPr>
+      <w:r>
+        <w:rPr>
+          <w:b/>
+          <w:bCs/>
+        </w:rPr>
+        <w:t>pinebatch_quantity</w:t>
+      </w:r>
+      <w:r>
+        <w:t>: int típusú mező. Az érkezett fenyőbálák mennyiségét tartalmazza;</w:t>
+      </w:r>
+    </w:p>
+    <w:p>
+      <w:pPr>
+        <w:pStyle w:val="Szakdolozatbekezdsek"/>
+        <w:numPr>
+          <w:ilvl w:val="0"/>
+          <w:numId w:val="6"/>
+        </w:numPr>
+        <w:spacing w:line="240" w:lineRule="auto"/>
+        <w:ind w:hanging="357"/>
+      </w:pPr>
+      <w:r>
+        <w:rPr>
+          <w:b/>
+          <w:bCs/>
+        </w:rPr>
+        <w:t>batch_arrived_date</w:t>
+      </w:r>
+      <w:r>
+        <w:t>: date típusú mező. Ez az érték automatikusan íródik be az adatbázis táblájába, amikor a megadott adatok mentésre kerülnek.</w:t>
+      </w:r>
+    </w:p>
+    <w:p>
+      <w:pPr>
+        <w:pStyle w:val="Szakdolozatbekezdsek"/>
+        <w:numPr>
+          <w:ilvl w:val="0"/>
+          <w:numId w:val="6"/>
+        </w:numPr>
+        <w:spacing w:line="240" w:lineRule="auto"/>
+        <w:ind w:hanging="357"/>
+      </w:pPr>
+      <w:r>
+        <w:rPr>
+          <w:b/>
+          <w:bCs/>
+        </w:rPr>
+        <w:t>batch_updated_at</w:t>
+      </w:r>
+      <w:r>
+        <w:t xml:space="preserve">: date típusú mező. Ennek az értéknek akkor kell új dátumot kapnia, </w:t>
+      </w:r>
+      <w:r>
+        <w:t>amikor a fenyőbála állapota nem az érkezett állapotot veszi fel.</w:t>
+      </w:r>
+    </w:p>
+    <w:p>
+      <w:pPr>
+        <w:pStyle w:val="Szakdolozatbekezdsek"/>
+        <w:spacing w:line="240" w:lineRule="auto"/>
+      </w:pPr>
+      <w:r>
+        <w:t>A tábla szerkesztő nézete, és a létrehozásához szükséges kód:</w:t>
+      </w:r>
+    </w:p>
+    <w:p>
+      <w:pPr>
+        <w:jc w:val="center"/>
+      </w:pPr>
+      <w:r>
+        <w:drawing>
+          <wp:inline distT="0" distB="0" distL="0" distR="0" wp14:anchorId="0278D40D" wp14:editId="77BAD6B3">
+            <wp:extent cx="3438525" cy="1232446"/>
+            <wp:effectExtent l="0" t="0" r="0" b="6350"/>
+            <wp:docPr id="388919927" name="Kép 1"/>
+            <wp:cNvGraphicFramePr>
+              <a:graphicFrameLocks xmlns:a="http://schemas.openxmlformats.org/drawingml/2006/main" noChangeAspect="1"/>
+            </wp:cNvGraphicFramePr>
+            <a:graphic xmlns:a="http://schemas.openxmlformats.org/drawingml/2006/main">
+              <a:graphicData uri="http://schemas.openxmlformats.org/drawingml/2006/picture">
+                <pic:pic xmlns:pic="http://schemas.openxmlformats.org/drawingml/2006/picture">
+                  <pic:nvPicPr>
+                    <pic:cNvPr id="388919927" name=""/>
+                    <pic:cNvPicPr/>
+                  </pic:nvPicPr>
+                  <pic:blipFill>
+                    <a:blip r:embed="rId26"/>
+                    <a:stretch>
+                      <a:fillRect/>
+                    </a:stretch>
+                  </pic:blipFill>
+                  <pic:spPr>
+                    <a:xfrm>
+                      <a:off x="0" y="0"/>
+                      <a:ext cx="3457469" cy="1239236"/>
+                    </a:xfrm>
+                    <a:prstGeom prst="rect">
+                      <a:avLst/>
+                    </a:prstGeom>
+                  </pic:spPr>
+                </pic:pic>
+              </a:graphicData>
+            </a:graphic>
+          </wp:inline>
+        </w:drawing>
+      </w:r>
+    </w:p>
+    <w:p>
+      <w:pPr>
+        <w:jc w:val="center"/>
+      </w:pPr>
+      <w:r>
+        <w:drawing>
+          <wp:inline distT="0" distB="0" distL="0" distR="0" wp14:anchorId="1F17A6B3" wp14:editId="456C5229">
+            <wp:extent cx="5324898" cy="1600200"/>
+            <wp:effectExtent l="0" t="0" r="9525" b="0"/>
+            <wp:docPr id="692225614" name="Kép 1"/>
+            <wp:cNvGraphicFramePr>
+              <a:graphicFrameLocks xmlns:a="http://schemas.openxmlformats.org/drawingml/2006/main" noChangeAspect="1"/>
+            </wp:cNvGraphicFramePr>
+            <a:graphic xmlns:a="http://schemas.openxmlformats.org/drawingml/2006/main">
+              <a:graphicData uri="http://schemas.openxmlformats.org/drawingml/2006/picture">
+                <pic:pic xmlns:pic="http://schemas.openxmlformats.org/drawingml/2006/picture">
+                  <pic:nvPicPr>
+                    <pic:cNvPr id="692225614" name=""/>
+                    <pic:cNvPicPr/>
+                  </pic:nvPicPr>
+                  <pic:blipFill>
+                    <a:blip r:embed="rId27"/>
+                    <a:stretch>
+                      <a:fillRect/>
+                    </a:stretch>
+                  </pic:blipFill>
+                  <pic:spPr>
+                    <a:xfrm>
+                      <a:off x="0" y="0"/>
+                      <a:ext cx="5327154" cy="1600878"/>
+                    </a:xfrm>
+                    <a:prstGeom prst="rect">
+                      <a:avLst/>
+                    </a:prstGeom>
+                  </pic:spPr>
+                </pic:pic>
+              </a:graphicData>
+            </a:graphic>
+          </wp:inline>
+        </w:drawing>
+      </w:r>
+    </w:p>
+    <w:p>
+      <w:r>
+        <w:br w:type="page"/>
+      </w:r>
+    </w:p>
+    <w:p>
+      <w:pPr>
+        <w:pStyle w:val="Cmsor2"/>
+      </w:pPr>
+      <w:r>
+        <w:lastRenderedPageBreak/>
+        <w:t>Koszorúalap tábla:</w:t>
+      </w:r>
+    </w:p>
+    <w:p>
+      <w:pPr>
+        <w:pStyle w:val="Szakdolozatbekezdsek"/>
+      </w:pPr>
+      <w:r>
+        <w:t xml:space="preserve">A fenyőbála egyik felhasználási állapotát tárolja ez a tábla. A nagykereskedésben a bálák egyik felhasználási módja a koszorúalap kötés. A koszorúalapból kétfélét készítenek, </w:t>
+      </w:r>
+      <w:r>
+        <w:t>és a fenyőkből is négy fajta van, amit felhasználnak.</w:t>
+      </w:r>
+      <w:r>
+        <w:t xml:space="preserve"> Valamint a koszorúalapot egy regisztrált vásárlónak kell megrendelnie.</w:t>
+      </w:r>
+      <w:r>
+        <w:t xml:space="preserve"> Ezért az adatokat tartalmazó táblát a következőképpen kellett kialakítani:</w:t>
+      </w:r>
+    </w:p>
+    <w:p>
+      <w:pPr>
+        <w:pStyle w:val="Szakdolozatbekezdsek"/>
+        <w:numPr>
+          <w:ilvl w:val="0"/>
+          <w:numId w:val="7"/>
+        </w:numPr>
+        <w:spacing w:line="240" w:lineRule="auto"/>
+        <w:ind w:hanging="357"/>
+      </w:pPr>
+      <w:r>
+        <w:rPr>
+          <w:b/>
+          <w:bCs/>
+        </w:rPr>
+        <w:t>base_id</w:t>
+      </w:r>
+      <w:r>
+        <w:t>: int típusú, a tábla elsődleges kulcsa, automatikusan növekszik;</w:t>
+      </w:r>
+    </w:p>
+    <w:p>
+      <w:pPr>
+        <w:pStyle w:val="Szakdolozatbekezdsek"/>
+        <w:numPr>
+          <w:ilvl w:val="0"/>
+          <w:numId w:val="7"/>
+        </w:numPr>
+        <w:spacing w:line="240" w:lineRule="auto"/>
+        <w:ind w:hanging="357"/>
+      </w:pPr>
+      <w:r>
+        <w:rPr>
+          <w:b/>
+          <w:bCs/>
+        </w:rPr>
+        <w:t>costumer_id</w:t>
+      </w:r>
+      <w:r>
+        <w:t>: int típusú, a tábla egyik másodlagos kulcsa</w:t>
+      </w:r>
+      <w:r>
+        <w:t>, a vásárlót azonosítja;</w:t>
+      </w:r>
+    </w:p>
+    <w:p>
+      <w:pPr>
+        <w:pStyle w:val="Szakdolozatbekezdsek"/>
+        <w:numPr>
+          <w:ilvl w:val="0"/>
+          <w:numId w:val="7"/>
+        </w:numPr>
+        <w:spacing w:line="240" w:lineRule="auto"/>
+        <w:ind w:hanging="357"/>
+      </w:pPr>
+      <w:r>
+        <w:rPr>
+          <w:b/>
+          <w:bCs/>
+        </w:rPr>
+        <w:t>pine_type_id</w:t>
+      </w:r>
+      <w:r>
+        <w:t>: int típusú, a tábla szintén másodlagos kulcsa, a fenyő fajtájára mutat;</w:t>
+      </w:r>
+    </w:p>
+    <w:p>
+      <w:pPr>
+        <w:pStyle w:val="Szakdolozatbekezdsek"/>
+        <w:numPr>
+          <w:ilvl w:val="0"/>
+          <w:numId w:val="7"/>
+        </w:numPr>
+        <w:spacing w:line="240" w:lineRule="auto"/>
+        <w:ind w:hanging="357"/>
+      </w:pPr>
+      <w:r>
+        <w:rPr>
+          <w:b/>
+          <w:bCs/>
+        </w:rPr>
+        <w:t>pinebasetype</w:t>
+      </w:r>
+      <w:r>
+        <w:t>: int típusú, a tábla harmadik másodlagos kulcsa, a koszorúalap méretét mutatja meg;</w:t>
+      </w:r>
+    </w:p>
+    <w:p>
+      <w:pPr>
+        <w:pStyle w:val="Szakdolozatbekezdsek"/>
+        <w:numPr>
+          <w:ilvl w:val="0"/>
+          <w:numId w:val="7"/>
+        </w:numPr>
+        <w:spacing w:line="240" w:lineRule="auto"/>
+        <w:ind w:hanging="357"/>
+      </w:pPr>
+      <w:r>
+        <w:rPr>
+          <w:b/>
+          <w:bCs/>
+        </w:rPr>
+        <w:t>base_quantity</w:t>
+      </w:r>
+      <w:r>
+        <w:t>: int típusú mező, a megrendelt alapok mennyiségét tárolja;</w:t>
+      </w:r>
+    </w:p>
+    <w:p>
+      <w:pPr>
+        <w:pStyle w:val="Szakdolozatbekezdsek"/>
+        <w:numPr>
+          <w:ilvl w:val="0"/>
+          <w:numId w:val="7"/>
+        </w:numPr>
+        <w:spacing w:line="240" w:lineRule="auto"/>
+        <w:ind w:hanging="357"/>
+      </w:pPr>
+      <w:r>
+        <w:rPr>
+          <w:b/>
+          <w:bCs/>
+        </w:rPr>
+        <w:t>base_state:</w:t>
+      </w:r>
+      <w:r>
+        <w:t xml:space="preserve"> </w:t>
+      </w:r>
+      <w:r>
+        <w:t>igazából</w:t>
+      </w:r>
+      <w:r>
+        <w:t xml:space="preserve"> bool típusú, ez ahhoz kell, hogy a koszorúalap </w:t>
+      </w:r>
+      <w:r>
+        <w:t>elkészült, vagy még nem;</w:t>
+      </w:r>
+    </w:p>
+    <w:p>
+      <w:pPr>
+        <w:pStyle w:val="Szakdolozatbekezdsek"/>
+        <w:numPr>
+          <w:ilvl w:val="0"/>
+          <w:numId w:val="7"/>
+        </w:numPr>
+        <w:spacing w:line="240" w:lineRule="auto"/>
+        <w:ind w:hanging="357"/>
+      </w:pPr>
+      <w:r>
+        <w:rPr>
+          <w:b/>
+          <w:bCs/>
+        </w:rPr>
+        <w:t>base_ordered_date</w:t>
+      </w:r>
+      <w:r>
+        <w:t>: date típusú mező, ez tárolja azt a dátumot, amikorra a koszorúalapnak készen kell lennie;</w:t>
+      </w:r>
+    </w:p>
+    <w:p>
+      <w:pPr>
+        <w:pStyle w:val="Szakdolozatbekezdsek"/>
+        <w:numPr>
+          <w:ilvl w:val="0"/>
+          <w:numId w:val="7"/>
+        </w:numPr>
+        <w:spacing w:line="240" w:lineRule="auto"/>
+        <w:ind w:hanging="357"/>
+      </w:pPr>
+      <w:r>
+        <w:rPr>
+          <w:b/>
+          <w:bCs/>
+        </w:rPr>
+        <w:t>base_updated_at</w:t>
+      </w:r>
+      <w:r>
+        <w:t>: date típusú, ez akkor változik meg, amikor az alap elkészül, és a checkbox állapota megváltozik;</w:t>
+      </w:r>
+    </w:p>
+    <w:p>
+      <w:pPr>
+        <w:jc w:val="center"/>
+      </w:pPr>
+      <w:r>
+        <w:drawing>
+          <wp:inline distT="0" distB="0" distL="0" distR="0" wp14:anchorId="5F480EF3" wp14:editId="0F67B9B2">
+            <wp:extent cx="3048000" cy="1714500"/>
+            <wp:effectExtent l="0" t="0" r="0" b="0"/>
+            <wp:docPr id="1818938826" name="Kép 1"/>
+            <wp:cNvGraphicFramePr>
+              <a:graphicFrameLocks xmlns:a="http://schemas.openxmlformats.org/drawingml/2006/main" noChangeAspect="1"/>
+            </wp:cNvGraphicFramePr>
+            <a:graphic xmlns:a="http://schemas.openxmlformats.org/drawingml/2006/main">
+              <a:graphicData uri="http://schemas.openxmlformats.org/drawingml/2006/picture">
+                <pic:pic xmlns:pic="http://schemas.openxmlformats.org/drawingml/2006/picture">
+                  <pic:nvPicPr>
+                    <pic:cNvPr id="1818938826" name=""/>
+                    <pic:cNvPicPr/>
+                  </pic:nvPicPr>
+                  <pic:blipFill>
+                    <a:blip r:embed="rId28"/>
+                    <a:stretch>
+                      <a:fillRect/>
+                    </a:stretch>
+                  </pic:blipFill>
+                  <pic:spPr>
+                    <a:xfrm>
+                      <a:off x="0" y="0"/>
+                      <a:ext cx="3048430" cy="1714742"/>
+                    </a:xfrm>
+                    <a:prstGeom prst="rect">
+                      <a:avLst/>
+                    </a:prstGeom>
+                  </pic:spPr>
+                </pic:pic>
+              </a:graphicData>
+            </a:graphic>
+          </wp:inline>
+        </w:drawing>
+      </w:r>
+    </w:p>
+    <w:p>
+      <w:pPr>
+        <w:jc w:val="center"/>
+      </w:pPr>
+      <w:r>
+        <w:drawing>
+          <wp:inline distT="0" distB="0" distL="0" distR="0" wp14:anchorId="345C9C12" wp14:editId="61E84148">
+            <wp:extent cx="4486275" cy="1704975"/>
+            <wp:effectExtent l="0" t="0" r="9525" b="9525"/>
+            <wp:docPr id="75386078" name="Kép 1"/>
+            <wp:cNvGraphicFramePr>
+              <a:graphicFrameLocks xmlns:a="http://schemas.openxmlformats.org/drawingml/2006/main" noChangeAspect="1"/>
+            </wp:cNvGraphicFramePr>
+            <a:graphic xmlns:a="http://schemas.openxmlformats.org/drawingml/2006/main">
+              <a:graphicData uri="http://schemas.openxmlformats.org/drawingml/2006/picture">
+                <pic:pic xmlns:pic="http://schemas.openxmlformats.org/drawingml/2006/picture">
+                  <pic:nvPicPr>
+                    <pic:cNvPr id="75386078" name=""/>
+                    <pic:cNvPicPr/>
+                  </pic:nvPicPr>
+                  <pic:blipFill>
+                    <a:blip r:embed="rId29"/>
+                    <a:stretch>
+                      <a:fillRect/>
+                    </a:stretch>
+                  </pic:blipFill>
+                  <pic:spPr>
+                    <a:xfrm>
+                      <a:off x="0" y="0"/>
+                      <a:ext cx="4486275" cy="1704975"/>
+                    </a:xfrm>
+                    <a:prstGeom prst="rect">
+                      <a:avLst/>
+                    </a:prstGeom>
+                  </pic:spPr>
+                </pic:pic>
+              </a:graphicData>
+            </a:graphic>
+          </wp:inline>
+        </w:drawing>
+      </w:r>
+    </w:p>
+    <w:p>
+      <w:pPr>
         <w:pStyle w:val="Szakdolozatbekezdsek"/>
       </w:pPr>
     </w:p>
@@ -2111,6 +3037,345 @@
     </w:lvl>
   </w:abstractNum>
   <w:abstractNum w:abstractNumId="2" w15:restartNumberingAfterBreak="0">
+    <w:nsid w:val="2D34586A"/>
+    <w:multiLevelType w:val="hybridMultilevel"/>
+    <w:tmpl w:val="57D288D6"/>
+    <w:lvl w:ilvl="0" w:tplc="040E0001">
+      <w:start w:val="1"/>
+      <w:numFmt w:val="bullet"/>
+      <w:lvlText w:val=""/>
+      <w:lvlJc w:val="left"/>
+      <w:pPr>
+        <w:ind w:left="1429" w:hanging="360"/>
+      </w:pPr>
+      <w:rPr>
+        <w:rFonts w:ascii="Symbol" w:hAnsi="Symbol" w:hint="default"/>
+      </w:rPr>
+    </w:lvl>
+    <w:lvl w:ilvl="1" w:tplc="040E0003" w:tentative="1">
+      <w:start w:val="1"/>
+      <w:numFmt w:val="bullet"/>
+      <w:lvlText w:val="o"/>
+      <w:lvlJc w:val="left"/>
+      <w:pPr>
+        <w:ind w:left="2149" w:hanging="360"/>
+      </w:pPr>
+      <w:rPr>
+        <w:rFonts w:ascii="Courier New" w:hAnsi="Courier New" w:cs="Courier New" w:hint="default"/>
+      </w:rPr>
+    </w:lvl>
+    <w:lvl w:ilvl="2" w:tplc="040E0005" w:tentative="1">
+      <w:start w:val="1"/>
+      <w:numFmt w:val="bullet"/>
+      <w:lvlText w:val=""/>
+      <w:lvlJc w:val="left"/>
+      <w:pPr>
+        <w:ind w:left="2869" w:hanging="360"/>
+      </w:pPr>
+      <w:rPr>
+        <w:rFonts w:ascii="Wingdings" w:hAnsi="Wingdings" w:hint="default"/>
+      </w:rPr>
+    </w:lvl>
+    <w:lvl w:ilvl="3" w:tplc="040E0001" w:tentative="1">
+      <w:start w:val="1"/>
+      <w:numFmt w:val="bullet"/>
+      <w:lvlText w:val=""/>
+      <w:lvlJc w:val="left"/>
+      <w:pPr>
+        <w:ind w:left="3589" w:hanging="360"/>
+      </w:pPr>
+      <w:rPr>
+        <w:rFonts w:ascii="Symbol" w:hAnsi="Symbol" w:hint="default"/>
+      </w:rPr>
+    </w:lvl>
+    <w:lvl w:ilvl="4" w:tplc="040E0003" w:tentative="1">
+      <w:start w:val="1"/>
+      <w:numFmt w:val="bullet"/>
+      <w:lvlText w:val="o"/>
+      <w:lvlJc w:val="left"/>
+      <w:pPr>
+        <w:ind w:left="4309" w:hanging="360"/>
+      </w:pPr>
+      <w:rPr>
+        <w:rFonts w:ascii="Courier New" w:hAnsi="Courier New" w:cs="Courier New" w:hint="default"/>
+      </w:rPr>
+    </w:lvl>
+    <w:lvl w:ilvl="5" w:tplc="040E0005" w:tentative="1">
+      <w:start w:val="1"/>
+      <w:numFmt w:val="bullet"/>
+      <w:lvlText w:val=""/>
+      <w:lvlJc w:val="left"/>
+      <w:pPr>
+        <w:ind w:left="5029" w:hanging="360"/>
+      </w:pPr>
+      <w:rPr>
+        <w:rFonts w:ascii="Wingdings" w:hAnsi="Wingdings" w:hint="default"/>
+      </w:rPr>
+    </w:lvl>
+    <w:lvl w:ilvl="6" w:tplc="040E0001" w:tentative="1">
+      <w:start w:val="1"/>
+      <w:numFmt w:val="bullet"/>
+      <w:lvlText w:val=""/>
+      <w:lvlJc w:val="left"/>
+      <w:pPr>
+        <w:ind w:left="5749" w:hanging="360"/>
+      </w:pPr>
+      <w:rPr>
+        <w:rFonts w:ascii="Symbol" w:hAnsi="Symbol" w:hint="default"/>
+      </w:rPr>
+    </w:lvl>
+    <w:lvl w:ilvl="7" w:tplc="040E0003" w:tentative="1">
+      <w:start w:val="1"/>
+      <w:numFmt w:val="bullet"/>
+      <w:lvlText w:val="o"/>
+      <w:lvlJc w:val="left"/>
+      <w:pPr>
+        <w:ind w:left="6469" w:hanging="360"/>
+      </w:pPr>
+      <w:rPr>
+        <w:rFonts w:ascii="Courier New" w:hAnsi="Courier New" w:cs="Courier New" w:hint="default"/>
+      </w:rPr>
+    </w:lvl>
+    <w:lvl w:ilvl="8" w:tplc="040E0005" w:tentative="1">
+      <w:start w:val="1"/>
+      <w:numFmt w:val="bullet"/>
+      <w:lvlText w:val=""/>
+      <w:lvlJc w:val="left"/>
+      <w:pPr>
+        <w:ind w:left="7189" w:hanging="360"/>
+      </w:pPr>
+      <w:rPr>
+        <w:rFonts w:ascii="Wingdings" w:hAnsi="Wingdings" w:hint="default"/>
+      </w:rPr>
+    </w:lvl>
+  </w:abstractNum>
+  <w:abstractNum w:abstractNumId="3" w15:restartNumberingAfterBreak="0">
+    <w:nsid w:val="361E6B14"/>
+    <w:multiLevelType w:val="hybridMultilevel"/>
+    <w:tmpl w:val="3BACB1F0"/>
+    <w:lvl w:ilvl="0" w:tplc="040E0001">
+      <w:start w:val="1"/>
+      <w:numFmt w:val="bullet"/>
+      <w:lvlText w:val=""/>
+      <w:lvlJc w:val="left"/>
+      <w:pPr>
+        <w:ind w:left="1429" w:hanging="360"/>
+      </w:pPr>
+      <w:rPr>
+        <w:rFonts w:ascii="Symbol" w:hAnsi="Symbol" w:hint="default"/>
+      </w:rPr>
+    </w:lvl>
+    <w:lvl w:ilvl="1" w:tplc="040E0003" w:tentative="1">
+      <w:start w:val="1"/>
+      <w:numFmt w:val="bullet"/>
+      <w:lvlText w:val="o"/>
+      <w:lvlJc w:val="left"/>
+      <w:pPr>
+        <w:ind w:left="2149" w:hanging="360"/>
+      </w:pPr>
+      <w:rPr>
+        <w:rFonts w:ascii="Courier New" w:hAnsi="Courier New" w:cs="Courier New" w:hint="default"/>
+      </w:rPr>
+    </w:lvl>
+    <w:lvl w:ilvl="2" w:tplc="040E0005" w:tentative="1">
+      <w:start w:val="1"/>
+      <w:numFmt w:val="bullet"/>
+      <w:lvlText w:val=""/>
+      <w:lvlJc w:val="left"/>
+      <w:pPr>
+        <w:ind w:left="2869" w:hanging="360"/>
+      </w:pPr>
+      <w:rPr>
+        <w:rFonts w:ascii="Wingdings" w:hAnsi="Wingdings" w:hint="default"/>
+      </w:rPr>
+    </w:lvl>
+    <w:lvl w:ilvl="3" w:tplc="040E0001" w:tentative="1">
+      <w:start w:val="1"/>
+      <w:numFmt w:val="bullet"/>
+      <w:lvlText w:val=""/>
+      <w:lvlJc w:val="left"/>
+      <w:pPr>
+        <w:ind w:left="3589" w:hanging="360"/>
+      </w:pPr>
+      <w:rPr>
+        <w:rFonts w:ascii="Symbol" w:hAnsi="Symbol" w:hint="default"/>
+      </w:rPr>
+    </w:lvl>
+    <w:lvl w:ilvl="4" w:tplc="040E0003" w:tentative="1">
+      <w:start w:val="1"/>
+      <w:numFmt w:val="bullet"/>
+      <w:lvlText w:val="o"/>
+      <w:lvlJc w:val="left"/>
+      <w:pPr>
+        <w:ind w:left="4309" w:hanging="360"/>
+      </w:pPr>
+      <w:rPr>
+        <w:rFonts w:ascii="Courier New" w:hAnsi="Courier New" w:cs="Courier New" w:hint="default"/>
+      </w:rPr>
+    </w:lvl>
+    <w:lvl w:ilvl="5" w:tplc="040E0005" w:tentative="1">
+      <w:start w:val="1"/>
+      <w:numFmt w:val="bullet"/>
+      <w:lvlText w:val=""/>
+      <w:lvlJc w:val="left"/>
+      <w:pPr>
+        <w:ind w:left="5029" w:hanging="360"/>
+      </w:pPr>
+      <w:rPr>
+        <w:rFonts w:ascii="Wingdings" w:hAnsi="Wingdings" w:hint="default"/>
+      </w:rPr>
+    </w:lvl>
+    <w:lvl w:ilvl="6" w:tplc="040E0001" w:tentative="1">
+      <w:start w:val="1"/>
+      <w:numFmt w:val="bullet"/>
+      <w:lvlText w:val=""/>
+      <w:lvlJc w:val="left"/>
+      <w:pPr>
+        <w:ind w:left="5749" w:hanging="360"/>
+      </w:pPr>
+      <w:rPr>
+        <w:rFonts w:ascii="Symbol" w:hAnsi="Symbol" w:hint="default"/>
+      </w:rPr>
+    </w:lvl>
+    <w:lvl w:ilvl="7" w:tplc="040E0003" w:tentative="1">
+      <w:start w:val="1"/>
+      <w:numFmt w:val="bullet"/>
+      <w:lvlText w:val="o"/>
+      <w:lvlJc w:val="left"/>
+      <w:pPr>
+        <w:ind w:left="6469" w:hanging="360"/>
+      </w:pPr>
+      <w:rPr>
+        <w:rFonts w:ascii="Courier New" w:hAnsi="Courier New" w:cs="Courier New" w:hint="default"/>
+      </w:rPr>
+    </w:lvl>
+    <w:lvl w:ilvl="8" w:tplc="040E0005" w:tentative="1">
+      <w:start w:val="1"/>
+      <w:numFmt w:val="bullet"/>
+      <w:lvlText w:val=""/>
+      <w:lvlJc w:val="left"/>
+      <w:pPr>
+        <w:ind w:left="7189" w:hanging="360"/>
+      </w:pPr>
+      <w:rPr>
+        <w:rFonts w:ascii="Wingdings" w:hAnsi="Wingdings" w:hint="default"/>
+      </w:rPr>
+    </w:lvl>
+  </w:abstractNum>
+  <w:abstractNum w:abstractNumId="4" w15:restartNumberingAfterBreak="0">
+    <w:nsid w:val="37405040"/>
+    <w:multiLevelType w:val="hybridMultilevel"/>
+    <w:tmpl w:val="DF764BFA"/>
+    <w:lvl w:ilvl="0" w:tplc="040E0001">
+      <w:start w:val="1"/>
+      <w:numFmt w:val="bullet"/>
+      <w:lvlText w:val=""/>
+      <w:lvlJc w:val="left"/>
+      <w:pPr>
+        <w:ind w:left="1429" w:hanging="360"/>
+      </w:pPr>
+      <w:rPr>
+        <w:rFonts w:ascii="Symbol" w:hAnsi="Symbol" w:hint="default"/>
+      </w:rPr>
+    </w:lvl>
+    <w:lvl w:ilvl="1" w:tplc="040E0003" w:tentative="1">
+      <w:start w:val="1"/>
+      <w:numFmt w:val="bullet"/>
+      <w:lvlText w:val="o"/>
+      <w:lvlJc w:val="left"/>
+      <w:pPr>
+        <w:ind w:left="2149" w:hanging="360"/>
+      </w:pPr>
+      <w:rPr>
+        <w:rFonts w:ascii="Courier New" w:hAnsi="Courier New" w:cs="Courier New" w:hint="default"/>
+      </w:rPr>
+    </w:lvl>
+    <w:lvl w:ilvl="2" w:tplc="040E0005" w:tentative="1">
+      <w:start w:val="1"/>
+      <w:numFmt w:val="bullet"/>
+      <w:lvlText w:val=""/>
+      <w:lvlJc w:val="left"/>
+      <w:pPr>
+        <w:ind w:left="2869" w:hanging="360"/>
+      </w:pPr>
+      <w:rPr>
+        <w:rFonts w:ascii="Wingdings" w:hAnsi="Wingdings" w:hint="default"/>
+      </w:rPr>
+    </w:lvl>
+    <w:lvl w:ilvl="3" w:tplc="040E0001" w:tentative="1">
+      <w:start w:val="1"/>
+      <w:numFmt w:val="bullet"/>
+      <w:lvlText w:val=""/>
+      <w:lvlJc w:val="left"/>
+      <w:pPr>
+        <w:ind w:left="3589" w:hanging="360"/>
+      </w:pPr>
+      <w:rPr>
+        <w:rFonts w:ascii="Symbol" w:hAnsi="Symbol" w:hint="default"/>
+      </w:rPr>
+    </w:lvl>
+    <w:lvl w:ilvl="4" w:tplc="040E0003" w:tentative="1">
+      <w:start w:val="1"/>
+      <w:numFmt w:val="bullet"/>
+      <w:lvlText w:val="o"/>
+      <w:lvlJc w:val="left"/>
+      <w:pPr>
+        <w:ind w:left="4309" w:hanging="360"/>
+      </w:pPr>
+      <w:rPr>
+        <w:rFonts w:ascii="Courier New" w:hAnsi="Courier New" w:cs="Courier New" w:hint="default"/>
+      </w:rPr>
+    </w:lvl>
+    <w:lvl w:ilvl="5" w:tplc="040E0005" w:tentative="1">
+      <w:start w:val="1"/>
+      <w:numFmt w:val="bullet"/>
+      <w:lvlText w:val=""/>
+      <w:lvlJc w:val="left"/>
+      <w:pPr>
+        <w:ind w:left="5029" w:hanging="360"/>
+      </w:pPr>
+      <w:rPr>
+        <w:rFonts w:ascii="Wingdings" w:hAnsi="Wingdings" w:hint="default"/>
+      </w:rPr>
+    </w:lvl>
+    <w:lvl w:ilvl="6" w:tplc="040E0001" w:tentative="1">
+      <w:start w:val="1"/>
+      <w:numFmt w:val="bullet"/>
+      <w:lvlText w:val=""/>
+      <w:lvlJc w:val="left"/>
+      <w:pPr>
+        <w:ind w:left="5749" w:hanging="360"/>
+      </w:pPr>
+      <w:rPr>
+        <w:rFonts w:ascii="Symbol" w:hAnsi="Symbol" w:hint="default"/>
+      </w:rPr>
+    </w:lvl>
+    <w:lvl w:ilvl="7" w:tplc="040E0003" w:tentative="1">
+      <w:start w:val="1"/>
+      <w:numFmt w:val="bullet"/>
+      <w:lvlText w:val="o"/>
+      <w:lvlJc w:val="left"/>
+      <w:pPr>
+        <w:ind w:left="6469" w:hanging="360"/>
+      </w:pPr>
+      <w:rPr>
+        <w:rFonts w:ascii="Courier New" w:hAnsi="Courier New" w:cs="Courier New" w:hint="default"/>
+      </w:rPr>
+    </w:lvl>
+    <w:lvl w:ilvl="8" w:tplc="040E0005" w:tentative="1">
+      <w:start w:val="1"/>
+      <w:numFmt w:val="bullet"/>
+      <w:lvlText w:val=""/>
+      <w:lvlJc w:val="left"/>
+      <w:pPr>
+        <w:ind w:left="7189" w:hanging="360"/>
+      </w:pPr>
+      <w:rPr>
+        <w:rFonts w:ascii="Wingdings" w:hAnsi="Wingdings" w:hint="default"/>
+      </w:rPr>
+    </w:lvl>
+  </w:abstractNum>
+  <w:abstractNum w:abstractNumId="5" w15:restartNumberingAfterBreak="0">
     <w:nsid w:val="4BC22624"/>
     <w:multiLevelType w:val="hybridMultilevel"/>
     <w:tmpl w:val="B378B62E"/>
@@ -2223,7 +3488,7 @@
       </w:rPr>
     </w:lvl>
   </w:abstractNum>
-  <w:abstractNum w:abstractNumId="3" w15:restartNumberingAfterBreak="0">
+  <w:abstractNum w:abstractNumId="6" w15:restartNumberingAfterBreak="0">
     <w:nsid w:val="77025383"/>
     <w:multiLevelType w:val="hybridMultilevel"/>
     <w:tmpl w:val="30246070"/>
@@ -2337,16 +3602,25 @@
     </w:lvl>
   </w:abstractNum>
   <w:num w:numId="1" w16cid:durableId="385834148">
-    <w:abstractNumId w:val="2"/>
+    <w:abstractNumId w:val="5"/>
   </w:num>
   <w:num w:numId="2" w16cid:durableId="1458258664">
     <w:abstractNumId w:val="0"/>
   </w:num>
   <w:num w:numId="3" w16cid:durableId="1530876048">
-    <w:abstractNumId w:val="3"/>
+    <w:abstractNumId w:val="6"/>
   </w:num>
   <w:num w:numId="4" w16cid:durableId="1143423714">
     <w:abstractNumId w:val="1"/>
+  </w:num>
+  <w:num w:numId="5" w16cid:durableId="176043529">
+    <w:abstractNumId w:val="2"/>
+  </w:num>
+  <w:num w:numId="6" w16cid:durableId="2122383911">
+    <w:abstractNumId w:val="4"/>
+  </w:num>
+  <w:num w:numId="7" w16cid:durableId="2082827038">
+    <w:abstractNumId w:val="3"/>
   </w:num>
 </w:numbering>
 </file>
@@ -3272,7 +4546,7 @@
     <w:link w:val="SzakdolozatbekezdsekChar"/>
     <w:autoRedefine/>
     <w:qFormat/>
-    <w:rsid w:val="006E4733"/>
+    <w:rsid w:val="003F27CA"/>
     <w:pPr>
       <w:spacing w:line="360" w:lineRule="auto"/>
       <w:ind w:firstLine="709"/>
@@ -3282,7 +4556,7 @@
     <w:name w:val="Szakdolozat bekezdések Char"/>
     <w:basedOn w:val="Bekezdsalapbettpusa"/>
     <w:link w:val="Szakdolozatbekezdsek"/>
-    <w:rsid w:val="006E4733"/>
+    <w:rsid w:val="003F27CA"/>
   </w:style>
 </w:styles>
 </file>

</xml_diff>

<commit_message>
Pinebatch fine and Pinebase started.
</commit_message>
<xml_diff>
--- a/Documents/Vizsgaremek dokumentáció.docx
+++ b/Documents/Vizsgaremek dokumentáció.docx
@@ -1981,14 +1981,7 @@
           <w:b/>
           <w:bCs/>
         </w:rPr>
-        <w:t>costumer_</w:t>
-      </w:r>
-      <w:r>
-        <w:rPr>
-          <w:b/>
-          <w:bCs/>
-        </w:rPr>
-        <w:t>name</w:t>
+        <w:t>costumer_name</w:t>
       </w:r>
       <w:r>
         <w:t>: varchar típusú, a vevő nevét tartalmazza;</w:t>
@@ -2009,14 +2002,7 @@
           <w:b/>
           <w:bCs/>
         </w:rPr>
-        <w:t>costumer_</w:t>
-      </w:r>
-      <w:r>
-        <w:rPr>
-          <w:b/>
-          <w:bCs/>
-        </w:rPr>
-        <w:t>taxnumber</w:t>
+        <w:t>costumer_taxnumber</w:t>
       </w:r>
       <w:r>
         <w:t>: a vevő adószáma;</w:t>
@@ -2037,14 +2023,7 @@
           <w:b/>
           <w:bCs/>
         </w:rPr>
-        <w:t>costumer_</w:t>
-      </w:r>
-      <w:r>
-        <w:rPr>
-          <w:b/>
-          <w:bCs/>
-        </w:rPr>
-        <w:t>postal_code</w:t>
+        <w:t>costumer_postal_code</w:t>
       </w:r>
       <w:r>
         <w:t>: a</w:t>
@@ -2068,14 +2047,7 @@
           <w:b/>
           <w:bCs/>
         </w:rPr>
-        <w:t>costumer_</w:t>
-      </w:r>
-      <w:r>
-        <w:rPr>
-          <w:b/>
-          <w:bCs/>
-        </w:rPr>
-        <w:t>city</w:t>
+        <w:t>costumer_city</w:t>
       </w:r>
       <w:r>
         <w:t>:</w:t>
@@ -2099,14 +2071,7 @@
           <w:b/>
           <w:bCs/>
         </w:rPr>
-        <w:t>costumer_</w:t>
-      </w:r>
-      <w:r>
-        <w:rPr>
-          <w:b/>
-          <w:bCs/>
-        </w:rPr>
-        <w:t>address</w:t>
+        <w:t>costumer_address</w:t>
       </w:r>
       <w:r>
         <w:t>:</w:t>
@@ -2130,14 +2095,7 @@
           <w:b/>
           <w:bCs/>
         </w:rPr>
-        <w:t>costumer_</w:t>
-      </w:r>
-      <w:r>
-        <w:rPr>
-          <w:b/>
-          <w:bCs/>
-        </w:rPr>
-        <w:t>phonenumber</w:t>
+        <w:t>costumer_phonenumber</w:t>
       </w:r>
       <w:r>
         <w:t>:</w:t>
@@ -2151,6 +2109,9 @@
         <w:jc w:val="center"/>
       </w:pPr>
       <w:r>
+        <w:rPr>
+          <w:noProof/>
+        </w:rPr>
         <w:drawing>
           <wp:inline distT="0" distB="0" distL="0" distR="0" wp14:anchorId="4A8B9D52" wp14:editId="065FA0B5">
             <wp:extent cx="2171700" cy="1436264"/>
@@ -2201,6 +2162,9 @@
         <w:jc w:val="center"/>
       </w:pPr>
       <w:r>
+        <w:rPr>
+          <w:noProof/>
+        </w:rPr>
         <w:drawing>
           <wp:inline distT="0" distB="0" distL="0" distR="0" wp14:anchorId="48F2BA6F" wp14:editId="1F64336B">
             <wp:extent cx="3695700" cy="1505036"/>
@@ -2418,6 +2382,9 @@
         <w:jc w:val="center"/>
       </w:pPr>
       <w:r>
+        <w:rPr>
+          <w:noProof/>
+        </w:rPr>
         <w:drawing>
           <wp:inline distT="0" distB="0" distL="0" distR="0" wp14:anchorId="0278D40D" wp14:editId="77BAD6B3">
             <wp:extent cx="3438525" cy="1232446"/>
@@ -2460,6 +2427,9 @@
         <w:jc w:val="center"/>
       </w:pPr>
       <w:r>
+        <w:rPr>
+          <w:noProof/>
+        </w:rPr>
         <w:drawing>
           <wp:inline distT="0" distB="0" distL="0" distR="0" wp14:anchorId="1F17A6B3" wp14:editId="456C5229">
             <wp:extent cx="5324898" cy="1600200"/>
@@ -2713,6 +2683,9 @@
         <w:jc w:val="center"/>
       </w:pPr>
       <w:r>
+        <w:rPr>
+          <w:noProof/>
+        </w:rPr>
         <w:drawing>
           <wp:inline distT="0" distB="0" distL="0" distR="0" wp14:anchorId="5F480EF3" wp14:editId="0F67B9B2">
             <wp:extent cx="3048000" cy="1714500"/>
@@ -2755,6 +2728,9 @@
         <w:jc w:val="center"/>
       </w:pPr>
       <w:r>
+        <w:rPr>
+          <w:noProof/>
+        </w:rPr>
         <w:drawing>
           <wp:inline distT="0" distB="0" distL="0" distR="0" wp14:anchorId="345C9C12" wp14:editId="61E84148">
             <wp:extent cx="4486275" cy="1704975"/>
@@ -2792,11 +2768,7 @@
         </w:drawing>
       </w:r>
     </w:p>
-    <w:p>
-      <w:pPr>
-        <w:pStyle w:val="Szakdolozatbekezdsek"/>
-      </w:pPr>
-    </w:p>
+    <w:p/>
     <w:sectPr>
       <w:type w:val="continuous"/>
       <w:pgSz w:w="11906" w:h="16838"/>

</xml_diff>

<commit_message>
Some mistakes have solved.
</commit_message>
<xml_diff>
--- a/Documents/Vizsgaremek dokumentáció.docx
+++ b/Documents/Vizsgaremek dokumentáció.docx
@@ -1017,10 +1017,22 @@
     <w:p>
       <w:pPr>
         <w:pStyle w:val="Cmsor1"/>
+        <w:sectPr>
+          <w:type w:val="continuous"/>
+          <w:pgSz w:w="11906" w:h="16838"/>
+          <w:pgMar w:top="1417" w:right="1417" w:bottom="1417" w:left="1417" w:header="708" w:footer="708" w:gutter="0"/>
+          <w:cols w:space="708"/>
+          <w:docGrid w:linePitch="360"/>
+        </w:sectPr>
       </w:pPr>
       <w:r>
         <w:br w:type="page"/>
       </w:r>
+    </w:p>
+    <w:p>
+      <w:pPr>
+        <w:pStyle w:val="Cmsor1"/>
+      </w:pPr>
       <w:r>
         <w:lastRenderedPageBreak/>
         <w:t>Az adatbázis</w:t>
@@ -1036,12 +1048,86 @@
       <w:r>
         <w:t>ben az egymással összefüggő adatokat tároljuk.</w:t>
       </w:r>
+      <w:r>
+        <w:t xml:space="preserve"> Az adatbázis szerkezetét az alábbi ábra mutatja.</w:t>
+      </w:r>
+    </w:p>
+    <w:p>
+      <w:pPr>
+        <w:jc w:val="center"/>
+      </w:pPr>
+      <w:r>
+        <w:rPr>
+          <w:noProof/>
+        </w:rPr>
+        <w:drawing>
+          <wp:inline distT="0" distB="0" distL="0" distR="0" wp14:anchorId="7CAB2BA8" wp14:editId="76C37A06">
+            <wp:extent cx="7305675" cy="3638550"/>
+            <wp:effectExtent l="0" t="0" r="9525" b="0"/>
+            <wp:docPr id="1382560112" name="Kép 1"/>
+            <wp:cNvGraphicFramePr>
+              <a:graphicFrameLocks xmlns:a="http://schemas.openxmlformats.org/drawingml/2006/main" noChangeAspect="1"/>
+            </wp:cNvGraphicFramePr>
+            <a:graphic xmlns:a="http://schemas.openxmlformats.org/drawingml/2006/main">
+              <a:graphicData uri="http://schemas.openxmlformats.org/drawingml/2006/picture">
+                <pic:pic xmlns:pic="http://schemas.openxmlformats.org/drawingml/2006/picture">
+                  <pic:nvPicPr>
+                    <pic:cNvPr id="1382560112" name="Kép 1382560112"/>
+                    <pic:cNvPicPr/>
+                  </pic:nvPicPr>
+                  <pic:blipFill>
+                    <a:blip r:embed="rId13">
+                      <a:extLst>
+                        <a:ext uri="{28A0092B-C50C-407E-A947-70E740481C1C}">
+                          <a14:useLocalDpi xmlns:a14="http://schemas.microsoft.com/office/drawing/2010/main" val="0"/>
+                        </a:ext>
+                      </a:extLst>
+                    </a:blip>
+                    <a:stretch>
+                      <a:fillRect/>
+                    </a:stretch>
+                  </pic:blipFill>
+                  <pic:spPr>
+                    <a:xfrm>
+                      <a:off x="0" y="0"/>
+                      <a:ext cx="7305675" cy="3638550"/>
+                    </a:xfrm>
+                    <a:prstGeom prst="rect">
+                      <a:avLst/>
+                    </a:prstGeom>
+                  </pic:spPr>
+                </pic:pic>
+              </a:graphicData>
+            </a:graphic>
+          </wp:inline>
+        </w:drawing>
+      </w:r>
+    </w:p>
+    <w:p>
+      <w:pPr>
+        <w:pStyle w:val="Szakdolozatbekezdsek"/>
+      </w:pPr>
+      <w:r>
+        <w:br w:type="page"/>
+      </w:r>
+    </w:p>
+    <w:p>
+      <w:pPr>
+        <w:pStyle w:val="Szakdolozatbekezdsek"/>
+        <w:sectPr>
+          <w:pgSz w:w="16838" w:h="11906" w:orient="landscape"/>
+          <w:pgMar w:top="1417" w:right="1417" w:bottom="1417" w:left="1417" w:header="708" w:footer="708" w:gutter="0"/>
+          <w:cols w:space="708"/>
+          <w:docGrid w:linePitch="360"/>
+        </w:sectPr>
+      </w:pPr>
     </w:p>
     <w:p>
       <w:pPr>
         <w:pStyle w:val="Cmsor2"/>
       </w:pPr>
       <w:r>
+        <w:lastRenderedPageBreak/>
         <w:t>Felhasználók</w:t>
       </w:r>
       <w:r>
@@ -1164,7 +1250,7 @@
                     <pic:cNvPicPr/>
                   </pic:nvPicPr>
                   <pic:blipFill>
-                    <a:blip r:embed="rId13"/>
+                    <a:blip r:embed="rId14"/>
                     <a:stretch>
                       <a:fillRect/>
                     </a:stretch>
@@ -1223,7 +1309,7 @@
                     <pic:cNvPicPr/>
                   </pic:nvPicPr>
                   <pic:blipFill>
-                    <a:blip r:embed="rId14"/>
+                    <a:blip r:embed="rId15"/>
                     <a:stretch>
                       <a:fillRect/>
                     </a:stretch>
@@ -1340,7 +1426,7 @@
                     <pic:cNvPicPr/>
                   </pic:nvPicPr>
                   <pic:blipFill>
-                    <a:blip r:embed="rId15"/>
+                    <a:blip r:embed="rId16"/>
                     <a:stretch>
                       <a:fillRect/>
                     </a:stretch>
@@ -1393,7 +1479,7 @@
                     <pic:cNvPicPr/>
                   </pic:nvPicPr>
                   <pic:blipFill>
-                    <a:blip r:embed="rId16"/>
+                    <a:blip r:embed="rId17"/>
                     <a:stretch>
                       <a:fillRect/>
                     </a:stretch>
@@ -1438,7 +1524,7 @@
                     <pic:cNvPicPr/>
                   </pic:nvPicPr>
                   <pic:blipFill>
-                    <a:blip r:embed="rId17"/>
+                    <a:blip r:embed="rId18"/>
                     <a:stretch>
                       <a:fillRect/>
                     </a:stretch>
@@ -1564,7 +1650,7 @@
                     <pic:cNvPicPr/>
                   </pic:nvPicPr>
                   <pic:blipFill>
-                    <a:blip r:embed="rId18"/>
+                    <a:blip r:embed="rId19"/>
                     <a:stretch>
                       <a:fillRect/>
                     </a:stretch>
@@ -1620,7 +1706,7 @@
                     <pic:cNvPicPr/>
                   </pic:nvPicPr>
                   <pic:blipFill>
-                    <a:blip r:embed="rId19"/>
+                    <a:blip r:embed="rId20"/>
                     <a:stretch>
                       <a:fillRect/>
                     </a:stretch>
@@ -1665,7 +1751,7 @@
                     <pic:cNvPicPr/>
                   </pic:nvPicPr>
                   <pic:blipFill>
-                    <a:blip r:embed="rId20"/>
+                    <a:blip r:embed="rId21"/>
                     <a:stretch>
                       <a:fillRect/>
                     </a:stretch>
@@ -1841,7 +1927,7 @@
                     <pic:cNvPicPr/>
                   </pic:nvPicPr>
                   <pic:blipFill>
-                    <a:blip r:embed="rId21"/>
+                    <a:blip r:embed="rId22"/>
                     <a:stretch>
                       <a:fillRect/>
                     </a:stretch>
@@ -1891,7 +1977,7 @@
                     <pic:cNvPicPr/>
                   </pic:nvPicPr>
                   <pic:blipFill>
-                    <a:blip r:embed="rId22"/>
+                    <a:blip r:embed="rId23"/>
                     <a:stretch>
                       <a:fillRect/>
                     </a:stretch>
@@ -1936,7 +2022,7 @@
                     <pic:cNvPicPr/>
                   </pic:nvPicPr>
                   <pic:blipFill>
-                    <a:blip r:embed="rId23"/>
+                    <a:blip r:embed="rId24"/>
                     <a:stretch>
                       <a:fillRect/>
                     </a:stretch>
@@ -2177,7 +2263,7 @@
                     <pic:cNvPicPr/>
                   </pic:nvPicPr>
                   <pic:blipFill>
-                    <a:blip r:embed="rId24"/>
+                    <a:blip r:embed="rId25"/>
                     <a:stretch>
                       <a:fillRect/>
                     </a:stretch>
@@ -2230,7 +2316,7 @@
                     <pic:cNvPicPr/>
                   </pic:nvPicPr>
                   <pic:blipFill>
-                    <a:blip r:embed="rId25"/>
+                    <a:blip r:embed="rId26"/>
                     <a:stretch>
                       <a:fillRect/>
                     </a:stretch>
@@ -2450,7 +2536,7 @@
                     <pic:cNvPicPr/>
                   </pic:nvPicPr>
                   <pic:blipFill>
-                    <a:blip r:embed="rId26"/>
+                    <a:blip r:embed="rId27"/>
                     <a:stretch>
                       <a:fillRect/>
                     </a:stretch>
@@ -2495,7 +2581,7 @@
                     <pic:cNvPicPr/>
                   </pic:nvPicPr>
                   <pic:blipFill>
-                    <a:blip r:embed="rId27"/>
+                    <a:blip r:embed="rId28"/>
                     <a:stretch>
                       <a:fillRect/>
                     </a:stretch>
@@ -2751,7 +2837,7 @@
                     <pic:cNvPicPr/>
                   </pic:nvPicPr>
                   <pic:blipFill>
-                    <a:blip r:embed="rId28"/>
+                    <a:blip r:embed="rId29"/>
                     <a:stretch>
                       <a:fillRect/>
                     </a:stretch>
@@ -2796,7 +2882,7 @@
                     <pic:cNvPicPr/>
                   </pic:nvPicPr>
                   <pic:blipFill>
-                    <a:blip r:embed="rId29"/>
+                    <a:blip r:embed="rId30"/>
                     <a:stretch>
                       <a:fillRect/>
                     </a:stretch>
@@ -2817,9 +2903,12 @@
         </w:drawing>
       </w:r>
     </w:p>
-    <w:p/>
+    <w:p>
+      <w:r>
+        <w:br w:type="page"/>
+      </w:r>
+    </w:p>
     <w:sectPr>
-      <w:type w:val="continuous"/>
       <w:pgSz w:w="11906" w:h="16838"/>
       <w:pgMar w:top="1417" w:right="1417" w:bottom="1417" w:left="1417" w:header="708" w:footer="708" w:gutter="0"/>
       <w:cols w:space="708"/>

</xml_diff>

<commit_message>
Table from the methods.
</commit_message>
<xml_diff>
--- a/Documents/Vizsgaremek dokumentáció.docx
+++ b/Documents/Vizsgaremek dokumentáció.docx
@@ -9644,11 +9644,11 @@
         <w:tblLook w:val="04A0" w:firstRow="1" w:lastRow="0" w:firstColumn="1" w:lastColumn="0" w:noHBand="0" w:noVBand="1"/>
       </w:tblPr>
       <w:tblGrid>
-        <w:gridCol w:w="1123"/>
-        <w:gridCol w:w="1057"/>
-        <w:gridCol w:w="1075"/>
-        <w:gridCol w:w="1419"/>
-        <w:gridCol w:w="1377"/>
+        <w:gridCol w:w="3693"/>
+        <w:gridCol w:w="2667"/>
+        <w:gridCol w:w="736"/>
+        <w:gridCol w:w="736"/>
+        <w:gridCol w:w="1230"/>
       </w:tblGrid>
       <w:tr>
         <w:trPr>
@@ -9746,6 +9746,37 @@
               <w:pStyle w:val="Szakdolozatbekezdsek"/>
               <w:ind w:firstLine="0"/>
             </w:pPr>
+            <w:r>
+              <w:t>login(</w:t>
+            </w:r>
+            <w:proofErr w:type="spellStart"/>
+            <w:r>
+              <w:rPr>
+                <w:b w:val="0"/>
+                <w:bCs w:val="0"/>
+              </w:rPr>
+              <w:t>username</w:t>
+            </w:r>
+            <w:proofErr w:type="spellEnd"/>
+            <w:r>
+              <w:rPr>
+                <w:b w:val="0"/>
+                <w:bCs w:val="0"/>
+              </w:rPr>
+              <w:t xml:space="preserve">, </w:t>
+            </w:r>
+            <w:proofErr w:type="spellStart"/>
+            <w:r>
+              <w:rPr>
+                <w:b w:val="0"/>
+                <w:bCs w:val="0"/>
+              </w:rPr>
+              <w:t>password</w:t>
+            </w:r>
+            <w:proofErr w:type="spellEnd"/>
+            <w:r>
+              <w:t>)</w:t>
+            </w:r>
           </w:p>
         </w:tc>
         <w:tc>
@@ -9758,6 +9789,9 @@
               <w:ind w:firstLine="0"/>
               <w:cnfStyle w:val="000000100000" w:firstRow="0" w:lastRow="0" w:firstColumn="0" w:lastColumn="0" w:oddVBand="0" w:evenVBand="0" w:oddHBand="1" w:evenHBand="0" w:firstRowFirstColumn="0" w:firstRowLastColumn="0" w:lastRowFirstColumn="0" w:lastRowLastColumn="0"/>
             </w:pPr>
+            <w:r>
+              <w:t>Login()</w:t>
+            </w:r>
           </w:p>
         </w:tc>
         <w:tc>
@@ -9811,6 +9845,42 @@
               <w:pStyle w:val="Szakdolozatbekezdsek"/>
               <w:ind w:firstLine="0"/>
             </w:pPr>
+            <w:proofErr w:type="spellStart"/>
+            <w:r>
+              <w:t>registerNerUser</w:t>
+            </w:r>
+            <w:proofErr w:type="spellEnd"/>
+            <w:r>
+              <w:t>(</w:t>
+            </w:r>
+            <w:proofErr w:type="spellStart"/>
+            <w:r>
+              <w:rPr>
+                <w:b w:val="0"/>
+                <w:bCs w:val="0"/>
+              </w:rPr>
+              <w:t>username</w:t>
+            </w:r>
+            <w:proofErr w:type="spellEnd"/>
+            <w:r>
+              <w:rPr>
+                <w:b w:val="0"/>
+                <w:bCs w:val="0"/>
+              </w:rPr>
+              <w:t xml:space="preserve">, </w:t>
+            </w:r>
+            <w:proofErr w:type="spellStart"/>
+            <w:r>
+              <w:rPr>
+                <w:b w:val="0"/>
+                <w:bCs w:val="0"/>
+              </w:rPr>
+              <w:t>password</w:t>
+            </w:r>
+            <w:proofErr w:type="spellEnd"/>
+            <w:r>
+              <w:t>)</w:t>
+            </w:r>
           </w:p>
         </w:tc>
         <w:tc>
@@ -9823,6 +9893,14 @@
               <w:ind w:firstLine="0"/>
               <w:cnfStyle w:val="000000000000" w:firstRow="0" w:lastRow="0" w:firstColumn="0" w:lastColumn="0" w:oddVBand="0" w:evenVBand="0" w:oddHBand="0" w:evenHBand="0" w:firstRowFirstColumn="0" w:firstRowLastColumn="0" w:lastRowFirstColumn="0" w:lastRowLastColumn="0"/>
             </w:pPr>
+            <w:proofErr w:type="spellStart"/>
+            <w:r>
+              <w:t>CreateUser</w:t>
+            </w:r>
+            <w:proofErr w:type="spellEnd"/>
+            <w:r>
+              <w:t>()</w:t>
+            </w:r>
           </w:p>
         </w:tc>
         <w:tc>
@@ -9877,6 +9955,14 @@
               <w:pStyle w:val="Szakdolozatbekezdsek"/>
               <w:ind w:firstLine="0"/>
             </w:pPr>
+            <w:proofErr w:type="spellStart"/>
+            <w:r>
+              <w:t>getPineTypes</w:t>
+            </w:r>
+            <w:proofErr w:type="spellEnd"/>
+            <w:r>
+              <w:t>()</w:t>
+            </w:r>
           </w:p>
         </w:tc>
         <w:tc>
@@ -9889,6 +9975,14 @@
               <w:ind w:firstLine="0"/>
               <w:cnfStyle w:val="000000100000" w:firstRow="0" w:lastRow="0" w:firstColumn="0" w:lastColumn="0" w:oddVBand="0" w:evenVBand="0" w:oddHBand="1" w:evenHBand="0" w:firstRowFirstColumn="0" w:firstRowLastColumn="0" w:lastRowFirstColumn="0" w:lastRowLastColumn="0"/>
             </w:pPr>
+            <w:proofErr w:type="spellStart"/>
+            <w:r>
+              <w:t>GetPineTypes</w:t>
+            </w:r>
+            <w:proofErr w:type="spellEnd"/>
+            <w:r>
+              <w:t>()</w:t>
+            </w:r>
           </w:p>
         </w:tc>
         <w:tc>
@@ -9942,6 +10036,14 @@
               <w:pStyle w:val="Szakdolozatbekezdsek"/>
               <w:ind w:firstLine="0"/>
             </w:pPr>
+            <w:proofErr w:type="spellStart"/>
+            <w:r>
+              <w:t>GetPineBatchStates</w:t>
+            </w:r>
+            <w:proofErr w:type="spellEnd"/>
+            <w:r>
+              <w:t>()</w:t>
+            </w:r>
           </w:p>
         </w:tc>
         <w:tc>
@@ -9954,6 +10056,14 @@
               <w:ind w:firstLine="0"/>
               <w:cnfStyle w:val="000000000000" w:firstRow="0" w:lastRow="0" w:firstColumn="0" w:lastColumn="0" w:oddVBand="0" w:evenVBand="0" w:oddHBand="0" w:evenHBand="0" w:firstRowFirstColumn="0" w:firstRowLastColumn="0" w:lastRowFirstColumn="0" w:lastRowLastColumn="0"/>
             </w:pPr>
+            <w:proofErr w:type="spellStart"/>
+            <w:r>
+              <w:t>GetPineBatchState</w:t>
+            </w:r>
+            <w:proofErr w:type="spellEnd"/>
+            <w:r>
+              <w:t>()</w:t>
+            </w:r>
           </w:p>
         </w:tc>
         <w:tc>
@@ -10008,6 +10118,14 @@
               <w:pStyle w:val="Szakdolozatbekezdsek"/>
               <w:ind w:firstLine="0"/>
             </w:pPr>
+            <w:proofErr w:type="spellStart"/>
+            <w:r>
+              <w:t>GetPineBatchOrder</w:t>
+            </w:r>
+            <w:proofErr w:type="spellEnd"/>
+            <w:r>
+              <w:t>()</w:t>
+            </w:r>
           </w:p>
         </w:tc>
         <w:tc>
@@ -10020,6 +10138,14 @@
               <w:ind w:firstLine="0"/>
               <w:cnfStyle w:val="000000100000" w:firstRow="0" w:lastRow="0" w:firstColumn="0" w:lastColumn="0" w:oddVBand="0" w:evenVBand="0" w:oddHBand="1" w:evenHBand="0" w:firstRowFirstColumn="0" w:firstRowLastColumn="0" w:lastRowFirstColumn="0" w:lastRowLastColumn="0"/>
             </w:pPr>
+            <w:proofErr w:type="spellStart"/>
+            <w:r>
+              <w:t>GetAllPinebatchOrders</w:t>
+            </w:r>
+            <w:proofErr w:type="spellEnd"/>
+            <w:r>
+              <w:t>()</w:t>
+            </w:r>
           </w:p>
         </w:tc>
         <w:tc>
@@ -10073,6 +10199,58 @@
               <w:pStyle w:val="Szakdolozatbekezdsek"/>
               <w:ind w:firstLine="0"/>
             </w:pPr>
+            <w:proofErr w:type="spellStart"/>
+            <w:r>
+              <w:t>RegisterNewPineBatchOrder</w:t>
+            </w:r>
+            <w:proofErr w:type="spellEnd"/>
+            <w:r>
+              <w:t>(</w:t>
+            </w:r>
+            <w:proofErr w:type="spellStart"/>
+            <w:r>
+              <w:rPr>
+                <w:b w:val="0"/>
+                <w:bCs w:val="0"/>
+              </w:rPr>
+              <w:t>pine_type</w:t>
+            </w:r>
+            <w:proofErr w:type="spellEnd"/>
+            <w:r>
+              <w:rPr>
+                <w:b w:val="0"/>
+                <w:bCs w:val="0"/>
+              </w:rPr>
+              <w:t xml:space="preserve">, </w:t>
+            </w:r>
+            <w:proofErr w:type="spellStart"/>
+            <w:r>
+              <w:rPr>
+                <w:b w:val="0"/>
+                <w:bCs w:val="0"/>
+              </w:rPr>
+              <w:t>batch_state</w:t>
+            </w:r>
+            <w:proofErr w:type="spellEnd"/>
+            <w:r>
+              <w:rPr>
+                <w:b w:val="0"/>
+                <w:bCs w:val="0"/>
+              </w:rPr>
+              <w:t xml:space="preserve">, </w:t>
+            </w:r>
+            <w:proofErr w:type="spellStart"/>
+            <w:r>
+              <w:rPr>
+                <w:b w:val="0"/>
+                <w:bCs w:val="0"/>
+              </w:rPr>
+              <w:t>quanity</w:t>
+            </w:r>
+            <w:proofErr w:type="spellEnd"/>
+            <w:r>
+              <w:t>)</w:t>
+            </w:r>
           </w:p>
         </w:tc>
         <w:tc>
@@ -10085,6 +10263,14 @@
               <w:ind w:firstLine="0"/>
               <w:cnfStyle w:val="000000000000" w:firstRow="0" w:lastRow="0" w:firstColumn="0" w:lastColumn="0" w:oddVBand="0" w:evenVBand="0" w:oddHBand="0" w:evenHBand="0" w:firstRowFirstColumn="0" w:firstRowLastColumn="0" w:lastRowFirstColumn="0" w:lastRowLastColumn="0"/>
             </w:pPr>
+            <w:proofErr w:type="spellStart"/>
+            <w:r>
+              <w:t>CreatePinebatchOrder</w:t>
+            </w:r>
+            <w:proofErr w:type="spellEnd"/>
+            <w:r>
+              <w:t>()</w:t>
+            </w:r>
           </w:p>
         </w:tc>
         <w:tc>
@@ -10139,6 +10325,14 @@
               <w:pStyle w:val="Szakdolozatbekezdsek"/>
               <w:ind w:firstLine="0"/>
             </w:pPr>
+            <w:proofErr w:type="spellStart"/>
+            <w:r>
+              <w:t>GetPineBaseTypes</w:t>
+            </w:r>
+            <w:proofErr w:type="spellEnd"/>
+            <w:r>
+              <w:t>()</w:t>
+            </w:r>
           </w:p>
         </w:tc>
         <w:tc>
@@ -10151,6 +10345,14 @@
               <w:ind w:firstLine="0"/>
               <w:cnfStyle w:val="000000100000" w:firstRow="0" w:lastRow="0" w:firstColumn="0" w:lastColumn="0" w:oddVBand="0" w:evenVBand="0" w:oddHBand="1" w:evenHBand="0" w:firstRowFirstColumn="0" w:firstRowLastColumn="0" w:lastRowFirstColumn="0" w:lastRowLastColumn="0"/>
             </w:pPr>
+            <w:proofErr w:type="spellStart"/>
+            <w:r>
+              <w:t>GetPineBaseTypes</w:t>
+            </w:r>
+            <w:proofErr w:type="spellEnd"/>
+            <w:r>
+              <w:t>()</w:t>
+            </w:r>
           </w:p>
         </w:tc>
         <w:tc>
@@ -10204,6 +10406,106 @@
               <w:pStyle w:val="Szakdolozatbekezdsek"/>
               <w:ind w:firstLine="0"/>
             </w:pPr>
+            <w:proofErr w:type="spellStart"/>
+            <w:r>
+              <w:t>RegisterNewCostumer</w:t>
+            </w:r>
+            <w:proofErr w:type="spellEnd"/>
+            <w:r>
+              <w:t>(</w:t>
+            </w:r>
+            <w:proofErr w:type="spellStart"/>
+            <w:r>
+              <w:rPr>
+                <w:b w:val="0"/>
+                <w:bCs w:val="0"/>
+              </w:rPr>
+              <w:t>costumer_name</w:t>
+            </w:r>
+            <w:proofErr w:type="spellEnd"/>
+            <w:r>
+              <w:rPr>
+                <w:b w:val="0"/>
+                <w:bCs w:val="0"/>
+              </w:rPr>
+              <w:t xml:space="preserve">, </w:t>
+            </w:r>
+            <w:proofErr w:type="spellStart"/>
+            <w:r>
+              <w:rPr>
+                <w:b w:val="0"/>
+                <w:bCs w:val="0"/>
+              </w:rPr>
+              <w:t>costumer_postal_code</w:t>
+            </w:r>
+            <w:proofErr w:type="spellEnd"/>
+            <w:r>
+              <w:rPr>
+                <w:b w:val="0"/>
+                <w:bCs w:val="0"/>
+              </w:rPr>
+              <w:t xml:space="preserve">, </w:t>
+            </w:r>
+            <w:proofErr w:type="spellStart"/>
+            <w:r>
+              <w:rPr>
+                <w:b w:val="0"/>
+                <w:bCs w:val="0"/>
+              </w:rPr>
+              <w:t>costumer_city</w:t>
+            </w:r>
+            <w:proofErr w:type="spellEnd"/>
+            <w:r>
+              <w:rPr>
+                <w:b w:val="0"/>
+                <w:bCs w:val="0"/>
+              </w:rPr>
+              <w:t xml:space="preserve">, </w:t>
+            </w:r>
+            <w:proofErr w:type="spellStart"/>
+            <w:r>
+              <w:rPr>
+                <w:b w:val="0"/>
+                <w:bCs w:val="0"/>
+              </w:rPr>
+              <w:t>costumer_address</w:t>
+            </w:r>
+            <w:proofErr w:type="spellEnd"/>
+            <w:r>
+              <w:rPr>
+                <w:b w:val="0"/>
+                <w:bCs w:val="0"/>
+              </w:rPr>
+              <w:t xml:space="preserve">, </w:t>
+            </w:r>
+            <w:proofErr w:type="spellStart"/>
+            <w:r>
+              <w:rPr>
+                <w:b w:val="0"/>
+                <w:bCs w:val="0"/>
+              </w:rPr>
+              <w:t>costumer_phonenumber</w:t>
+            </w:r>
+            <w:proofErr w:type="spellEnd"/>
+            <w:r>
+              <w:rPr>
+                <w:b w:val="0"/>
+                <w:bCs w:val="0"/>
+              </w:rPr>
+              <w:t xml:space="preserve">, </w:t>
+            </w:r>
+            <w:proofErr w:type="spellStart"/>
+            <w:r>
+              <w:rPr>
+                <w:b w:val="0"/>
+                <w:bCs w:val="0"/>
+              </w:rPr>
+              <w:t>costumer_taxnumber</w:t>
+            </w:r>
+            <w:proofErr w:type="spellEnd"/>
+            <w:r>
+              <w:t>)</w:t>
+            </w:r>
           </w:p>
         </w:tc>
         <w:tc>
@@ -10216,6 +10518,14 @@
               <w:ind w:firstLine="0"/>
               <w:cnfStyle w:val="000000000000" w:firstRow="0" w:lastRow="0" w:firstColumn="0" w:lastColumn="0" w:oddVBand="0" w:evenVBand="0" w:oddHBand="0" w:evenHBand="0" w:firstRowFirstColumn="0" w:firstRowLastColumn="0" w:lastRowFirstColumn="0" w:lastRowLastColumn="0"/>
             </w:pPr>
+            <w:proofErr w:type="spellStart"/>
+            <w:r>
+              <w:t>CreateCostumer</w:t>
+            </w:r>
+            <w:proofErr w:type="spellEnd"/>
+            <w:r>
+              <w:t>()</w:t>
+            </w:r>
           </w:p>
         </w:tc>
         <w:tc>
@@ -10270,6 +10580,14 @@
               <w:pStyle w:val="Szakdolozatbekezdsek"/>
               <w:ind w:firstLine="0"/>
             </w:pPr>
+            <w:proofErr w:type="spellStart"/>
+            <w:r>
+              <w:t>GetAllCostumers</w:t>
+            </w:r>
+            <w:proofErr w:type="spellEnd"/>
+            <w:r>
+              <w:t>()</w:t>
+            </w:r>
           </w:p>
         </w:tc>
         <w:tc>
@@ -10282,6 +10600,14 @@
               <w:ind w:firstLine="0"/>
               <w:cnfStyle w:val="000000100000" w:firstRow="0" w:lastRow="0" w:firstColumn="0" w:lastColumn="0" w:oddVBand="0" w:evenVBand="0" w:oddHBand="1" w:evenHBand="0" w:firstRowFirstColumn="0" w:firstRowLastColumn="0" w:lastRowFirstColumn="0" w:lastRowLastColumn="0"/>
             </w:pPr>
+            <w:proofErr w:type="spellStart"/>
+            <w:r>
+              <w:t>GetAllCostumers</w:t>
+            </w:r>
+            <w:proofErr w:type="spellEnd"/>
+            <w:r>
+              <w:t>()</w:t>
+            </w:r>
           </w:p>
         </w:tc>
         <w:tc>
@@ -10335,6 +10661,14 @@
               <w:pStyle w:val="Szakdolozatbekezdsek"/>
               <w:ind w:firstLine="0"/>
             </w:pPr>
+            <w:proofErr w:type="spellStart"/>
+            <w:r>
+              <w:t>GetCostumersList</w:t>
+            </w:r>
+            <w:proofErr w:type="spellEnd"/>
+            <w:r>
+              <w:t>()</w:t>
+            </w:r>
           </w:p>
         </w:tc>
         <w:tc>
@@ -10347,6 +10681,14 @@
               <w:ind w:firstLine="0"/>
               <w:cnfStyle w:val="000000000000" w:firstRow="0" w:lastRow="0" w:firstColumn="0" w:lastColumn="0" w:oddVBand="0" w:evenVBand="0" w:oddHBand="0" w:evenHBand="0" w:firstRowFirstColumn="0" w:firstRowLastColumn="0" w:lastRowFirstColumn="0" w:lastRowLastColumn="0"/>
             </w:pPr>
+            <w:proofErr w:type="spellStart"/>
+            <w:r>
+              <w:t>GetCostumerList</w:t>
+            </w:r>
+            <w:proofErr w:type="spellEnd"/>
+            <w:r>
+              <w:t>()</w:t>
+            </w:r>
           </w:p>
         </w:tc>
         <w:tc>
@@ -10401,6 +10743,113 @@
               <w:pStyle w:val="Szakdolozatbekezdsek"/>
               <w:ind w:firstLine="0"/>
             </w:pPr>
+            <w:proofErr w:type="spellStart"/>
+            <w:r>
+              <w:lastRenderedPageBreak/>
+              <w:t>RegisterNewPinebaseOrder</w:t>
+            </w:r>
+            <w:proofErr w:type="spellEnd"/>
+            <w:r>
+              <w:t>(</w:t>
+            </w:r>
+            <w:proofErr w:type="spellStart"/>
+            <w:r>
+              <w:rPr>
+                <w:b w:val="0"/>
+                <w:bCs w:val="0"/>
+              </w:rPr>
+              <w:t>costumerId</w:t>
+            </w:r>
+            <w:proofErr w:type="spellEnd"/>
+            <w:r>
+              <w:rPr>
+                <w:b w:val="0"/>
+                <w:bCs w:val="0"/>
+              </w:rPr>
+              <w:t xml:space="preserve">, </w:t>
+            </w:r>
+            <w:proofErr w:type="spellStart"/>
+            <w:r>
+              <w:rPr>
+                <w:b w:val="0"/>
+                <w:bCs w:val="0"/>
+              </w:rPr>
+              <w:t>pineTypeId</w:t>
+            </w:r>
+            <w:proofErr w:type="spellEnd"/>
+            <w:r>
+              <w:rPr>
+                <w:b w:val="0"/>
+                <w:bCs w:val="0"/>
+              </w:rPr>
+              <w:t xml:space="preserve">, </w:t>
+            </w:r>
+            <w:proofErr w:type="spellStart"/>
+            <w:r>
+              <w:rPr>
+                <w:b w:val="0"/>
+                <w:bCs w:val="0"/>
+              </w:rPr>
+              <w:t>pinebasetype</w:t>
+            </w:r>
+            <w:proofErr w:type="spellEnd"/>
+            <w:r>
+              <w:rPr>
+                <w:b w:val="0"/>
+                <w:bCs w:val="0"/>
+              </w:rPr>
+              <w:t xml:space="preserve">, </w:t>
+            </w:r>
+            <w:proofErr w:type="spellStart"/>
+            <w:r>
+              <w:rPr>
+                <w:b w:val="0"/>
+                <w:bCs w:val="0"/>
+              </w:rPr>
+              <w:t>baseQuantity</w:t>
+            </w:r>
+            <w:proofErr w:type="spellEnd"/>
+            <w:r>
+              <w:rPr>
+                <w:b w:val="0"/>
+                <w:bCs w:val="0"/>
+              </w:rPr>
+              <w:t xml:space="preserve">, </w:t>
+            </w:r>
+            <w:proofErr w:type="spellStart"/>
+            <w:r>
+              <w:rPr>
+                <w:b w:val="0"/>
+                <w:bCs w:val="0"/>
+              </w:rPr>
+              <w:t>baseOrderedDate</w:t>
+            </w:r>
+            <w:proofErr w:type="spellEnd"/>
+            <w:r>
+              <w:rPr>
+                <w:b w:val="0"/>
+                <w:bCs w:val="0"/>
+              </w:rPr>
+              <w:t xml:space="preserve">, </w:t>
+            </w:r>
+            <w:proofErr w:type="spellStart"/>
+            <w:r>
+              <w:rPr>
+                <w:b w:val="0"/>
+                <w:bCs w:val="0"/>
+              </w:rPr>
+              <w:t>baseState</w:t>
+            </w:r>
+            <w:proofErr w:type="spellEnd"/>
+          </w:p>
+          <w:p>
+            <w:pPr>
+              <w:pStyle w:val="Szakdolozatbekezdsek"/>
+              <w:ind w:firstLine="0"/>
+            </w:pPr>
+            <w:r>
+              <w:t>)</w:t>
+            </w:r>
           </w:p>
         </w:tc>
         <w:tc>
@@ -10413,6 +10862,14 @@
               <w:ind w:firstLine="0"/>
               <w:cnfStyle w:val="000000100000" w:firstRow="0" w:lastRow="0" w:firstColumn="0" w:lastColumn="0" w:oddVBand="0" w:evenVBand="0" w:oddHBand="1" w:evenHBand="0" w:firstRowFirstColumn="0" w:firstRowLastColumn="0" w:lastRowFirstColumn="0" w:lastRowLastColumn="0"/>
             </w:pPr>
+            <w:proofErr w:type="spellStart"/>
+            <w:r>
+              <w:t>CreatePinebaseOrder</w:t>
+            </w:r>
+            <w:proofErr w:type="spellEnd"/>
+            <w:r>
+              <w:t>()</w:t>
+            </w:r>
           </w:p>
         </w:tc>
         <w:tc>
@@ -10466,6 +10923,34 @@
               <w:pStyle w:val="Szakdolozatbekezdsek"/>
               <w:ind w:firstLine="0"/>
             </w:pPr>
+            <w:proofErr w:type="spellStart"/>
+            <w:r>
+              <w:t>GetAllPinebaseOrders</w:t>
+            </w:r>
+            <w:proofErr w:type="spellEnd"/>
+            <w:r>
+              <w:t>()</w:t>
+            </w:r>
+          </w:p>
+        </w:tc>
+        <w:tc>
+          <w:tcPr>
+            <w:tcW w:w="0" w:type="auto"/>
+          </w:tcPr>
+          <w:p>
+            <w:pPr>
+              <w:pStyle w:val="Szakdolozatbekezdsek"/>
+              <w:ind w:firstLine="0"/>
+              <w:cnfStyle w:val="000000000000" w:firstRow="0" w:lastRow="0" w:firstColumn="0" w:lastColumn="0" w:oddVBand="0" w:evenVBand="0" w:oddHBand="0" w:evenHBand="0" w:firstRowFirstColumn="0" w:firstRowLastColumn="0" w:lastRowFirstColumn="0" w:lastRowLastColumn="0"/>
+            </w:pPr>
+            <w:proofErr w:type="spellStart"/>
+            <w:r>
+              <w:t>GetAllPinebaseOrder</w:t>
+            </w:r>
+            <w:proofErr w:type="spellEnd"/>
+            <w:r>
+              <w:t>()</w:t>
+            </w:r>
           </w:p>
         </w:tc>
         <w:tc>
@@ -10504,6 +10989,48 @@
             </w:pPr>
           </w:p>
         </w:tc>
+      </w:tr>
+      <w:tr>
+        <w:trPr>
+          <w:cnfStyle w:val="000000100000" w:firstRow="0" w:lastRow="0" w:firstColumn="0" w:lastColumn="0" w:oddVBand="0" w:evenVBand="0" w:oddHBand="1" w:evenHBand="0" w:firstRowFirstColumn="0" w:firstRowLastColumn="0" w:lastRowFirstColumn="0" w:lastRowLastColumn="0"/>
+          <w:jc w:val="center"/>
+        </w:trPr>
+        <w:tc>
+          <w:tcPr>
+            <w:cnfStyle w:val="001000000000" w:firstRow="0" w:lastRow="0" w:firstColumn="1" w:lastColumn="0" w:oddVBand="0" w:evenVBand="0" w:oddHBand="0" w:evenHBand="0" w:firstRowFirstColumn="0" w:firstRowLastColumn="0" w:lastRowFirstColumn="0" w:lastRowLastColumn="0"/>
+            <w:tcW w:w="0" w:type="auto"/>
+          </w:tcPr>
+          <w:p>
+            <w:pPr>
+              <w:pStyle w:val="Szakdolozatbekezdsek"/>
+              <w:ind w:firstLine="0"/>
+            </w:pPr>
+            <w:proofErr w:type="spellStart"/>
+            <w:r>
+              <w:t>UpdatePinebaseOrderState</w:t>
+            </w:r>
+            <w:proofErr w:type="spellEnd"/>
+            <w:r>
+              <w:t>(</w:t>
+            </w:r>
+            <w:proofErr w:type="spellStart"/>
+            <w:r>
+              <w:t>baseId</w:t>
+            </w:r>
+            <w:proofErr w:type="spellEnd"/>
+            <w:r>
+              <w:t xml:space="preserve">, </w:t>
+            </w:r>
+            <w:proofErr w:type="spellStart"/>
+            <w:r>
+              <w:t>baseState</w:t>
+            </w:r>
+            <w:proofErr w:type="spellEnd"/>
+            <w:r>
+              <w:t>)</w:t>
+            </w:r>
+          </w:p>
+        </w:tc>
         <w:tc>
           <w:tcPr>
             <w:tcW w:w="0" w:type="auto"/>
@@ -10512,7 +11039,51 @@
             <w:pPr>
               <w:pStyle w:val="Szakdolozatbekezdsek"/>
               <w:ind w:firstLine="0"/>
-              <w:cnfStyle w:val="000000000000" w:firstRow="0" w:lastRow="0" w:firstColumn="0" w:lastColumn="0" w:oddVBand="0" w:evenVBand="0" w:oddHBand="0" w:evenHBand="0" w:firstRowFirstColumn="0" w:firstRowLastColumn="0" w:lastRowFirstColumn="0" w:lastRowLastColumn="0"/>
+              <w:cnfStyle w:val="000000100000" w:firstRow="0" w:lastRow="0" w:firstColumn="0" w:lastColumn="0" w:oddVBand="0" w:evenVBand="0" w:oddHBand="1" w:evenHBand="0" w:firstRowFirstColumn="0" w:firstRowLastColumn="0" w:lastRowFirstColumn="0" w:lastRowLastColumn="0"/>
+            </w:pPr>
+            <w:proofErr w:type="spellStart"/>
+            <w:r>
+              <w:t>UpdatePinebaseOrderState</w:t>
+            </w:r>
+            <w:proofErr w:type="spellEnd"/>
+            <w:r>
+              <w:t>()</w:t>
+            </w:r>
+          </w:p>
+        </w:tc>
+        <w:tc>
+          <w:tcPr>
+            <w:tcW w:w="0" w:type="auto"/>
+          </w:tcPr>
+          <w:p>
+            <w:pPr>
+              <w:pStyle w:val="Szakdolozatbekezdsek"/>
+              <w:ind w:firstLine="0"/>
+              <w:cnfStyle w:val="000000100000" w:firstRow="0" w:lastRow="0" w:firstColumn="0" w:lastColumn="0" w:oddVBand="0" w:evenVBand="0" w:oddHBand="1" w:evenHBand="0" w:firstRowFirstColumn="0" w:firstRowLastColumn="0" w:lastRowFirstColumn="0" w:lastRowLastColumn="0"/>
+            </w:pPr>
+          </w:p>
+        </w:tc>
+        <w:tc>
+          <w:tcPr>
+            <w:tcW w:w="0" w:type="auto"/>
+          </w:tcPr>
+          <w:p>
+            <w:pPr>
+              <w:pStyle w:val="Szakdolozatbekezdsek"/>
+              <w:ind w:firstLine="0"/>
+              <w:cnfStyle w:val="000000100000" w:firstRow="0" w:lastRow="0" w:firstColumn="0" w:lastColumn="0" w:oddVBand="0" w:evenVBand="0" w:oddHBand="1" w:evenHBand="0" w:firstRowFirstColumn="0" w:firstRowLastColumn="0" w:lastRowFirstColumn="0" w:lastRowLastColumn="0"/>
+            </w:pPr>
+          </w:p>
+        </w:tc>
+        <w:tc>
+          <w:tcPr>
+            <w:tcW w:w="0" w:type="auto"/>
+          </w:tcPr>
+          <w:p>
+            <w:pPr>
+              <w:pStyle w:val="Szakdolozatbekezdsek"/>
+              <w:ind w:firstLine="0"/>
+              <w:cnfStyle w:val="000000100000" w:firstRow="0" w:lastRow="0" w:firstColumn="0" w:lastColumn="0" w:oddVBand="0" w:evenVBand="0" w:oddHBand="1" w:evenHBand="0" w:firstRowFirstColumn="0" w:firstRowLastColumn="0" w:lastRowFirstColumn="0" w:lastRowLastColumn="0"/>
             </w:pPr>
           </w:p>
         </w:tc>
@@ -12166,7 +12737,6 @@
   <w:style w:type="character" w:default="1" w:styleId="Bekezdsalapbettpusa">
     <w:name w:val="Default Paragraph Font"/>
     <w:uiPriority w:val="1"/>
-    <w:semiHidden/>
     <w:unhideWhenUsed/>
   </w:style>
   <w:style w:type="table" w:default="1" w:styleId="Normltblzat">

</xml_diff>

<commit_message>
The Project is DONE!
</commit_message>
<xml_diff>
--- a/Documents/Vizsgaremek dokumentáció.docx
+++ b/Documents/Vizsgaremek dokumentáció.docx
@@ -3965,7 +3965,7 @@
           <w:r>
             <w:fldChar w:fldCharType="separate"/>
           </w:r>
-          <w:hyperlink w:anchor="_Toc240134225" w:history="1">
+          <w:hyperlink w:anchor="_Toc240193036" w:history="1">
             <w:r>
               <w:rPr>
                 <w:rStyle w:val="Hiperhivatkozs"/>
@@ -3992,7 +3992,7 @@
                 <w:noProof/>
                 <w:webHidden/>
               </w:rPr>
-              <w:instrText xml:space="preserve"> PAGEREF _Toc240134225 \h </w:instrText>
+              <w:instrText xml:space="preserve"> PAGEREF _Toc240193036 \h </w:instrText>
             </w:r>
             <w:r>
               <w:rPr>
@@ -4035,7 +4035,7 @@
               <w:lang w:eastAsia="hu-HU"/>
             </w:rPr>
           </w:pPr>
-          <w:hyperlink w:anchor="_Toc240134226" w:history="1">
+          <w:hyperlink w:anchor="_Toc240193037" w:history="1">
             <w:r>
               <w:rPr>
                 <w:rStyle w:val="Hiperhivatkozs"/>
@@ -4062,7 +4062,7 @@
                 <w:noProof/>
                 <w:webHidden/>
               </w:rPr>
-              <w:instrText xml:space="preserve"> PAGEREF _Toc240134226 \h </w:instrText>
+              <w:instrText xml:space="preserve"> PAGEREF _Toc240193037 \h </w:instrText>
             </w:r>
             <w:r>
               <w:rPr>
@@ -4105,7 +4105,7 @@
               <w:lang w:eastAsia="hu-HU"/>
             </w:rPr>
           </w:pPr>
-          <w:hyperlink w:anchor="_Toc240134227" w:history="1">
+          <w:hyperlink w:anchor="_Toc240193038" w:history="1">
             <w:r>
               <w:rPr>
                 <w:rStyle w:val="Hiperhivatkozs"/>
@@ -4132,7 +4132,7 @@
                 <w:noProof/>
                 <w:webHidden/>
               </w:rPr>
-              <w:instrText xml:space="preserve"> PAGEREF _Toc240134227 \h </w:instrText>
+              <w:instrText xml:space="preserve"> PAGEREF _Toc240193038 \h </w:instrText>
             </w:r>
             <w:r>
               <w:rPr>
@@ -4175,7 +4175,7 @@
               <w:lang w:eastAsia="hu-HU"/>
             </w:rPr>
           </w:pPr>
-          <w:hyperlink w:anchor="_Toc240134228" w:history="1">
+          <w:hyperlink w:anchor="_Toc240193039" w:history="1">
             <w:r>
               <w:rPr>
                 <w:rStyle w:val="Hiperhivatkozs"/>
@@ -4202,7 +4202,7 @@
                 <w:noProof/>
                 <w:webHidden/>
               </w:rPr>
-              <w:instrText xml:space="preserve"> PAGEREF _Toc240134228 \h </w:instrText>
+              <w:instrText xml:space="preserve"> PAGEREF _Toc240193039 \h </w:instrText>
             </w:r>
             <w:r>
               <w:rPr>
@@ -4245,7 +4245,7 @@
               <w:lang w:eastAsia="hu-HU"/>
             </w:rPr>
           </w:pPr>
-          <w:hyperlink w:anchor="_Toc240134229" w:history="1">
+          <w:hyperlink w:anchor="_Toc240193040" w:history="1">
             <w:r>
               <w:rPr>
                 <w:rStyle w:val="Hiperhivatkozs"/>
@@ -4272,7 +4272,7 @@
                 <w:noProof/>
                 <w:webHidden/>
               </w:rPr>
-              <w:instrText xml:space="preserve"> PAGEREF _Toc240134229 \h </w:instrText>
+              <w:instrText xml:space="preserve"> PAGEREF _Toc240193040 \h </w:instrText>
             </w:r>
             <w:r>
               <w:rPr>
@@ -4315,7 +4315,7 @@
               <w:lang w:eastAsia="hu-HU"/>
             </w:rPr>
           </w:pPr>
-          <w:hyperlink w:anchor="_Toc240134230" w:history="1">
+          <w:hyperlink w:anchor="_Toc240193041" w:history="1">
             <w:r>
               <w:rPr>
                 <w:rStyle w:val="Hiperhivatkozs"/>
@@ -4342,7 +4342,7 @@
                 <w:noProof/>
                 <w:webHidden/>
               </w:rPr>
-              <w:instrText xml:space="preserve"> PAGEREF _Toc240134230 \h </w:instrText>
+              <w:instrText xml:space="preserve"> PAGEREF _Toc240193041 \h </w:instrText>
             </w:r>
             <w:r>
               <w:rPr>
@@ -4385,7 +4385,7 @@
               <w:lang w:eastAsia="hu-HU"/>
             </w:rPr>
           </w:pPr>
-          <w:hyperlink w:anchor="_Toc240134231" w:history="1">
+          <w:hyperlink w:anchor="_Toc240193042" w:history="1">
             <w:r>
               <w:rPr>
                 <w:rStyle w:val="Hiperhivatkozs"/>
@@ -4412,7 +4412,7 @@
                 <w:noProof/>
                 <w:webHidden/>
               </w:rPr>
-              <w:instrText xml:space="preserve"> PAGEREF _Toc240134231 \h </w:instrText>
+              <w:instrText xml:space="preserve"> PAGEREF _Toc240193042 \h </w:instrText>
             </w:r>
             <w:r>
               <w:rPr>
@@ -4455,7 +4455,7 @@
               <w:lang w:eastAsia="hu-HU"/>
             </w:rPr>
           </w:pPr>
-          <w:hyperlink w:anchor="_Toc240134232" w:history="1">
+          <w:hyperlink w:anchor="_Toc240193043" w:history="1">
             <w:r>
               <w:rPr>
                 <w:rStyle w:val="Hiperhivatkozs"/>
@@ -4482,7 +4482,7 @@
                 <w:noProof/>
                 <w:webHidden/>
               </w:rPr>
-              <w:instrText xml:space="preserve"> PAGEREF _Toc240134232 \h </w:instrText>
+              <w:instrText xml:space="preserve"> PAGEREF _Toc240193043 \h </w:instrText>
             </w:r>
             <w:r>
               <w:rPr>
@@ -4525,7 +4525,7 @@
               <w:lang w:eastAsia="hu-HU"/>
             </w:rPr>
           </w:pPr>
-          <w:hyperlink w:anchor="_Toc240134233" w:history="1">
+          <w:hyperlink w:anchor="_Toc240193044" w:history="1">
             <w:r>
               <w:rPr>
                 <w:rStyle w:val="Hiperhivatkozs"/>
@@ -4552,7 +4552,7 @@
                 <w:noProof/>
                 <w:webHidden/>
               </w:rPr>
-              <w:instrText xml:space="preserve"> PAGEREF _Toc240134233 \h </w:instrText>
+              <w:instrText xml:space="preserve"> PAGEREF _Toc240193044 \h </w:instrText>
             </w:r>
             <w:r>
               <w:rPr>
@@ -4595,7 +4595,7 @@
               <w:lang w:eastAsia="hu-HU"/>
             </w:rPr>
           </w:pPr>
-          <w:hyperlink w:anchor="_Toc240134234" w:history="1">
+          <w:hyperlink w:anchor="_Toc240193045" w:history="1">
             <w:r>
               <w:rPr>
                 <w:rStyle w:val="Hiperhivatkozs"/>
@@ -4622,7 +4622,7 @@
                 <w:noProof/>
                 <w:webHidden/>
               </w:rPr>
-              <w:instrText xml:space="preserve"> PAGEREF _Toc240134234 \h </w:instrText>
+              <w:instrText xml:space="preserve"> PAGEREF _Toc240193045 \h </w:instrText>
             </w:r>
             <w:r>
               <w:rPr>
@@ -4665,7 +4665,7 @@
               <w:lang w:eastAsia="hu-HU"/>
             </w:rPr>
           </w:pPr>
-          <w:hyperlink w:anchor="_Toc240134235" w:history="1">
+          <w:hyperlink w:anchor="_Toc240193046" w:history="1">
             <w:r>
               <w:rPr>
                 <w:rStyle w:val="Hiperhivatkozs"/>
@@ -4692,7 +4692,7 @@
                 <w:noProof/>
                 <w:webHidden/>
               </w:rPr>
-              <w:instrText xml:space="preserve"> PAGEREF _Toc240134235 \h </w:instrText>
+              <w:instrText xml:space="preserve"> PAGEREF _Toc240193046 \h </w:instrText>
             </w:r>
             <w:r>
               <w:rPr>
@@ -4735,7 +4735,7 @@
               <w:lang w:eastAsia="hu-HU"/>
             </w:rPr>
           </w:pPr>
-          <w:hyperlink w:anchor="_Toc240134236" w:history="1">
+          <w:hyperlink w:anchor="_Toc240193047" w:history="1">
             <w:r>
               <w:rPr>
                 <w:rStyle w:val="Hiperhivatkozs"/>
@@ -4762,7 +4762,7 @@
                 <w:noProof/>
                 <w:webHidden/>
               </w:rPr>
-              <w:instrText xml:space="preserve"> PAGEREF _Toc240134236 \h </w:instrText>
+              <w:instrText xml:space="preserve"> PAGEREF _Toc240193047 \h </w:instrText>
             </w:r>
             <w:r>
               <w:rPr>
@@ -4805,7 +4805,7 @@
               <w:lang w:eastAsia="hu-HU"/>
             </w:rPr>
           </w:pPr>
-          <w:hyperlink w:anchor="_Toc240134237" w:history="1">
+          <w:hyperlink w:anchor="_Toc240193048" w:history="1">
             <w:r>
               <w:rPr>
                 <w:rStyle w:val="Hiperhivatkozs"/>
@@ -4832,7 +4832,7 @@
                 <w:noProof/>
                 <w:webHidden/>
               </w:rPr>
-              <w:instrText xml:space="preserve"> PAGEREF _Toc240134237 \h </w:instrText>
+              <w:instrText xml:space="preserve"> PAGEREF _Toc240193048 \h </w:instrText>
             </w:r>
             <w:r>
               <w:rPr>
@@ -4875,7 +4875,7 @@
               <w:lang w:eastAsia="hu-HU"/>
             </w:rPr>
           </w:pPr>
-          <w:hyperlink w:anchor="_Toc240134238" w:history="1">
+          <w:hyperlink w:anchor="_Toc240193049" w:history="1">
             <w:r>
               <w:rPr>
                 <w:rStyle w:val="Hiperhivatkozs"/>
@@ -4902,7 +4902,7 @@
                 <w:noProof/>
                 <w:webHidden/>
               </w:rPr>
-              <w:instrText xml:space="preserve"> PAGEREF _Toc240134238 \h </w:instrText>
+              <w:instrText xml:space="preserve"> PAGEREF _Toc240193049 \h </w:instrText>
             </w:r>
             <w:r>
               <w:rPr>
@@ -4945,7 +4945,7 @@
               <w:lang w:eastAsia="hu-HU"/>
             </w:rPr>
           </w:pPr>
-          <w:hyperlink w:anchor="_Toc240134239" w:history="1">
+          <w:hyperlink w:anchor="_Toc240193050" w:history="1">
             <w:r>
               <w:rPr>
                 <w:rStyle w:val="Hiperhivatkozs"/>
@@ -4972,7 +4972,7 @@
                 <w:noProof/>
                 <w:webHidden/>
               </w:rPr>
-              <w:instrText xml:space="preserve"> PAGEREF _Toc240134239 \h </w:instrText>
+              <w:instrText xml:space="preserve"> PAGEREF _Toc240193050 \h </w:instrText>
             </w:r>
             <w:r>
               <w:rPr>
@@ -5015,7 +5015,7 @@
               <w:lang w:eastAsia="hu-HU"/>
             </w:rPr>
           </w:pPr>
-          <w:hyperlink w:anchor="_Toc240134240" w:history="1">
+          <w:hyperlink w:anchor="_Toc240193051" w:history="1">
             <w:r>
               <w:rPr>
                 <w:rStyle w:val="Hiperhivatkozs"/>
@@ -5042,7 +5042,7 @@
                 <w:noProof/>
                 <w:webHidden/>
               </w:rPr>
-              <w:instrText xml:space="preserve"> PAGEREF _Toc240134240 \h </w:instrText>
+              <w:instrText xml:space="preserve"> PAGEREF _Toc240193051 \h </w:instrText>
             </w:r>
             <w:r>
               <w:rPr>
@@ -5085,7 +5085,7 @@
               <w:lang w:eastAsia="hu-HU"/>
             </w:rPr>
           </w:pPr>
-          <w:hyperlink w:anchor="_Toc240134241" w:history="1">
+          <w:hyperlink w:anchor="_Toc240193052" w:history="1">
             <w:r>
               <w:rPr>
                 <w:rStyle w:val="Hiperhivatkozs"/>
@@ -5112,7 +5112,7 @@
                 <w:noProof/>
                 <w:webHidden/>
               </w:rPr>
-              <w:instrText xml:space="preserve"> PAGEREF _Toc240134241 \h </w:instrText>
+              <w:instrText xml:space="preserve"> PAGEREF _Toc240193052 \h </w:instrText>
             </w:r>
             <w:r>
               <w:rPr>
@@ -5155,7 +5155,7 @@
               <w:lang w:eastAsia="hu-HU"/>
             </w:rPr>
           </w:pPr>
-          <w:hyperlink w:anchor="_Toc240134242" w:history="1">
+          <w:hyperlink w:anchor="_Toc240193053" w:history="1">
             <w:r>
               <w:rPr>
                 <w:rStyle w:val="Hiperhivatkozs"/>
@@ -5182,7 +5182,7 @@
                 <w:noProof/>
                 <w:webHidden/>
               </w:rPr>
-              <w:instrText xml:space="preserve"> PAGEREF _Toc240134242 \h </w:instrText>
+              <w:instrText xml:space="preserve"> PAGEREF _Toc240193053 \h </w:instrText>
             </w:r>
             <w:r>
               <w:rPr>
@@ -5225,7 +5225,7 @@
               <w:lang w:eastAsia="hu-HU"/>
             </w:rPr>
           </w:pPr>
-          <w:hyperlink w:anchor="_Toc240134243" w:history="1">
+          <w:hyperlink w:anchor="_Toc240193054" w:history="1">
             <w:r>
               <w:rPr>
                 <w:rStyle w:val="Hiperhivatkozs"/>
@@ -5252,7 +5252,7 @@
                 <w:noProof/>
                 <w:webHidden/>
               </w:rPr>
-              <w:instrText xml:space="preserve"> PAGEREF _Toc240134243 \h </w:instrText>
+              <w:instrText xml:space="preserve"> PAGEREF _Toc240193054 \h </w:instrText>
             </w:r>
             <w:r>
               <w:rPr>
@@ -5295,7 +5295,7 @@
               <w:lang w:eastAsia="hu-HU"/>
             </w:rPr>
           </w:pPr>
-          <w:hyperlink w:anchor="_Toc240134244" w:history="1">
+          <w:hyperlink w:anchor="_Toc240193055" w:history="1">
             <w:r>
               <w:rPr>
                 <w:rStyle w:val="Hiperhivatkozs"/>
@@ -5322,7 +5322,7 @@
                 <w:noProof/>
                 <w:webHidden/>
               </w:rPr>
-              <w:instrText xml:space="preserve"> PAGEREF _Toc240134244 \h </w:instrText>
+              <w:instrText xml:space="preserve"> PAGEREF _Toc240193055 \h </w:instrText>
             </w:r>
             <w:r>
               <w:rPr>
@@ -5365,7 +5365,7 @@
               <w:lang w:eastAsia="hu-HU"/>
             </w:rPr>
           </w:pPr>
-          <w:hyperlink w:anchor="_Toc240134245" w:history="1">
+          <w:hyperlink w:anchor="_Toc240193056" w:history="1">
             <w:r>
               <w:rPr>
                 <w:rStyle w:val="Hiperhivatkozs"/>
@@ -5392,7 +5392,7 @@
                 <w:noProof/>
                 <w:webHidden/>
               </w:rPr>
-              <w:instrText xml:space="preserve"> PAGEREF _Toc240134245 \h </w:instrText>
+              <w:instrText xml:space="preserve"> PAGEREF _Toc240193056 \h </w:instrText>
             </w:r>
             <w:r>
               <w:rPr>
@@ -5435,12 +5435,82 @@
               <w:lang w:eastAsia="hu-HU"/>
             </w:rPr>
           </w:pPr>
-          <w:hyperlink w:anchor="_Toc240134246" w:history="1">
+          <w:hyperlink w:anchor="_Toc240193057" w:history="1">
             <w:r>
               <w:rPr>
                 <w:rStyle w:val="Hiperhivatkozs"/>
                 <w:noProof/>
               </w:rPr>
+              <w:t>Kapcsolat a Frontend és a Backend között</w:t>
+            </w:r>
+            <w:r>
+              <w:rPr>
+                <w:noProof/>
+                <w:webHidden/>
+              </w:rPr>
+              <w:tab/>
+            </w:r>
+            <w:r>
+              <w:rPr>
+                <w:noProof/>
+                <w:webHidden/>
+              </w:rPr>
+              <w:fldChar w:fldCharType="begin"/>
+            </w:r>
+            <w:r>
+              <w:rPr>
+                <w:noProof/>
+                <w:webHidden/>
+              </w:rPr>
+              <w:instrText xml:space="preserve"> PAGEREF _Toc240193057 \h </w:instrText>
+            </w:r>
+            <w:r>
+              <w:rPr>
+                <w:noProof/>
+                <w:webHidden/>
+              </w:rPr>
+            </w:r>
+            <w:r>
+              <w:rPr>
+                <w:noProof/>
+                <w:webHidden/>
+              </w:rPr>
+              <w:fldChar w:fldCharType="separate"/>
+            </w:r>
+            <w:r>
+              <w:rPr>
+                <w:noProof/>
+                <w:webHidden/>
+              </w:rPr>
+              <w:t>26</w:t>
+            </w:r>
+            <w:r>
+              <w:rPr>
+                <w:noProof/>
+                <w:webHidden/>
+              </w:rPr>
+              <w:fldChar w:fldCharType="end"/>
+            </w:r>
+          </w:hyperlink>
+        </w:p>
+        <w:p>
+          <w:pPr>
+            <w:pStyle w:val="TJ2"/>
+            <w:tabs>
+              <w:tab w:val="right" w:leader="dot" w:pos="9062"/>
+            </w:tabs>
+            <w:rPr>
+              <w:rFonts w:eastAsiaTheme="minorEastAsia"/>
+              <w:noProof/>
+              <w:lang w:eastAsia="hu-HU"/>
+            </w:rPr>
+          </w:pPr>
+          <w:hyperlink w:anchor="_Toc240193058" w:history="1">
+            <w:r>
+              <w:rPr>
+                <w:rStyle w:val="Hiperhivatkozs"/>
+                <w:noProof/>
+              </w:rPr>
               <w:t>A Frontend metódusai</w:t>
             </w:r>
             <w:r>
@@ -5462,7 +5532,7 @@
                 <w:noProof/>
                 <w:webHidden/>
               </w:rPr>
-              <w:instrText xml:space="preserve"> PAGEREF _Toc240134246 \h </w:instrText>
+              <w:instrText xml:space="preserve"> PAGEREF _Toc240193058 \h </w:instrText>
             </w:r>
             <w:r>
               <w:rPr>
@@ -5482,7 +5552,77 @@
                 <w:noProof/>
                 <w:webHidden/>
               </w:rPr>
-              <w:t>26</w:t>
+              <w:t>27</w:t>
+            </w:r>
+            <w:r>
+              <w:rPr>
+                <w:noProof/>
+                <w:webHidden/>
+              </w:rPr>
+              <w:fldChar w:fldCharType="end"/>
+            </w:r>
+          </w:hyperlink>
+        </w:p>
+        <w:p>
+          <w:pPr>
+            <w:pStyle w:val="TJ1"/>
+            <w:tabs>
+              <w:tab w:val="right" w:leader="dot" w:pos="9062"/>
+            </w:tabs>
+            <w:rPr>
+              <w:rFonts w:eastAsiaTheme="minorEastAsia"/>
+              <w:noProof/>
+              <w:lang w:eastAsia="hu-HU"/>
+            </w:rPr>
+          </w:pPr>
+          <w:hyperlink w:anchor="_Toc240193059" w:history="1">
+            <w:r>
+              <w:rPr>
+                <w:rStyle w:val="Hiperhivatkozs"/>
+                <w:noProof/>
+              </w:rPr>
+              <w:t>Az alkalmazás indításához szükséges szoftverek</w:t>
+            </w:r>
+            <w:r>
+              <w:rPr>
+                <w:noProof/>
+                <w:webHidden/>
+              </w:rPr>
+              <w:tab/>
+            </w:r>
+            <w:r>
+              <w:rPr>
+                <w:noProof/>
+                <w:webHidden/>
+              </w:rPr>
+              <w:fldChar w:fldCharType="begin"/>
+            </w:r>
+            <w:r>
+              <w:rPr>
+                <w:noProof/>
+                <w:webHidden/>
+              </w:rPr>
+              <w:instrText xml:space="preserve"> PAGEREF _Toc240193059 \h </w:instrText>
+            </w:r>
+            <w:r>
+              <w:rPr>
+                <w:noProof/>
+                <w:webHidden/>
+              </w:rPr>
+            </w:r>
+            <w:r>
+              <w:rPr>
+                <w:noProof/>
+                <w:webHidden/>
+              </w:rPr>
+              <w:fldChar w:fldCharType="separate"/>
+            </w:r>
+            <w:r>
+              <w:rPr>
+                <w:noProof/>
+                <w:webHidden/>
+              </w:rPr>
+              <w:t>30</w:t>
             </w:r>
             <w:r>
               <w:rPr>
@@ -5521,7 +5661,7 @@
       <w:pPr>
         <w:pStyle w:val="Cmsor1"/>
       </w:pPr>
-      <w:bookmarkStart w:id="0" w:name="_Toc240134225"/>
+      <w:bookmarkStart w:id="0" w:name="_Toc240193036"/>
       <w:r>
         <w:lastRenderedPageBreak/>
         <w:t>Az alkalmazás célja és követelményei:</w:t>
@@ -5649,7 +5789,7 @@
       <w:pPr>
         <w:pStyle w:val="Cmsor1"/>
       </w:pPr>
-      <w:bookmarkStart w:id="1" w:name="_Toc240134226"/>
+      <w:bookmarkStart w:id="1" w:name="_Toc240193037"/>
       <w:r>
         <w:lastRenderedPageBreak/>
         <w:t>Az alkalmazás bemutatása:</w:t>
@@ -5689,7 +5829,7 @@
       <w:pPr>
         <w:pStyle w:val="Cmsor2"/>
       </w:pPr>
-      <w:bookmarkStart w:id="2" w:name="_Toc240134227"/>
+      <w:bookmarkStart w:id="2" w:name="_Toc240193038"/>
       <w:r>
         <w:t>Bejelentkezés:</w:t>
       </w:r>
@@ -5841,7 +5981,7 @@
       <w:pPr>
         <w:pStyle w:val="Cmsor2"/>
       </w:pPr>
-      <w:bookmarkStart w:id="3" w:name="_Toc240134228"/>
+      <w:bookmarkStart w:id="3" w:name="_Toc240193039"/>
       <w:r>
         <w:t>Fenyőbála:</w:t>
       </w:r>
@@ -6127,7 +6267,7 @@
           <w:docGrid w:linePitch="360"/>
         </w:sectPr>
       </w:pPr>
-      <w:bookmarkStart w:id="4" w:name="_Toc240134229"/>
+      <w:bookmarkStart w:id="4" w:name="_Toc240193040"/>
       <w:r>
         <w:lastRenderedPageBreak/>
         <w:t>Koszorúalap:</w:t>
@@ -6409,7 +6549,7 @@
       <w:pPr>
         <w:pStyle w:val="Cmsor2"/>
       </w:pPr>
-      <w:bookmarkStart w:id="5" w:name="_Toc240134230"/>
+      <w:bookmarkStart w:id="5" w:name="_Toc240193041"/>
       <w:r>
         <w:t>Vásárlók:</w:t>
       </w:r>
@@ -6579,7 +6719,7 @@
       <w:pPr>
         <w:pStyle w:val="Cmsor1"/>
       </w:pPr>
-      <w:bookmarkStart w:id="6" w:name="_Toc240134231"/>
+      <w:bookmarkStart w:id="6" w:name="_Toc240193042"/>
       <w:r>
         <w:lastRenderedPageBreak/>
         <w:t>Az adatbázis</w:t>
@@ -6674,7 +6814,7 @@
       <w:pPr>
         <w:pStyle w:val="Cmsor2"/>
       </w:pPr>
-      <w:bookmarkStart w:id="7" w:name="_Toc240134232"/>
+      <w:bookmarkStart w:id="7" w:name="_Toc240193043"/>
       <w:r>
         <w:lastRenderedPageBreak/>
         <w:t>Felhasználók</w:t>
@@ -6883,7 +7023,7 @@
       <w:pPr>
         <w:pStyle w:val="Cmsor2"/>
       </w:pPr>
-      <w:bookmarkStart w:id="8" w:name="_Toc240134233"/>
+      <w:bookmarkStart w:id="8" w:name="_Toc240193044"/>
       <w:r>
         <w:lastRenderedPageBreak/>
         <w:t>Fenyőfajta tábla:</w:t>
@@ -7096,7 +7236,7 @@
       <w:pPr>
         <w:pStyle w:val="Cmsor2"/>
       </w:pPr>
-      <w:bookmarkStart w:id="9" w:name="_Toc240134234"/>
+      <w:bookmarkStart w:id="9" w:name="_Toc240193045"/>
       <w:r>
         <w:lastRenderedPageBreak/>
         <w:t>Fenyőalap típus tábla:</w:t>
@@ -7321,7 +7461,7 @@
       <w:pPr>
         <w:pStyle w:val="Cmsor2"/>
       </w:pPr>
-      <w:bookmarkStart w:id="10" w:name="_Toc240134235"/>
+      <w:bookmarkStart w:id="10" w:name="_Toc240193046"/>
       <w:r>
         <w:lastRenderedPageBreak/>
         <w:t>Fenyőbála állapot tábla:</w:t>
@@ -7590,7 +7730,7 @@
       <w:pPr>
         <w:pStyle w:val="Cmsor2"/>
       </w:pPr>
-      <w:bookmarkStart w:id="11" w:name="_Toc240134236"/>
+      <w:bookmarkStart w:id="11" w:name="_Toc240193047"/>
       <w:r>
         <w:lastRenderedPageBreak/>
         <w:t>Vásárlók tábla:</w:t>
@@ -7872,7 +8012,7 @@
       <w:pPr>
         <w:pStyle w:val="Cmsor2"/>
       </w:pPr>
-      <w:bookmarkStart w:id="12" w:name="_Toc240134237"/>
+      <w:bookmarkStart w:id="12" w:name="_Toc240193048"/>
       <w:r>
         <w:lastRenderedPageBreak/>
         <w:t xml:space="preserve">Fenyőbála </w:t>
@@ -8122,7 +8262,7 @@
       <w:pPr>
         <w:pStyle w:val="Cmsor2"/>
       </w:pPr>
-      <w:bookmarkStart w:id="13" w:name="_Toc240134238"/>
+      <w:bookmarkStart w:id="13" w:name="_Toc240193049"/>
       <w:r>
         <w:t>Koszorúalap tábla:</w:t>
       </w:r>
@@ -8407,7 +8547,7 @@
       <w:r>
         <w:br w:type="page"/>
       </w:r>
-      <w:bookmarkStart w:id="14" w:name="_Toc240134239"/>
+      <w:bookmarkStart w:id="14" w:name="_Toc240193050"/>
       <w:r>
         <w:lastRenderedPageBreak/>
         <w:t>A Backend</w:t>
@@ -8587,7 +8727,7 @@
       <w:pPr>
         <w:pStyle w:val="Cmsor1"/>
       </w:pPr>
-      <w:bookmarkStart w:id="15" w:name="_Toc240134240"/>
+      <w:bookmarkStart w:id="15" w:name="_Toc240193051"/>
       <w:r>
         <w:lastRenderedPageBreak/>
         <w:t xml:space="preserve">A </w:t>
@@ -8604,7 +8744,7 @@
       <w:pPr>
         <w:pStyle w:val="Cmsor2"/>
       </w:pPr>
-      <w:bookmarkStart w:id="16" w:name="_Toc240134241"/>
+      <w:bookmarkStart w:id="16" w:name="_Toc240193052"/>
       <w:r>
         <w:t>Előkészületek:</w:t>
       </w:r>
@@ -8941,7 +9081,7 @@
       <w:pPr>
         <w:pStyle w:val="Cmsor2"/>
       </w:pPr>
-      <w:bookmarkStart w:id="17" w:name="_Toc240134242"/>
+      <w:bookmarkStart w:id="17" w:name="_Toc240193053"/>
       <w:r>
         <w:lastRenderedPageBreak/>
         <w:t>Az adatbázis migrálása:</w:t>
@@ -9231,7 +9371,7 @@
       <w:pPr>
         <w:pStyle w:val="Cmsor2"/>
       </w:pPr>
-      <w:bookmarkStart w:id="18" w:name="_Toc240134243"/>
+      <w:bookmarkStart w:id="18" w:name="_Toc240193054"/>
       <w:r>
         <w:t>Adatok átadása:</w:t>
       </w:r>
@@ -9800,7 +9940,7 @@
       <w:pPr>
         <w:pStyle w:val="Cmsor2"/>
       </w:pPr>
-      <w:bookmarkStart w:id="19" w:name="_Toc240134244"/>
+      <w:bookmarkStart w:id="19" w:name="_Toc240193055"/>
       <w:r>
         <w:t xml:space="preserve">A </w:t>
       </w:r>
@@ -11178,7 +11318,7 @@
       <w:r>
         <w:br w:type="page"/>
       </w:r>
-      <w:bookmarkStart w:id="20" w:name="_Toc240134245"/>
+      <w:bookmarkStart w:id="20" w:name="_Toc240193056"/>
       <w:r>
         <w:lastRenderedPageBreak/>
         <w:t>A Fronten</w:t>
@@ -11192,9 +11332,11 @@
       <w:pPr>
         <w:pStyle w:val="Cmsor2"/>
       </w:pPr>
+      <w:bookmarkStart w:id="21" w:name="_Toc240193057"/>
       <w:r>
         <w:t>Kapcsolat a Frontend és a Backend között</w:t>
       </w:r>
+      <w:bookmarkEnd w:id="21"/>
     </w:p>
     <w:p>
       <w:pPr>
@@ -11305,7 +11447,6 @@
           <w:szCs w:val="32"/>
         </w:rPr>
       </w:pPr>
-      <w:bookmarkStart w:id="21" w:name="_Toc240134246"/>
       <w:r>
         <w:br w:type="page"/>
       </w:r>
@@ -11314,16 +11455,1430 @@
       <w:pPr>
         <w:pStyle w:val="Cmsor2"/>
       </w:pPr>
+      <w:bookmarkStart w:id="22" w:name="_Toc240193058"/>
       <w:r>
         <w:lastRenderedPageBreak/>
         <w:t>A Frontend metódusai</w:t>
       </w:r>
-      <w:bookmarkEnd w:id="21"/>
-    </w:p>
-    <w:p>
-      <w:pPr>
-        <w:pStyle w:val="Szakdolozatbekezdsek"/>
-      </w:pPr>
+      <w:bookmarkEnd w:id="22"/>
+    </w:p>
+    <w:p>
+      <w:pPr>
+        <w:pStyle w:val="Cmsor4"/>
+      </w:pPr>
+      <w:r>
+        <w:t>Login(username, password)</w:t>
+      </w:r>
+    </w:p>
+    <w:p>
+      <w:pPr>
+        <w:pStyle w:val="Szakdolozatbekezdsek"/>
+        <w:numPr>
+          <w:ilvl w:val="0"/>
+          <w:numId w:val="23"/>
+        </w:numPr>
+      </w:pPr>
+      <w:r>
+        <w:rPr>
+          <w:b/>
+          <w:bCs/>
+        </w:rPr>
+        <w:t>Funkció</w:t>
+      </w:r>
+      <w:r>
+        <w:t>: A paraméterben megadott adatokat továbbítja a Backend számára;</w:t>
+      </w:r>
+    </w:p>
+    <w:p>
+      <w:pPr>
+        <w:pStyle w:val="Szakdolozatbekezdsek"/>
+        <w:numPr>
+          <w:ilvl w:val="0"/>
+          <w:numId w:val="23"/>
+        </w:numPr>
+      </w:pPr>
+      <w:r>
+        <w:rPr>
+          <w:b/>
+          <w:bCs/>
+        </w:rPr>
+        <w:t>Bemenet</w:t>
+      </w:r>
+      <w:r>
+        <w:t>:</w:t>
+      </w:r>
+      <w:r>
+        <w:t xml:space="preserve"> </w:t>
+      </w:r>
+      <w:r>
+        <w:t>username, password;</w:t>
+      </w:r>
+    </w:p>
+    <w:p>
+      <w:pPr>
+        <w:pStyle w:val="Szakdolozatbekezdsek"/>
+        <w:numPr>
+          <w:ilvl w:val="0"/>
+          <w:numId w:val="23"/>
+        </w:numPr>
+      </w:pPr>
+      <w:r>
+        <w:rPr>
+          <w:b/>
+          <w:bCs/>
+        </w:rPr>
+        <w:t>Kimenet</w:t>
+      </w:r>
+      <w:r>
+        <w:t>:</w:t>
+      </w:r>
+      <w:r>
+        <w:t xml:space="preserve"> Lehet adatbázishiba, vagy felhasználó-jelszó páros hiba. Máskülönben belépés;</w:t>
+      </w:r>
+    </w:p>
+    <w:p>
+      <w:pPr>
+        <w:pStyle w:val="Cmsor4"/>
+      </w:pPr>
+      <w:r>
+        <w:t>RegisterNewUser(username, password)</w:t>
+      </w:r>
+    </w:p>
+    <w:p>
+      <w:pPr>
+        <w:pStyle w:val="Szakdolozatbekezdsek"/>
+        <w:numPr>
+          <w:ilvl w:val="0"/>
+          <w:numId w:val="24"/>
+        </w:numPr>
+      </w:pPr>
+      <w:r>
+        <w:rPr>
+          <w:b/>
+          <w:bCs/>
+        </w:rPr>
+        <w:t>Funkció</w:t>
+      </w:r>
+      <w:r>
+        <w:t>: A paraméterben megadott adatokat továbbítja a Backend felé;</w:t>
+      </w:r>
+    </w:p>
+    <w:p>
+      <w:pPr>
+        <w:pStyle w:val="Szakdolozatbekezdsek"/>
+        <w:numPr>
+          <w:ilvl w:val="0"/>
+          <w:numId w:val="24"/>
+        </w:numPr>
+      </w:pPr>
+      <w:r>
+        <w:rPr>
+          <w:b/>
+          <w:bCs/>
+        </w:rPr>
+        <w:t>Bemenet</w:t>
+      </w:r>
+      <w:r>
+        <w:t>: username, password;</w:t>
+      </w:r>
+    </w:p>
+    <w:p>
+      <w:pPr>
+        <w:pStyle w:val="Szakdolozatbekezdsek"/>
+        <w:numPr>
+          <w:ilvl w:val="0"/>
+          <w:numId w:val="24"/>
+        </w:numPr>
+      </w:pPr>
+      <w:r>
+        <w:rPr>
+          <w:b/>
+          <w:bCs/>
+        </w:rPr>
+        <w:t>Kimenet</w:t>
+      </w:r>
+      <w:r>
+        <w:t xml:space="preserve">: </w:t>
+      </w:r>
+      <w:r>
+        <w:t>Adatbázis hiba, vagy sikeres regisztráció;</w:t>
+      </w:r>
+    </w:p>
+    <w:p>
+      <w:pPr>
+        <w:pStyle w:val="Cmsor4"/>
+      </w:pPr>
+      <w:r>
+        <w:t>GetPineTypes()</w:t>
+      </w:r>
+    </w:p>
+    <w:p>
+      <w:pPr>
+        <w:pStyle w:val="Szakdolozatbekezdsek"/>
+        <w:numPr>
+          <w:ilvl w:val="0"/>
+          <w:numId w:val="25"/>
+        </w:numPr>
+      </w:pPr>
+      <w:r>
+        <w:rPr>
+          <w:b/>
+          <w:bCs/>
+        </w:rPr>
+        <w:t>Funkció</w:t>
+      </w:r>
+      <w:r>
+        <w:t>: Lekéri az adatbázisból a fenyőtípusokat;</w:t>
+      </w:r>
+    </w:p>
+    <w:p>
+      <w:pPr>
+        <w:pStyle w:val="Szakdolozatbekezdsek"/>
+        <w:numPr>
+          <w:ilvl w:val="0"/>
+          <w:numId w:val="25"/>
+        </w:numPr>
+      </w:pPr>
+      <w:r>
+        <w:rPr>
+          <w:b/>
+          <w:bCs/>
+        </w:rPr>
+        <w:t>Bemenet</w:t>
+      </w:r>
+      <w:r>
+        <w:t>: Nincs szükség adatra;</w:t>
+      </w:r>
+    </w:p>
+    <w:p>
+      <w:pPr>
+        <w:pStyle w:val="Szakdolozatbekezdsek"/>
+        <w:numPr>
+          <w:ilvl w:val="0"/>
+          <w:numId w:val="25"/>
+        </w:numPr>
+      </w:pPr>
+      <w:r>
+        <w:rPr>
+          <w:b/>
+          <w:bCs/>
+        </w:rPr>
+        <w:t>Kimenet</w:t>
+      </w:r>
+      <w:r>
+        <w:t>: Adatbázishiba, vagy a fenyőtípusok adatai;</w:t>
+      </w:r>
+    </w:p>
+    <w:p>
+      <w:pPr>
+        <w:pStyle w:val="Cmsor4"/>
+      </w:pPr>
+      <w:r>
+        <w:t>GetPineBatchStates()</w:t>
+      </w:r>
+    </w:p>
+    <w:p>
+      <w:pPr>
+        <w:pStyle w:val="Szakdolozatbekezdsek"/>
+        <w:numPr>
+          <w:ilvl w:val="0"/>
+          <w:numId w:val="26"/>
+        </w:numPr>
+      </w:pPr>
+      <w:r>
+        <w:rPr>
+          <w:b/>
+          <w:bCs/>
+        </w:rPr>
+        <w:t>Funkció</w:t>
+      </w:r>
+      <w:r>
+        <w:t>: Lekéri az adatbázisból a fenyőbálák állapotait;</w:t>
+      </w:r>
+    </w:p>
+    <w:p>
+      <w:pPr>
+        <w:pStyle w:val="Szakdolozatbekezdsek"/>
+        <w:numPr>
+          <w:ilvl w:val="0"/>
+          <w:numId w:val="26"/>
+        </w:numPr>
+      </w:pPr>
+      <w:r>
+        <w:rPr>
+          <w:b/>
+          <w:bCs/>
+        </w:rPr>
+        <w:t>Bemenet</w:t>
+      </w:r>
+      <w:r>
+        <w:t>: Nincs szükség beneti adatokra;</w:t>
+      </w:r>
+    </w:p>
+    <w:p>
+      <w:pPr>
+        <w:pStyle w:val="Szakdolozatbekezdsek"/>
+        <w:numPr>
+          <w:ilvl w:val="0"/>
+          <w:numId w:val="26"/>
+        </w:numPr>
+      </w:pPr>
+      <w:r>
+        <w:rPr>
+          <w:b/>
+          <w:bCs/>
+        </w:rPr>
+        <w:t>Kimenet</w:t>
+      </w:r>
+      <w:r>
+        <w:t>: Adatbázishiba, vagy a fenyőbálák állapotai;</w:t>
+      </w:r>
+    </w:p>
+    <w:p>
+      <w:pPr>
+        <w:pStyle w:val="Cmsor4"/>
+      </w:pPr>
+      <w:r>
+        <w:t>GetPineBatchOrder()</w:t>
+      </w:r>
+    </w:p>
+    <w:p>
+      <w:pPr>
+        <w:pStyle w:val="Szakdolozatbekezdsek"/>
+        <w:numPr>
+          <w:ilvl w:val="0"/>
+          <w:numId w:val="27"/>
+        </w:numPr>
+      </w:pPr>
+      <w:r>
+        <w:rPr>
+          <w:b/>
+          <w:bCs/>
+        </w:rPr>
+        <w:t>Funkció</w:t>
+      </w:r>
+      <w:r>
+        <w:t>: Lekérdezi az adatbázisból a fenyőbála rendeléseket;</w:t>
+      </w:r>
+    </w:p>
+    <w:p>
+      <w:pPr>
+        <w:pStyle w:val="Szakdolozatbekezdsek"/>
+        <w:numPr>
+          <w:ilvl w:val="0"/>
+          <w:numId w:val="27"/>
+        </w:numPr>
+      </w:pPr>
+      <w:r>
+        <w:rPr>
+          <w:b/>
+          <w:bCs/>
+        </w:rPr>
+        <w:t>Bemenet</w:t>
+      </w:r>
+      <w:r>
+        <w:t>: Nincs szükség bemeneti adatokra;</w:t>
+      </w:r>
+    </w:p>
+    <w:p>
+      <w:pPr>
+        <w:pStyle w:val="Szakdolozatbekezdsek"/>
+        <w:numPr>
+          <w:ilvl w:val="0"/>
+          <w:numId w:val="27"/>
+        </w:numPr>
+      </w:pPr>
+      <w:r>
+        <w:rPr>
+          <w:b/>
+          <w:bCs/>
+        </w:rPr>
+        <w:t>Kimenet</w:t>
+      </w:r>
+      <w:r>
+        <w:t>: Adatbázishiba, vagy a fenyőbála rendelések adatai;</w:t>
+      </w:r>
+    </w:p>
+    <w:p>
+      <w:r>
+        <w:br w:type="page"/>
+      </w:r>
+    </w:p>
+    <w:p>
+      <w:pPr>
+        <w:pStyle w:val="Cmsor4"/>
+      </w:pPr>
+      <w:r>
+        <w:lastRenderedPageBreak/>
+        <w:t>RegisterNewPineBatchOrder(pine_type, batch_state, quantity)</w:t>
+      </w:r>
+    </w:p>
+    <w:p>
+      <w:pPr>
+        <w:pStyle w:val="Szakdolozatbekezdsek"/>
+        <w:numPr>
+          <w:ilvl w:val="0"/>
+          <w:numId w:val="28"/>
+        </w:numPr>
+      </w:pPr>
+      <w:r>
+        <w:rPr>
+          <w:b/>
+          <w:bCs/>
+        </w:rPr>
+        <w:t>Funkció</w:t>
+      </w:r>
+      <w:r>
+        <w:t>:</w:t>
+      </w:r>
+      <w:r>
+        <w:t xml:space="preserve"> Új fenyőbála rendelés</w:t>
+      </w:r>
+      <w:r>
+        <w:t xml:space="preserve"> paraméter</w:t>
+      </w:r>
+      <w:r>
+        <w:t xml:space="preserve">eit átadja a </w:t>
+      </w:r>
+      <w:r>
+        <w:t>Backend-nek;</w:t>
+      </w:r>
+    </w:p>
+    <w:p>
+      <w:pPr>
+        <w:pStyle w:val="Szakdolozatbekezdsek"/>
+        <w:numPr>
+          <w:ilvl w:val="0"/>
+          <w:numId w:val="28"/>
+        </w:numPr>
+      </w:pPr>
+      <w:r>
+        <w:rPr>
+          <w:b/>
+          <w:bCs/>
+        </w:rPr>
+        <w:t>Bemenet</w:t>
+      </w:r>
+      <w:r>
+        <w:t xml:space="preserve">: </w:t>
+      </w:r>
+      <w:r>
+        <w:t>A fenyőtípus, a fenyőbála állapotjelzője és a mennyisége;</w:t>
+      </w:r>
+    </w:p>
+    <w:p>
+      <w:pPr>
+        <w:pStyle w:val="Szakdolozatbekezdsek"/>
+        <w:numPr>
+          <w:ilvl w:val="0"/>
+          <w:numId w:val="28"/>
+        </w:numPr>
+      </w:pPr>
+      <w:r>
+        <w:rPr>
+          <w:b/>
+          <w:bCs/>
+        </w:rPr>
+        <w:t>Kimenet</w:t>
+      </w:r>
+      <w:r>
+        <w:t>: Adatbázishiba, vagy az adatok mentése az adatbázisba;</w:t>
+      </w:r>
+    </w:p>
+    <w:p>
+      <w:pPr>
+        <w:pStyle w:val="Cmsor4"/>
+      </w:pPr>
+      <w:r>
+        <w:t>GetPineBaseTypes()</w:t>
+      </w:r>
+    </w:p>
+    <w:p>
+      <w:pPr>
+        <w:pStyle w:val="Szakdolozatbekezdsek"/>
+        <w:numPr>
+          <w:ilvl w:val="0"/>
+          <w:numId w:val="29"/>
+        </w:numPr>
+      </w:pPr>
+      <w:r>
+        <w:rPr>
+          <w:b/>
+          <w:bCs/>
+        </w:rPr>
+        <w:t>Funkció</w:t>
+      </w:r>
+      <w:r>
+        <w:t>: Lekérdezi a koszorúalapok típusát;</w:t>
+      </w:r>
+    </w:p>
+    <w:p>
+      <w:pPr>
+        <w:pStyle w:val="Szakdolozatbekezdsek"/>
+        <w:numPr>
+          <w:ilvl w:val="0"/>
+          <w:numId w:val="29"/>
+        </w:numPr>
+      </w:pPr>
+      <w:r>
+        <w:rPr>
+          <w:b/>
+          <w:bCs/>
+        </w:rPr>
+        <w:t>Bemenet</w:t>
+      </w:r>
+      <w:r>
+        <w:t>: Nincs szükség bemeneti adatokra;</w:t>
+      </w:r>
+    </w:p>
+    <w:p>
+      <w:pPr>
+        <w:pStyle w:val="Szakdolozatbekezdsek"/>
+        <w:numPr>
+          <w:ilvl w:val="0"/>
+          <w:numId w:val="29"/>
+        </w:numPr>
+      </w:pPr>
+      <w:r>
+        <w:rPr>
+          <w:b/>
+          <w:bCs/>
+        </w:rPr>
+        <w:t>Kimenet</w:t>
+      </w:r>
+      <w:r>
+        <w:t>: Adatbázishiba, vagy a koszorúalapok típusainak listája;</w:t>
+      </w:r>
+    </w:p>
+    <w:p>
+      <w:pPr>
+        <w:pStyle w:val="Cmsor4"/>
+      </w:pPr>
+      <w:r>
+        <w:t>RegisterNewCostumer(costumer_name, costumer_postal_code, costumer_city, costumer_address, costumer_phonenumber, costumer_taxnumber)</w:t>
+      </w:r>
+    </w:p>
+    <w:p>
+      <w:pPr>
+        <w:pStyle w:val="Szakdolozatbekezdsek"/>
+        <w:numPr>
+          <w:ilvl w:val="0"/>
+          <w:numId w:val="30"/>
+        </w:numPr>
+      </w:pPr>
+      <w:r>
+        <w:rPr>
+          <w:b/>
+          <w:bCs/>
+        </w:rPr>
+        <w:t>Funkció</w:t>
+      </w:r>
+      <w:r>
+        <w:t>: Egy új vásárló regisztrálása az adatbázisban;</w:t>
+      </w:r>
+    </w:p>
+    <w:p>
+      <w:pPr>
+        <w:pStyle w:val="Szakdolozatbekezdsek"/>
+        <w:numPr>
+          <w:ilvl w:val="0"/>
+          <w:numId w:val="30"/>
+        </w:numPr>
+      </w:pPr>
+      <w:r>
+        <w:rPr>
+          <w:b/>
+          <w:bCs/>
+        </w:rPr>
+        <w:t>Bemenet</w:t>
+      </w:r>
+      <w:r>
+        <w:t>: Az új vásárló fontos adatait kell megadni</w:t>
+      </w:r>
+    </w:p>
+    <w:p>
+      <w:pPr>
+        <w:pStyle w:val="Szakdolozatbekezdsek"/>
+        <w:numPr>
+          <w:ilvl w:val="1"/>
+          <w:numId w:val="30"/>
+        </w:numPr>
+        <w:spacing w:line="240" w:lineRule="auto"/>
+        <w:ind w:hanging="357"/>
+      </w:pPr>
+      <w:r>
+        <w:t>Név;</w:t>
+      </w:r>
+    </w:p>
+    <w:p>
+      <w:pPr>
+        <w:pStyle w:val="Szakdolozatbekezdsek"/>
+        <w:numPr>
+          <w:ilvl w:val="1"/>
+          <w:numId w:val="30"/>
+        </w:numPr>
+        <w:spacing w:line="240" w:lineRule="auto"/>
+        <w:ind w:hanging="357"/>
+      </w:pPr>
+      <w:r>
+        <w:t>Irányítószám;</w:t>
+      </w:r>
+    </w:p>
+    <w:p>
+      <w:pPr>
+        <w:pStyle w:val="Szakdolozatbekezdsek"/>
+        <w:numPr>
+          <w:ilvl w:val="1"/>
+          <w:numId w:val="30"/>
+        </w:numPr>
+        <w:spacing w:line="240" w:lineRule="auto"/>
+        <w:ind w:hanging="357"/>
+      </w:pPr>
+      <w:r>
+        <w:t>Város;</w:t>
+      </w:r>
+    </w:p>
+    <w:p>
+      <w:pPr>
+        <w:pStyle w:val="Szakdolozatbekezdsek"/>
+        <w:numPr>
+          <w:ilvl w:val="1"/>
+          <w:numId w:val="30"/>
+        </w:numPr>
+        <w:spacing w:line="240" w:lineRule="auto"/>
+        <w:ind w:hanging="357"/>
+      </w:pPr>
+      <w:r>
+        <w:t>Cím;</w:t>
+      </w:r>
+    </w:p>
+    <w:p>
+      <w:pPr>
+        <w:pStyle w:val="Szakdolozatbekezdsek"/>
+        <w:numPr>
+          <w:ilvl w:val="1"/>
+          <w:numId w:val="30"/>
+        </w:numPr>
+        <w:spacing w:line="240" w:lineRule="auto"/>
+        <w:ind w:hanging="357"/>
+      </w:pPr>
+      <w:r>
+        <w:t>Telefonszám;</w:t>
+      </w:r>
+    </w:p>
+    <w:p>
+      <w:pPr>
+        <w:pStyle w:val="Szakdolozatbekezdsek"/>
+        <w:numPr>
+          <w:ilvl w:val="1"/>
+          <w:numId w:val="30"/>
+        </w:numPr>
+        <w:spacing w:line="240" w:lineRule="auto"/>
+        <w:ind w:hanging="357"/>
+      </w:pPr>
+      <w:r>
+        <w:t>Adószám;</w:t>
+      </w:r>
+    </w:p>
+    <w:p>
+      <w:pPr>
+        <w:pStyle w:val="Szakdolozatbekezdsek"/>
+        <w:numPr>
+          <w:ilvl w:val="0"/>
+          <w:numId w:val="30"/>
+        </w:numPr>
+      </w:pPr>
+      <w:r>
+        <w:rPr>
+          <w:b/>
+          <w:bCs/>
+        </w:rPr>
+        <w:t>Kimenet</w:t>
+      </w:r>
+      <w:r>
+        <w:t xml:space="preserve">: Adatbázishiba, </w:t>
+      </w:r>
+      <w:r>
+        <w:t>vagy az új vásárló sikeres regisztrációja;</w:t>
+      </w:r>
+    </w:p>
+    <w:p>
+      <w:pPr>
+        <w:pStyle w:val="Cmsor4"/>
+      </w:pPr>
+      <w:r>
+        <w:t>GetAllCostumers()</w:t>
+      </w:r>
+    </w:p>
+    <w:p>
+      <w:pPr>
+        <w:pStyle w:val="Szakdolozatbekezdsek"/>
+        <w:numPr>
+          <w:ilvl w:val="0"/>
+          <w:numId w:val="31"/>
+        </w:numPr>
+      </w:pPr>
+      <w:r>
+        <w:rPr>
+          <w:b/>
+          <w:bCs/>
+        </w:rPr>
+        <w:t>Funkció</w:t>
+      </w:r>
+      <w:r>
+        <w:t>: Az összes vásárló adatait lekérdezni az adatbázisból;</w:t>
+      </w:r>
+    </w:p>
+    <w:p>
+      <w:pPr>
+        <w:pStyle w:val="Szakdolozatbekezdsek"/>
+        <w:numPr>
+          <w:ilvl w:val="0"/>
+          <w:numId w:val="31"/>
+        </w:numPr>
+      </w:pPr>
+      <w:r>
+        <w:rPr>
+          <w:b/>
+          <w:bCs/>
+        </w:rPr>
+        <w:t>Bemenet</w:t>
+      </w:r>
+      <w:r>
+        <w:t>: Nincs szükség bemeneti adatokra;</w:t>
+      </w:r>
+    </w:p>
+    <w:p>
+      <w:pPr>
+        <w:pStyle w:val="Szakdolozatbekezdsek"/>
+        <w:numPr>
+          <w:ilvl w:val="0"/>
+          <w:numId w:val="31"/>
+        </w:numPr>
+      </w:pPr>
+      <w:r>
+        <w:rPr>
+          <w:b/>
+          <w:bCs/>
+        </w:rPr>
+        <w:t>Kimenet</w:t>
+      </w:r>
+      <w:r>
+        <w:t>: Egy listában megkapjuk az összes vásárló adatait, vagy adatbázishiba;</w:t>
+      </w:r>
+    </w:p>
+    <w:p>
+      <w:r>
+        <w:br w:type="page"/>
+      </w:r>
+    </w:p>
+    <w:p>
+      <w:pPr>
+        <w:pStyle w:val="Cmsor4"/>
+      </w:pPr>
+      <w:r>
+        <w:lastRenderedPageBreak/>
+        <w:t>GetCostumersList()</w:t>
+      </w:r>
+    </w:p>
+    <w:p>
+      <w:pPr>
+        <w:pStyle w:val="Szakdolozatbekezdsek"/>
+        <w:numPr>
+          <w:ilvl w:val="0"/>
+          <w:numId w:val="32"/>
+        </w:numPr>
+      </w:pPr>
+      <w:r>
+        <w:rPr>
+          <w:b/>
+          <w:bCs/>
+        </w:rPr>
+        <w:t>Funkció</w:t>
+      </w:r>
+      <w:r>
+        <w:t>: Lekérdezi az adatbázisból a vásárlók neveit;</w:t>
+      </w:r>
+    </w:p>
+    <w:p>
+      <w:pPr>
+        <w:pStyle w:val="Szakdolozatbekezdsek"/>
+        <w:numPr>
+          <w:ilvl w:val="0"/>
+          <w:numId w:val="32"/>
+        </w:numPr>
+      </w:pPr>
+      <w:r>
+        <w:rPr>
+          <w:b/>
+          <w:bCs/>
+        </w:rPr>
+        <w:t>Bemenet</w:t>
+      </w:r>
+      <w:r>
+        <w:t>: Nincsenek bemeneti adatok;</w:t>
+      </w:r>
+    </w:p>
+    <w:p>
+      <w:pPr>
+        <w:pStyle w:val="Szakdolozatbekezdsek"/>
+        <w:numPr>
+          <w:ilvl w:val="0"/>
+          <w:numId w:val="32"/>
+        </w:numPr>
+      </w:pPr>
+      <w:r>
+        <w:rPr>
+          <w:b/>
+          <w:bCs/>
+        </w:rPr>
+        <w:t>Kimenet</w:t>
+      </w:r>
+      <w:r>
+        <w:t>: Az adatbázisból kapott vevői lista, vagy adatbázishiba;</w:t>
+      </w:r>
+    </w:p>
+    <w:p>
+      <w:pPr>
+        <w:pStyle w:val="Cmsor4"/>
+      </w:pPr>
+      <w:r>
+        <w:t>RegisterNewPinebaseOrder(costumerId, pineTypeId, pinebasetype, baseQuantity, baseOrderedDate, baseState)</w:t>
+      </w:r>
+    </w:p>
+    <w:p>
+      <w:pPr>
+        <w:pStyle w:val="Szakdolozatbekezdsek"/>
+        <w:numPr>
+          <w:ilvl w:val="0"/>
+          <w:numId w:val="33"/>
+        </w:numPr>
+      </w:pPr>
+      <w:r>
+        <w:rPr>
+          <w:b/>
+          <w:bCs/>
+        </w:rPr>
+        <w:t>Funkció</w:t>
+      </w:r>
+      <w:r>
+        <w:t>: Új koszorúalap megrendelés regisztrálása az adatbázisba;</w:t>
+      </w:r>
+    </w:p>
+    <w:p>
+      <w:pPr>
+        <w:pStyle w:val="Szakdolozatbekezdsek"/>
+        <w:numPr>
+          <w:ilvl w:val="0"/>
+          <w:numId w:val="33"/>
+        </w:numPr>
+      </w:pPr>
+      <w:r>
+        <w:rPr>
+          <w:b/>
+          <w:bCs/>
+        </w:rPr>
+        <w:t>Bemenet</w:t>
+      </w:r>
+      <w:r>
+        <w:t>: A koszorúalap megrendeléséhez szükséges adatok</w:t>
+      </w:r>
+    </w:p>
+    <w:p>
+      <w:pPr>
+        <w:pStyle w:val="Szakdolozatbekezdsek"/>
+        <w:numPr>
+          <w:ilvl w:val="1"/>
+          <w:numId w:val="33"/>
+        </w:numPr>
+        <w:spacing w:line="240" w:lineRule="auto"/>
+        <w:ind w:hanging="357"/>
+      </w:pPr>
+      <w:r>
+        <w:t>Vevő;</w:t>
+      </w:r>
+    </w:p>
+    <w:p>
+      <w:pPr>
+        <w:pStyle w:val="Szakdolozatbekezdsek"/>
+        <w:numPr>
+          <w:ilvl w:val="1"/>
+          <w:numId w:val="33"/>
+        </w:numPr>
+        <w:spacing w:line="240" w:lineRule="auto"/>
+        <w:ind w:hanging="357"/>
+      </w:pPr>
+      <w:r>
+        <w:t>Fenyőtípus;</w:t>
+      </w:r>
+    </w:p>
+    <w:p>
+      <w:pPr>
+        <w:pStyle w:val="Szakdolozatbekezdsek"/>
+        <w:numPr>
+          <w:ilvl w:val="1"/>
+          <w:numId w:val="33"/>
+        </w:numPr>
+        <w:spacing w:line="240" w:lineRule="auto"/>
+        <w:ind w:hanging="357"/>
+      </w:pPr>
+      <w:r>
+        <w:t>Koszorúalap típus;</w:t>
+      </w:r>
+    </w:p>
+    <w:p>
+      <w:pPr>
+        <w:pStyle w:val="Szakdolozatbekezdsek"/>
+        <w:numPr>
+          <w:ilvl w:val="1"/>
+          <w:numId w:val="33"/>
+        </w:numPr>
+        <w:spacing w:line="240" w:lineRule="auto"/>
+        <w:ind w:hanging="357"/>
+      </w:pPr>
+      <w:r>
+        <w:t>Koszorúalap mennyisége;</w:t>
+      </w:r>
+    </w:p>
+    <w:p>
+      <w:pPr>
+        <w:pStyle w:val="Szakdolozatbekezdsek"/>
+        <w:numPr>
+          <w:ilvl w:val="1"/>
+          <w:numId w:val="33"/>
+        </w:numPr>
+        <w:spacing w:line="240" w:lineRule="auto"/>
+        <w:ind w:hanging="357"/>
+      </w:pPr>
+      <w:r>
+        <w:t>Elkészülési határidő;</w:t>
+      </w:r>
+    </w:p>
+    <w:p>
+      <w:pPr>
+        <w:pStyle w:val="Szakdolozatbekezdsek"/>
+        <w:numPr>
+          <w:ilvl w:val="1"/>
+          <w:numId w:val="33"/>
+        </w:numPr>
+        <w:spacing w:line="240" w:lineRule="auto"/>
+        <w:ind w:hanging="357"/>
+      </w:pPr>
+      <w:r>
+        <w:t xml:space="preserve">Koszorúalap </w:t>
+      </w:r>
+      <w:r>
+        <w:t>állapota;</w:t>
+      </w:r>
+    </w:p>
+    <w:p>
+      <w:pPr>
+        <w:pStyle w:val="Szakdolozatbekezdsek"/>
+        <w:numPr>
+          <w:ilvl w:val="0"/>
+          <w:numId w:val="33"/>
+        </w:numPr>
+      </w:pPr>
+      <w:r>
+        <w:rPr>
+          <w:b/>
+          <w:bCs/>
+        </w:rPr>
+        <w:t>Kimenet</w:t>
+      </w:r>
+      <w:r>
+        <w:t>: Adatbázishiba, vagy a koszorúalap rendelés adatbázisba mentése;</w:t>
+      </w:r>
+    </w:p>
+    <w:p>
+      <w:pPr>
+        <w:pStyle w:val="Cmsor4"/>
+      </w:pPr>
+      <w:r>
+        <w:t>GetAllPinebaseOrders()</w:t>
+      </w:r>
+    </w:p>
+    <w:p>
+      <w:pPr>
+        <w:pStyle w:val="Szakdolozatbekezdsek"/>
+        <w:numPr>
+          <w:ilvl w:val="0"/>
+          <w:numId w:val="35"/>
+        </w:numPr>
+      </w:pPr>
+      <w:r>
+        <w:t>Funkció: Lekérdezi az adatbázisban tárolt koszorúalapok adatait;</w:t>
+      </w:r>
+    </w:p>
+    <w:p>
+      <w:pPr>
+        <w:pStyle w:val="Szakdolozatbekezdsek"/>
+        <w:numPr>
+          <w:ilvl w:val="0"/>
+          <w:numId w:val="35"/>
+        </w:numPr>
+      </w:pPr>
+      <w:r>
+        <w:t>Bemenet: Nincs szükség adatokra;</w:t>
+      </w:r>
+    </w:p>
+    <w:p>
+      <w:pPr>
+        <w:pStyle w:val="Szakdolozatbekezdsek"/>
+        <w:numPr>
+          <w:ilvl w:val="0"/>
+          <w:numId w:val="35"/>
+        </w:numPr>
+      </w:pPr>
+      <w:r>
+        <w:t>Kimenet: Adatbázishiba, vagy a koszorúalapok adatainak listája</w:t>
+      </w:r>
+    </w:p>
+    <w:p>
+      <w:pPr>
+        <w:pStyle w:val="Szakdolozatbekezdsek"/>
+        <w:numPr>
+          <w:ilvl w:val="1"/>
+          <w:numId w:val="35"/>
+        </w:numPr>
+        <w:spacing w:line="240" w:lineRule="auto"/>
+      </w:pPr>
+      <w:r>
+        <w:t>Vevő;</w:t>
+      </w:r>
+    </w:p>
+    <w:p>
+      <w:pPr>
+        <w:pStyle w:val="Szakdolozatbekezdsek"/>
+        <w:numPr>
+          <w:ilvl w:val="1"/>
+          <w:numId w:val="35"/>
+        </w:numPr>
+        <w:spacing w:line="240" w:lineRule="auto"/>
+      </w:pPr>
+      <w:r>
+        <w:t>Fenyőtípus;</w:t>
+      </w:r>
+    </w:p>
+    <w:p>
+      <w:pPr>
+        <w:pStyle w:val="Szakdolozatbekezdsek"/>
+        <w:numPr>
+          <w:ilvl w:val="1"/>
+          <w:numId w:val="35"/>
+        </w:numPr>
+        <w:spacing w:line="240" w:lineRule="auto"/>
+      </w:pPr>
+      <w:r>
+        <w:t>Koszorúalap típus;</w:t>
+      </w:r>
+    </w:p>
+    <w:p>
+      <w:pPr>
+        <w:pStyle w:val="Szakdolozatbekezdsek"/>
+        <w:numPr>
+          <w:ilvl w:val="1"/>
+          <w:numId w:val="35"/>
+        </w:numPr>
+        <w:spacing w:line="240" w:lineRule="auto"/>
+      </w:pPr>
+      <w:r>
+        <w:t>Koszorúalap mennyisége;</w:t>
+      </w:r>
+    </w:p>
+    <w:p>
+      <w:pPr>
+        <w:pStyle w:val="Szakdolozatbekezdsek"/>
+        <w:numPr>
+          <w:ilvl w:val="1"/>
+          <w:numId w:val="35"/>
+        </w:numPr>
+        <w:spacing w:line="240" w:lineRule="auto"/>
+      </w:pPr>
+      <w:r>
+        <w:t>Elkészülési határidő;</w:t>
+      </w:r>
+    </w:p>
+    <w:p>
+      <w:pPr>
+        <w:pStyle w:val="Szakdolozatbekezdsek"/>
+        <w:numPr>
+          <w:ilvl w:val="1"/>
+          <w:numId w:val="35"/>
+        </w:numPr>
+        <w:spacing w:line="240" w:lineRule="auto"/>
+      </w:pPr>
+      <w:r>
+        <w:t>Koszorúalap állapota;</w:t>
+      </w:r>
+    </w:p>
+    <w:p>
+      <w:r>
+        <w:br w:type="page"/>
+      </w:r>
+    </w:p>
+    <w:p>
+      <w:pPr>
+        <w:pStyle w:val="Cmsor4"/>
+      </w:pPr>
+      <w:r>
+        <w:lastRenderedPageBreak/>
+        <w:t>UpdatePinebaseOrderState(baseId, baseState)</w:t>
+      </w:r>
+    </w:p>
+    <w:p>
+      <w:pPr>
+        <w:pStyle w:val="Szakdolozatbekezdsek"/>
+        <w:numPr>
+          <w:ilvl w:val="0"/>
+          <w:numId w:val="36"/>
+        </w:numPr>
+      </w:pPr>
+      <w:r>
+        <w:rPr>
+          <w:b/>
+          <w:bCs/>
+        </w:rPr>
+        <w:t>Funkció</w:t>
+      </w:r>
+      <w:r>
+        <w:t>: Frissíti az adatbázisban a koszorúalapok állapotát;</w:t>
+      </w:r>
+    </w:p>
+    <w:p>
+      <w:pPr>
+        <w:pStyle w:val="Szakdolozatbekezdsek"/>
+        <w:numPr>
+          <w:ilvl w:val="0"/>
+          <w:numId w:val="36"/>
+        </w:numPr>
+      </w:pPr>
+      <w:r>
+        <w:rPr>
+          <w:b/>
+          <w:bCs/>
+        </w:rPr>
+        <w:t>Bemenet</w:t>
+      </w:r>
+      <w:r>
+        <w:t>: A kiválasztott koszorúalap azonosító</w:t>
+      </w:r>
+      <w:r>
+        <w:t>ja</w:t>
+      </w:r>
+      <w:r>
+        <w:t>, és az állapot</w:t>
+      </w:r>
+      <w:r>
+        <w:t>a</w:t>
+      </w:r>
+      <w:r>
+        <w:t>;</w:t>
+      </w:r>
+    </w:p>
+    <w:p>
+      <w:pPr>
+        <w:pStyle w:val="Szakdolozatbekezdsek"/>
+        <w:numPr>
+          <w:ilvl w:val="0"/>
+          <w:numId w:val="36"/>
+        </w:numPr>
+      </w:pPr>
+      <w:r>
+        <w:rPr>
+          <w:b/>
+          <w:bCs/>
+        </w:rPr>
+        <w:t>Kimenet</w:t>
+      </w:r>
+      <w:r>
+        <w:t>: Az adatbázisba</w:t>
+      </w:r>
+      <w:r>
+        <w:t xml:space="preserve">n </w:t>
+      </w:r>
+      <w:r>
+        <w:t>frissíti a kiválasztott koszorúalap állapotát;</w:t>
+      </w:r>
+    </w:p>
+    <w:p>
+      <w:pPr>
+        <w:pStyle w:val="Cmsor1"/>
+      </w:pPr>
+      <w:bookmarkStart w:id="23" w:name="_Toc240193059"/>
+      <w:r>
+        <w:t>Az alkalmazás indításához szükséges szoftverek</w:t>
+      </w:r>
+      <w:bookmarkEnd w:id="23"/>
+    </w:p>
+    <w:p>
+      <w:pPr>
+        <w:pStyle w:val="Cmsor4"/>
+      </w:pPr>
+      <w:r>
+        <w:t>A Frontend eszközei:</w:t>
+      </w:r>
+    </w:p>
+    <w:p>
+      <w:pPr>
+        <w:pStyle w:val="Szakdolozatbekezdsek"/>
+      </w:pPr>
+      <w:r>
+        <w:t>A Frontendet A Visual Studio Code névre keresztelt fejlesztői környezetben készítettük el</w:t>
+      </w:r>
+      <w:r>
+        <w:t xml:space="preserve"> </w:t>
+      </w:r>
+      <w:r>
+        <w:t>JavaScript</w:t>
+      </w:r>
+      <w:r>
+        <w:t xml:space="preserve"> és html nyelven</w:t>
+      </w:r>
+      <w:r>
+        <w:t>. Ez az eszköz segíti a fejlesztőt olyan bővítményekkel, mint a Live Server, am</w:t>
+      </w:r>
+      <w:r>
+        <w:t>ivel a fejlesztés folyamán, akár már egy billentyűleütésnyi változást is láthatóvá tesz. A program sokféle fájlkiterjesztésekkel tud dolgozni, amennyiben olyat szeretnénk használni, ami nincs a listában, akkor egy másik bővítmény telepítésével meg is oldható. Ennél a projektnél csak a Live Serverre volt szükség, ugyanis a fejlesztőkörnyezet alapból ismeri a .</w:t>
+      </w:r>
+      <w:r>
+        <w:t>html-t</w:t>
+      </w:r>
+      <w:r>
+        <w:t>,</w:t>
+      </w:r>
+      <w:r>
+        <w:t xml:space="preserve"> és a .js-t fájlkiterjesztéseket.</w:t>
+      </w:r>
+    </w:p>
+    <w:p>
+      <w:pPr>
+        <w:pStyle w:val="Cmsor4"/>
+      </w:pPr>
+      <w:r>
+        <w:t>A Backend eszközei:</w:t>
+      </w:r>
+    </w:p>
+    <w:p>
+      <w:pPr>
+        <w:pStyle w:val="Szakdolozatbekezdsek"/>
+      </w:pPr>
+      <w:r>
+        <w:t>A Backendet a Microsoft Visual Studio néven futó fejlesztőkörnyeze</w:t>
+      </w:r>
+      <w:r>
+        <w:t>t segítségével</w:t>
+      </w:r>
+      <w:r>
+        <w:t xml:space="preserve"> </w:t>
+      </w:r>
+      <w:r>
+        <w:t>alkottuk meg</w:t>
+      </w:r>
+      <w:r>
+        <w:t xml:space="preserve">. </w:t>
+      </w:r>
+      <w:r>
+        <w:t xml:space="preserve">Ezt a programot C# nyelven hoztuk létre. Az adatbázis és a Backend szoftver közötti kapcsolat létrehozásához ide is kell telepíteni néhány kiegészítőt. Ebben nagyon sokat tud segíteni a NuGet Package Manager. </w:t>
+      </w:r>
+      <w:r>
+        <w:t>Viszont ezt már korábban említettem. Az adatbázis kapcsolat létrehozását is az egyik ilyen bővítmény segíti egy úgynevezett kapcsolati karakterlánc segítségével, ami a következőképpen néz ki:</w:t>
+      </w:r>
+    </w:p>
+    <w:p>
+      <w:pPr>
+        <w:pStyle w:val="Programkd"/>
+      </w:pPr>
+      <w:r>
+        <w:tab/>
+        <w:t>Scaffold-DbContext</w:t>
+      </w:r>
+    </w:p>
+    <w:p>
+      <w:pPr>
+        <w:pStyle w:val="Programkd"/>
+      </w:pPr>
+      <w:r>
+        <w:tab/>
+      </w:r>
+      <w:r>
+        <w:t>("server=localhost;database=szines_negy_evszak;user=root;password=")</w:t>
+      </w:r>
+    </w:p>
+    <w:p>
+      <w:pPr>
+        <w:pStyle w:val="Programkd"/>
+      </w:pPr>
+      <w:r>
+        <w:tab/>
+        <w:t>MySql.EntityFrameworkCore -Outputdir Models -f</w:t>
+      </w:r>
+    </w:p>
+    <w:p>
+      <w:pPr>
+        <w:pStyle w:val="Cmsor4"/>
+      </w:pPr>
+      <w:r>
+        <w:t>A WAMP szerver:</w:t>
+      </w:r>
+    </w:p>
+    <w:p>
+      <w:pPr>
+        <w:pStyle w:val="Szakdolozatbekezdsek"/>
+      </w:pPr>
+      <w:r>
+        <w:t>Ebben a szerverprogramban lehet létrehozni azt az adatbázist, amihez a Backend programunk csatlakozik. A WAMP letöltése teljesen ingyenes, valamint telepítés után azonnal használható. A program tartalmazza az Apache servert, MySQL-, és a MariaDB adatbáziskezelőket, valamint a PHP</w:t>
+      </w:r>
+      <w:r>
+        <w:t xml:space="preserve"> programozási nyelvet.</w:t>
+      </w:r>
+    </w:p>
+    <w:p>
+      <w:r>
+        <w:br w:type="page"/>
+      </w:r>
+    </w:p>
+    <w:p>
+      <w:pPr>
+        <w:pStyle w:val="Cmsor4"/>
+      </w:pPr>
+      <w:r>
+        <w:lastRenderedPageBreak/>
+        <w:t>Az adatbázis:</w:t>
+      </w:r>
+    </w:p>
+    <w:p>
+      <w:pPr>
+        <w:pStyle w:val="Szakdolozatbekezdsek"/>
+      </w:pPr>
+      <w:r>
+        <w:t>Az előbb említett WAMP szerver segítségével lehet létrehozni az adatbázist. Az adatbázis tábláinak létrehozásához egy fájlban már megvannak a parancsok.</w:t>
+      </w:r>
+      <w:r>
+        <w:t xml:space="preserve"> Ahhoz, hogy ezeket importálhassuk egy kattintással, először létre kell hozni magát az adatbázist. A következő SQL utasítás pont ezt hajtja végre.</w:t>
+      </w:r>
+    </w:p>
+    <w:p>
+      <w:pPr>
+        <w:pStyle w:val="Programkd"/>
+      </w:pPr>
+      <w:r>
+        <w:tab/>
+        <w:t>CREATE DATABASE szines_negy_evszak;</w:t>
+      </w:r>
+    </w:p>
+    <w:p>
+      <w:pPr>
+        <w:pStyle w:val="Szakdolozatbekezdsek"/>
+      </w:pPr>
+      <w:r>
+        <w:t>Miután lefuttattuk a fenti kódot létrejön az adatbázis a WAMP szerveren. Az adatbázis kiválasztása után az importálás fülre kattintva be kell másolni a már kész utasításokat.</w:t>
+      </w:r>
+    </w:p>
+    <w:p>
+      <w:pPr>
+        <w:jc w:val="center"/>
+      </w:pPr>
+      <w:r>
+        <w:drawing>
+          <wp:inline distT="0" distB="0" distL="0" distR="0" wp14:anchorId="2D3D5CE3" wp14:editId="3B1E513E">
+            <wp:extent cx="5760720" cy="688975"/>
+            <wp:effectExtent l="0" t="0" r="0" b="0"/>
+            <wp:docPr id="1290703515" name="Kép 1"/>
+            <wp:cNvGraphicFramePr>
+              <a:graphicFrameLocks xmlns:a="http://schemas.openxmlformats.org/drawingml/2006/main" noChangeAspect="1"/>
+            </wp:cNvGraphicFramePr>
+            <a:graphic xmlns:a="http://schemas.openxmlformats.org/drawingml/2006/main">
+              <a:graphicData uri="http://schemas.openxmlformats.org/drawingml/2006/picture">
+                <pic:pic xmlns:pic="http://schemas.openxmlformats.org/drawingml/2006/picture">
+                  <pic:nvPicPr>
+                    <pic:cNvPr id="1290703515" name=""/>
+                    <pic:cNvPicPr/>
+                  </pic:nvPicPr>
+                  <pic:blipFill>
+                    <a:blip r:embed="rId37"/>
+                    <a:stretch>
+                      <a:fillRect/>
+                    </a:stretch>
+                  </pic:blipFill>
+                  <pic:spPr>
+                    <a:xfrm>
+                      <a:off x="0" y="0"/>
+                      <a:ext cx="5760720" cy="688975"/>
+                    </a:xfrm>
+                    <a:prstGeom prst="rect">
+                      <a:avLst/>
+                    </a:prstGeom>
+                  </pic:spPr>
+                </pic:pic>
+              </a:graphicData>
+            </a:graphic>
+          </wp:inline>
+        </w:drawing>
+      </w:r>
+    </w:p>
+    <w:p>
+      <w:pPr>
+        <w:pStyle w:val="Szakdolozatbekezdsek"/>
+      </w:pPr>
+      <w:r>
+        <w:t xml:space="preserve">A fenti képen lehet látni a kiválasztott adatbázist, és az importáláshoz szükséges parancsgombot. Az előzőekben leírt folyamatot </w:t>
+      </w:r>
+      <w:r>
+        <w:t>végig járva</w:t>
+      </w:r>
+      <w:r>
+        <w:t xml:space="preserve"> az adatbázisban megjelennek a táblák.</w:t>
+      </w:r>
+    </w:p>
+    <w:p>
+      <w:pPr>
+        <w:pStyle w:val="Cmsor4"/>
+      </w:pPr>
+      <w:r>
+        <w:t>A webalkalmazás elindítása:</w:t>
+      </w:r>
+    </w:p>
+    <w:p>
+      <w:pPr>
+        <w:pStyle w:val="Szakdolozatbekezdsek"/>
+      </w:pPr>
+      <w:r>
+        <w:t xml:space="preserve">A WAMP szerver elindítása után – mivel az adatbázist – már tartalmazza más dolgunk ebben a programban nincs. Ezután a Backend programot kell megnyitni a Visual Studio-ban, és elindítani a programot. </w:t>
+      </w:r>
+      <w:r>
+        <w:t xml:space="preserve">Abban az esetben, amikor már a háttérprogramok futnak el lehet indítani a Frontend fejlesztőkörnyezetét a Visual Studio Code-ot. </w:t>
+      </w:r>
+      <w:r>
+        <w:t xml:space="preserve">Itt ki kell választani az </w:t>
+      </w:r>
+      <w:r>
+        <w:rPr>
+          <w:i/>
+          <w:iCs/>
+        </w:rPr>
+        <w:t>index.html</w:t>
+      </w:r>
+      <w:r>
+        <w:t xml:space="preserve"> állományt és indítani a </w:t>
+      </w:r>
+      <w:r>
+        <w:t>már említett Live Server-t</w:t>
+      </w:r>
+      <w:r>
+        <w:t>.</w:t>
+      </w:r>
+    </w:p>
+    <w:p>
+      <w:pPr>
+        <w:pStyle w:val="Szakdolozatbekezdsek"/>
+      </w:pPr>
+      <w:r>
+        <w:t xml:space="preserve">Ekkor az alapértelmezett böngészőnk elindul, és megjelenik az alkalmazásunk első oldala. Ahogyan a programot megírtuk, úgy is kell viselkednie. </w:t>
+      </w:r>
+      <w:r>
+        <w:t>A fejlesztés során előkerült hibákat mostanra kijavítottuk, így már csak a jól működő program előnyeit kell élvezni.</w:t>
+      </w:r>
     </w:p>
     <w:sectPr>
       <w:type w:val="continuous"/>
@@ -11431,6 +12986,119 @@
 <file path=word/numbering.xml><?xml version="1.0" encoding="utf-8"?>
 <w:numbering xmlns:wpc="http://schemas.microsoft.com/office/word/2010/wordprocessingCanvas" xmlns:cx="http://schemas.microsoft.com/office/drawing/2014/chartex" xmlns:cx1="http://schemas.microsoft.com/office/drawing/2015/9/8/chartex" xmlns:cx2="http://schemas.microsoft.com/office/drawing/2015/10/21/chartex" xmlns:cx3="http://schemas.microsoft.com/office/drawing/2016/5/9/chartex" xmlns:cx4="http://schemas.microsoft.com/office/drawing/2016/5/10/chartex" xmlns:cx5="http://schemas.microsoft.com/office/drawing/2016/5/11/chartex" xmlns:cx6="http://schemas.microsoft.com/office/drawing/2016/5/12/chartex" xmlns:cx7="http://schemas.microsoft.com/office/drawing/2016/5/13/chartex" xmlns:cx8="http://schemas.microsoft.com/office/drawing/2016/5/14/chartex" xmlns:mc="http://schemas.openxmlformats.org/markup-compatibility/2006" xmlns:aink="http://schemas.microsoft.com/office/drawing/2016/ink" xmlns:am3d="http://schemas.microsoft.com/office/drawing/2017/model3d" xmlns:o="urn:schemas-microsoft-com:office:office" xmlns:oel="http://schemas.microsoft.com/office/2019/extlst" xmlns:r="http://schemas.openxmlformats.org/officeDocument/2006/relationships" xmlns:m="http://schemas.openxmlformats.org/officeDocument/2006/math" xmlns:v="urn:schemas-microsoft-com:vml" xmlns:wp14="http://schemas.microsoft.com/office/word/2010/wordprocessingDrawing" xmlns:wp="http://schemas.openxmlformats.org/drawingml/2006/wordprocessingDrawing" xmlns:w10="urn:schemas-microsoft-com:office:word" xmlns:w="http://schemas.openxmlformats.org/wordprocessingml/2006/main" xmlns:w14="http://schemas.microsoft.com/office/word/2010/wordml" xmlns:w15="http://schemas.microsoft.com/office/word/2012/wordml" xmlns:w16cex="http://schemas.microsoft.com/office/word/2018/wordml/cex" xmlns:w16cid="http://schemas.microsoft.com/office/word/2016/wordml/cid" xmlns:w16="http://schemas.microsoft.com/office/word/2018/wordml" xmlns:w16du="http://schemas.microsoft.com/office/word/2023/wordml/word16du" xmlns:w16sdtdh="http://schemas.microsoft.com/office/word/2020/wordml/sdtdatahash" xmlns:w16sdtfl="http://schemas.microsoft.com/office/word/2024/wordml/sdtformatlock" xmlns:w16se="http://schemas.microsoft.com/office/word/2015/wordml/symex" xmlns:wpg="http://schemas.microsoft.com/office/word/2010/wordprocessingGroup" xmlns:wpi="http://schemas.microsoft.com/office/word/2010/wordprocessingInk" xmlns:wne="http://schemas.microsoft.com/office/word/2006/wordml" xmlns:wps="http://schemas.microsoft.com/office/word/2010/wordprocessingShape" mc:Ignorable="w14 w15 w16se w16cid w16 w16cex w16sdtdh w16sdtfl w16du wp14">
   <w:abstractNum w:abstractNumId="0" w15:restartNumberingAfterBreak="0">
+    <w:nsid w:val="06441412"/>
+    <w:multiLevelType w:val="hybridMultilevel"/>
+    <w:tmpl w:val="73867396"/>
+    <w:lvl w:ilvl="0" w:tplc="040E0001">
+      <w:start w:val="1"/>
+      <w:numFmt w:val="bullet"/>
+      <w:lvlText w:val=""/>
+      <w:lvlJc w:val="left"/>
+      <w:pPr>
+        <w:ind w:left="1429" w:hanging="360"/>
+      </w:pPr>
+      <w:rPr>
+        <w:rFonts w:ascii="Symbol" w:hAnsi="Symbol" w:hint="default"/>
+      </w:rPr>
+    </w:lvl>
+    <w:lvl w:ilvl="1" w:tplc="040E0003" w:tentative="1">
+      <w:start w:val="1"/>
+      <w:numFmt w:val="bullet"/>
+      <w:lvlText w:val="o"/>
+      <w:lvlJc w:val="left"/>
+      <w:pPr>
+        <w:ind w:left="2149" w:hanging="360"/>
+      </w:pPr>
+      <w:rPr>
+        <w:rFonts w:ascii="Courier New" w:hAnsi="Courier New" w:cs="Courier New" w:hint="default"/>
+      </w:rPr>
+    </w:lvl>
+    <w:lvl w:ilvl="2" w:tplc="040E0005" w:tentative="1">
+      <w:start w:val="1"/>
+      <w:numFmt w:val="bullet"/>
+      <w:lvlText w:val=""/>
+      <w:lvlJc w:val="left"/>
+      <w:pPr>
+        <w:ind w:left="2869" w:hanging="360"/>
+      </w:pPr>
+      <w:rPr>
+        <w:rFonts w:ascii="Wingdings" w:hAnsi="Wingdings" w:hint="default"/>
+      </w:rPr>
+    </w:lvl>
+    <w:lvl w:ilvl="3" w:tplc="040E0001" w:tentative="1">
+      <w:start w:val="1"/>
+      <w:numFmt w:val="bullet"/>
+      <w:lvlText w:val=""/>
+      <w:lvlJc w:val="left"/>
+      <w:pPr>
+        <w:ind w:left="3589" w:hanging="360"/>
+      </w:pPr>
+      <w:rPr>
+        <w:rFonts w:ascii="Symbol" w:hAnsi="Symbol" w:hint="default"/>
+      </w:rPr>
+    </w:lvl>
+    <w:lvl w:ilvl="4" w:tplc="040E0003" w:tentative="1">
+      <w:start w:val="1"/>
+      <w:numFmt w:val="bullet"/>
+      <w:lvlText w:val="o"/>
+      <w:lvlJc w:val="left"/>
+      <w:pPr>
+        <w:ind w:left="4309" w:hanging="360"/>
+      </w:pPr>
+      <w:rPr>
+        <w:rFonts w:ascii="Courier New" w:hAnsi="Courier New" w:cs="Courier New" w:hint="default"/>
+      </w:rPr>
+    </w:lvl>
+    <w:lvl w:ilvl="5" w:tplc="040E0005" w:tentative="1">
+      <w:start w:val="1"/>
+      <w:numFmt w:val="bullet"/>
+      <w:lvlText w:val=""/>
+      <w:lvlJc w:val="left"/>
+      <w:pPr>
+        <w:ind w:left="5029" w:hanging="360"/>
+      </w:pPr>
+      <w:rPr>
+        <w:rFonts w:ascii="Wingdings" w:hAnsi="Wingdings" w:hint="default"/>
+      </w:rPr>
+    </w:lvl>
+    <w:lvl w:ilvl="6" w:tplc="040E0001" w:tentative="1">
+      <w:start w:val="1"/>
+      <w:numFmt w:val="bullet"/>
+      <w:lvlText w:val=""/>
+      <w:lvlJc w:val="left"/>
+      <w:pPr>
+        <w:ind w:left="5749" w:hanging="360"/>
+      </w:pPr>
+      <w:rPr>
+        <w:rFonts w:ascii="Symbol" w:hAnsi="Symbol" w:hint="default"/>
+      </w:rPr>
+    </w:lvl>
+    <w:lvl w:ilvl="7" w:tplc="040E0003" w:tentative="1">
+      <w:start w:val="1"/>
+      <w:numFmt w:val="bullet"/>
+      <w:lvlText w:val="o"/>
+      <w:lvlJc w:val="left"/>
+      <w:pPr>
+        <w:ind w:left="6469" w:hanging="360"/>
+      </w:pPr>
+      <w:rPr>
+        <w:rFonts w:ascii="Courier New" w:hAnsi="Courier New" w:cs="Courier New" w:hint="default"/>
+      </w:rPr>
+    </w:lvl>
+    <w:lvl w:ilvl="8" w:tplc="040E0005" w:tentative="1">
+      <w:start w:val="1"/>
+      <w:numFmt w:val="bullet"/>
+      <w:lvlText w:val=""/>
+      <w:lvlJc w:val="left"/>
+      <w:pPr>
+        <w:ind w:left="7189" w:hanging="360"/>
+      </w:pPr>
+      <w:rPr>
+        <w:rFonts w:ascii="Wingdings" w:hAnsi="Wingdings" w:hint="default"/>
+      </w:rPr>
+    </w:lvl>
+  </w:abstractNum>
+  <w:abstractNum w:abstractNumId="1" w15:restartNumberingAfterBreak="0">
     <w:nsid w:val="06F631CA"/>
     <w:multiLevelType w:val="hybridMultilevel"/>
     <w:tmpl w:val="9DFC4DE0"/>
@@ -11543,7 +13211,7 @@
       </w:rPr>
     </w:lvl>
   </w:abstractNum>
-  <w:abstractNum w:abstractNumId="1" w15:restartNumberingAfterBreak="0">
+  <w:abstractNum w:abstractNumId="2" w15:restartNumberingAfterBreak="0">
     <w:nsid w:val="088E5FFF"/>
     <w:multiLevelType w:val="hybridMultilevel"/>
     <w:tmpl w:val="E7146BBA"/>
@@ -11656,7 +13324,7 @@
       </w:rPr>
     </w:lvl>
   </w:abstractNum>
-  <w:abstractNum w:abstractNumId="2" w15:restartNumberingAfterBreak="0">
+  <w:abstractNum w:abstractNumId="3" w15:restartNumberingAfterBreak="0">
     <w:nsid w:val="0A3D67CB"/>
     <w:multiLevelType w:val="hybridMultilevel"/>
     <w:tmpl w:val="26167B6E"/>
@@ -11769,7 +13437,233 @@
       </w:rPr>
     </w:lvl>
   </w:abstractNum>
-  <w:abstractNum w:abstractNumId="3" w15:restartNumberingAfterBreak="0">
+  <w:abstractNum w:abstractNumId="4" w15:restartNumberingAfterBreak="0">
+    <w:nsid w:val="0DD852AE"/>
+    <w:multiLevelType w:val="hybridMultilevel"/>
+    <w:tmpl w:val="4C4C868E"/>
+    <w:lvl w:ilvl="0" w:tplc="040E0001">
+      <w:start w:val="1"/>
+      <w:numFmt w:val="bullet"/>
+      <w:lvlText w:val=""/>
+      <w:lvlJc w:val="left"/>
+      <w:pPr>
+        <w:ind w:left="720" w:hanging="360"/>
+      </w:pPr>
+      <w:rPr>
+        <w:rFonts w:ascii="Symbol" w:hAnsi="Symbol" w:hint="default"/>
+      </w:rPr>
+    </w:lvl>
+    <w:lvl w:ilvl="1" w:tplc="040E0003">
+      <w:start w:val="1"/>
+      <w:numFmt w:val="bullet"/>
+      <w:lvlText w:val="o"/>
+      <w:lvlJc w:val="left"/>
+      <w:pPr>
+        <w:ind w:left="1440" w:hanging="360"/>
+      </w:pPr>
+      <w:rPr>
+        <w:rFonts w:ascii="Courier New" w:hAnsi="Courier New" w:cs="Courier New" w:hint="default"/>
+      </w:rPr>
+    </w:lvl>
+    <w:lvl w:ilvl="2" w:tplc="040E0005" w:tentative="1">
+      <w:start w:val="1"/>
+      <w:numFmt w:val="bullet"/>
+      <w:lvlText w:val=""/>
+      <w:lvlJc w:val="left"/>
+      <w:pPr>
+        <w:ind w:left="2160" w:hanging="360"/>
+      </w:pPr>
+      <w:rPr>
+        <w:rFonts w:ascii="Wingdings" w:hAnsi="Wingdings" w:hint="default"/>
+      </w:rPr>
+    </w:lvl>
+    <w:lvl w:ilvl="3" w:tplc="040E0001" w:tentative="1">
+      <w:start w:val="1"/>
+      <w:numFmt w:val="bullet"/>
+      <w:lvlText w:val=""/>
+      <w:lvlJc w:val="left"/>
+      <w:pPr>
+        <w:ind w:left="2880" w:hanging="360"/>
+      </w:pPr>
+      <w:rPr>
+        <w:rFonts w:ascii="Symbol" w:hAnsi="Symbol" w:hint="default"/>
+      </w:rPr>
+    </w:lvl>
+    <w:lvl w:ilvl="4" w:tplc="040E0003" w:tentative="1">
+      <w:start w:val="1"/>
+      <w:numFmt w:val="bullet"/>
+      <w:lvlText w:val="o"/>
+      <w:lvlJc w:val="left"/>
+      <w:pPr>
+        <w:ind w:left="3600" w:hanging="360"/>
+      </w:pPr>
+      <w:rPr>
+        <w:rFonts w:ascii="Courier New" w:hAnsi="Courier New" w:cs="Courier New" w:hint="default"/>
+      </w:rPr>
+    </w:lvl>
+    <w:lvl w:ilvl="5" w:tplc="040E0005" w:tentative="1">
+      <w:start w:val="1"/>
+      <w:numFmt w:val="bullet"/>
+      <w:lvlText w:val=""/>
+      <w:lvlJc w:val="left"/>
+      <w:pPr>
+        <w:ind w:left="4320" w:hanging="360"/>
+      </w:pPr>
+      <w:rPr>
+        <w:rFonts w:ascii="Wingdings" w:hAnsi="Wingdings" w:hint="default"/>
+      </w:rPr>
+    </w:lvl>
+    <w:lvl w:ilvl="6" w:tplc="040E0001" w:tentative="1">
+      <w:start w:val="1"/>
+      <w:numFmt w:val="bullet"/>
+      <w:lvlText w:val=""/>
+      <w:lvlJc w:val="left"/>
+      <w:pPr>
+        <w:ind w:left="5040" w:hanging="360"/>
+      </w:pPr>
+      <w:rPr>
+        <w:rFonts w:ascii="Symbol" w:hAnsi="Symbol" w:hint="default"/>
+      </w:rPr>
+    </w:lvl>
+    <w:lvl w:ilvl="7" w:tplc="040E0003" w:tentative="1">
+      <w:start w:val="1"/>
+      <w:numFmt w:val="bullet"/>
+      <w:lvlText w:val="o"/>
+      <w:lvlJc w:val="left"/>
+      <w:pPr>
+        <w:ind w:left="5760" w:hanging="360"/>
+      </w:pPr>
+      <w:rPr>
+        <w:rFonts w:ascii="Courier New" w:hAnsi="Courier New" w:cs="Courier New" w:hint="default"/>
+      </w:rPr>
+    </w:lvl>
+    <w:lvl w:ilvl="8" w:tplc="040E0005" w:tentative="1">
+      <w:start w:val="1"/>
+      <w:numFmt w:val="bullet"/>
+      <w:lvlText w:val=""/>
+      <w:lvlJc w:val="left"/>
+      <w:pPr>
+        <w:ind w:left="6480" w:hanging="360"/>
+      </w:pPr>
+      <w:rPr>
+        <w:rFonts w:ascii="Wingdings" w:hAnsi="Wingdings" w:hint="default"/>
+      </w:rPr>
+    </w:lvl>
+  </w:abstractNum>
+  <w:abstractNum w:abstractNumId="5" w15:restartNumberingAfterBreak="0">
+    <w:nsid w:val="1043127A"/>
+    <w:multiLevelType w:val="hybridMultilevel"/>
+    <w:tmpl w:val="21B6B326"/>
+    <w:lvl w:ilvl="0" w:tplc="040E0001">
+      <w:start w:val="1"/>
+      <w:numFmt w:val="bullet"/>
+      <w:lvlText w:val=""/>
+      <w:lvlJc w:val="left"/>
+      <w:pPr>
+        <w:ind w:left="1429" w:hanging="360"/>
+      </w:pPr>
+      <w:rPr>
+        <w:rFonts w:ascii="Symbol" w:hAnsi="Symbol" w:hint="default"/>
+      </w:rPr>
+    </w:lvl>
+    <w:lvl w:ilvl="1" w:tplc="040E0003" w:tentative="1">
+      <w:start w:val="1"/>
+      <w:numFmt w:val="bullet"/>
+      <w:lvlText w:val="o"/>
+      <w:lvlJc w:val="left"/>
+      <w:pPr>
+        <w:ind w:left="2149" w:hanging="360"/>
+      </w:pPr>
+      <w:rPr>
+        <w:rFonts w:ascii="Courier New" w:hAnsi="Courier New" w:cs="Courier New" w:hint="default"/>
+      </w:rPr>
+    </w:lvl>
+    <w:lvl w:ilvl="2" w:tplc="040E0005" w:tentative="1">
+      <w:start w:val="1"/>
+      <w:numFmt w:val="bullet"/>
+      <w:lvlText w:val=""/>
+      <w:lvlJc w:val="left"/>
+      <w:pPr>
+        <w:ind w:left="2869" w:hanging="360"/>
+      </w:pPr>
+      <w:rPr>
+        <w:rFonts w:ascii="Wingdings" w:hAnsi="Wingdings" w:hint="default"/>
+      </w:rPr>
+    </w:lvl>
+    <w:lvl w:ilvl="3" w:tplc="040E0001" w:tentative="1">
+      <w:start w:val="1"/>
+      <w:numFmt w:val="bullet"/>
+      <w:lvlText w:val=""/>
+      <w:lvlJc w:val="left"/>
+      <w:pPr>
+        <w:ind w:left="3589" w:hanging="360"/>
+      </w:pPr>
+      <w:rPr>
+        <w:rFonts w:ascii="Symbol" w:hAnsi="Symbol" w:hint="default"/>
+      </w:rPr>
+    </w:lvl>
+    <w:lvl w:ilvl="4" w:tplc="040E0003" w:tentative="1">
+      <w:start w:val="1"/>
+      <w:numFmt w:val="bullet"/>
+      <w:lvlText w:val="o"/>
+      <w:lvlJc w:val="left"/>
+      <w:pPr>
+        <w:ind w:left="4309" w:hanging="360"/>
+      </w:pPr>
+      <w:rPr>
+        <w:rFonts w:ascii="Courier New" w:hAnsi="Courier New" w:cs="Courier New" w:hint="default"/>
+      </w:rPr>
+    </w:lvl>
+    <w:lvl w:ilvl="5" w:tplc="040E0005" w:tentative="1">
+      <w:start w:val="1"/>
+      <w:numFmt w:val="bullet"/>
+      <w:lvlText w:val=""/>
+      <w:lvlJc w:val="left"/>
+      <w:pPr>
+        <w:ind w:left="5029" w:hanging="360"/>
+      </w:pPr>
+      <w:rPr>
+        <w:rFonts w:ascii="Wingdings" w:hAnsi="Wingdings" w:hint="default"/>
+      </w:rPr>
+    </w:lvl>
+    <w:lvl w:ilvl="6" w:tplc="040E0001" w:tentative="1">
+      <w:start w:val="1"/>
+      <w:numFmt w:val="bullet"/>
+      <w:lvlText w:val=""/>
+      <w:lvlJc w:val="left"/>
+      <w:pPr>
+        <w:ind w:left="5749" w:hanging="360"/>
+      </w:pPr>
+      <w:rPr>
+        <w:rFonts w:ascii="Symbol" w:hAnsi="Symbol" w:hint="default"/>
+      </w:rPr>
+    </w:lvl>
+    <w:lvl w:ilvl="7" w:tplc="040E0003" w:tentative="1">
+      <w:start w:val="1"/>
+      <w:numFmt w:val="bullet"/>
+      <w:lvlText w:val="o"/>
+      <w:lvlJc w:val="left"/>
+      <w:pPr>
+        <w:ind w:left="6469" w:hanging="360"/>
+      </w:pPr>
+      <w:rPr>
+        <w:rFonts w:ascii="Courier New" w:hAnsi="Courier New" w:cs="Courier New" w:hint="default"/>
+      </w:rPr>
+    </w:lvl>
+    <w:lvl w:ilvl="8" w:tplc="040E0005" w:tentative="1">
+      <w:start w:val="1"/>
+      <w:numFmt w:val="bullet"/>
+      <w:lvlText w:val=""/>
+      <w:lvlJc w:val="left"/>
+      <w:pPr>
+        <w:ind w:left="7189" w:hanging="360"/>
+      </w:pPr>
+      <w:rPr>
+        <w:rFonts w:ascii="Wingdings" w:hAnsi="Wingdings" w:hint="default"/>
+      </w:rPr>
+    </w:lvl>
+  </w:abstractNum>
+  <w:abstractNum w:abstractNumId="6" w15:restartNumberingAfterBreak="0">
     <w:nsid w:val="1A0F61F9"/>
     <w:multiLevelType w:val="hybridMultilevel"/>
     <w:tmpl w:val="9A0C61AE"/>
@@ -11882,7 +13776,7 @@
       </w:rPr>
     </w:lvl>
   </w:abstractNum>
-  <w:abstractNum w:abstractNumId="4" w15:restartNumberingAfterBreak="0">
+  <w:abstractNum w:abstractNumId="7" w15:restartNumberingAfterBreak="0">
     <w:nsid w:val="1D1430D8"/>
     <w:multiLevelType w:val="hybridMultilevel"/>
     <w:tmpl w:val="2AFEA61A"/>
@@ -11995,7 +13889,120 @@
       </w:rPr>
     </w:lvl>
   </w:abstractNum>
-  <w:abstractNum w:abstractNumId="5" w15:restartNumberingAfterBreak="0">
+  <w:abstractNum w:abstractNumId="8" w15:restartNumberingAfterBreak="0">
+    <w:nsid w:val="1D44691A"/>
+    <w:multiLevelType w:val="hybridMultilevel"/>
+    <w:tmpl w:val="BDCAA692"/>
+    <w:lvl w:ilvl="0" w:tplc="040E0001">
+      <w:start w:val="1"/>
+      <w:numFmt w:val="bullet"/>
+      <w:lvlText w:val=""/>
+      <w:lvlJc w:val="left"/>
+      <w:pPr>
+        <w:ind w:left="1429" w:hanging="360"/>
+      </w:pPr>
+      <w:rPr>
+        <w:rFonts w:ascii="Symbol" w:hAnsi="Symbol" w:hint="default"/>
+      </w:rPr>
+    </w:lvl>
+    <w:lvl w:ilvl="1" w:tplc="040E0003">
+      <w:start w:val="1"/>
+      <w:numFmt w:val="bullet"/>
+      <w:lvlText w:val="o"/>
+      <w:lvlJc w:val="left"/>
+      <w:pPr>
+        <w:ind w:left="2149" w:hanging="360"/>
+      </w:pPr>
+      <w:rPr>
+        <w:rFonts w:ascii="Courier New" w:hAnsi="Courier New" w:cs="Courier New" w:hint="default"/>
+      </w:rPr>
+    </w:lvl>
+    <w:lvl w:ilvl="2" w:tplc="040E0005" w:tentative="1">
+      <w:start w:val="1"/>
+      <w:numFmt w:val="bullet"/>
+      <w:lvlText w:val=""/>
+      <w:lvlJc w:val="left"/>
+      <w:pPr>
+        <w:ind w:left="2869" w:hanging="360"/>
+      </w:pPr>
+      <w:rPr>
+        <w:rFonts w:ascii="Wingdings" w:hAnsi="Wingdings" w:hint="default"/>
+      </w:rPr>
+    </w:lvl>
+    <w:lvl w:ilvl="3" w:tplc="040E0001" w:tentative="1">
+      <w:start w:val="1"/>
+      <w:numFmt w:val="bullet"/>
+      <w:lvlText w:val=""/>
+      <w:lvlJc w:val="left"/>
+      <w:pPr>
+        <w:ind w:left="3589" w:hanging="360"/>
+      </w:pPr>
+      <w:rPr>
+        <w:rFonts w:ascii="Symbol" w:hAnsi="Symbol" w:hint="default"/>
+      </w:rPr>
+    </w:lvl>
+    <w:lvl w:ilvl="4" w:tplc="040E0003" w:tentative="1">
+      <w:start w:val="1"/>
+      <w:numFmt w:val="bullet"/>
+      <w:lvlText w:val="o"/>
+      <w:lvlJc w:val="left"/>
+      <w:pPr>
+        <w:ind w:left="4309" w:hanging="360"/>
+      </w:pPr>
+      <w:rPr>
+        <w:rFonts w:ascii="Courier New" w:hAnsi="Courier New" w:cs="Courier New" w:hint="default"/>
+      </w:rPr>
+    </w:lvl>
+    <w:lvl w:ilvl="5" w:tplc="040E0005" w:tentative="1">
+      <w:start w:val="1"/>
+      <w:numFmt w:val="bullet"/>
+      <w:lvlText w:val=""/>
+      <w:lvlJc w:val="left"/>
+      <w:pPr>
+        <w:ind w:left="5029" w:hanging="360"/>
+      </w:pPr>
+      <w:rPr>
+        <w:rFonts w:ascii="Wingdings" w:hAnsi="Wingdings" w:hint="default"/>
+      </w:rPr>
+    </w:lvl>
+    <w:lvl w:ilvl="6" w:tplc="040E0001" w:tentative="1">
+      <w:start w:val="1"/>
+      <w:numFmt w:val="bullet"/>
+      <w:lvlText w:val=""/>
+      <w:lvlJc w:val="left"/>
+      <w:pPr>
+        <w:ind w:left="5749" w:hanging="360"/>
+      </w:pPr>
+      <w:rPr>
+        <w:rFonts w:ascii="Symbol" w:hAnsi="Symbol" w:hint="default"/>
+      </w:rPr>
+    </w:lvl>
+    <w:lvl w:ilvl="7" w:tplc="040E0003" w:tentative="1">
+      <w:start w:val="1"/>
+      <w:numFmt w:val="bullet"/>
+      <w:lvlText w:val="o"/>
+      <w:lvlJc w:val="left"/>
+      <w:pPr>
+        <w:ind w:left="6469" w:hanging="360"/>
+      </w:pPr>
+      <w:rPr>
+        <w:rFonts w:ascii="Courier New" w:hAnsi="Courier New" w:cs="Courier New" w:hint="default"/>
+      </w:rPr>
+    </w:lvl>
+    <w:lvl w:ilvl="8" w:tplc="040E0005" w:tentative="1">
+      <w:start w:val="1"/>
+      <w:numFmt w:val="bullet"/>
+      <w:lvlText w:val=""/>
+      <w:lvlJc w:val="left"/>
+      <w:pPr>
+        <w:ind w:left="7189" w:hanging="360"/>
+      </w:pPr>
+      <w:rPr>
+        <w:rFonts w:ascii="Wingdings" w:hAnsi="Wingdings" w:hint="default"/>
+      </w:rPr>
+    </w:lvl>
+  </w:abstractNum>
+  <w:abstractNum w:abstractNumId="9" w15:restartNumberingAfterBreak="0">
     <w:nsid w:val="1D673BBA"/>
     <w:multiLevelType w:val="hybridMultilevel"/>
     <w:tmpl w:val="073245E4"/>
@@ -12108,7 +14115,7 @@
       </w:rPr>
     </w:lvl>
   </w:abstractNum>
-  <w:abstractNum w:abstractNumId="6" w15:restartNumberingAfterBreak="0">
+  <w:abstractNum w:abstractNumId="10" w15:restartNumberingAfterBreak="0">
     <w:nsid w:val="24A91DD0"/>
     <w:multiLevelType w:val="hybridMultilevel"/>
     <w:tmpl w:val="F1167498"/>
@@ -12221,7 +14228,346 @@
       </w:rPr>
     </w:lvl>
   </w:abstractNum>
-  <w:abstractNum w:abstractNumId="7" w15:restartNumberingAfterBreak="0">
+  <w:abstractNum w:abstractNumId="11" w15:restartNumberingAfterBreak="0">
+    <w:nsid w:val="251673D2"/>
+    <w:multiLevelType w:val="hybridMultilevel"/>
+    <w:tmpl w:val="3F8AFBE2"/>
+    <w:lvl w:ilvl="0" w:tplc="040E0001">
+      <w:start w:val="1"/>
+      <w:numFmt w:val="bullet"/>
+      <w:lvlText w:val=""/>
+      <w:lvlJc w:val="left"/>
+      <w:pPr>
+        <w:ind w:left="1429" w:hanging="360"/>
+      </w:pPr>
+      <w:rPr>
+        <w:rFonts w:ascii="Symbol" w:hAnsi="Symbol" w:hint="default"/>
+      </w:rPr>
+    </w:lvl>
+    <w:lvl w:ilvl="1" w:tplc="040E0003" w:tentative="1">
+      <w:start w:val="1"/>
+      <w:numFmt w:val="bullet"/>
+      <w:lvlText w:val="o"/>
+      <w:lvlJc w:val="left"/>
+      <w:pPr>
+        <w:ind w:left="2149" w:hanging="360"/>
+      </w:pPr>
+      <w:rPr>
+        <w:rFonts w:ascii="Courier New" w:hAnsi="Courier New" w:cs="Courier New" w:hint="default"/>
+      </w:rPr>
+    </w:lvl>
+    <w:lvl w:ilvl="2" w:tplc="040E0005" w:tentative="1">
+      <w:start w:val="1"/>
+      <w:numFmt w:val="bullet"/>
+      <w:lvlText w:val=""/>
+      <w:lvlJc w:val="left"/>
+      <w:pPr>
+        <w:ind w:left="2869" w:hanging="360"/>
+      </w:pPr>
+      <w:rPr>
+        <w:rFonts w:ascii="Wingdings" w:hAnsi="Wingdings" w:hint="default"/>
+      </w:rPr>
+    </w:lvl>
+    <w:lvl w:ilvl="3" w:tplc="040E0001" w:tentative="1">
+      <w:start w:val="1"/>
+      <w:numFmt w:val="bullet"/>
+      <w:lvlText w:val=""/>
+      <w:lvlJc w:val="left"/>
+      <w:pPr>
+        <w:ind w:left="3589" w:hanging="360"/>
+      </w:pPr>
+      <w:rPr>
+        <w:rFonts w:ascii="Symbol" w:hAnsi="Symbol" w:hint="default"/>
+      </w:rPr>
+    </w:lvl>
+    <w:lvl w:ilvl="4" w:tplc="040E0003" w:tentative="1">
+      <w:start w:val="1"/>
+      <w:numFmt w:val="bullet"/>
+      <w:lvlText w:val="o"/>
+      <w:lvlJc w:val="left"/>
+      <w:pPr>
+        <w:ind w:left="4309" w:hanging="360"/>
+      </w:pPr>
+      <w:rPr>
+        <w:rFonts w:ascii="Courier New" w:hAnsi="Courier New" w:cs="Courier New" w:hint="default"/>
+      </w:rPr>
+    </w:lvl>
+    <w:lvl w:ilvl="5" w:tplc="040E0005" w:tentative="1">
+      <w:start w:val="1"/>
+      <w:numFmt w:val="bullet"/>
+      <w:lvlText w:val=""/>
+      <w:lvlJc w:val="left"/>
+      <w:pPr>
+        <w:ind w:left="5029" w:hanging="360"/>
+      </w:pPr>
+      <w:rPr>
+        <w:rFonts w:ascii="Wingdings" w:hAnsi="Wingdings" w:hint="default"/>
+      </w:rPr>
+    </w:lvl>
+    <w:lvl w:ilvl="6" w:tplc="040E0001" w:tentative="1">
+      <w:start w:val="1"/>
+      <w:numFmt w:val="bullet"/>
+      <w:lvlText w:val=""/>
+      <w:lvlJc w:val="left"/>
+      <w:pPr>
+        <w:ind w:left="5749" w:hanging="360"/>
+      </w:pPr>
+      <w:rPr>
+        <w:rFonts w:ascii="Symbol" w:hAnsi="Symbol" w:hint="default"/>
+      </w:rPr>
+    </w:lvl>
+    <w:lvl w:ilvl="7" w:tplc="040E0003" w:tentative="1">
+      <w:start w:val="1"/>
+      <w:numFmt w:val="bullet"/>
+      <w:lvlText w:val="o"/>
+      <w:lvlJc w:val="left"/>
+      <w:pPr>
+        <w:ind w:left="6469" w:hanging="360"/>
+      </w:pPr>
+      <w:rPr>
+        <w:rFonts w:ascii="Courier New" w:hAnsi="Courier New" w:cs="Courier New" w:hint="default"/>
+      </w:rPr>
+    </w:lvl>
+    <w:lvl w:ilvl="8" w:tplc="040E0005" w:tentative="1">
+      <w:start w:val="1"/>
+      <w:numFmt w:val="bullet"/>
+      <w:lvlText w:val=""/>
+      <w:lvlJc w:val="left"/>
+      <w:pPr>
+        <w:ind w:left="7189" w:hanging="360"/>
+      </w:pPr>
+      <w:rPr>
+        <w:rFonts w:ascii="Wingdings" w:hAnsi="Wingdings" w:hint="default"/>
+      </w:rPr>
+    </w:lvl>
+  </w:abstractNum>
+  <w:abstractNum w:abstractNumId="12" w15:restartNumberingAfterBreak="0">
+    <w:nsid w:val="26CA53D7"/>
+    <w:multiLevelType w:val="hybridMultilevel"/>
+    <w:tmpl w:val="2F24CD80"/>
+    <w:lvl w:ilvl="0" w:tplc="040E0001">
+      <w:start w:val="1"/>
+      <w:numFmt w:val="bullet"/>
+      <w:lvlText w:val=""/>
+      <w:lvlJc w:val="left"/>
+      <w:pPr>
+        <w:ind w:left="1429" w:hanging="360"/>
+      </w:pPr>
+      <w:rPr>
+        <w:rFonts w:ascii="Symbol" w:hAnsi="Symbol" w:hint="default"/>
+      </w:rPr>
+    </w:lvl>
+    <w:lvl w:ilvl="1" w:tplc="040E0003" w:tentative="1">
+      <w:start w:val="1"/>
+      <w:numFmt w:val="bullet"/>
+      <w:lvlText w:val="o"/>
+      <w:lvlJc w:val="left"/>
+      <w:pPr>
+        <w:ind w:left="2149" w:hanging="360"/>
+      </w:pPr>
+      <w:rPr>
+        <w:rFonts w:ascii="Courier New" w:hAnsi="Courier New" w:cs="Courier New" w:hint="default"/>
+      </w:rPr>
+    </w:lvl>
+    <w:lvl w:ilvl="2" w:tplc="040E0005" w:tentative="1">
+      <w:start w:val="1"/>
+      <w:numFmt w:val="bullet"/>
+      <w:lvlText w:val=""/>
+      <w:lvlJc w:val="left"/>
+      <w:pPr>
+        <w:ind w:left="2869" w:hanging="360"/>
+      </w:pPr>
+      <w:rPr>
+        <w:rFonts w:ascii="Wingdings" w:hAnsi="Wingdings" w:hint="default"/>
+      </w:rPr>
+    </w:lvl>
+    <w:lvl w:ilvl="3" w:tplc="040E0001" w:tentative="1">
+      <w:start w:val="1"/>
+      <w:numFmt w:val="bullet"/>
+      <w:lvlText w:val=""/>
+      <w:lvlJc w:val="left"/>
+      <w:pPr>
+        <w:ind w:left="3589" w:hanging="360"/>
+      </w:pPr>
+      <w:rPr>
+        <w:rFonts w:ascii="Symbol" w:hAnsi="Symbol" w:hint="default"/>
+      </w:rPr>
+    </w:lvl>
+    <w:lvl w:ilvl="4" w:tplc="040E0003" w:tentative="1">
+      <w:start w:val="1"/>
+      <w:numFmt w:val="bullet"/>
+      <w:lvlText w:val="o"/>
+      <w:lvlJc w:val="left"/>
+      <w:pPr>
+        <w:ind w:left="4309" w:hanging="360"/>
+      </w:pPr>
+      <w:rPr>
+        <w:rFonts w:ascii="Courier New" w:hAnsi="Courier New" w:cs="Courier New" w:hint="default"/>
+      </w:rPr>
+    </w:lvl>
+    <w:lvl w:ilvl="5" w:tplc="040E0005" w:tentative="1">
+      <w:start w:val="1"/>
+      <w:numFmt w:val="bullet"/>
+      <w:lvlText w:val=""/>
+      <w:lvlJc w:val="left"/>
+      <w:pPr>
+        <w:ind w:left="5029" w:hanging="360"/>
+      </w:pPr>
+      <w:rPr>
+        <w:rFonts w:ascii="Wingdings" w:hAnsi="Wingdings" w:hint="default"/>
+      </w:rPr>
+    </w:lvl>
+    <w:lvl w:ilvl="6" w:tplc="040E0001" w:tentative="1">
+      <w:start w:val="1"/>
+      <w:numFmt w:val="bullet"/>
+      <w:lvlText w:val=""/>
+      <w:lvlJc w:val="left"/>
+      <w:pPr>
+        <w:ind w:left="5749" w:hanging="360"/>
+      </w:pPr>
+      <w:rPr>
+        <w:rFonts w:ascii="Symbol" w:hAnsi="Symbol" w:hint="default"/>
+      </w:rPr>
+    </w:lvl>
+    <w:lvl w:ilvl="7" w:tplc="040E0003" w:tentative="1">
+      <w:start w:val="1"/>
+      <w:numFmt w:val="bullet"/>
+      <w:lvlText w:val="o"/>
+      <w:lvlJc w:val="left"/>
+      <w:pPr>
+        <w:ind w:left="6469" w:hanging="360"/>
+      </w:pPr>
+      <w:rPr>
+        <w:rFonts w:ascii="Courier New" w:hAnsi="Courier New" w:cs="Courier New" w:hint="default"/>
+      </w:rPr>
+    </w:lvl>
+    <w:lvl w:ilvl="8" w:tplc="040E0005" w:tentative="1">
+      <w:start w:val="1"/>
+      <w:numFmt w:val="bullet"/>
+      <w:lvlText w:val=""/>
+      <w:lvlJc w:val="left"/>
+      <w:pPr>
+        <w:ind w:left="7189" w:hanging="360"/>
+      </w:pPr>
+      <w:rPr>
+        <w:rFonts w:ascii="Wingdings" w:hAnsi="Wingdings" w:hint="default"/>
+      </w:rPr>
+    </w:lvl>
+  </w:abstractNum>
+  <w:abstractNum w:abstractNumId="13" w15:restartNumberingAfterBreak="0">
+    <w:nsid w:val="29A97D34"/>
+    <w:multiLevelType w:val="hybridMultilevel"/>
+    <w:tmpl w:val="104C8854"/>
+    <w:lvl w:ilvl="0" w:tplc="040E0001">
+      <w:start w:val="1"/>
+      <w:numFmt w:val="bullet"/>
+      <w:lvlText w:val=""/>
+      <w:lvlJc w:val="left"/>
+      <w:pPr>
+        <w:ind w:left="1429" w:hanging="360"/>
+      </w:pPr>
+      <w:rPr>
+        <w:rFonts w:ascii="Symbol" w:hAnsi="Symbol" w:hint="default"/>
+      </w:rPr>
+    </w:lvl>
+    <w:lvl w:ilvl="1" w:tplc="040E0003" w:tentative="1">
+      <w:start w:val="1"/>
+      <w:numFmt w:val="bullet"/>
+      <w:lvlText w:val="o"/>
+      <w:lvlJc w:val="left"/>
+      <w:pPr>
+        <w:ind w:left="2149" w:hanging="360"/>
+      </w:pPr>
+      <w:rPr>
+        <w:rFonts w:ascii="Courier New" w:hAnsi="Courier New" w:cs="Courier New" w:hint="default"/>
+      </w:rPr>
+    </w:lvl>
+    <w:lvl w:ilvl="2" w:tplc="040E0005" w:tentative="1">
+      <w:start w:val="1"/>
+      <w:numFmt w:val="bullet"/>
+      <w:lvlText w:val=""/>
+      <w:lvlJc w:val="left"/>
+      <w:pPr>
+        <w:ind w:left="2869" w:hanging="360"/>
+      </w:pPr>
+      <w:rPr>
+        <w:rFonts w:ascii="Wingdings" w:hAnsi="Wingdings" w:hint="default"/>
+      </w:rPr>
+    </w:lvl>
+    <w:lvl w:ilvl="3" w:tplc="040E0001" w:tentative="1">
+      <w:start w:val="1"/>
+      <w:numFmt w:val="bullet"/>
+      <w:lvlText w:val=""/>
+      <w:lvlJc w:val="left"/>
+      <w:pPr>
+        <w:ind w:left="3589" w:hanging="360"/>
+      </w:pPr>
+      <w:rPr>
+        <w:rFonts w:ascii="Symbol" w:hAnsi="Symbol" w:hint="default"/>
+      </w:rPr>
+    </w:lvl>
+    <w:lvl w:ilvl="4" w:tplc="040E0003" w:tentative="1">
+      <w:start w:val="1"/>
+      <w:numFmt w:val="bullet"/>
+      <w:lvlText w:val="o"/>
+      <w:lvlJc w:val="left"/>
+      <w:pPr>
+        <w:ind w:left="4309" w:hanging="360"/>
+      </w:pPr>
+      <w:rPr>
+        <w:rFonts w:ascii="Courier New" w:hAnsi="Courier New" w:cs="Courier New" w:hint="default"/>
+      </w:rPr>
+    </w:lvl>
+    <w:lvl w:ilvl="5" w:tplc="040E0005" w:tentative="1">
+      <w:start w:val="1"/>
+      <w:numFmt w:val="bullet"/>
+      <w:lvlText w:val=""/>
+      <w:lvlJc w:val="left"/>
+      <w:pPr>
+        <w:ind w:left="5029" w:hanging="360"/>
+      </w:pPr>
+      <w:rPr>
+        <w:rFonts w:ascii="Wingdings" w:hAnsi="Wingdings" w:hint="default"/>
+      </w:rPr>
+    </w:lvl>
+    <w:lvl w:ilvl="6" w:tplc="040E0001" w:tentative="1">
+      <w:start w:val="1"/>
+      <w:numFmt w:val="bullet"/>
+      <w:lvlText w:val=""/>
+      <w:lvlJc w:val="left"/>
+      <w:pPr>
+        <w:ind w:left="5749" w:hanging="360"/>
+      </w:pPr>
+      <w:rPr>
+        <w:rFonts w:ascii="Symbol" w:hAnsi="Symbol" w:hint="default"/>
+      </w:rPr>
+    </w:lvl>
+    <w:lvl w:ilvl="7" w:tplc="040E0003" w:tentative="1">
+      <w:start w:val="1"/>
+      <w:numFmt w:val="bullet"/>
+      <w:lvlText w:val="o"/>
+      <w:lvlJc w:val="left"/>
+      <w:pPr>
+        <w:ind w:left="6469" w:hanging="360"/>
+      </w:pPr>
+      <w:rPr>
+        <w:rFonts w:ascii="Courier New" w:hAnsi="Courier New" w:cs="Courier New" w:hint="default"/>
+      </w:rPr>
+    </w:lvl>
+    <w:lvl w:ilvl="8" w:tplc="040E0005" w:tentative="1">
+      <w:start w:val="1"/>
+      <w:numFmt w:val="bullet"/>
+      <w:lvlText w:val=""/>
+      <w:lvlJc w:val="left"/>
+      <w:pPr>
+        <w:ind w:left="7189" w:hanging="360"/>
+      </w:pPr>
+      <w:rPr>
+        <w:rFonts w:ascii="Wingdings" w:hAnsi="Wingdings" w:hint="default"/>
+      </w:rPr>
+    </w:lvl>
+  </w:abstractNum>
+  <w:abstractNum w:abstractNumId="14" w15:restartNumberingAfterBreak="0">
     <w:nsid w:val="2D34586A"/>
     <w:multiLevelType w:val="hybridMultilevel"/>
     <w:tmpl w:val="57D288D6"/>
@@ -12334,7 +14680,7 @@
       </w:rPr>
     </w:lvl>
   </w:abstractNum>
-  <w:abstractNum w:abstractNumId="8" w15:restartNumberingAfterBreak="0">
+  <w:abstractNum w:abstractNumId="15" w15:restartNumberingAfterBreak="0">
     <w:nsid w:val="332E381B"/>
     <w:multiLevelType w:val="hybridMultilevel"/>
     <w:tmpl w:val="59E650A0"/>
@@ -12447,7 +14793,7 @@
       </w:rPr>
     </w:lvl>
   </w:abstractNum>
-  <w:abstractNum w:abstractNumId="9" w15:restartNumberingAfterBreak="0">
+  <w:abstractNum w:abstractNumId="16" w15:restartNumberingAfterBreak="0">
     <w:nsid w:val="361E6B14"/>
     <w:multiLevelType w:val="hybridMultilevel"/>
     <w:tmpl w:val="3BACB1F0"/>
@@ -12560,7 +14906,7 @@
       </w:rPr>
     </w:lvl>
   </w:abstractNum>
-  <w:abstractNum w:abstractNumId="10" w15:restartNumberingAfterBreak="0">
+  <w:abstractNum w:abstractNumId="17" w15:restartNumberingAfterBreak="0">
     <w:nsid w:val="373B0F5A"/>
     <w:multiLevelType w:val="hybridMultilevel"/>
     <w:tmpl w:val="69C893FC"/>
@@ -12673,7 +15019,7 @@
       </w:rPr>
     </w:lvl>
   </w:abstractNum>
-  <w:abstractNum w:abstractNumId="11" w15:restartNumberingAfterBreak="0">
+  <w:abstractNum w:abstractNumId="18" w15:restartNumberingAfterBreak="0">
     <w:nsid w:val="37405040"/>
     <w:multiLevelType w:val="hybridMultilevel"/>
     <w:tmpl w:val="DF764BFA"/>
@@ -12786,7 +15132,120 @@
       </w:rPr>
     </w:lvl>
   </w:abstractNum>
-  <w:abstractNum w:abstractNumId="12" w15:restartNumberingAfterBreak="0">
+  <w:abstractNum w:abstractNumId="19" w15:restartNumberingAfterBreak="0">
+    <w:nsid w:val="37630C60"/>
+    <w:multiLevelType w:val="hybridMultilevel"/>
+    <w:tmpl w:val="F9665FCC"/>
+    <w:lvl w:ilvl="0" w:tplc="040E0001">
+      <w:start w:val="1"/>
+      <w:numFmt w:val="bullet"/>
+      <w:lvlText w:val=""/>
+      <w:lvlJc w:val="left"/>
+      <w:pPr>
+        <w:ind w:left="1429" w:hanging="360"/>
+      </w:pPr>
+      <w:rPr>
+        <w:rFonts w:ascii="Symbol" w:hAnsi="Symbol" w:hint="default"/>
+      </w:rPr>
+    </w:lvl>
+    <w:lvl w:ilvl="1" w:tplc="040E0003" w:tentative="1">
+      <w:start w:val="1"/>
+      <w:numFmt w:val="bullet"/>
+      <w:lvlText w:val="o"/>
+      <w:lvlJc w:val="left"/>
+      <w:pPr>
+        <w:ind w:left="2149" w:hanging="360"/>
+      </w:pPr>
+      <w:rPr>
+        <w:rFonts w:ascii="Courier New" w:hAnsi="Courier New" w:cs="Courier New" w:hint="default"/>
+      </w:rPr>
+    </w:lvl>
+    <w:lvl w:ilvl="2" w:tplc="040E0005" w:tentative="1">
+      <w:start w:val="1"/>
+      <w:numFmt w:val="bullet"/>
+      <w:lvlText w:val=""/>
+      <w:lvlJc w:val="left"/>
+      <w:pPr>
+        <w:ind w:left="2869" w:hanging="360"/>
+      </w:pPr>
+      <w:rPr>
+        <w:rFonts w:ascii="Wingdings" w:hAnsi="Wingdings" w:hint="default"/>
+      </w:rPr>
+    </w:lvl>
+    <w:lvl w:ilvl="3" w:tplc="040E0001" w:tentative="1">
+      <w:start w:val="1"/>
+      <w:numFmt w:val="bullet"/>
+      <w:lvlText w:val=""/>
+      <w:lvlJc w:val="left"/>
+      <w:pPr>
+        <w:ind w:left="3589" w:hanging="360"/>
+      </w:pPr>
+      <w:rPr>
+        <w:rFonts w:ascii="Symbol" w:hAnsi="Symbol" w:hint="default"/>
+      </w:rPr>
+    </w:lvl>
+    <w:lvl w:ilvl="4" w:tplc="040E0003" w:tentative="1">
+      <w:start w:val="1"/>
+      <w:numFmt w:val="bullet"/>
+      <w:lvlText w:val="o"/>
+      <w:lvlJc w:val="left"/>
+      <w:pPr>
+        <w:ind w:left="4309" w:hanging="360"/>
+      </w:pPr>
+      <w:rPr>
+        <w:rFonts w:ascii="Courier New" w:hAnsi="Courier New" w:cs="Courier New" w:hint="default"/>
+      </w:rPr>
+    </w:lvl>
+    <w:lvl w:ilvl="5" w:tplc="040E0005" w:tentative="1">
+      <w:start w:val="1"/>
+      <w:numFmt w:val="bullet"/>
+      <w:lvlText w:val=""/>
+      <w:lvlJc w:val="left"/>
+      <w:pPr>
+        <w:ind w:left="5029" w:hanging="360"/>
+      </w:pPr>
+      <w:rPr>
+        <w:rFonts w:ascii="Wingdings" w:hAnsi="Wingdings" w:hint="default"/>
+      </w:rPr>
+    </w:lvl>
+    <w:lvl w:ilvl="6" w:tplc="040E0001" w:tentative="1">
+      <w:start w:val="1"/>
+      <w:numFmt w:val="bullet"/>
+      <w:lvlText w:val=""/>
+      <w:lvlJc w:val="left"/>
+      <w:pPr>
+        <w:ind w:left="5749" w:hanging="360"/>
+      </w:pPr>
+      <w:rPr>
+        <w:rFonts w:ascii="Symbol" w:hAnsi="Symbol" w:hint="default"/>
+      </w:rPr>
+    </w:lvl>
+    <w:lvl w:ilvl="7" w:tplc="040E0003" w:tentative="1">
+      <w:start w:val="1"/>
+      <w:numFmt w:val="bullet"/>
+      <w:lvlText w:val="o"/>
+      <w:lvlJc w:val="left"/>
+      <w:pPr>
+        <w:ind w:left="6469" w:hanging="360"/>
+      </w:pPr>
+      <w:rPr>
+        <w:rFonts w:ascii="Courier New" w:hAnsi="Courier New" w:cs="Courier New" w:hint="default"/>
+      </w:rPr>
+    </w:lvl>
+    <w:lvl w:ilvl="8" w:tplc="040E0005" w:tentative="1">
+      <w:start w:val="1"/>
+      <w:numFmt w:val="bullet"/>
+      <w:lvlText w:val=""/>
+      <w:lvlJc w:val="left"/>
+      <w:pPr>
+        <w:ind w:left="7189" w:hanging="360"/>
+      </w:pPr>
+      <w:rPr>
+        <w:rFonts w:ascii="Wingdings" w:hAnsi="Wingdings" w:hint="default"/>
+      </w:rPr>
+    </w:lvl>
+  </w:abstractNum>
+  <w:abstractNum w:abstractNumId="20" w15:restartNumberingAfterBreak="0">
     <w:nsid w:val="3C4B36A6"/>
     <w:multiLevelType w:val="hybridMultilevel"/>
     <w:tmpl w:val="8C8AEF7E"/>
@@ -12899,7 +15358,7 @@
       </w:rPr>
     </w:lvl>
   </w:abstractNum>
-  <w:abstractNum w:abstractNumId="13" w15:restartNumberingAfterBreak="0">
+  <w:abstractNum w:abstractNumId="21" w15:restartNumberingAfterBreak="0">
     <w:nsid w:val="4BC22624"/>
     <w:multiLevelType w:val="hybridMultilevel"/>
     <w:tmpl w:val="B378B62E"/>
@@ -13012,7 +15471,7 @@
       </w:rPr>
     </w:lvl>
   </w:abstractNum>
-  <w:abstractNum w:abstractNumId="14" w15:restartNumberingAfterBreak="0">
+  <w:abstractNum w:abstractNumId="22" w15:restartNumberingAfterBreak="0">
     <w:nsid w:val="51381A88"/>
     <w:multiLevelType w:val="hybridMultilevel"/>
     <w:tmpl w:val="FAAE8B82"/>
@@ -13125,7 +15584,120 @@
       </w:rPr>
     </w:lvl>
   </w:abstractNum>
-  <w:abstractNum w:abstractNumId="15" w15:restartNumberingAfterBreak="0">
+  <w:abstractNum w:abstractNumId="23" w15:restartNumberingAfterBreak="0">
+    <w:nsid w:val="54D36166"/>
+    <w:multiLevelType w:val="hybridMultilevel"/>
+    <w:tmpl w:val="863E6CEE"/>
+    <w:lvl w:ilvl="0" w:tplc="040E0001">
+      <w:start w:val="1"/>
+      <w:numFmt w:val="bullet"/>
+      <w:lvlText w:val=""/>
+      <w:lvlJc w:val="left"/>
+      <w:pPr>
+        <w:ind w:left="1429" w:hanging="360"/>
+      </w:pPr>
+      <w:rPr>
+        <w:rFonts w:ascii="Symbol" w:hAnsi="Symbol" w:hint="default"/>
+      </w:rPr>
+    </w:lvl>
+    <w:lvl w:ilvl="1" w:tplc="040E0003" w:tentative="1">
+      <w:start w:val="1"/>
+      <w:numFmt w:val="bullet"/>
+      <w:lvlText w:val="o"/>
+      <w:lvlJc w:val="left"/>
+      <w:pPr>
+        <w:ind w:left="2149" w:hanging="360"/>
+      </w:pPr>
+      <w:rPr>
+        <w:rFonts w:ascii="Courier New" w:hAnsi="Courier New" w:cs="Courier New" w:hint="default"/>
+      </w:rPr>
+    </w:lvl>
+    <w:lvl w:ilvl="2" w:tplc="040E0005" w:tentative="1">
+      <w:start w:val="1"/>
+      <w:numFmt w:val="bullet"/>
+      <w:lvlText w:val=""/>
+      <w:lvlJc w:val="left"/>
+      <w:pPr>
+        <w:ind w:left="2869" w:hanging="360"/>
+      </w:pPr>
+      <w:rPr>
+        <w:rFonts w:ascii="Wingdings" w:hAnsi="Wingdings" w:hint="default"/>
+      </w:rPr>
+    </w:lvl>
+    <w:lvl w:ilvl="3" w:tplc="040E0001" w:tentative="1">
+      <w:start w:val="1"/>
+      <w:numFmt w:val="bullet"/>
+      <w:lvlText w:val=""/>
+      <w:lvlJc w:val="left"/>
+      <w:pPr>
+        <w:ind w:left="3589" w:hanging="360"/>
+      </w:pPr>
+      <w:rPr>
+        <w:rFonts w:ascii="Symbol" w:hAnsi="Symbol" w:hint="default"/>
+      </w:rPr>
+    </w:lvl>
+    <w:lvl w:ilvl="4" w:tplc="040E0003" w:tentative="1">
+      <w:start w:val="1"/>
+      <w:numFmt w:val="bullet"/>
+      <w:lvlText w:val="o"/>
+      <w:lvlJc w:val="left"/>
+      <w:pPr>
+        <w:ind w:left="4309" w:hanging="360"/>
+      </w:pPr>
+      <w:rPr>
+        <w:rFonts w:ascii="Courier New" w:hAnsi="Courier New" w:cs="Courier New" w:hint="default"/>
+      </w:rPr>
+    </w:lvl>
+    <w:lvl w:ilvl="5" w:tplc="040E0005" w:tentative="1">
+      <w:start w:val="1"/>
+      <w:numFmt w:val="bullet"/>
+      <w:lvlText w:val=""/>
+      <w:lvlJc w:val="left"/>
+      <w:pPr>
+        <w:ind w:left="5029" w:hanging="360"/>
+      </w:pPr>
+      <w:rPr>
+        <w:rFonts w:ascii="Wingdings" w:hAnsi="Wingdings" w:hint="default"/>
+      </w:rPr>
+    </w:lvl>
+    <w:lvl w:ilvl="6" w:tplc="040E0001" w:tentative="1">
+      <w:start w:val="1"/>
+      <w:numFmt w:val="bullet"/>
+      <w:lvlText w:val=""/>
+      <w:lvlJc w:val="left"/>
+      <w:pPr>
+        <w:ind w:left="5749" w:hanging="360"/>
+      </w:pPr>
+      <w:rPr>
+        <w:rFonts w:ascii="Symbol" w:hAnsi="Symbol" w:hint="default"/>
+      </w:rPr>
+    </w:lvl>
+    <w:lvl w:ilvl="7" w:tplc="040E0003" w:tentative="1">
+      <w:start w:val="1"/>
+      <w:numFmt w:val="bullet"/>
+      <w:lvlText w:val="o"/>
+      <w:lvlJc w:val="left"/>
+      <w:pPr>
+        <w:ind w:left="6469" w:hanging="360"/>
+      </w:pPr>
+      <w:rPr>
+        <w:rFonts w:ascii="Courier New" w:hAnsi="Courier New" w:cs="Courier New" w:hint="default"/>
+      </w:rPr>
+    </w:lvl>
+    <w:lvl w:ilvl="8" w:tplc="040E0005" w:tentative="1">
+      <w:start w:val="1"/>
+      <w:numFmt w:val="bullet"/>
+      <w:lvlText w:val=""/>
+      <w:lvlJc w:val="left"/>
+      <w:pPr>
+        <w:ind w:left="7189" w:hanging="360"/>
+      </w:pPr>
+      <w:rPr>
+        <w:rFonts w:ascii="Wingdings" w:hAnsi="Wingdings" w:hint="default"/>
+      </w:rPr>
+    </w:lvl>
+  </w:abstractNum>
+  <w:abstractNum w:abstractNumId="24" w15:restartNumberingAfterBreak="0">
     <w:nsid w:val="57467333"/>
     <w:multiLevelType w:val="hybridMultilevel"/>
     <w:tmpl w:val="6F0E0028"/>
@@ -13238,7 +15810,120 @@
       </w:rPr>
     </w:lvl>
   </w:abstractNum>
-  <w:abstractNum w:abstractNumId="16" w15:restartNumberingAfterBreak="0">
+  <w:abstractNum w:abstractNumId="25" w15:restartNumberingAfterBreak="0">
+    <w:nsid w:val="576A50DE"/>
+    <w:multiLevelType w:val="hybridMultilevel"/>
+    <w:tmpl w:val="3E607592"/>
+    <w:lvl w:ilvl="0" w:tplc="040E0001">
+      <w:start w:val="1"/>
+      <w:numFmt w:val="bullet"/>
+      <w:lvlText w:val=""/>
+      <w:lvlJc w:val="left"/>
+      <w:pPr>
+        <w:ind w:left="1429" w:hanging="360"/>
+      </w:pPr>
+      <w:rPr>
+        <w:rFonts w:ascii="Symbol" w:hAnsi="Symbol" w:hint="default"/>
+      </w:rPr>
+    </w:lvl>
+    <w:lvl w:ilvl="1" w:tplc="040E0003" w:tentative="1">
+      <w:start w:val="1"/>
+      <w:numFmt w:val="bullet"/>
+      <w:lvlText w:val="o"/>
+      <w:lvlJc w:val="left"/>
+      <w:pPr>
+        <w:ind w:left="2149" w:hanging="360"/>
+      </w:pPr>
+      <w:rPr>
+        <w:rFonts w:ascii="Courier New" w:hAnsi="Courier New" w:cs="Courier New" w:hint="default"/>
+      </w:rPr>
+    </w:lvl>
+    <w:lvl w:ilvl="2" w:tplc="040E0005" w:tentative="1">
+      <w:start w:val="1"/>
+      <w:numFmt w:val="bullet"/>
+      <w:lvlText w:val=""/>
+      <w:lvlJc w:val="left"/>
+      <w:pPr>
+        <w:ind w:left="2869" w:hanging="360"/>
+      </w:pPr>
+      <w:rPr>
+        <w:rFonts w:ascii="Wingdings" w:hAnsi="Wingdings" w:hint="default"/>
+      </w:rPr>
+    </w:lvl>
+    <w:lvl w:ilvl="3" w:tplc="040E0001" w:tentative="1">
+      <w:start w:val="1"/>
+      <w:numFmt w:val="bullet"/>
+      <w:lvlText w:val=""/>
+      <w:lvlJc w:val="left"/>
+      <w:pPr>
+        <w:ind w:left="3589" w:hanging="360"/>
+      </w:pPr>
+      <w:rPr>
+        <w:rFonts w:ascii="Symbol" w:hAnsi="Symbol" w:hint="default"/>
+      </w:rPr>
+    </w:lvl>
+    <w:lvl w:ilvl="4" w:tplc="040E0003" w:tentative="1">
+      <w:start w:val="1"/>
+      <w:numFmt w:val="bullet"/>
+      <w:lvlText w:val="o"/>
+      <w:lvlJc w:val="left"/>
+      <w:pPr>
+        <w:ind w:left="4309" w:hanging="360"/>
+      </w:pPr>
+      <w:rPr>
+        <w:rFonts w:ascii="Courier New" w:hAnsi="Courier New" w:cs="Courier New" w:hint="default"/>
+      </w:rPr>
+    </w:lvl>
+    <w:lvl w:ilvl="5" w:tplc="040E0005" w:tentative="1">
+      <w:start w:val="1"/>
+      <w:numFmt w:val="bullet"/>
+      <w:lvlText w:val=""/>
+      <w:lvlJc w:val="left"/>
+      <w:pPr>
+        <w:ind w:left="5029" w:hanging="360"/>
+      </w:pPr>
+      <w:rPr>
+        <w:rFonts w:ascii="Wingdings" w:hAnsi="Wingdings" w:hint="default"/>
+      </w:rPr>
+    </w:lvl>
+    <w:lvl w:ilvl="6" w:tplc="040E0001" w:tentative="1">
+      <w:start w:val="1"/>
+      <w:numFmt w:val="bullet"/>
+      <w:lvlText w:val=""/>
+      <w:lvlJc w:val="left"/>
+      <w:pPr>
+        <w:ind w:left="5749" w:hanging="360"/>
+      </w:pPr>
+      <w:rPr>
+        <w:rFonts w:ascii="Symbol" w:hAnsi="Symbol" w:hint="default"/>
+      </w:rPr>
+    </w:lvl>
+    <w:lvl w:ilvl="7" w:tplc="040E0003" w:tentative="1">
+      <w:start w:val="1"/>
+      <w:numFmt w:val="bullet"/>
+      <w:lvlText w:val="o"/>
+      <w:lvlJc w:val="left"/>
+      <w:pPr>
+        <w:ind w:left="6469" w:hanging="360"/>
+      </w:pPr>
+      <w:rPr>
+        <w:rFonts w:ascii="Courier New" w:hAnsi="Courier New" w:cs="Courier New" w:hint="default"/>
+      </w:rPr>
+    </w:lvl>
+    <w:lvl w:ilvl="8" w:tplc="040E0005" w:tentative="1">
+      <w:start w:val="1"/>
+      <w:numFmt w:val="bullet"/>
+      <w:lvlText w:val=""/>
+      <w:lvlJc w:val="left"/>
+      <w:pPr>
+        <w:ind w:left="7189" w:hanging="360"/>
+      </w:pPr>
+      <w:rPr>
+        <w:rFonts w:ascii="Wingdings" w:hAnsi="Wingdings" w:hint="default"/>
+      </w:rPr>
+    </w:lvl>
+  </w:abstractNum>
+  <w:abstractNum w:abstractNumId="26" w15:restartNumberingAfterBreak="0">
     <w:nsid w:val="5AF53A4F"/>
     <w:multiLevelType w:val="hybridMultilevel"/>
     <w:tmpl w:val="3A704032"/>
@@ -13351,7 +16036,120 @@
       </w:rPr>
     </w:lvl>
   </w:abstractNum>
-  <w:abstractNum w:abstractNumId="17" w15:restartNumberingAfterBreak="0">
+  <w:abstractNum w:abstractNumId="27" w15:restartNumberingAfterBreak="0">
+    <w:nsid w:val="5D2A4C71"/>
+    <w:multiLevelType w:val="hybridMultilevel"/>
+    <w:tmpl w:val="7AFA6588"/>
+    <w:lvl w:ilvl="0" w:tplc="040E0001">
+      <w:start w:val="1"/>
+      <w:numFmt w:val="bullet"/>
+      <w:lvlText w:val=""/>
+      <w:lvlJc w:val="left"/>
+      <w:pPr>
+        <w:ind w:left="1429" w:hanging="360"/>
+      </w:pPr>
+      <w:rPr>
+        <w:rFonts w:ascii="Symbol" w:hAnsi="Symbol" w:hint="default"/>
+      </w:rPr>
+    </w:lvl>
+    <w:lvl w:ilvl="1" w:tplc="040E0003">
+      <w:start w:val="1"/>
+      <w:numFmt w:val="bullet"/>
+      <w:lvlText w:val="o"/>
+      <w:lvlJc w:val="left"/>
+      <w:pPr>
+        <w:ind w:left="2149" w:hanging="360"/>
+      </w:pPr>
+      <w:rPr>
+        <w:rFonts w:ascii="Courier New" w:hAnsi="Courier New" w:cs="Courier New" w:hint="default"/>
+      </w:rPr>
+    </w:lvl>
+    <w:lvl w:ilvl="2" w:tplc="040E0005" w:tentative="1">
+      <w:start w:val="1"/>
+      <w:numFmt w:val="bullet"/>
+      <w:lvlText w:val=""/>
+      <w:lvlJc w:val="left"/>
+      <w:pPr>
+        <w:ind w:left="2869" w:hanging="360"/>
+      </w:pPr>
+      <w:rPr>
+        <w:rFonts w:ascii="Wingdings" w:hAnsi="Wingdings" w:hint="default"/>
+      </w:rPr>
+    </w:lvl>
+    <w:lvl w:ilvl="3" w:tplc="040E0001" w:tentative="1">
+      <w:start w:val="1"/>
+      <w:numFmt w:val="bullet"/>
+      <w:lvlText w:val=""/>
+      <w:lvlJc w:val="left"/>
+      <w:pPr>
+        <w:ind w:left="3589" w:hanging="360"/>
+      </w:pPr>
+      <w:rPr>
+        <w:rFonts w:ascii="Symbol" w:hAnsi="Symbol" w:hint="default"/>
+      </w:rPr>
+    </w:lvl>
+    <w:lvl w:ilvl="4" w:tplc="040E0003" w:tentative="1">
+      <w:start w:val="1"/>
+      <w:numFmt w:val="bullet"/>
+      <w:lvlText w:val="o"/>
+      <w:lvlJc w:val="left"/>
+      <w:pPr>
+        <w:ind w:left="4309" w:hanging="360"/>
+      </w:pPr>
+      <w:rPr>
+        <w:rFonts w:ascii="Courier New" w:hAnsi="Courier New" w:cs="Courier New" w:hint="default"/>
+      </w:rPr>
+    </w:lvl>
+    <w:lvl w:ilvl="5" w:tplc="040E0005" w:tentative="1">
+      <w:start w:val="1"/>
+      <w:numFmt w:val="bullet"/>
+      <w:lvlText w:val=""/>
+      <w:lvlJc w:val="left"/>
+      <w:pPr>
+        <w:ind w:left="5029" w:hanging="360"/>
+      </w:pPr>
+      <w:rPr>
+        <w:rFonts w:ascii="Wingdings" w:hAnsi="Wingdings" w:hint="default"/>
+      </w:rPr>
+    </w:lvl>
+    <w:lvl w:ilvl="6" w:tplc="040E0001" w:tentative="1">
+      <w:start w:val="1"/>
+      <w:numFmt w:val="bullet"/>
+      <w:lvlText w:val=""/>
+      <w:lvlJc w:val="left"/>
+      <w:pPr>
+        <w:ind w:left="5749" w:hanging="360"/>
+      </w:pPr>
+      <w:rPr>
+        <w:rFonts w:ascii="Symbol" w:hAnsi="Symbol" w:hint="default"/>
+      </w:rPr>
+    </w:lvl>
+    <w:lvl w:ilvl="7" w:tplc="040E0003" w:tentative="1">
+      <w:start w:val="1"/>
+      <w:numFmt w:val="bullet"/>
+      <w:lvlText w:val="o"/>
+      <w:lvlJc w:val="left"/>
+      <w:pPr>
+        <w:ind w:left="6469" w:hanging="360"/>
+      </w:pPr>
+      <w:rPr>
+        <w:rFonts w:ascii="Courier New" w:hAnsi="Courier New" w:cs="Courier New" w:hint="default"/>
+      </w:rPr>
+    </w:lvl>
+    <w:lvl w:ilvl="8" w:tplc="040E0005" w:tentative="1">
+      <w:start w:val="1"/>
+      <w:numFmt w:val="bullet"/>
+      <w:lvlText w:val=""/>
+      <w:lvlJc w:val="left"/>
+      <w:pPr>
+        <w:ind w:left="7189" w:hanging="360"/>
+      </w:pPr>
+      <w:rPr>
+        <w:rFonts w:ascii="Wingdings" w:hAnsi="Wingdings" w:hint="default"/>
+      </w:rPr>
+    </w:lvl>
+  </w:abstractNum>
+  <w:abstractNum w:abstractNumId="28" w15:restartNumberingAfterBreak="0">
     <w:nsid w:val="5F3D624A"/>
     <w:multiLevelType w:val="hybridMultilevel"/>
     <w:tmpl w:val="F2D2071C"/>
@@ -13464,7 +16262,233 @@
       </w:rPr>
     </w:lvl>
   </w:abstractNum>
-  <w:abstractNum w:abstractNumId="18" w15:restartNumberingAfterBreak="0">
+  <w:abstractNum w:abstractNumId="29" w15:restartNumberingAfterBreak="0">
+    <w:nsid w:val="610C5820"/>
+    <w:multiLevelType w:val="hybridMultilevel"/>
+    <w:tmpl w:val="2ED05986"/>
+    <w:lvl w:ilvl="0" w:tplc="040E0001">
+      <w:start w:val="1"/>
+      <w:numFmt w:val="bullet"/>
+      <w:lvlText w:val=""/>
+      <w:lvlJc w:val="left"/>
+      <w:pPr>
+        <w:ind w:left="1429" w:hanging="360"/>
+      </w:pPr>
+      <w:rPr>
+        <w:rFonts w:ascii="Symbol" w:hAnsi="Symbol" w:hint="default"/>
+      </w:rPr>
+    </w:lvl>
+    <w:lvl w:ilvl="1" w:tplc="040E0003" w:tentative="1">
+      <w:start w:val="1"/>
+      <w:numFmt w:val="bullet"/>
+      <w:lvlText w:val="o"/>
+      <w:lvlJc w:val="left"/>
+      <w:pPr>
+        <w:ind w:left="2149" w:hanging="360"/>
+      </w:pPr>
+      <w:rPr>
+        <w:rFonts w:ascii="Courier New" w:hAnsi="Courier New" w:cs="Courier New" w:hint="default"/>
+      </w:rPr>
+    </w:lvl>
+    <w:lvl w:ilvl="2" w:tplc="040E0005" w:tentative="1">
+      <w:start w:val="1"/>
+      <w:numFmt w:val="bullet"/>
+      <w:lvlText w:val=""/>
+      <w:lvlJc w:val="left"/>
+      <w:pPr>
+        <w:ind w:left="2869" w:hanging="360"/>
+      </w:pPr>
+      <w:rPr>
+        <w:rFonts w:ascii="Wingdings" w:hAnsi="Wingdings" w:hint="default"/>
+      </w:rPr>
+    </w:lvl>
+    <w:lvl w:ilvl="3" w:tplc="040E0001" w:tentative="1">
+      <w:start w:val="1"/>
+      <w:numFmt w:val="bullet"/>
+      <w:lvlText w:val=""/>
+      <w:lvlJc w:val="left"/>
+      <w:pPr>
+        <w:ind w:left="3589" w:hanging="360"/>
+      </w:pPr>
+      <w:rPr>
+        <w:rFonts w:ascii="Symbol" w:hAnsi="Symbol" w:hint="default"/>
+      </w:rPr>
+    </w:lvl>
+    <w:lvl w:ilvl="4" w:tplc="040E0003" w:tentative="1">
+      <w:start w:val="1"/>
+      <w:numFmt w:val="bullet"/>
+      <w:lvlText w:val="o"/>
+      <w:lvlJc w:val="left"/>
+      <w:pPr>
+        <w:ind w:left="4309" w:hanging="360"/>
+      </w:pPr>
+      <w:rPr>
+        <w:rFonts w:ascii="Courier New" w:hAnsi="Courier New" w:cs="Courier New" w:hint="default"/>
+      </w:rPr>
+    </w:lvl>
+    <w:lvl w:ilvl="5" w:tplc="040E0005" w:tentative="1">
+      <w:start w:val="1"/>
+      <w:numFmt w:val="bullet"/>
+      <w:lvlText w:val=""/>
+      <w:lvlJc w:val="left"/>
+      <w:pPr>
+        <w:ind w:left="5029" w:hanging="360"/>
+      </w:pPr>
+      <w:rPr>
+        <w:rFonts w:ascii="Wingdings" w:hAnsi="Wingdings" w:hint="default"/>
+      </w:rPr>
+    </w:lvl>
+    <w:lvl w:ilvl="6" w:tplc="040E0001" w:tentative="1">
+      <w:start w:val="1"/>
+      <w:numFmt w:val="bullet"/>
+      <w:lvlText w:val=""/>
+      <w:lvlJc w:val="left"/>
+      <w:pPr>
+        <w:ind w:left="5749" w:hanging="360"/>
+      </w:pPr>
+      <w:rPr>
+        <w:rFonts w:ascii="Symbol" w:hAnsi="Symbol" w:hint="default"/>
+      </w:rPr>
+    </w:lvl>
+    <w:lvl w:ilvl="7" w:tplc="040E0003" w:tentative="1">
+      <w:start w:val="1"/>
+      <w:numFmt w:val="bullet"/>
+      <w:lvlText w:val="o"/>
+      <w:lvlJc w:val="left"/>
+      <w:pPr>
+        <w:ind w:left="6469" w:hanging="360"/>
+      </w:pPr>
+      <w:rPr>
+        <w:rFonts w:ascii="Courier New" w:hAnsi="Courier New" w:cs="Courier New" w:hint="default"/>
+      </w:rPr>
+    </w:lvl>
+    <w:lvl w:ilvl="8" w:tplc="040E0005" w:tentative="1">
+      <w:start w:val="1"/>
+      <w:numFmt w:val="bullet"/>
+      <w:lvlText w:val=""/>
+      <w:lvlJc w:val="left"/>
+      <w:pPr>
+        <w:ind w:left="7189" w:hanging="360"/>
+      </w:pPr>
+      <w:rPr>
+        <w:rFonts w:ascii="Wingdings" w:hAnsi="Wingdings" w:hint="default"/>
+      </w:rPr>
+    </w:lvl>
+  </w:abstractNum>
+  <w:abstractNum w:abstractNumId="30" w15:restartNumberingAfterBreak="0">
+    <w:nsid w:val="6DFA550A"/>
+    <w:multiLevelType w:val="hybridMultilevel"/>
+    <w:tmpl w:val="2F6A50A6"/>
+    <w:lvl w:ilvl="0" w:tplc="040E0001">
+      <w:start w:val="1"/>
+      <w:numFmt w:val="bullet"/>
+      <w:lvlText w:val=""/>
+      <w:lvlJc w:val="left"/>
+      <w:pPr>
+        <w:ind w:left="1429" w:hanging="360"/>
+      </w:pPr>
+      <w:rPr>
+        <w:rFonts w:ascii="Symbol" w:hAnsi="Symbol" w:hint="default"/>
+      </w:rPr>
+    </w:lvl>
+    <w:lvl w:ilvl="1" w:tplc="040E0003" w:tentative="1">
+      <w:start w:val="1"/>
+      <w:numFmt w:val="bullet"/>
+      <w:lvlText w:val="o"/>
+      <w:lvlJc w:val="left"/>
+      <w:pPr>
+        <w:ind w:left="2149" w:hanging="360"/>
+      </w:pPr>
+      <w:rPr>
+        <w:rFonts w:ascii="Courier New" w:hAnsi="Courier New" w:cs="Courier New" w:hint="default"/>
+      </w:rPr>
+    </w:lvl>
+    <w:lvl w:ilvl="2" w:tplc="040E0005" w:tentative="1">
+      <w:start w:val="1"/>
+      <w:numFmt w:val="bullet"/>
+      <w:lvlText w:val=""/>
+      <w:lvlJc w:val="left"/>
+      <w:pPr>
+        <w:ind w:left="2869" w:hanging="360"/>
+      </w:pPr>
+      <w:rPr>
+        <w:rFonts w:ascii="Wingdings" w:hAnsi="Wingdings" w:hint="default"/>
+      </w:rPr>
+    </w:lvl>
+    <w:lvl w:ilvl="3" w:tplc="040E0001" w:tentative="1">
+      <w:start w:val="1"/>
+      <w:numFmt w:val="bullet"/>
+      <w:lvlText w:val=""/>
+      <w:lvlJc w:val="left"/>
+      <w:pPr>
+        <w:ind w:left="3589" w:hanging="360"/>
+      </w:pPr>
+      <w:rPr>
+        <w:rFonts w:ascii="Symbol" w:hAnsi="Symbol" w:hint="default"/>
+      </w:rPr>
+    </w:lvl>
+    <w:lvl w:ilvl="4" w:tplc="040E0003" w:tentative="1">
+      <w:start w:val="1"/>
+      <w:numFmt w:val="bullet"/>
+      <w:lvlText w:val="o"/>
+      <w:lvlJc w:val="left"/>
+      <w:pPr>
+        <w:ind w:left="4309" w:hanging="360"/>
+      </w:pPr>
+      <w:rPr>
+        <w:rFonts w:ascii="Courier New" w:hAnsi="Courier New" w:cs="Courier New" w:hint="default"/>
+      </w:rPr>
+    </w:lvl>
+    <w:lvl w:ilvl="5" w:tplc="040E0005" w:tentative="1">
+      <w:start w:val="1"/>
+      <w:numFmt w:val="bullet"/>
+      <w:lvlText w:val=""/>
+      <w:lvlJc w:val="left"/>
+      <w:pPr>
+        <w:ind w:left="5029" w:hanging="360"/>
+      </w:pPr>
+      <w:rPr>
+        <w:rFonts w:ascii="Wingdings" w:hAnsi="Wingdings" w:hint="default"/>
+      </w:rPr>
+    </w:lvl>
+    <w:lvl w:ilvl="6" w:tplc="040E0001" w:tentative="1">
+      <w:start w:val="1"/>
+      <w:numFmt w:val="bullet"/>
+      <w:lvlText w:val=""/>
+      <w:lvlJc w:val="left"/>
+      <w:pPr>
+        <w:ind w:left="5749" w:hanging="360"/>
+      </w:pPr>
+      <w:rPr>
+        <w:rFonts w:ascii="Symbol" w:hAnsi="Symbol" w:hint="default"/>
+      </w:rPr>
+    </w:lvl>
+    <w:lvl w:ilvl="7" w:tplc="040E0003" w:tentative="1">
+      <w:start w:val="1"/>
+      <w:numFmt w:val="bullet"/>
+      <w:lvlText w:val="o"/>
+      <w:lvlJc w:val="left"/>
+      <w:pPr>
+        <w:ind w:left="6469" w:hanging="360"/>
+      </w:pPr>
+      <w:rPr>
+        <w:rFonts w:ascii="Courier New" w:hAnsi="Courier New" w:cs="Courier New" w:hint="default"/>
+      </w:rPr>
+    </w:lvl>
+    <w:lvl w:ilvl="8" w:tplc="040E0005" w:tentative="1">
+      <w:start w:val="1"/>
+      <w:numFmt w:val="bullet"/>
+      <w:lvlText w:val=""/>
+      <w:lvlJc w:val="left"/>
+      <w:pPr>
+        <w:ind w:left="7189" w:hanging="360"/>
+      </w:pPr>
+      <w:rPr>
+        <w:rFonts w:ascii="Wingdings" w:hAnsi="Wingdings" w:hint="default"/>
+      </w:rPr>
+    </w:lvl>
+  </w:abstractNum>
+  <w:abstractNum w:abstractNumId="31" w15:restartNumberingAfterBreak="0">
     <w:nsid w:val="6F0E3834"/>
     <w:multiLevelType w:val="hybridMultilevel"/>
     <w:tmpl w:val="A672F3EA"/>
@@ -13577,7 +16601,7 @@
       </w:rPr>
     </w:lvl>
   </w:abstractNum>
-  <w:abstractNum w:abstractNumId="19" w15:restartNumberingAfterBreak="0">
+  <w:abstractNum w:abstractNumId="32" w15:restartNumberingAfterBreak="0">
     <w:nsid w:val="7038612E"/>
     <w:multiLevelType w:val="hybridMultilevel"/>
     <w:tmpl w:val="EDDE01E2"/>
@@ -13690,7 +16714,7 @@
       </w:rPr>
     </w:lvl>
   </w:abstractNum>
-  <w:abstractNum w:abstractNumId="20" w15:restartNumberingAfterBreak="0">
+  <w:abstractNum w:abstractNumId="33" w15:restartNumberingAfterBreak="0">
     <w:nsid w:val="73292ABA"/>
     <w:multiLevelType w:val="hybridMultilevel"/>
     <w:tmpl w:val="ADDC6BB2"/>
@@ -13803,7 +16827,7 @@
       </w:rPr>
     </w:lvl>
   </w:abstractNum>
-  <w:abstractNum w:abstractNumId="21" w15:restartNumberingAfterBreak="0">
+  <w:abstractNum w:abstractNumId="34" w15:restartNumberingAfterBreak="0">
     <w:nsid w:val="77025383"/>
     <w:multiLevelType w:val="hybridMultilevel"/>
     <w:tmpl w:val="30246070"/>
@@ -13916,71 +16940,226 @@
       </w:rPr>
     </w:lvl>
   </w:abstractNum>
+  <w:abstractNum w:abstractNumId="35" w15:restartNumberingAfterBreak="0">
+    <w:nsid w:val="7FEC653D"/>
+    <w:multiLevelType w:val="hybridMultilevel"/>
+    <w:tmpl w:val="5BECED2A"/>
+    <w:lvl w:ilvl="0" w:tplc="040E0001">
+      <w:start w:val="1"/>
+      <w:numFmt w:val="bullet"/>
+      <w:lvlText w:val=""/>
+      <w:lvlJc w:val="left"/>
+      <w:pPr>
+        <w:ind w:left="1429" w:hanging="360"/>
+      </w:pPr>
+      <w:rPr>
+        <w:rFonts w:ascii="Symbol" w:hAnsi="Symbol" w:hint="default"/>
+      </w:rPr>
+    </w:lvl>
+    <w:lvl w:ilvl="1" w:tplc="040E0003">
+      <w:start w:val="1"/>
+      <w:numFmt w:val="bullet"/>
+      <w:lvlText w:val="o"/>
+      <w:lvlJc w:val="left"/>
+      <w:pPr>
+        <w:ind w:left="2149" w:hanging="360"/>
+      </w:pPr>
+      <w:rPr>
+        <w:rFonts w:ascii="Courier New" w:hAnsi="Courier New" w:cs="Courier New" w:hint="default"/>
+      </w:rPr>
+    </w:lvl>
+    <w:lvl w:ilvl="2" w:tplc="040E0005" w:tentative="1">
+      <w:start w:val="1"/>
+      <w:numFmt w:val="bullet"/>
+      <w:lvlText w:val=""/>
+      <w:lvlJc w:val="left"/>
+      <w:pPr>
+        <w:ind w:left="2869" w:hanging="360"/>
+      </w:pPr>
+      <w:rPr>
+        <w:rFonts w:ascii="Wingdings" w:hAnsi="Wingdings" w:hint="default"/>
+      </w:rPr>
+    </w:lvl>
+    <w:lvl w:ilvl="3" w:tplc="040E0001" w:tentative="1">
+      <w:start w:val="1"/>
+      <w:numFmt w:val="bullet"/>
+      <w:lvlText w:val=""/>
+      <w:lvlJc w:val="left"/>
+      <w:pPr>
+        <w:ind w:left="3589" w:hanging="360"/>
+      </w:pPr>
+      <w:rPr>
+        <w:rFonts w:ascii="Symbol" w:hAnsi="Symbol" w:hint="default"/>
+      </w:rPr>
+    </w:lvl>
+    <w:lvl w:ilvl="4" w:tplc="040E0003" w:tentative="1">
+      <w:start w:val="1"/>
+      <w:numFmt w:val="bullet"/>
+      <w:lvlText w:val="o"/>
+      <w:lvlJc w:val="left"/>
+      <w:pPr>
+        <w:ind w:left="4309" w:hanging="360"/>
+      </w:pPr>
+      <w:rPr>
+        <w:rFonts w:ascii="Courier New" w:hAnsi="Courier New" w:cs="Courier New" w:hint="default"/>
+      </w:rPr>
+    </w:lvl>
+    <w:lvl w:ilvl="5" w:tplc="040E0005" w:tentative="1">
+      <w:start w:val="1"/>
+      <w:numFmt w:val="bullet"/>
+      <w:lvlText w:val=""/>
+      <w:lvlJc w:val="left"/>
+      <w:pPr>
+        <w:ind w:left="5029" w:hanging="360"/>
+      </w:pPr>
+      <w:rPr>
+        <w:rFonts w:ascii="Wingdings" w:hAnsi="Wingdings" w:hint="default"/>
+      </w:rPr>
+    </w:lvl>
+    <w:lvl w:ilvl="6" w:tplc="040E0001" w:tentative="1">
+      <w:start w:val="1"/>
+      <w:numFmt w:val="bullet"/>
+      <w:lvlText w:val=""/>
+      <w:lvlJc w:val="left"/>
+      <w:pPr>
+        <w:ind w:left="5749" w:hanging="360"/>
+      </w:pPr>
+      <w:rPr>
+        <w:rFonts w:ascii="Symbol" w:hAnsi="Symbol" w:hint="default"/>
+      </w:rPr>
+    </w:lvl>
+    <w:lvl w:ilvl="7" w:tplc="040E0003" w:tentative="1">
+      <w:start w:val="1"/>
+      <w:numFmt w:val="bullet"/>
+      <w:lvlText w:val="o"/>
+      <w:lvlJc w:val="left"/>
+      <w:pPr>
+        <w:ind w:left="6469" w:hanging="360"/>
+      </w:pPr>
+      <w:rPr>
+        <w:rFonts w:ascii="Courier New" w:hAnsi="Courier New" w:cs="Courier New" w:hint="default"/>
+      </w:rPr>
+    </w:lvl>
+    <w:lvl w:ilvl="8" w:tplc="040E0005" w:tentative="1">
+      <w:start w:val="1"/>
+      <w:numFmt w:val="bullet"/>
+      <w:lvlText w:val=""/>
+      <w:lvlJc w:val="left"/>
+      <w:pPr>
+        <w:ind w:left="7189" w:hanging="360"/>
+      </w:pPr>
+      <w:rPr>
+        <w:rFonts w:ascii="Wingdings" w:hAnsi="Wingdings" w:hint="default"/>
+      </w:rPr>
+    </w:lvl>
+  </w:abstractNum>
   <w:num w:numId="1" w16cid:durableId="385834148">
+    <w:abstractNumId w:val="21"/>
+  </w:num>
+  <w:num w:numId="2" w16cid:durableId="1458258664">
+    <w:abstractNumId w:val="1"/>
+  </w:num>
+  <w:num w:numId="3" w16cid:durableId="1530876048">
+    <w:abstractNumId w:val="34"/>
+  </w:num>
+  <w:num w:numId="4" w16cid:durableId="1143423714">
+    <w:abstractNumId w:val="7"/>
+  </w:num>
+  <w:num w:numId="5" w16cid:durableId="176043529">
+    <w:abstractNumId w:val="14"/>
+  </w:num>
+  <w:num w:numId="6" w16cid:durableId="2122383911">
+    <w:abstractNumId w:val="18"/>
+  </w:num>
+  <w:num w:numId="7" w16cid:durableId="2082827038">
+    <w:abstractNumId w:val="16"/>
+  </w:num>
+  <w:num w:numId="8" w16cid:durableId="994529510">
+    <w:abstractNumId w:val="24"/>
+  </w:num>
+  <w:num w:numId="9" w16cid:durableId="682518659">
+    <w:abstractNumId w:val="17"/>
+  </w:num>
+  <w:num w:numId="10" w16cid:durableId="367684126">
+    <w:abstractNumId w:val="20"/>
+  </w:num>
+  <w:num w:numId="11" w16cid:durableId="831868213">
+    <w:abstractNumId w:val="10"/>
+  </w:num>
+  <w:num w:numId="12" w16cid:durableId="355277367">
+    <w:abstractNumId w:val="26"/>
+  </w:num>
+  <w:num w:numId="13" w16cid:durableId="1657224416">
+    <w:abstractNumId w:val="6"/>
+  </w:num>
+  <w:num w:numId="14" w16cid:durableId="781414857">
+    <w:abstractNumId w:val="31"/>
+  </w:num>
+  <w:num w:numId="15" w16cid:durableId="677468912">
+    <w:abstractNumId w:val="32"/>
+  </w:num>
+  <w:num w:numId="16" w16cid:durableId="1757897046">
+    <w:abstractNumId w:val="28"/>
+  </w:num>
+  <w:num w:numId="17" w16cid:durableId="933587595">
+    <w:abstractNumId w:val="9"/>
+  </w:num>
+  <w:num w:numId="18" w16cid:durableId="1041512992">
+    <w:abstractNumId w:val="3"/>
+  </w:num>
+  <w:num w:numId="19" w16cid:durableId="1987276328">
+    <w:abstractNumId w:val="22"/>
+  </w:num>
+  <w:num w:numId="20" w16cid:durableId="1671788309">
+    <w:abstractNumId w:val="15"/>
+  </w:num>
+  <w:num w:numId="21" w16cid:durableId="565148369">
+    <w:abstractNumId w:val="2"/>
+  </w:num>
+  <w:num w:numId="22" w16cid:durableId="948663299">
+    <w:abstractNumId w:val="33"/>
+  </w:num>
+  <w:num w:numId="23" w16cid:durableId="1647053204">
+    <w:abstractNumId w:val="12"/>
+  </w:num>
+  <w:num w:numId="24" w16cid:durableId="1192453921">
+    <w:abstractNumId w:val="11"/>
+  </w:num>
+  <w:num w:numId="25" w16cid:durableId="1771393947">
     <w:abstractNumId w:val="13"/>
   </w:num>
-  <w:num w:numId="2" w16cid:durableId="1458258664">
-    <w:abstractNumId w:val="0"/>
+  <w:num w:numId="26" w16cid:durableId="1613635104">
+    <w:abstractNumId w:val="30"/>
   </w:num>
-  <w:num w:numId="3" w16cid:durableId="1530876048">
-    <w:abstractNumId w:val="21"/>
+  <w:num w:numId="27" w16cid:durableId="1441026439">
+    <w:abstractNumId w:val="29"/>
   </w:num>
-  <w:num w:numId="4" w16cid:durableId="1143423714">
+  <w:num w:numId="28" w16cid:durableId="696976727">
+    <w:abstractNumId w:val="5"/>
+  </w:num>
+  <w:num w:numId="29" w16cid:durableId="1429957950">
+    <w:abstractNumId w:val="19"/>
+  </w:num>
+  <w:num w:numId="30" w16cid:durableId="1266428912">
+    <w:abstractNumId w:val="27"/>
+  </w:num>
+  <w:num w:numId="31" w16cid:durableId="652366918">
+    <w:abstractNumId w:val="25"/>
+  </w:num>
+  <w:num w:numId="32" w16cid:durableId="246765215">
+    <w:abstractNumId w:val="23"/>
+  </w:num>
+  <w:num w:numId="33" w16cid:durableId="105393448">
+    <w:abstractNumId w:val="8"/>
+  </w:num>
+  <w:num w:numId="34" w16cid:durableId="932779622">
     <w:abstractNumId w:val="4"/>
   </w:num>
-  <w:num w:numId="5" w16cid:durableId="176043529">
-    <w:abstractNumId w:val="7"/>
+  <w:num w:numId="35" w16cid:durableId="1268537049">
+    <w:abstractNumId w:val="35"/>
   </w:num>
-  <w:num w:numId="6" w16cid:durableId="2122383911">
-    <w:abstractNumId w:val="11"/>
-  </w:num>
-  <w:num w:numId="7" w16cid:durableId="2082827038">
-    <w:abstractNumId w:val="9"/>
-  </w:num>
-  <w:num w:numId="8" w16cid:durableId="994529510">
-    <w:abstractNumId w:val="15"/>
-  </w:num>
-  <w:num w:numId="9" w16cid:durableId="682518659">
-    <w:abstractNumId w:val="10"/>
-  </w:num>
-  <w:num w:numId="10" w16cid:durableId="367684126">
-    <w:abstractNumId w:val="12"/>
-  </w:num>
-  <w:num w:numId="11" w16cid:durableId="831868213">
-    <w:abstractNumId w:val="6"/>
-  </w:num>
-  <w:num w:numId="12" w16cid:durableId="355277367">
-    <w:abstractNumId w:val="16"/>
-  </w:num>
-  <w:num w:numId="13" w16cid:durableId="1657224416">
-    <w:abstractNumId w:val="3"/>
-  </w:num>
-  <w:num w:numId="14" w16cid:durableId="781414857">
-    <w:abstractNumId w:val="18"/>
-  </w:num>
-  <w:num w:numId="15" w16cid:durableId="677468912">
-    <w:abstractNumId w:val="19"/>
-  </w:num>
-  <w:num w:numId="16" w16cid:durableId="1757897046">
-    <w:abstractNumId w:val="17"/>
-  </w:num>
-  <w:num w:numId="17" w16cid:durableId="933587595">
-    <w:abstractNumId w:val="5"/>
-  </w:num>
-  <w:num w:numId="18" w16cid:durableId="1041512992">
-    <w:abstractNumId w:val="2"/>
-  </w:num>
-  <w:num w:numId="19" w16cid:durableId="1987276328">
-    <w:abstractNumId w:val="14"/>
-  </w:num>
-  <w:num w:numId="20" w16cid:durableId="1671788309">
-    <w:abstractNumId w:val="8"/>
-  </w:num>
-  <w:num w:numId="21" w16cid:durableId="565148369">
-    <w:abstractNumId w:val="1"/>
-  </w:num>
-  <w:num w:numId="22" w16cid:durableId="948663299">
-    <w:abstractNumId w:val="20"/>
+  <w:num w:numId="36" w16cid:durableId="1239750296">
+    <w:abstractNumId w:val="0"/>
   </w:num>
 </w:numbering>
 </file>
@@ -14901,7 +18080,7 @@
     <w:link w:val="SzakdolozatbekezdsekChar"/>
     <w:autoRedefine/>
     <w:qFormat/>
-    <w:rsid w:val="00677EA1"/>
+    <w:rsid w:val="00967607"/>
     <w:pPr>
       <w:spacing w:line="360" w:lineRule="auto"/>
       <w:ind w:firstLine="709"/>
@@ -14911,7 +18090,7 @@
     <w:name w:val="Szakdolozat bekezdések Char"/>
     <w:basedOn w:val="Bekezdsalapbettpusa"/>
     <w:link w:val="Szakdolozatbekezdsek"/>
-    <w:rsid w:val="00677EA1"/>
+    <w:rsid w:val="00967607"/>
   </w:style>
   <w:style w:type="paragraph" w:styleId="HTML-kntformzott">
     <w:name w:val="HTML Preformatted"/>

</xml_diff>

<commit_message>
Some semantical problem solved.
</commit_message>
<xml_diff>
--- a/Documents/Vizsgaremek dokumentáció.docx
+++ b/Documents/Vizsgaremek dokumentáció.docx
@@ -99,7 +99,27 @@
                                         <w:sz w:val="32"/>
                                         <w:szCs w:val="32"/>
                                       </w:rPr>
-                                      <w:t>VAS-DUDÁS DOMINIKA, PROKAI GÁBOR</w:t>
+                                      <w:t>PROKAI GÁBOR</w:t>
+                                    </w:r>
+                                    <w:r>
+                                      <w:rPr>
+                                        <w:rFonts w:ascii="Times New Roman" w:hAnsi="Times New Roman" w:cs="Times New Roman"/>
+                                        <w:caps/>
+                                        <w:color w:val="2F5496" w:themeColor="accent1" w:themeShade="BF"/>
+                                        <w:sz w:val="32"/>
+                                        <w:szCs w:val="32"/>
+                                      </w:rPr>
+                                      <w:t xml:space="preserve">, </w:t>
+                                    </w:r>
+                                    <w:r>
+                                      <w:rPr>
+                                        <w:rFonts w:ascii="Times New Roman" w:hAnsi="Times New Roman" w:cs="Times New Roman"/>
+                                        <w:caps/>
+                                        <w:color w:val="2F5496" w:themeColor="accent1" w:themeShade="BF"/>
+                                        <w:sz w:val="32"/>
+                                        <w:szCs w:val="32"/>
+                                      </w:rPr>
+                                      <w:t>VAS-DUDÁS DOMINIKA</w:t>
                                     </w:r>
                                   </w:sdtContent>
                                 </w:sdt>
@@ -232,7 +252,27 @@
                                   <w:sz w:val="32"/>
                                   <w:szCs w:val="32"/>
                                 </w:rPr>
-                                <w:t>VAS-DUDÁS DOMINIKA, PROKAI GÁBOR</w:t>
+                                <w:t>PROKAI GÁBOR</w:t>
+                              </w:r>
+                              <w:r>
+                                <w:rPr>
+                                  <w:rFonts w:ascii="Times New Roman" w:hAnsi="Times New Roman" w:cs="Times New Roman"/>
+                                  <w:caps/>
+                                  <w:color w:val="2F5496" w:themeColor="accent1" w:themeShade="BF"/>
+                                  <w:sz w:val="32"/>
+                                  <w:szCs w:val="32"/>
+                                </w:rPr>
+                                <w:t xml:space="preserve">, </w:t>
+                              </w:r>
+                              <w:r>
+                                <w:rPr>
+                                  <w:rFonts w:ascii="Times New Roman" w:hAnsi="Times New Roman" w:cs="Times New Roman"/>
+                                  <w:caps/>
+                                  <w:color w:val="2F5496" w:themeColor="accent1" w:themeShade="BF"/>
+                                  <w:sz w:val="32"/>
+                                  <w:szCs w:val="32"/>
+                                </w:rPr>
+                                <w:t>VAS-DUDÁS DOMINIKA</w:t>
                               </w:r>
                             </w:sdtContent>
                           </w:sdt>
@@ -5674,7 +5714,13 @@
         <w:ind w:firstLine="709"/>
       </w:pPr>
       <w:r>
-        <w:t>Ez az alkalmazás egy jelenleg is működő virágnagykereskedésnek nyújt gyakorlati segítséget a koszorúalapok, és koszorúbálák megrendeléséhez, kezeléséhez. Ebben lehet regisztrálni a vásárlók által megrendelt koszorúalapokat. Az alapokból kétféle, a fenyőből négy fajtát használnak fel a nagykereskedésben. Az alkalmazás abban segít, hogy a vásárlók rendeléseit tudják összegezni, a bálák mennyiségét követni, valamint, hogy melyik fajta fenyő fogy jobban. Mennyit kellett kiszállítani, mennyi lett eladva, lekötve koszorúalapnak, vagy esetleg eltéve egy vásárlónak. Mivel ezek a darabszámok követve vannak</w:t>
+        <w:t xml:space="preserve">Ez az alkalmazás egy jelenleg is működő virágnagykereskedésnek nyújt gyakorlati segítséget a koszorúalapok, és </w:t>
+      </w:r>
+      <w:r>
+        <w:t>fenyő</w:t>
+      </w:r>
+      <w:r>
+        <w:t>bálák megrendeléséhez, kezeléséhez. Ebben lehet regisztrálni a vásárlók által megrendelt koszorúalapokat. Az alapokból kétféle, a fenyőből négy fajtát használnak fel a nagykereskedésben. Az alkalmazás abban segít, hogy a vásárlók rendeléseit tudják összegezni, a bálák mennyiségét követni, valamint, hogy melyik fajta fenyő fogy jobban. Mennyit kellett kiszállítani, mennyi lett eladva, lekötve koszorúalapnak, vagy esetleg eltéve egy vásárlónak. Mivel ezek a darabszámok követve vannak</w:t>
       </w:r>
       <w:r>
         <w:t xml:space="preserve"> -</w:t>
@@ -5744,7 +5790,13 @@
         </w:numPr>
       </w:pPr>
       <w:r>
-        <w:t>A koszorúbálák darabszámát követni, jelezni a maradékot;</w:t>
+        <w:t xml:space="preserve">A </w:t>
+      </w:r>
+      <w:r>
+        <w:t>fenyő</w:t>
+      </w:r>
+      <w:r>
+        <w:t>bálák darabszámát követni, jelezni a maradékot;</w:t>
       </w:r>
     </w:p>
     <w:p>
@@ -6122,9 +6174,9 @@
           <w:noProof/>
         </w:rPr>
         <w:drawing>
-          <wp:inline distT="0" distB="0" distL="0" distR="0" wp14:anchorId="1227864C" wp14:editId="6749B608">
-            <wp:extent cx="5812843" cy="4451954"/>
-            <wp:effectExtent l="0" t="0" r="0" b="6350"/>
+          <wp:inline distT="0" distB="0" distL="0" distR="0" wp14:anchorId="1227864C" wp14:editId="0DDD5906">
+            <wp:extent cx="5812843" cy="4441890"/>
+            <wp:effectExtent l="0" t="0" r="0" b="0"/>
             <wp:docPr id="637573680" name="Kép 2"/>
             <wp:cNvGraphicFramePr>
               <a:graphicFrameLocks xmlns:a="http://schemas.openxmlformats.org/drawingml/2006/main" noChangeAspect="1"/>
@@ -6153,7 +6205,7 @@
                   <pic:spPr bwMode="auto">
                     <a:xfrm>
                       <a:off x="0" y="0"/>
-                      <a:ext cx="5812843" cy="4451954"/>
+                      <a:ext cx="5812843" cy="4441890"/>
                     </a:xfrm>
                     <a:prstGeom prst="rect">
                       <a:avLst/>
@@ -6496,7 +6548,13 @@
         <w:t>fajta</w:t>
       </w:r>
       <w:r>
-        <w:t xml:space="preserve"> az négy fajta lehet, az </w:t>
+        <w:t xml:space="preserve"> az</w:t>
+      </w:r>
+      <w:r>
+        <w:t>t jelöli milyen fenyőtípusból legyen az alap</w:t>
+      </w:r>
+      <w:r>
+        <w:t xml:space="preserve">, az </w:t>
       </w:r>
       <w:r>
         <w:rPr>
@@ -6832,7 +6890,13 @@
         <w:pStyle w:val="Szakdolozatbekezdsek"/>
       </w:pPr>
       <w:r>
-        <w:t>Ebben, ahogyan a tábla neve is mondja, a felhasználók adatait tároljuk le. Ehhez a következő mezőket kellett létrehozni:</w:t>
+        <w:t xml:space="preserve">Ebben, ahogyan a tábla neve is </w:t>
+      </w:r>
+      <w:r>
+        <w:t>mutatja</w:t>
+      </w:r>
+      <w:r>
+        <w:t>, a felhasználók adatait tároljuk le. Ehhez a következő mezőket kellett létrehozni:</w:t>
       </w:r>
     </w:p>
     <w:p>
@@ -7035,7 +7099,19 @@
         <w:pStyle w:val="Szakdolozatbekezdsek"/>
       </w:pPr>
       <w:r>
-        <w:t>A nagykereskedés négy fajta fenyőt használ fel, illetve ad el. Ezek tárolásához is létre lett hozva egy tábla. A táblázat adatai előre meg vannak adva, viszont a későbbi típusok hozzáadása is lehetséges lesz majd később.</w:t>
+        <w:t>A nagykereskedés négy fajta fenyőt ad el</w:t>
+      </w:r>
+      <w:r>
+        <w:t>, de csak három használható alapkötésre</w:t>
+      </w:r>
+      <w:r>
+        <w:t xml:space="preserve">. Ezek tárolásához is létre lett hozva egy tábla. A táblázat adatai előre meg vannak adva, viszont a </w:t>
+      </w:r>
+      <w:r>
+        <w:t>további</w:t>
+      </w:r>
+      <w:r>
+        <w:t xml:space="preserve"> típusok hozzáadása is lehetséges lesz majd később.</w:t>
       </w:r>
     </w:p>
     <w:p>
@@ -7254,10 +7330,49 @@
         <w:t>ve lett</w:t>
       </w:r>
       <w:r>
-        <w:t xml:space="preserve">, hogy négyfajta fenyőt használnak fel. Mind a négy típusból </w:t>
-      </w:r>
-      <w:r>
-        <w:t>érkeznek bálák. Ezekből kötnek koszorúalapot, valamint el is adnak belőle. Viszont ez a tábla csak a koszorúalaphoz kötődik oly módon, hogy a koszorúalapból a nagykereskedés csak kettő félét köt. Ezen adatok vannak a táblában az előzőhöz hasonlóan beégetve. Egyébként a könnyebb adatbevitel érdekében lett ez létrehozva.</w:t>
+        <w:t xml:space="preserve">, hogy </w:t>
+      </w:r>
+      <w:r>
+        <w:t>többféle</w:t>
+      </w:r>
+      <w:r>
+        <w:t xml:space="preserve"> fenyőt használnak fel</w:t>
+      </w:r>
+      <w:r>
+        <w:t>.</w:t>
+      </w:r>
+      <w:r>
+        <w:t xml:space="preserve"> </w:t>
+      </w:r>
+      <w:r>
+        <w:t>E</w:t>
+      </w:r>
+      <w:r>
+        <w:t>zekből kötnek koszorúalapot, valamint el is adnak belől</w:t>
+      </w:r>
+      <w:r>
+        <w:t>ük</w:t>
+      </w:r>
+      <w:r>
+        <w:t xml:space="preserve">. </w:t>
+      </w:r>
+      <w:r>
+        <w:t>E</w:t>
+      </w:r>
+      <w:r>
+        <w:t xml:space="preserve">z a tábla csak a koszorúalaphoz kötődik oly módon, hogy a koszorúalapból a nagykereskedés csak kettő </w:t>
+      </w:r>
+      <w:r>
+        <w:t>méretet</w:t>
+      </w:r>
+      <w:r>
+        <w:t xml:space="preserve"> köt. </w:t>
+      </w:r>
+      <w:r>
+        <w:t xml:space="preserve">Azonban a felhasznált fenyőfajtája háromféle. </w:t>
+      </w:r>
+      <w:r>
+        <w:t>Ezen adatok vannak a táblában az előzőhöz hasonlóan beégetve. Egyébként a könnyebb adatbevitel érdekében lett ez létrehozva.</w:t>
       </w:r>
     </w:p>
     <w:p>
@@ -7745,13 +7860,13 @@
         <w:t>A vásárlók</w:t>
       </w:r>
       <w:r>
-        <w:t>nak is van egy külön tábla, melyben az adataikat tároljuk. Itt már jóval több adatra van szükség, főleg</w:t>
-      </w:r>
-      <w:r>
-        <w:t>,</w:t>
-      </w:r>
-      <w:r>
-        <w:t xml:space="preserve"> ha a későbbiek folyamán majd hivatalossá is lehetne tenni az alkalmazást. </w:t>
+        <w:t>nak is van egy külön tábla, melyben az adataikat tároljuk. Itt már jóval több adatra van szükség</w:t>
+      </w:r>
+      <w:r>
+        <w:t>.</w:t>
+      </w:r>
+      <w:r>
+        <w:t xml:space="preserve"> </w:t>
       </w:r>
       <w:r>
         <w:t>Jelen esetben a vásárlók nem tudnak regisztrálni az alkalmazásba, viszont a nagykereskedés dolgozói fel tudják venni az adataikat.</w:t>
@@ -8030,10 +8145,19 @@
         <w:pStyle w:val="Szakdolozatbekezdsek"/>
       </w:pPr>
       <w:r>
-        <w:t xml:space="preserve">A nagykereskedésnél a fenyőbála nagyon fontos alapanyag. Ebből kötnek koszorúalapot, valamint még eladnak, kiszállítják, és sokféleképpen kezelik az érkezett bálákat. </w:t>
-      </w:r>
-      <w:r>
-        <w:t>A bálák négyfajta fenyőből hetente érkezik. Az érkezett bálák számát felvezetik az adatbázisban, majd a hét folyamán – amikor kiszállítás van, vagy lekötnek koszorúalapokat, vagy egy-két vevőnek eltesznek – azokat ez a tábla tartalmazza</w:t>
+        <w:t xml:space="preserve">A bálák többféle fenyőből, általában hetente érkeznek, </w:t>
+      </w:r>
+      <w:r>
+        <w:t xml:space="preserve">és sokféleképpen kezelik az érkezett </w:t>
+      </w:r>
+      <w:r>
+        <w:t>alapanyagot</w:t>
+      </w:r>
+      <w:r>
+        <w:t>.</w:t>
+      </w:r>
+      <w:r>
+        <w:t xml:space="preserve"> A bálák számát felvezetik az adatbázisban, majd a hét folyamán – amikor kiszállítás van, vagy lekötnek koszorúalapokat, vagy egy-két vevőnek eltesznek – azokat ez a tábla tartalmazza</w:t>
       </w:r>
       <w:r>
         <w:t>. Itt már számolni kell a megmaradt bálákat.</w:t>
@@ -8273,16 +8397,37 @@
         <w:pStyle w:val="Szakdolozatbekezdsek"/>
       </w:pPr>
       <w:r>
-        <w:t xml:space="preserve">A fenyőbála egyik felhasználási állapotát tárolja ez a tábla. A nagykereskedésben a bálák egyik felhasználási módja a koszorúalap kötés. A koszorúalapból kétfélét készítenek, </w:t>
-      </w:r>
-      <w:r>
-        <w:t>és a fenyőkből is négy fajta van, amit felhasználnak.</w:t>
-      </w:r>
-      <w:r>
-        <w:t xml:space="preserve"> Valamint a koszorúalapot egy regisztrált vásárlónak kell megrendelnie.</w:t>
-      </w:r>
-      <w:r>
-        <w:t xml:space="preserve"> Ezért az adatokat tartalmazó táblát a következőképpen kellett kialakítani:</w:t>
+        <w:t xml:space="preserve">A fenyőbála egyik felhasználási állapotát tárolja ez a tábla. A </w:t>
+      </w:r>
+      <w:r>
+        <w:t>bálák egyik része helyben felhasználásra kerül.</w:t>
+      </w:r>
+      <w:r>
+        <w:t xml:space="preserve"> </w:t>
+      </w:r>
+      <w:r>
+        <w:t xml:space="preserve">A </w:t>
+      </w:r>
+      <w:r>
+        <w:t xml:space="preserve">koszorúalapot </w:t>
+      </w:r>
+      <w:r>
+        <w:t xml:space="preserve">csak </w:t>
+      </w:r>
+      <w:r>
+        <w:t>regisztrált vásárló rendel</w:t>
+      </w:r>
+      <w:r>
+        <w:t>heti meg,</w:t>
+      </w:r>
+      <w:r>
+        <w:t xml:space="preserve"> </w:t>
+      </w:r>
+      <w:r>
+        <w:t>e</w:t>
+      </w:r>
+      <w:r>
+        <w:t>zért az adatokat tartalmazó táblát a következőképpen kellett kialakítani:</w:t>
       </w:r>
     </w:p>
     <w:p>
@@ -11416,7 +11561,13 @@
         <w:t>index.js</w:t>
       </w:r>
       <w:r>
-        <w:t xml:space="preserve"> állományban összegyűjtjük a Backend által kért adatokat. A megfelelő esemény meghívása a megfelelő adatokkal az már az </w:t>
+        <w:t xml:space="preserve"> állományban összegyűjtjük a </w:t>
+      </w:r>
+      <w:r>
+        <w:t>háttérrendszer</w:t>
+      </w:r>
+      <w:r>
+        <w:t xml:space="preserve"> által kért adatokat. A megfelelő esemény meghívása a megfelelő adatokkal az már az </w:t>
       </w:r>
       <w:r>
         <w:rPr>
@@ -11426,7 +11577,25 @@
         <w:t>api.js</w:t>
       </w:r>
       <w:r>
-        <w:t xml:space="preserve"> állományra mutat, ahol a Backend hívás történik. Ebben a fájlban találhatóak a különböző Backend hívások. Ezek közvetlenül kapcsolódnak a Backend programhoz. Azokat az adatokat, melyeket a Backend metódusai</w:t>
+        <w:t xml:space="preserve"> állományra mutat, ahol a Backend hívás történik. Ebben a fájlban találhatóak a különböző </w:t>
+      </w:r>
+      <w:r>
+        <w:t>szerveroldali</w:t>
+      </w:r>
+      <w:r>
+        <w:t xml:space="preserve"> hívások. Ezek közvetlenül kapcsolódnak a</w:t>
+      </w:r>
+      <w:r>
+        <w:t xml:space="preserve">z adatkezelő réteghez </w:t>
+      </w:r>
+      <w:r>
+        <w:t>program</w:t>
+      </w:r>
+      <w:r>
+        <w:t>ban</w:t>
+      </w:r>
+      <w:r>
+        <w:t>. Azokat az adatokat, melyeket a Backend metódusai</w:t>
       </w:r>
       <w:r>
         <w:t xml:space="preserve"> igényelnek, ezek a </w:t>
@@ -12624,7 +12793,13 @@
         <w:pStyle w:val="Szakdolozatbekezdsek"/>
       </w:pPr>
       <w:r>
-        <w:t>A Frontendet A Visual Studio Code névre keresztelt fejlesztői környezetben készítettük el</w:t>
+        <w:t>A Frontendet A Visual Studio Code névre keresztelt fejlesztői környezetben kész</w:t>
+      </w:r>
+      <w:r>
+        <w:t>ült</w:t>
+      </w:r>
+      <w:r>
+        <w:t xml:space="preserve"> el</w:t>
       </w:r>
       <w:r>
         <w:t xml:space="preserve"> </w:t>
@@ -12673,13 +12848,19 @@
         <w:t xml:space="preserve"> </w:t>
       </w:r>
       <w:r>
-        <w:t>alkottuk meg</w:t>
+        <w:t>készült el</w:t>
       </w:r>
       <w:r>
         <w:t xml:space="preserve">. </w:t>
       </w:r>
       <w:r>
-        <w:t xml:space="preserve">Ezt a programot C# nyelven hoztuk létre. Az adatbázis és a Backend szoftver közötti kapcsolat létrehozásához ide is kell telepíteni néhány kiegészítőt. Ebben nagyon sokat tud segíteni a NuGet Package Manager. </w:t>
+        <w:t xml:space="preserve">Ez a program C# nyelven </w:t>
+      </w:r>
+      <w:r>
+        <w:t>jött</w:t>
+      </w:r>
+      <w:r>
+        <w:t xml:space="preserve"> létre. Az adatbázis és a Backend szoftver közötti kapcsolat létrehozásához ide is kell telepíteni néhány kiegészítőt. Ebben nagyon sokat tud segíteni a NuGet Package Manager. </w:t>
       </w:r>
       <w:r>
         <w:t>Viszont ezt már korábban említettem. Az adatbázis kapcsolat létrehozását is az egyik ilyen bővítmény segíti egy úgynevezett kapcsolati karakterlánc segítségével, ami a következőképpen néz ki:</w:t>
@@ -12780,6 +12961,9 @@
         <w:jc w:val="center"/>
       </w:pPr>
       <w:r>
+        <w:rPr>
+          <w:noProof/>
+        </w:rPr>
         <w:drawing>
           <wp:inline distT="0" distB="0" distL="0" distR="0" wp14:anchorId="2D3D5CE3" wp14:editId="3B1E513E">
             <wp:extent cx="5760720" cy="688975"/>
@@ -12874,10 +13058,22 @@
         <w:pStyle w:val="Szakdolozatbekezdsek"/>
       </w:pPr>
       <w:r>
-        <w:t xml:space="preserve">Ekkor az alapértelmezett böngészőnk elindul, és megjelenik az alkalmazásunk első oldala. Ahogyan a programot megírtuk, úgy is kell viselkednie. </w:t>
-      </w:r>
-      <w:r>
-        <w:t>A fejlesztés során előkerült hibákat mostanra kijavítottuk, így már csak a jól működő program előnyeit kell élvezni.</w:t>
+        <w:t xml:space="preserve">Ekkor az alapértelmezett böngészőnk elindul, és megjelenik az alkalmazásunk első oldala. </w:t>
+      </w:r>
+      <w:r>
+        <w:t>A fejlesztés során előkerült hibák</w:t>
+      </w:r>
+      <w:r>
+        <w:t xml:space="preserve"> kijavításra kerültek</w:t>
+      </w:r>
+      <w:r>
+        <w:t>, így már csak a jól működő program előnyeit kell élvezni.</w:t>
+      </w:r>
+      <w:r>
+        <w:t xml:space="preserve"> </w:t>
+      </w:r>
+      <w:r>
+        <w:t>További fejleszthető lehetőségei a programnak, hogy szélesíteni lehet a felhasználását. Kiterjeszthető a nagykereskedés további forgalmazott termékeire is. Mint cserepes növények, élő vágott virágok és kiegészítők, valamint egyéb dekorációs kellékek, és virágkötészeti segéd árúk.</w:t>
       </w:r>
     </w:p>
     <w:sectPr>
@@ -17764,6 +17960,7 @@
   <w:style w:type="character" w:default="1" w:styleId="Bekezdsalapbettpusa">
     <w:name w:val="Default Paragraph Font"/>
     <w:uiPriority w:val="1"/>
+    <w:semiHidden/>
     <w:unhideWhenUsed/>
   </w:style>
   <w:style w:type="table" w:default="1" w:styleId="Normltblzat">

</xml_diff>